<commit_message>
Gids voor projecten bijgewerkt op de nieuwe app
De gids volgt nu de oplevering, krappe datums, geen deadline bij intern en
menu aanpassen. Een nieuw hoofdstuk 'Je design is klaar' laat de
opleveringsmail zien, met de knop Feedback geven. De screenshots staan in
een Windows-venster in plaats van een Mac-venster.

Co-Authored-By: Claude Opus 5.5 <noreply@anthropic.com>
Claude-Session: https://claude.ai/code/session_01FF5qjJmcy9G5HYxEPWYe11
</commit_message>
<xml_diff>
--- a/docs/gids-projecten/Designs aanvragen - Handleiding voor projecten.docx
+++ b/docs/gids-projecten/Designs aanvragen - Handleiding voor projecten.docx
@@ -44,7 +44,7 @@
         <w:spacing w:after="200"/>
       </w:pPr>
       <w:r>
-        <w:t>Kort en stap voor stap, op je laptop</w:t>
+        <w:t>Kort en stap voor stap, op je computer</w:t>
       </w:r>
     </w:p>
     <w:p>
@@ -69,7 +69,7 @@
         </w:rPr>
         <w:drawing>
           <wp:inline distT="0" distB="0" distL="0" distR="0">
-            <wp:extent cx="4699000" cy="3389992"/>
+            <wp:extent cx="4699000" cy="3117003"/>
             <wp:effectExtent l="0" t="0" r="0" b="0"/>
             <wp:docPr id="101" name="Afbeelding 101"/>
             <wp:cNvGraphicFramePr>
@@ -91,7 +91,7 @@
                   <pic:spPr>
                     <a:xfrm>
                       <a:off x="0" y="0"/>
-                      <a:ext cx="4699000" cy="3389992"/>
+                      <a:ext cx="4699000" cy="3117003"/>
                     </a:xfrm>
                     <a:prstGeom prst="rect">
                       <a:avLst/>
@@ -442,7 +442,7 @@
               <w:rPr>
                 <w:rFonts w:ascii="Area Normal Extrabold" w:hAnsi="Area Normal Extrabold"/>
               </w:rPr>
-              <w:t xml:space="preserve">Aanvullen of wijzigen</w:t>
+              <w:t xml:space="preserve">Je design is klaar</w:t>
             </w:r>
           </w:p>
         </w:tc>
@@ -461,7 +461,7 @@
               <w:spacing w:after="20"/>
             </w:pPr>
             <w:r>
-              <w:t xml:space="preserve">feedback, materiaal of een nieuwe deadline</w:t>
+              <w:t xml:space="preserve">de mail van Marketing en feedback geven</w:t>
             </w:r>
           </w:p>
         </w:tc>
@@ -509,7 +509,7 @@
               <w:rPr>
                 <w:rFonts w:ascii="Area Normal Extrabold" w:hAnsi="Area Normal Extrabold"/>
               </w:rPr>
-              <w:t xml:space="preserve">Wat gebeurt er daarna?</w:t>
+              <w:t xml:space="preserve">Aanvullen of wijzigen</w:t>
             </w:r>
           </w:p>
         </w:tc>
@@ -528,7 +528,74 @@
               <w:spacing w:after="20"/>
             </w:pPr>
             <w:r>
-              <w:t xml:space="preserve">inplannen, spoed en oplevering</w:t>
+              <w:t xml:space="preserve">iets vergeten, iets erbij of een nieuwe datum</w:t>
+            </w:r>
+          </w:p>
+        </w:tc>
+      </w:tr>
+      <w:tr>
+        <w:tc>
+          <w:tcPr>
+            <w:tcW w:w="510" w:type="dxa"/>
+            <w:tcMar>
+              <w:top w:w="30" w:type="dxa"/>
+              <w:left w:w="0" w:type="dxa"/>
+              <w:bottom w:w="30" w:type="dxa"/>
+              <w:right w:w="80" w:type="dxa"/>
+            </w:tcMar>
+          </w:tcPr>
+          <w:p>
+            <w:pPr>
+              <w:spacing w:after="20"/>
+            </w:pPr>
+            <w:r>
+              <w:rPr>
+                <w:rFonts w:ascii="Pockota Med" w:hAnsi="Pockota Med"/>
+                <w:color w:val="229D96"/>
+                <w:sz w:val="20"/>
+              </w:rPr>
+              <w:t>7</w:t>
+            </w:r>
+          </w:p>
+        </w:tc>
+        <w:tc>
+          <w:tcPr>
+            <w:tcW w:w="3061" w:type="dxa"/>
+            <w:tcMar>
+              <w:top w:w="30" w:type="dxa"/>
+              <w:left w:w="0" w:type="dxa"/>
+              <w:bottom w:w="30" w:type="dxa"/>
+              <w:right w:w="80" w:type="dxa"/>
+            </w:tcMar>
+          </w:tcPr>
+          <w:p>
+            <w:pPr>
+              <w:spacing w:after="20"/>
+            </w:pPr>
+            <w:r>
+              <w:rPr>
+                <w:rFonts w:ascii="Area Normal Extrabold" w:hAnsi="Area Normal Extrabold"/>
+              </w:rPr>
+              <w:t xml:space="preserve">Spoed en vragen</w:t>
+            </w:r>
+          </w:p>
+        </w:tc>
+        <w:tc>
+          <w:tcPr>
+            <w:tcW w:w="5443" w:type="dxa"/>
+            <w:tcMar>
+              <w:top w:w="30" w:type="dxa"/>
+              <w:left w:w="0" w:type="dxa"/>
+              <w:bottom w:w="30" w:type="dxa"/>
+              <w:right w:w="80" w:type="dxa"/>
+            </w:tcMar>
+          </w:tcPr>
+          <w:p>
+            <w:pPr>
+              <w:spacing w:after="20"/>
+            </w:pPr>
+            <w:r>
+              <w:t xml:space="preserve">krappe datums en wat je doet als…</w:t>
             </w:r>
           </w:p>
         </w:tc>
@@ -610,7 +677,7 @@
               </w:rPr>
               <w:drawing>
                 <wp:inline distT="0" distB="0" distL="0" distR="0">
-                  <wp:extent cx="3492500" cy="2519589"/>
+                  <wp:extent cx="3492500" cy="2316691"/>
                   <wp:effectExtent l="0" t="0" r="0" b="0"/>
                   <wp:docPr id="102" name="Afbeelding 102"/>
                   <wp:cNvGraphicFramePr>
@@ -632,7 +699,7 @@
                         <pic:spPr>
                           <a:xfrm>
                             <a:off x="0" y="0"/>
-                            <a:ext cx="3492500" cy="2519589"/>
+                            <a:ext cx="3492500" cy="2316691"/>
                           </a:xfrm>
                           <a:prstGeom prst="rect">
                             <a:avLst/>
@@ -712,7 +779,7 @@
               <w:t xml:space="preserve">Iets aanvullen of wijzigen</w:t>
             </w:r>
             <w:r>
-              <w:t xml:space="preserve">: voor een aanvraag die je al hebt gedaan (hoofdstuk 5).</w:t>
+              <w:t xml:space="preserve">: voor een aanvraag die je al hebt gedaan (hoofdstuk 6).</w:t>
             </w:r>
           </w:p>
         </w:tc>
@@ -765,7 +832,7 @@
               </w:rPr>
               <w:drawing>
                 <wp:inline distT="0" distB="0" distL="0" distR="0">
-                  <wp:extent cx="3492500" cy="2519589"/>
+                  <wp:extent cx="3492500" cy="2316691"/>
                   <wp:effectExtent l="0" t="0" r="0" b="0"/>
                   <wp:docPr id="103" name="Afbeelding 103"/>
                   <wp:cNvGraphicFramePr>
@@ -787,7 +854,7 @@
                         <pic:spPr>
                           <a:xfrm>
                             <a:off x="0" y="0"/>
-                            <a:ext cx="3492500" cy="2519589"/>
+                            <a:ext cx="3492500" cy="2316691"/>
                           </a:xfrm>
                           <a:prstGeom prst="rect">
                             <a:avLst/>
@@ -1021,7 +1088,7 @@
         <w:t xml:space="preserve">Feedback en wijzigingen gaan via het formulier</w:t>
       </w:r>
       <w:r>
-        <w:t xml:space="preserve">, met Iets aanvullen of wijzigen. Niet via mail, Teams of WhatsApp.</w:t>
+        <w:t xml:space="preserve">: met de knop Feedback geven in de mail van Marketing, of met Iets aanvullen of wijzigen. Niet via mail, Teams of WhatsApp.</w:t>
       </w:r>
     </w:p>
     <w:p>
@@ -1071,7 +1138,7 @@
         <w:spacing w:after="0"/>
       </w:pPr>
       <w:r>
-        <w:t xml:space="preserve">Kies bij de eerste vraag Green Village. Het formulier werkt verder hetzelfde; je kunt alleen geen LED-kolom aanvragen.</w:t>
+        <w:t xml:space="preserve">Kies bij de eerste vraag Green Village. Het formulier werkt verder hetzelfde; je kunt alleen geen LED-kolom aanvragen. Het postvak is marketing@green-village.nl.</w:t>
       </w:r>
     </w:p>
     <w:p>
@@ -1170,7 +1237,7 @@
               </w:rPr>
               <w:drawing>
                 <wp:inline distT="0" distB="0" distL="0" distR="0">
-                  <wp:extent cx="3492500" cy="2519589"/>
+                  <wp:extent cx="3492500" cy="2316691"/>
                   <wp:effectExtent l="0" t="0" r="0" b="0"/>
                   <wp:docPr id="104" name="Afbeelding 104"/>
                   <wp:cNvGraphicFramePr>
@@ -1192,7 +1259,7 @@
                         <pic:spPr>
                           <a:xfrm>
                             <a:off x="0" y="0"/>
-                            <a:ext cx="3492500" cy="2519589"/>
+                            <a:ext cx="3492500" cy="2316691"/>
                           </a:xfrm>
                           <a:prstGeom prst="rect">
                             <a:avLst/>
@@ -1323,27 +1390,6 @@
             </w:r>
             <w:r>
               <w:t xml:space="preserve">: de dag waarop het design klaar moet zijn. Die ligt niet na het event.</w:t>
-            </w:r>
-          </w:p>
-          <w:p>
-            <w:pPr>
-              <w:tabs>
-                <w:tab w:val="left" w:pos="425"/>
-              </w:tabs>
-              <w:spacing w:after="120"/>
-              <w:ind w:left="425" w:hanging="425"/>
-            </w:pPr>
-            <w:r>
-              <w:rPr>
-                <w:color w:val="E8590C"/>
-              </w:rPr>
-              <w:t>•</w:t>
-            </w:r>
-            <w:r>
-              <w:tab/>
-            </w:r>
-            <w:r>
-              <w:t xml:space="preserve">Is de deadline minder dan 5 werkdagen weg, dan krijg je een waarschuwing. Je kunt door, maar overleg even met Marketing.</w:t>
             </w:r>
           </w:p>
         </w:tc>
@@ -1396,7 +1442,7 @@
               </w:rPr>
               <w:drawing>
                 <wp:inline distT="0" distB="0" distL="0" distR="0">
-                  <wp:extent cx="3492500" cy="2519589"/>
+                  <wp:extent cx="3492500" cy="2633345"/>
                   <wp:effectExtent l="0" t="0" r="0" b="0"/>
                   <wp:docPr id="105" name="Afbeelding 105"/>
                   <wp:cNvGraphicFramePr>
@@ -1406,7 +1452,7 @@
                     <a:graphicData uri="http://schemas.openxmlformats.org/drawingml/2006/picture">
                       <pic:pic xmlns:pic="http://schemas.openxmlformats.org/drawingml/2006/picture">
                         <pic:nvPicPr>
-                          <pic:cNvPr id="0" name="g05-website.jpg"/>
+                          <pic:cNvPr id="0" name="g04-krap.jpg"/>
                           <pic:cNvPicPr/>
                         </pic:nvPicPr>
                         <pic:blipFill>
@@ -1418,7 +1464,7 @@
                         <pic:spPr>
                           <a:xfrm>
                             <a:off x="0" y="0"/>
-                            <a:ext cx="3492500" cy="2519589"/>
+                            <a:ext cx="3492500" cy="2633345"/>
                           </a:xfrm>
                           <a:prstGeom prst="rect">
                             <a:avLst/>
@@ -1463,16 +1509,16 @@
               <w:tab/>
             </w:r>
             <w:r>
-              <w:t xml:space="preserve">De </w:t>
-            </w:r>
-            <w:r>
-              <w:rPr>
-                <w:rFonts w:ascii="Area Normal Extrabold" w:hAnsi="Area Normal Extrabold"/>
-              </w:rPr>
-              <w:t xml:space="preserve">website</w:t>
-            </w:r>
-            <w:r>
-              <w:t xml:space="preserve"> van het bedrijf of het event. Logo, kleuren en fonts worden daar automatisch vandaan gehaald.</w:t>
+              <w:t xml:space="preserve">Is het event of de deadline over </w:t>
+            </w:r>
+            <w:r>
+              <w:rPr>
+                <w:rFonts w:ascii="Area Normal Extrabold" w:hAnsi="Area Normal Extrabold"/>
+              </w:rPr>
+              <w:t xml:space="preserve">3 werkdagen of minder</w:t>
+            </w:r>
+            <w:r>
+              <w:t xml:space="preserve">, dan zie je een rode melding. Vul het formulier gewoon in en mail daarna meteen Marketing.</w:t>
             </w:r>
           </w:p>
           <w:p>
@@ -1493,7 +1539,16 @@
               <w:tab/>
             </w:r>
             <w:r>
-              <w:t xml:space="preserve">Geen website? Laat het veld leeg.</w:t>
+              <w:t xml:space="preserve">Event over minder dan </w:t>
+            </w:r>
+            <w:r>
+              <w:rPr>
+                <w:rFonts w:ascii="Area Normal Extrabold" w:hAnsi="Area Normal Extrabold"/>
+              </w:rPr>
+              <w:t xml:space="preserve">twee weken</w:t>
+            </w:r>
+            <w:r>
+              <w:t xml:space="preserve">? Dan krijg je een oranje melding: drukwerk dat we bestellen, zoals een geprinte menukaart, vlaggen, banners en roll-ups, is dan waarschijnlijk niet meer op tijd.</w:t>
             </w:r>
           </w:p>
           <w:p>
@@ -1514,16 +1569,7 @@
               <w:tab/>
             </w:r>
             <w:r>
-              <w:t xml:space="preserve">De vraag erna is de map op de </w:t>
-            </w:r>
-            <w:r>
-              <w:rPr>
-                <w:rFonts w:ascii="Area Normal Extrabold" w:hAnsi="Area Normal Extrabold"/>
-              </w:rPr>
-              <w:t xml:space="preserve">G:\-schijf</w:t>
-            </w:r>
-            <w:r>
-              <w:t xml:space="preserve"> met informatie of eerdere designs. Die mag ook leeg blijven.</w:t>
+              <w:t xml:space="preserve">Deadline over minder dan 5 werkdagen? Dan krijg je ook een melding. Je kunt door, maar overleg even met Marketing.</w:t>
             </w:r>
           </w:p>
         </w:tc>
@@ -1576,7 +1622,7 @@
               </w:rPr>
               <w:drawing>
                 <wp:inline distT="0" distB="0" distL="0" distR="0">
-                  <wp:extent cx="3492500" cy="2519589"/>
+                  <wp:extent cx="3492500" cy="2316691"/>
                   <wp:effectExtent l="0" t="0" r="0" b="0"/>
                   <wp:docPr id="106" name="Afbeelding 106"/>
                   <wp:cNvGraphicFramePr>
@@ -1598,7 +1644,7 @@
                         <pic:spPr>
                           <a:xfrm>
                             <a:off x="0" y="0"/>
-                            <a:ext cx="3492500" cy="2519589"/>
+                            <a:ext cx="3492500" cy="2316691"/>
                           </a:xfrm>
                           <a:prstGeom prst="rect">
                             <a:avLst/>
@@ -1688,6 +1734,45 @@
             </w:r>
             <w:r>
               <w:t xml:space="preserve">Afbeeldingen, PDF, Word en PowerPoint; hooguit 5 bestanden van 25 MB. Grotere bestanden en bronbestanden (AI, PSD, INDD) zet je op de schijf.</w:t>
+            </w:r>
+          </w:p>
+          <w:p>
+            <w:pPr>
+              <w:tabs>
+                <w:tab w:val="left" w:pos="425"/>
+              </w:tabs>
+              <w:spacing w:after="120"/>
+              <w:ind w:left="425" w:hanging="425"/>
+            </w:pPr>
+            <w:r>
+              <w:rPr>
+                <w:color w:val="E8590C"/>
+              </w:rPr>
+              <w:t>•</w:t>
+            </w:r>
+            <w:r>
+              <w:tab/>
+            </w:r>
+            <w:r>
+              <w:t xml:space="preserve">Daarvoor vraagt het formulier naar de </w:t>
+            </w:r>
+            <w:r>
+              <w:rPr>
+                <w:rFonts w:ascii="Area Normal Extrabold" w:hAnsi="Area Normal Extrabold"/>
+              </w:rPr>
+              <w:t xml:space="preserve">website</w:t>
+            </w:r>
+            <w:r>
+              <w:t xml:space="preserve"> van het bedrijf of het event (daar halen we logo, kleuren en fonts vandaan) en naar de map op de </w:t>
+            </w:r>
+            <w:r>
+              <w:rPr>
+                <w:rFonts w:ascii="Area Normal Extrabold" w:hAnsi="Area Normal Extrabold"/>
+              </w:rPr>
+              <w:t xml:space="preserve">G:\-schijf</w:t>
+            </w:r>
+            <w:r>
+              <w:t xml:space="preserve">. Allebei mag leeg blijven.</w:t>
             </w:r>
           </w:p>
         </w:tc>
@@ -1740,7 +1825,7 @@
               </w:rPr>
               <w:drawing>
                 <wp:inline distT="0" distB="0" distL="0" distR="0">
-                  <wp:extent cx="3492500" cy="2519589"/>
+                  <wp:extent cx="3492500" cy="2316691"/>
                   <wp:effectExtent l="0" t="0" r="0" b="0"/>
                   <wp:docPr id="107" name="Afbeelding 107"/>
                   <wp:cNvGraphicFramePr>
@@ -1762,7 +1847,7 @@
                         <pic:spPr>
                           <a:xfrm>
                             <a:off x="0" y="0"/>
-                            <a:ext cx="3492500" cy="2519589"/>
+                            <a:ext cx="3492500" cy="2316691"/>
                           </a:xfrm>
                           <a:prstGeom prst="rect">
                             <a:avLst/>
@@ -1920,7 +2005,7 @@
               </w:rPr>
               <w:drawing>
                 <wp:inline distT="0" distB="0" distL="0" distR="0">
-                  <wp:extent cx="3492500" cy="2519589"/>
+                  <wp:extent cx="3492500" cy="2316691"/>
                   <wp:effectExtent l="0" t="0" r="0" b="0"/>
                   <wp:docPr id="108" name="Afbeelding 108"/>
                   <wp:cNvGraphicFramePr>
@@ -1942,7 +2027,7 @@
                         <pic:spPr>
                           <a:xfrm>
                             <a:off x="0" y="0"/>
-                            <a:ext cx="3492500" cy="2519589"/>
+                            <a:ext cx="3492500" cy="2316691"/>
                           </a:xfrm>
                           <a:prstGeom prst="rect">
                             <a:avLst/>
@@ -2075,7 +2160,7 @@
               </w:rPr>
               <w:drawing>
                 <wp:inline distT="0" distB="0" distL="0" distR="0">
-                  <wp:extent cx="3492500" cy="2519589"/>
+                  <wp:extent cx="3492500" cy="2316691"/>
                   <wp:effectExtent l="0" t="0" r="0" b="0"/>
                   <wp:docPr id="109" name="Afbeelding 109"/>
                   <wp:cNvGraphicFramePr>
@@ -2097,7 +2182,7 @@
                         <pic:spPr>
                           <a:xfrm>
                             <a:off x="0" y="0"/>
-                            <a:ext cx="3492500" cy="2519589"/>
+                            <a:ext cx="3492500" cy="2316691"/>
                           </a:xfrm>
                           <a:prstGeom prst="rect">
                             <a:avLst/>
@@ -2192,7 +2277,7 @@
               <w:tab/>
             </w:r>
             <w:r>
-              <w:t xml:space="preserve">Hoe meer hier staat, hoe minder Marketing hoeft na te vragen.</w:t>
+              <w:t xml:space="preserve">Moet een collega de mail krijgen als het design klaar is? Zet zijn of haar naam en mailadres hier.</w:t>
             </w:r>
           </w:p>
         </w:tc>
@@ -2245,7 +2330,7 @@
               </w:rPr>
               <w:drawing>
                 <wp:inline distT="0" distB="0" distL="0" distR="0">
-                  <wp:extent cx="3492500" cy="2519589"/>
+                  <wp:extent cx="3492500" cy="2316691"/>
                   <wp:effectExtent l="0" t="0" r="0" b="0"/>
                   <wp:docPr id="110" name="Afbeelding 110"/>
                   <wp:cNvGraphicFramePr>
@@ -2267,7 +2352,7 @@
                         <pic:spPr>
                           <a:xfrm>
                             <a:off x="0" y="0"/>
-                            <a:ext cx="3492500" cy="2519589"/>
+                            <a:ext cx="3492500" cy="2316691"/>
                           </a:xfrm>
                           <a:prstGeom prst="rect">
                             <a:avLst/>
@@ -2400,7 +2485,7 @@
               </w:rPr>
               <w:drawing>
                 <wp:inline distT="0" distB="0" distL="0" distR="0">
-                  <wp:extent cx="3492500" cy="2519589"/>
+                  <wp:extent cx="3492500" cy="2316691"/>
                   <wp:effectExtent l="0" t="0" r="0" b="0"/>
                   <wp:docPr id="111" name="Afbeelding 111"/>
                   <wp:cNvGraphicFramePr>
@@ -2422,7 +2507,7 @@
                         <pic:spPr>
                           <a:xfrm>
                             <a:off x="0" y="0"/>
-                            <a:ext cx="3492500" cy="2519589"/>
+                            <a:ext cx="3492500" cy="2316691"/>
                           </a:xfrm>
                           <a:prstGeom prst="rect">
                             <a:avLst/>
@@ -2511,6 +2596,27 @@
               <w:tab/>
             </w:r>
             <w:r>
+              <w:t xml:space="preserve">Was het krap, dan staat hier nog een keer dat je Marketing moet mailen.</w:t>
+            </w:r>
+          </w:p>
+          <w:p>
+            <w:pPr>
+              <w:tabs>
+                <w:tab w:val="left" w:pos="425"/>
+              </w:tabs>
+              <w:spacing w:after="120"/>
+              <w:ind w:left="425" w:hanging="425"/>
+            </w:pPr>
+            <w:r>
+              <w:rPr>
+                <w:color w:val="E8590C"/>
+              </w:rPr>
+              <w:t>•</w:t>
+            </w:r>
+            <w:r>
+              <w:tab/>
+            </w:r>
+            <w:r>
               <w:t xml:space="preserve">Iets vergeten? Doe geen tweede aanvraag, maar gebruik </w:t>
             </w:r>
             <w:r>
@@ -2520,7 +2626,7 @@
               <w:t xml:space="preserve">Iets aanvullen of wijzigen</w:t>
             </w:r>
             <w:r>
-              <w:t xml:space="preserve"> (hoofdstuk 5).</w:t>
+              <w:t xml:space="preserve"> (hoofdstuk 6).</w:t>
             </w:r>
           </w:p>
         </w:tc>
@@ -2545,7 +2651,16 @@
         <w:keepNext/>
       </w:pPr>
       <w:r>
-        <w:t xml:space="preserve">Voor iets zonder event, zoals visitekaartjes of een poster voor de kantine. Locatie en naam gaan zoals in hoofdstuk 2; daarna zijn het nog maar twee vragen.</w:t>
+        <w:t xml:space="preserve">Voor iets zonder event, zoals visitekaartjes of een poster voor de kantine. Locatie en naam gaan zoals in hoofdstuk 2. Kies daarna </w:t>
+      </w:r>
+      <w:r>
+        <w:rPr>
+          <w:rFonts w:ascii="Area Normal Extrabold" w:hAnsi="Area Normal Extrabold"/>
+        </w:rPr>
+        <w:t xml:space="preserve">Intern</w:t>
+      </w:r>
+      <w:r>
+        <w:t xml:space="preserve">; dan zijn het nog maar twee vragen.</w:t>
       </w:r>
     </w:p>
     <w:tbl>
@@ -2590,7 +2705,7 @@
               </w:rPr>
               <w:drawing>
                 <wp:inline distT="0" distB="0" distL="0" distR="0">
-                  <wp:extent cx="3492500" cy="2519589"/>
+                  <wp:extent cx="3492500" cy="2316691"/>
                   <wp:effectExtent l="0" t="0" r="0" b="0"/>
                   <wp:docPr id="112" name="Afbeelding 112"/>
                   <wp:cNvGraphicFramePr>
@@ -2600,7 +2715,7 @@
                     <a:graphicData uri="http://schemas.openxmlformats.org/drawingml/2006/picture">
                       <pic:pic xmlns:pic="http://schemas.openxmlformats.org/drawingml/2006/picture">
                         <pic:nvPicPr>
-                          <pic:cNvPr id="0" name="g20-intern.jpg"/>
+                          <pic:cNvPr id="0" name="g21-intern-wens.jpg"/>
                           <pic:cNvPicPr/>
                         </pic:nvPicPr>
                         <pic:blipFill>
@@ -2612,7 +2727,7 @@
                         <pic:spPr>
                           <a:xfrm>
                             <a:off x="0" y="0"/>
-                            <a:ext cx="3492500" cy="2519589"/>
+                            <a:ext cx="3492500" cy="2316691"/>
                           </a:xfrm>
                           <a:prstGeom prst="rect">
                             <a:avLst/>
@@ -2657,16 +2772,7 @@
               <w:tab/>
             </w:r>
             <w:r>
-              <w:t xml:space="preserve">Kies </w:t>
-            </w:r>
-            <w:r>
-              <w:rPr>
-                <w:rFonts w:ascii="Area Normal Extrabold" w:hAnsi="Area Normal Extrabold"/>
-              </w:rPr>
-              <w:t xml:space="preserve">Intern</w:t>
-            </w:r>
-            <w:r>
-              <w:t xml:space="preserve">.</w:t>
+              <w:t xml:space="preserve">Beschrijf alles in één keer: wat het is, formaat, teksten en voor wie.</w:t>
             </w:r>
           </w:p>
         </w:tc>
@@ -2719,7 +2825,7 @@
               </w:rPr>
               <w:drawing>
                 <wp:inline distT="0" distB="0" distL="0" distR="0">
-                  <wp:extent cx="3492500" cy="2519589"/>
+                  <wp:extent cx="3492500" cy="2684568"/>
                   <wp:effectExtent l="0" t="0" r="0" b="0"/>
                   <wp:docPr id="113" name="Afbeelding 113"/>
                   <wp:cNvGraphicFramePr>
@@ -2729,7 +2835,7 @@
                     <a:graphicData uri="http://schemas.openxmlformats.org/drawingml/2006/picture">
                       <pic:pic xmlns:pic="http://schemas.openxmlformats.org/drawingml/2006/picture">
                         <pic:nvPicPr>
-                          <pic:cNvPr id="0" name="g21-intern-wens.jpg"/>
+                          <pic:cNvPr id="0" name="g22-intern-deadline.jpg"/>
                           <pic:cNvPicPr/>
                         </pic:nvPicPr>
                         <pic:blipFill>
@@ -2741,7 +2847,7 @@
                         <pic:spPr>
                           <a:xfrm>
                             <a:off x="0" y="0"/>
-                            <a:ext cx="3492500" cy="2519589"/>
+                            <a:ext cx="3492500" cy="2684568"/>
                           </a:xfrm>
                           <a:prstGeom prst="rect">
                             <a:avLst/>
@@ -2786,7 +2892,7 @@
               <w:tab/>
             </w:r>
             <w:r>
-              <w:t xml:space="preserve">Beschrijf alles in één keer: wat het is, formaat, teksten en voor wie.</w:t>
+              <w:t xml:space="preserve">Kies de dag waarop je het nodig hebt…</w:t>
             </w:r>
           </w:p>
           <w:p>
@@ -2799,15 +2905,26 @@
             </w:pPr>
             <w:r>
               <w:rPr>
+                <w:rFonts w:ascii="Area Normal Extrabold" w:hAnsi="Area Normal Extrabold"/>
                 <w:color w:val="E8590C"/>
-              </w:rPr>
-              <w:t>•</w:t>
+                <w:sz w:val="22"/>
+              </w:rPr>
+              <w:t>2</w:t>
             </w:r>
             <w:r>
               <w:tab/>
             </w:r>
             <w:r>
-              <w:t xml:space="preserve">Daarna kies je de datum waarop je het nodig hebt, en volgt het overzicht.</w:t>
+              <w:t xml:space="preserve">…of </w:t>
+            </w:r>
+            <w:r>
+              <w:rPr>
+                <w:rFonts w:ascii="Area Normal Extrabold" w:hAnsi="Area Normal Extrabold"/>
+              </w:rPr>
+              <w:t xml:space="preserve">Geen deadline</w:t>
+            </w:r>
+            <w:r>
+              <w:t xml:space="preserve"> als het geen haast heeft. Het mag dan klaar zijn wanneer het past.</w:t>
             </w:r>
           </w:p>
           <w:p>
@@ -2828,7 +2945,7 @@
               <w:tab/>
             </w:r>
             <w:r>
-              <w:t xml:space="preserve">Bestanden meesturen? Dat doe je na het versturen met Iets aanvullen of wijzigen (hoofdstuk 5).</w:t>
+              <w:t xml:space="preserve">Komt er later toch een datum? Die geef je door met Iets aanvullen of wijzigen.</w:t>
             </w:r>
           </w:p>
         </w:tc>
@@ -2925,7 +3042,7 @@
               </w:rPr>
               <w:drawing>
                 <wp:inline distT="0" distB="0" distL="0" distR="0">
-                  <wp:extent cx="3492500" cy="2519589"/>
+                  <wp:extent cx="3492500" cy="2316691"/>
                   <wp:effectExtent l="0" t="0" r="0" b="0"/>
                   <wp:docPr id="114" name="Afbeelding 114"/>
                   <wp:cNvGraphicFramePr>
@@ -2947,7 +3064,7 @@
                         <pic:spPr>
                           <a:xfrm>
                             <a:off x="0" y="0"/>
-                            <a:ext cx="3492500" cy="2519589"/>
+                            <a:ext cx="3492500" cy="2316691"/>
                           </a:xfrm>
                           <a:prstGeom prst="rect">
                             <a:avLst/>
@@ -3054,7 +3171,7 @@
               </w:rPr>
               <w:drawing>
                 <wp:inline distT="0" distB="0" distL="0" distR="0">
-                  <wp:extent cx="3492500" cy="2519589"/>
+                  <wp:extent cx="3492500" cy="2316691"/>
                   <wp:effectExtent l="0" t="0" r="0" b="0"/>
                   <wp:docPr id="115" name="Afbeelding 115"/>
                   <wp:cNvGraphicFramePr>
@@ -3076,7 +3193,7 @@
                         <pic:spPr>
                           <a:xfrm>
                             <a:off x="0" y="0"/>
-                            <a:ext cx="3492500" cy="2519589"/>
+                            <a:ext cx="3492500" cy="2316691"/>
                           </a:xfrm>
                           <a:prstGeom prst="rect">
                             <a:avLst/>
@@ -3211,7 +3328,7 @@
               <w:rPr>
                 <w:rFonts w:ascii="Area Normal Extrabold" w:hAnsi="Area Normal Extrabold"/>
               </w:rPr>
-              <w:t xml:space="preserve">Ander pakket</w:t>
+              <w:t xml:space="preserve">Pakket wijzigen</w:t>
             </w:r>
             <w:r>
               <w:t xml:space="preserve">: opnieuw kiezen.</w:t>
@@ -3238,6 +3355,36 @@
               <w:t xml:space="preserve">Kies gerechten uit de lijst. Typ je zelf een gerecht, dan krijg je een melding en kijkt Marketing ernaar.</w:t>
             </w:r>
           </w:p>
+          <w:p>
+            <w:pPr>
+              <w:tabs>
+                <w:tab w:val="left" w:pos="425"/>
+              </w:tabs>
+              <w:spacing w:after="120"/>
+              <w:ind w:left="425" w:hanging="425"/>
+            </w:pPr>
+            <w:r>
+              <w:rPr>
+                <w:color w:val="E8590C"/>
+              </w:rPr>
+              <w:t>•</w:t>
+            </w:r>
+            <w:r>
+              <w:tab/>
+            </w:r>
+            <w:r>
+              <w:t xml:space="preserve">Verandert het menu later nog? Dat doe je met </w:t>
+            </w:r>
+            <w:r>
+              <w:rPr>
+                <w:rFonts w:ascii="Area Normal Extrabold" w:hAnsi="Area Normal Extrabold"/>
+              </w:rPr>
+              <w:t xml:space="preserve">Menu aanpassen</w:t>
+            </w:r>
+            <w:r>
+              <w:t xml:space="preserve"> (hoofdstuk 6).</w:t>
+            </w:r>
+          </w:p>
         </w:tc>
       </w:tr>
     </w:tbl>
@@ -3252,7 +3399,7 @@
         <w:pageBreakBefore/>
       </w:pPr>
       <w:r>
-        <w:t xml:space="preserve">5  Aanvullen of wijzigen</w:t>
+        <w:t xml:space="preserve">5  Je design is klaar</w:t>
       </w:r>
     </w:p>
     <w:p>
@@ -3260,35 +3407,237 @@
         <w:keepNext/>
       </w:pPr>
       <w:r>
-        <w:t xml:space="preserve">Komt er een design bij, stuur je materiaal na of heb je feedback op het concept? Dat hoort bij je bestaande aanvraag. Klik op het startscherm op </w:t>
+        <w:t xml:space="preserve">Is het design klaar, dan krijg je een mail van </w:t>
       </w:r>
       <w:r>
         <w:rPr>
           <w:rFonts w:ascii="Area Normal Extrabold" w:hAnsi="Area Normal Extrabold"/>
         </w:rPr>
-        <w:t xml:space="preserve">Iets aanvullen of wijzigen</w:t>
-      </w:r>
-      <w:r>
-        <w:t xml:space="preserve"> en kies </w:t>
-      </w:r>
-      <w:r>
-        <w:rPr>
-          <w:rFonts w:ascii="Area Normal Extrabold" w:hAnsi="Area Normal Extrabold"/>
-        </w:rPr>
-        <w:t xml:space="preserve">Voor een evenement</w:t>
-      </w:r>
-      <w:r>
-        <w:t xml:space="preserve"> of </w:t>
-      </w:r>
-      <w:r>
-        <w:rPr>
-          <w:rFonts w:ascii="Area Normal Extrabold" w:hAnsi="Area Normal Extrabold"/>
-        </w:rPr>
-        <w:t xml:space="preserve">Intern</w:t>
-      </w:r>
-      <w:r>
-        <w:t xml:space="preserve">.</w:t>
-      </w:r>
+        <w:t xml:space="preserve">Designaanvraag</w:t>
+      </w:r>
+      <w:r>
+        <w:t xml:space="preserve"> (designaanvraag@nbcevents.nl).</w:t>
+      </w:r>
+    </w:p>
+    <w:tbl>
+      <w:tblPr>
+        <w:tblW w:w="0" w:type="auto"/>
+        <w:tblBorders>
+          <w:top w:val="nil"/>
+          <w:left w:val="nil"/>
+          <w:bottom w:val="nil"/>
+          <w:right w:val="nil"/>
+          <w:insideH w:val="nil"/>
+          <w:insideV w:val="nil"/>
+        </w:tblBorders>
+        <w:tblLayout w:type="fixed"/>
+      </w:tblPr>
+      <w:tblGrid>
+        <w:gridCol w:w="4300"/>
+        <w:gridCol w:w="4715"/>
+      </w:tblGrid>
+      <w:tr>
+        <w:trPr>
+          <w:cantSplit/>
+        </w:trPr>
+        <w:tc>
+          <w:tcPr>
+            <w:tcW w:w="4300" w:type="dxa"/>
+            <w:tcMar>
+              <w:top w:w="0" w:type="dxa"/>
+              <w:left w:w="0" w:type="dxa"/>
+              <w:bottom w:w="0" w:type="dxa"/>
+              <w:right w:w="0" w:type="dxa"/>
+            </w:tcMar>
+            <w:vAlign w:val="center"/>
+          </w:tcPr>
+          <w:p>
+            <w:pPr>
+              <w:spacing w:after="0"/>
+            </w:pPr>
+            <w:r>
+              <w:rPr>
+                <w:noProof/>
+              </w:rPr>
+              <w:drawing>
+                <wp:inline distT="0" distB="0" distL="0" distR="0">
+                  <wp:extent cx="2730500" cy="3033337"/>
+                  <wp:effectExtent l="0" t="0" r="0" b="0"/>
+                  <wp:docPr id="116" name="Afbeelding 116"/>
+                  <wp:cNvGraphicFramePr>
+                    <a:graphicFrameLocks xmlns:a="http://schemas.openxmlformats.org/drawingml/2006/main" noChangeAspect="1"/>
+                  </wp:cNvGraphicFramePr>
+                  <a:graphic xmlns:a="http://schemas.openxmlformats.org/drawingml/2006/main">
+                    <a:graphicData uri="http://schemas.openxmlformats.org/drawingml/2006/picture">
+                      <pic:pic xmlns:pic="http://schemas.openxmlformats.org/drawingml/2006/picture">
+                        <pic:nvPicPr>
+                          <pic:cNvPr id="0" name="g50-mail.jpg"/>
+                          <pic:cNvPicPr/>
+                        </pic:nvPicPr>
+                        <pic:blipFill>
+                          <a:blip r:embed="rIdG16"/>
+                          <a:stretch>
+                            <a:fillRect/>
+                          </a:stretch>
+                        </pic:blipFill>
+                        <pic:spPr>
+                          <a:xfrm>
+                            <a:off x="0" y="0"/>
+                            <a:ext cx="2730500" cy="3033337"/>
+                          </a:xfrm>
+                          <a:prstGeom prst="rect">
+                            <a:avLst/>
+                          </a:prstGeom>
+                        </pic:spPr>
+                      </pic:pic>
+                    </a:graphicData>
+                  </a:graphic>
+                </wp:inline>
+              </w:drawing>
+            </w:r>
+          </w:p>
+        </w:tc>
+        <w:tc>
+          <w:tcPr>
+            <w:tcW w:w="4715" w:type="dxa"/>
+            <w:tcMar>
+              <w:top w:w="120" w:type="dxa"/>
+              <w:left w:w="240" w:type="dxa"/>
+              <w:bottom w:w="0" w:type="dxa"/>
+              <w:right w:w="0" w:type="dxa"/>
+            </w:tcMar>
+            <w:vAlign w:val="center"/>
+          </w:tcPr>
+          <w:p>
+            <w:pPr>
+              <w:tabs>
+                <w:tab w:val="left" w:pos="425"/>
+              </w:tabs>
+              <w:spacing w:after="120"/>
+              <w:ind w:left="425" w:hanging="425"/>
+            </w:pPr>
+            <w:r>
+              <w:rPr>
+                <w:rFonts w:ascii="Area Normal Extrabold" w:hAnsi="Area Normal Extrabold"/>
+                <w:color w:val="E8590C"/>
+                <w:sz w:val="22"/>
+              </w:rPr>
+              <w:t>1</w:t>
+            </w:r>
+            <w:r>
+              <w:tab/>
+            </w:r>
+            <w:r>
+              <w:t xml:space="preserve">Het onderwerp begint met </w:t>
+            </w:r>
+            <w:r>
+              <w:rPr>
+                <w:rFonts w:ascii="Area Normal Extrabold" w:hAnsi="Area Normal Extrabold"/>
+              </w:rPr>
+              <w:t xml:space="preserve">Klaar</w:t>
+            </w:r>
+            <w:r>
+              <w:t xml:space="preserve">, met het event en wat je hebt aangevraagd. Een volgende versie heet </w:t>
+            </w:r>
+            <w:r>
+              <w:rPr>
+                <w:rFonts w:ascii="Area Normal Extrabold" w:hAnsi="Area Normal Extrabold"/>
+              </w:rPr>
+              <w:t xml:space="preserve">Versie 2 klaar</w:t>
+            </w:r>
+            <w:r>
+              <w:t xml:space="preserve">.</w:t>
+            </w:r>
+          </w:p>
+          <w:p>
+            <w:pPr>
+              <w:tabs>
+                <w:tab w:val="left" w:pos="425"/>
+              </w:tabs>
+              <w:spacing w:after="120"/>
+              <w:ind w:left="425" w:hanging="425"/>
+            </w:pPr>
+            <w:r>
+              <w:rPr>
+                <w:rFonts w:ascii="Area Normal Extrabold" w:hAnsi="Area Normal Extrabold"/>
+                <w:color w:val="E8590C"/>
+                <w:sz w:val="22"/>
+              </w:rPr>
+              <w:t>2</w:t>
+            </w:r>
+            <w:r>
+              <w:tab/>
+            </w:r>
+            <w:r>
+              <w:t xml:space="preserve">De </w:t>
+            </w:r>
+            <w:r>
+              <w:rPr>
+                <w:rFonts w:ascii="Area Normal Extrabold" w:hAnsi="Area Normal Extrabold"/>
+              </w:rPr>
+              <w:t xml:space="preserve">bestanden</w:t>
+            </w:r>
+            <w:r>
+              <w:t xml:space="preserve"> zitten als bijlage bij de mail. Grote drukbestanden staan op de schijf; Marketing zet in de mail waar.</w:t>
+            </w:r>
+          </w:p>
+          <w:p>
+            <w:pPr>
+              <w:tabs>
+                <w:tab w:val="left" w:pos="425"/>
+              </w:tabs>
+              <w:spacing w:after="120"/>
+              <w:ind w:left="425" w:hanging="425"/>
+            </w:pPr>
+            <w:r>
+              <w:rPr>
+                <w:rFonts w:ascii="Area Normal Extrabold" w:hAnsi="Area Normal Extrabold"/>
+                <w:color w:val="E8590C"/>
+                <w:sz w:val="22"/>
+              </w:rPr>
+              <w:t>3</w:t>
+            </w:r>
+            <w:r>
+              <w:tab/>
+            </w:r>
+            <w:r>
+              <w:rPr>
+                <w:rFonts w:ascii="Area Normal Extrabold" w:hAnsi="Area Normal Extrabold"/>
+              </w:rPr>
+              <w:t xml:space="preserve">Feedback geven</w:t>
+            </w:r>
+            <w:r>
+              <w:t xml:space="preserve">: iets aan te passen? Klik hierop.</w:t>
+            </w:r>
+          </w:p>
+          <w:p>
+            <w:pPr>
+              <w:tabs>
+                <w:tab w:val="left" w:pos="425"/>
+              </w:tabs>
+              <w:spacing w:after="120"/>
+              <w:ind w:left="425" w:hanging="425"/>
+            </w:pPr>
+            <w:r>
+              <w:rPr>
+                <w:color w:val="E8590C"/>
+              </w:rPr>
+              <w:t>•</w:t>
+            </w:r>
+            <w:r>
+              <w:tab/>
+            </w:r>
+            <w:r>
+              <w:t xml:space="preserve">Antwoord niet op de mail, maar gebruik de knop. Dan komt je feedback meteen bij de juiste aanvraag.</w:t>
+            </w:r>
+          </w:p>
+        </w:tc>
+      </w:tr>
+    </w:tbl>
+    <w:p>
+      <w:pPr>
+        <w:spacing w:after="0" w:line="200" w:lineRule="exact"/>
+      </w:pPr>
     </w:p>
     <w:tbl>
       <w:tblPr>
@@ -3332,9 +3681,9 @@
               </w:rPr>
               <w:drawing>
                 <wp:inline distT="0" distB="0" distL="0" distR="0">
-                  <wp:extent cx="3492500" cy="2519589"/>
+                  <wp:extent cx="3492500" cy="2316691"/>
                   <wp:effectExtent l="0" t="0" r="0" b="0"/>
-                  <wp:docPr id="116" name="Afbeelding 116"/>
+                  <wp:docPr id="117" name="Afbeelding 117"/>
                   <wp:cNvGraphicFramePr>
                     <a:graphicFrameLocks xmlns:a="http://schemas.openxmlformats.org/drawingml/2006/main" noChangeAspect="1"/>
                   </wp:cNvGraphicFramePr>
@@ -3342,11 +3691,11 @@
                     <a:graphicData uri="http://schemas.openxmlformats.org/drawingml/2006/picture">
                       <pic:pic xmlns:pic="http://schemas.openxmlformats.org/drawingml/2006/picture">
                         <pic:nvPicPr>
-                          <pic:cNvPr id="0" name="g40-aanv-zoek.jpg"/>
+                          <pic:cNvPr id="0" name="g51-feedback.jpg"/>
                           <pic:cNvPicPr/>
                         </pic:nvPicPr>
                         <pic:blipFill>
-                          <a:blip r:embed="rIdG16"/>
+                          <a:blip r:embed="rIdG17"/>
                           <a:stretch>
                             <a:fillRect/>
                           </a:stretch>
@@ -3354,7 +3703,7 @@
                         <pic:spPr>
                           <a:xfrm>
                             <a:off x="0" y="0"/>
-                            <a:ext cx="3492500" cy="2519589"/>
+                            <a:ext cx="3492500" cy="2316691"/>
                           </a:xfrm>
                           <a:prstGeom prst="rect">
                             <a:avLst/>
@@ -3399,16 +3748,7 @@
               <w:tab/>
             </w:r>
             <w:r>
-              <w:t xml:space="preserve">Typ minstens 3 letters van de </w:t>
-            </w:r>
-            <w:r>
-              <w:rPr>
-                <w:rFonts w:ascii="Area Normal Extrabold" w:hAnsi="Area Normal Extrabold"/>
-              </w:rPr>
-              <w:t xml:space="preserve">eventnaam</w:t>
-            </w:r>
-            <w:r>
-              <w:t xml:space="preserve">.</w:t>
+              <w:t xml:space="preserve">Het formulier opent met je aanvraag al gekozen. Zoeken hoeft niet.</w:t>
             </w:r>
           </w:p>
           <w:p>
@@ -3431,7 +3771,16 @@
               <w:tab/>
             </w:r>
             <w:r>
-              <w:t xml:space="preserve">Klik de aanvraag aan.</w:t>
+              <w:t xml:space="preserve">Kies je </w:t>
+            </w:r>
+            <w:r>
+              <w:rPr>
+                <w:rFonts w:ascii="Area Normal Extrabold" w:hAnsi="Area Normal Extrabold"/>
+              </w:rPr>
+              <w:t xml:space="preserve">naam</w:t>
+            </w:r>
+            <w:r>
+              <w:t xml:space="preserve"> en klik op Volgende.</w:t>
             </w:r>
           </w:p>
           <w:p>
@@ -3452,7 +3801,7 @@
               <w:tab/>
             </w:r>
             <w:r>
-              <w:t xml:space="preserve">Je ziet de aanvragen van de afgelopen 4 maanden, ook die van collega’s.</w:t>
+              <w:t xml:space="preserve">Daarna typ je je feedback, met eventueel bestanden, een nieuwe deadline of een ander menu. Dat werkt zoals in hoofdstuk 6.</w:t>
             </w:r>
           </w:p>
           <w:p>
@@ -3473,7 +3822,16 @@
               <w:tab/>
             </w:r>
             <w:r>
-              <w:t xml:space="preserve">Intern? Dan vul je je naam in en kies je uit je eigen aanvragen.</w:t>
+              <w:t xml:space="preserve">Is je feedback verwerkt, dan krijg je weer een mail: </w:t>
+            </w:r>
+            <w:r>
+              <w:rPr>
+                <w:rFonts w:ascii="Area Normal Extrabold" w:hAnsi="Area Normal Extrabold"/>
+              </w:rPr>
+              <w:t xml:space="preserve">Versie 2 klaar</w:t>
+            </w:r>
+            <w:r>
+              <w:t xml:space="preserve">.</w:t>
             </w:r>
           </w:p>
         </w:tc>
@@ -3483,6 +3841,50 @@
       <w:pPr>
         <w:spacing w:after="0" w:line="200" w:lineRule="exact"/>
       </w:pPr>
+    </w:p>
+    <w:p>
+      <w:pPr>
+        <w:pStyle w:val="Kop1"/>
+        <w:pageBreakBefore/>
+      </w:pPr>
+      <w:r>
+        <w:t xml:space="preserve">6  Aanvullen of wijzigen</w:t>
+      </w:r>
+    </w:p>
+    <w:p>
+      <w:pPr>
+        <w:keepNext/>
+      </w:pPr>
+      <w:r>
+        <w:t xml:space="preserve">Iets vergeten, komt er een design bij, of is een datum verschoven? Dat hoort bij je bestaande aanvraag. Klik op het startscherm op </w:t>
+      </w:r>
+      <w:r>
+        <w:rPr>
+          <w:rFonts w:ascii="Area Normal Extrabold" w:hAnsi="Area Normal Extrabold"/>
+        </w:rPr>
+        <w:t xml:space="preserve">Iets aanvullen of wijzigen</w:t>
+      </w:r>
+      <w:r>
+        <w:t xml:space="preserve"> en kies </w:t>
+      </w:r>
+      <w:r>
+        <w:rPr>
+          <w:rFonts w:ascii="Area Normal Extrabold" w:hAnsi="Area Normal Extrabold"/>
+        </w:rPr>
+        <w:t xml:space="preserve">Voor een evenement</w:t>
+      </w:r>
+      <w:r>
+        <w:t xml:space="preserve"> of </w:t>
+      </w:r>
+      <w:r>
+        <w:rPr>
+          <w:rFonts w:ascii="Area Normal Extrabold" w:hAnsi="Area Normal Extrabold"/>
+        </w:rPr>
+        <w:t xml:space="preserve">Intern</w:t>
+      </w:r>
+      <w:r>
+        <w:t xml:space="preserve">.</w:t>
+      </w:r>
     </w:p>
     <w:tbl>
       <w:tblPr>
@@ -3526,9 +3928,9 @@
               </w:rPr>
               <w:drawing>
                 <wp:inline distT="0" distB="0" distL="0" distR="0">
-                  <wp:extent cx="3492500" cy="2519589"/>
+                  <wp:extent cx="3492500" cy="2316691"/>
                   <wp:effectExtent l="0" t="0" r="0" b="0"/>
-                  <wp:docPr id="117" name="Afbeelding 117"/>
+                  <wp:docPr id="118" name="Afbeelding 118"/>
                   <wp:cNvGraphicFramePr>
                     <a:graphicFrameLocks xmlns:a="http://schemas.openxmlformats.org/drawingml/2006/main" noChangeAspect="1"/>
                   </wp:cNvGraphicFramePr>
@@ -3536,11 +3938,11 @@
                     <a:graphicData uri="http://schemas.openxmlformats.org/drawingml/2006/picture">
                       <pic:pic xmlns:pic="http://schemas.openxmlformats.org/drawingml/2006/picture">
                         <pic:nvPicPr>
-                          <pic:cNvPr id="0" name="g41-aanv-wat.jpg"/>
+                          <pic:cNvPr id="0" name="g40-aanv-zoek.jpg"/>
                           <pic:cNvPicPr/>
                         </pic:nvPicPr>
                         <pic:blipFill>
-                          <a:blip r:embed="rIdG17"/>
+                          <a:blip r:embed="rIdG18"/>
                           <a:stretch>
                             <a:fillRect/>
                           </a:stretch>
@@ -3548,7 +3950,7 @@
                         <pic:spPr>
                           <a:xfrm>
                             <a:off x="0" y="0"/>
-                            <a:ext cx="3492500" cy="2519589"/>
+                            <a:ext cx="3492500" cy="2316691"/>
                           </a:xfrm>
                           <a:prstGeom prst="rect">
                             <a:avLst/>
@@ -3593,7 +3995,16 @@
               <w:tab/>
             </w:r>
             <w:r>
-              <w:t xml:space="preserve">Wat moet erbij of anders: extra designs, wensen of feedback. Marketing krijgt er meteen bericht van.</w:t>
+              <w:t xml:space="preserve">Typ minstens 3 letters van de </w:t>
+            </w:r>
+            <w:r>
+              <w:rPr>
+                <w:rFonts w:ascii="Area Normal Extrabold" w:hAnsi="Area Normal Extrabold"/>
+              </w:rPr>
+              <w:t xml:space="preserve">eventnaam</w:t>
+            </w:r>
+            <w:r>
+              <w:t xml:space="preserve">.</w:t>
             </w:r>
           </w:p>
           <w:p>
@@ -3606,7 +4017,30 @@
             </w:pPr>
             <w:r>
               <w:rPr>
+                <w:rFonts w:ascii="Area Normal Extrabold" w:hAnsi="Area Normal Extrabold"/>
                 <w:color w:val="E8590C"/>
+                <w:sz w:val="22"/>
+              </w:rPr>
+              <w:t>2</w:t>
+            </w:r>
+            <w:r>
+              <w:tab/>
+            </w:r>
+            <w:r>
+              <w:t xml:space="preserve">Klik de aanvraag aan.</w:t>
+            </w:r>
+          </w:p>
+          <w:p>
+            <w:pPr>
+              <w:tabs>
+                <w:tab w:val="left" w:pos="425"/>
+              </w:tabs>
+              <w:spacing w:after="120"/>
+              <w:ind w:left="425" w:hanging="425"/>
+            </w:pPr>
+            <w:r>
+              <w:rPr>
+                <w:color w:val="E8590C"/>
               </w:rPr>
               <w:t>•</w:t>
             </w:r>
@@ -3614,7 +4048,49 @@
               <w:tab/>
             </w:r>
             <w:r>
-              <w:t xml:space="preserve">Daarvoor vul je je naam in, zodat Marketing weet van wie het komt.</w:t>
+              <w:t xml:space="preserve">Je ziet de aanvragen van de afgelopen 4 maanden, ook die van collega’s.</w:t>
+            </w:r>
+          </w:p>
+          <w:p>
+            <w:pPr>
+              <w:tabs>
+                <w:tab w:val="left" w:pos="425"/>
+              </w:tabs>
+              <w:spacing w:after="120"/>
+              <w:ind w:left="425" w:hanging="425"/>
+            </w:pPr>
+            <w:r>
+              <w:rPr>
+                <w:color w:val="E8590C"/>
+              </w:rPr>
+              <w:t>•</w:t>
+            </w:r>
+            <w:r>
+              <w:tab/>
+            </w:r>
+            <w:r>
+              <w:t xml:space="preserve">Intern? Dan vul je je naam in en kies je uit je eigen aanvragen.</w:t>
+            </w:r>
+          </w:p>
+          <w:p>
+            <w:pPr>
+              <w:tabs>
+                <w:tab w:val="left" w:pos="425"/>
+              </w:tabs>
+              <w:spacing w:after="120"/>
+              <w:ind w:left="425" w:hanging="425"/>
+            </w:pPr>
+            <w:r>
+              <w:rPr>
+                <w:color w:val="E8590C"/>
+              </w:rPr>
+              <w:t>•</w:t>
+            </w:r>
+            <w:r>
+              <w:tab/>
+            </w:r>
+            <w:r>
+              <w:t xml:space="preserve">Daarna vul je je naam in, zodat Marketing weet van wie het komt.</w:t>
             </w:r>
           </w:p>
         </w:tc>
@@ -3667,9 +4143,9 @@
               </w:rPr>
               <w:drawing>
                 <wp:inline distT="0" distB="0" distL="0" distR="0">
-                  <wp:extent cx="3492500" cy="2816451"/>
+                  <wp:extent cx="3492500" cy="2316691"/>
                   <wp:effectExtent l="0" t="0" r="0" b="0"/>
-                  <wp:docPr id="118" name="Afbeelding 118"/>
+                  <wp:docPr id="119" name="Afbeelding 119"/>
                   <wp:cNvGraphicFramePr>
                     <a:graphicFrameLocks xmlns:a="http://schemas.openxmlformats.org/drawingml/2006/main" noChangeAspect="1"/>
                   </wp:cNvGraphicFramePr>
@@ -3677,11 +4153,11 @@
                     <a:graphicData uri="http://schemas.openxmlformats.org/drawingml/2006/picture">
                       <pic:pic xmlns:pic="http://schemas.openxmlformats.org/drawingml/2006/picture">
                         <pic:nvPicPr>
-                          <pic:cNvPr id="0" name="g42-aanv-extra.jpg"/>
+                          <pic:cNvPr id="0" name="g41-aanv-wat.jpg"/>
                           <pic:cNvPicPr/>
                         </pic:nvPicPr>
                         <pic:blipFill>
-                          <a:blip r:embed="rIdG18"/>
+                          <a:blip r:embed="rIdG19"/>
                           <a:stretch>
                             <a:fillRect/>
                           </a:stretch>
@@ -3689,7 +4165,7 @@
                         <pic:spPr>
                           <a:xfrm>
                             <a:off x="0" y="0"/>
-                            <a:ext cx="3492500" cy="2816451"/>
+                            <a:ext cx="3492500" cy="2316691"/>
                           </a:xfrm>
                           <a:prstGeom prst="rect">
                             <a:avLst/>
@@ -3734,16 +4210,7 @@
               <w:tab/>
             </w:r>
             <w:r>
-              <w:t xml:space="preserve">Is de eventdatum of deadline verschoven? Klik op </w:t>
-            </w:r>
-            <w:r>
-              <w:rPr>
-                <w:rFonts w:ascii="Area Normal Extrabold" w:hAnsi="Area Normal Extrabold"/>
-              </w:rPr>
-              <w:t xml:space="preserve">wijzigen</w:t>
-            </w:r>
-            <w:r>
-              <w:t xml:space="preserve">.</w:t>
+              <w:t xml:space="preserve">Wat moet erbij of anders. Marketing krijgt er meteen bericht van.</w:t>
             </w:r>
           </w:p>
           <w:p>
@@ -3789,37 +4256,13 @@
               <w:tab/>
             </w:r>
             <w:r>
-              <w:t xml:space="preserve">Of een map op de schijf, of een WeTransfer-link.</w:t>
-            </w:r>
-          </w:p>
-          <w:p>
-            <w:pPr>
-              <w:tabs>
-                <w:tab w:val="left" w:pos="425"/>
-              </w:tabs>
-              <w:spacing w:after="120"/>
-              <w:ind w:left="425" w:hanging="425"/>
-            </w:pPr>
-            <w:r>
-              <w:rPr>
-                <w:color w:val="E8590C"/>
-              </w:rPr>
-              <w:t>•</w:t>
-            </w:r>
-            <w:r>
-              <w:tab/>
-            </w:r>
-            <w:r>
-              <w:t xml:space="preserve">Alles op dit scherm mag leeg blijven. Klik op </w:t>
-            </w:r>
-            <w:r>
-              <w:rPr>
-                <w:rFonts w:ascii="Area Normal Extrabold" w:hAnsi="Area Normal Extrabold"/>
-              </w:rPr>
-              <w:t xml:space="preserve">Versturen</w:t>
-            </w:r>
-            <w:r>
-              <w:t xml:space="preserve">.</w:t>
+              <w:rPr>
+                <w:rFonts w:ascii="Area Normal Extrabold" w:hAnsi="Area Normal Extrabold"/>
+              </w:rPr>
+              <w:t xml:space="preserve">Menu aanpassen</w:t>
+            </w:r>
+            <w:r>
+              <w:t xml:space="preserve">: alleen bij een menukaart of menuscherm. Je krijgt hetzelfde menuscherm als in hoofdstuk 4, met het menu dat er nu staat.</w:t>
             </w:r>
           </w:p>
         </w:tc>
@@ -3872,9 +4315,191 @@
               </w:rPr>
               <w:drawing>
                 <wp:inline distT="0" distB="0" distL="0" distR="0">
-                  <wp:extent cx="3492500" cy="2933700"/>
+                  <wp:extent cx="3492500" cy="2579793"/>
                   <wp:effectExtent l="0" t="0" r="0" b="0"/>
-                  <wp:docPr id="119" name="Afbeelding 119"/>
+                  <wp:docPr id="120" name="Afbeelding 120"/>
+                  <wp:cNvGraphicFramePr>
+                    <a:graphicFrameLocks xmlns:a="http://schemas.openxmlformats.org/drawingml/2006/main" noChangeAspect="1"/>
+                  </wp:cNvGraphicFramePr>
+                  <a:graphic xmlns:a="http://schemas.openxmlformats.org/drawingml/2006/main">
+                    <a:graphicData uri="http://schemas.openxmlformats.org/drawingml/2006/picture">
+                      <pic:pic xmlns:pic="http://schemas.openxmlformats.org/drawingml/2006/picture">
+                        <pic:nvPicPr>
+                          <pic:cNvPr id="0" name="g42-aanv-extra.jpg"/>
+                          <pic:cNvPicPr/>
+                        </pic:nvPicPr>
+                        <pic:blipFill>
+                          <a:blip r:embed="rIdG20"/>
+                          <a:stretch>
+                            <a:fillRect/>
+                          </a:stretch>
+                        </pic:blipFill>
+                        <pic:spPr>
+                          <a:xfrm>
+                            <a:off x="0" y="0"/>
+                            <a:ext cx="3492500" cy="2579793"/>
+                          </a:xfrm>
+                          <a:prstGeom prst="rect">
+                            <a:avLst/>
+                          </a:prstGeom>
+                        </pic:spPr>
+                      </pic:pic>
+                    </a:graphicData>
+                  </a:graphic>
+                </wp:inline>
+              </w:drawing>
+            </w:r>
+          </w:p>
+        </w:tc>
+        <w:tc>
+          <w:tcPr>
+            <w:tcW w:w="3515" w:type="dxa"/>
+            <w:tcMar>
+              <w:top w:w="120" w:type="dxa"/>
+              <w:left w:w="240" w:type="dxa"/>
+              <w:bottom w:w="0" w:type="dxa"/>
+              <w:right w:w="0" w:type="dxa"/>
+            </w:tcMar>
+            <w:vAlign w:val="center"/>
+          </w:tcPr>
+          <w:p>
+            <w:pPr>
+              <w:tabs>
+                <w:tab w:val="left" w:pos="425"/>
+              </w:tabs>
+              <w:spacing w:after="120"/>
+              <w:ind w:left="425" w:hanging="425"/>
+            </w:pPr>
+            <w:r>
+              <w:rPr>
+                <w:rFonts w:ascii="Area Normal Extrabold" w:hAnsi="Area Normal Extrabold"/>
+                <w:color w:val="E8590C"/>
+                <w:sz w:val="22"/>
+              </w:rPr>
+              <w:t>1</w:t>
+            </w:r>
+            <w:r>
+              <w:tab/>
+            </w:r>
+            <w:r>
+              <w:t xml:space="preserve">Is de eventdatum of deadline verschoven? Klik op </w:t>
+            </w:r>
+            <w:r>
+              <w:rPr>
+                <w:rFonts w:ascii="Area Normal Extrabold" w:hAnsi="Area Normal Extrabold"/>
+              </w:rPr>
+              <w:t xml:space="preserve">wijzigen</w:t>
+            </w:r>
+            <w:r>
+              <w:t xml:space="preserve">.</w:t>
+            </w:r>
+          </w:p>
+          <w:p>
+            <w:pPr>
+              <w:tabs>
+                <w:tab w:val="left" w:pos="425"/>
+              </w:tabs>
+              <w:spacing w:after="120"/>
+              <w:ind w:left="425" w:hanging="425"/>
+            </w:pPr>
+            <w:r>
+              <w:rPr>
+                <w:rFonts w:ascii="Area Normal Extrabold" w:hAnsi="Area Normal Extrabold"/>
+                <w:color w:val="E8590C"/>
+                <w:sz w:val="22"/>
+              </w:rPr>
+              <w:t>2</w:t>
+            </w:r>
+            <w:r>
+              <w:tab/>
+            </w:r>
+            <w:r>
+              <w:t xml:space="preserve">Een map op de schijf of een WeTransfer-link.</w:t>
+            </w:r>
+          </w:p>
+          <w:p>
+            <w:pPr>
+              <w:tabs>
+                <w:tab w:val="left" w:pos="425"/>
+              </w:tabs>
+              <w:spacing w:after="120"/>
+              <w:ind w:left="425" w:hanging="425"/>
+            </w:pPr>
+            <w:r>
+              <w:rPr>
+                <w:color w:val="E8590C"/>
+              </w:rPr>
+              <w:t>•</w:t>
+            </w:r>
+            <w:r>
+              <w:tab/>
+            </w:r>
+            <w:r>
+              <w:t xml:space="preserve">Alles op dit scherm mag leeg blijven. Klik op </w:t>
+            </w:r>
+            <w:r>
+              <w:rPr>
+                <w:rFonts w:ascii="Area Normal Extrabold" w:hAnsi="Area Normal Extrabold"/>
+              </w:rPr>
+              <w:t xml:space="preserve">Versturen</w:t>
+            </w:r>
+            <w:r>
+              <w:t xml:space="preserve">.</w:t>
+            </w:r>
+          </w:p>
+        </w:tc>
+      </w:tr>
+    </w:tbl>
+    <w:p>
+      <w:pPr>
+        <w:spacing w:after="0" w:line="200" w:lineRule="exact"/>
+      </w:pPr>
+    </w:p>
+    <w:tbl>
+      <w:tblPr>
+        <w:tblW w:w="0" w:type="auto"/>
+        <w:tblBorders>
+          <w:top w:val="nil"/>
+          <w:left w:val="nil"/>
+          <w:bottom w:val="nil"/>
+          <w:right w:val="nil"/>
+          <w:insideH w:val="nil"/>
+          <w:insideV w:val="nil"/>
+        </w:tblBorders>
+        <w:tblLayout w:type="fixed"/>
+      </w:tblPr>
+      <w:tblGrid>
+        <w:gridCol w:w="5500"/>
+        <w:gridCol w:w="3515"/>
+      </w:tblGrid>
+      <w:tr>
+        <w:trPr>
+          <w:cantSplit/>
+        </w:trPr>
+        <w:tc>
+          <w:tcPr>
+            <w:tcW w:w="5500" w:type="dxa"/>
+            <w:tcMar>
+              <w:top w:w="0" w:type="dxa"/>
+              <w:left w:w="0" w:type="dxa"/>
+              <w:bottom w:w="0" w:type="dxa"/>
+              <w:right w:w="0" w:type="dxa"/>
+            </w:tcMar>
+            <w:vAlign w:val="center"/>
+          </w:tcPr>
+          <w:p>
+            <w:pPr>
+              <w:spacing w:after="0"/>
+            </w:pPr>
+            <w:r>
+              <w:rPr>
+                <w:noProof/>
+              </w:rPr>
+              <w:drawing>
+                <wp:inline distT="0" distB="0" distL="0" distR="0">
+                  <wp:extent cx="3492500" cy="2684568"/>
+                  <wp:effectExtent l="0" t="0" r="0" b="0"/>
+                  <wp:docPr id="121" name="Afbeelding 121"/>
                   <wp:cNvGraphicFramePr>
                     <a:graphicFrameLocks xmlns:a="http://schemas.openxmlformats.org/drawingml/2006/main" noChangeAspect="1"/>
                   </wp:cNvGraphicFramePr>
@@ -3886,7 +4511,7 @@
                           <pic:cNvPicPr/>
                         </pic:nvPicPr>
                         <pic:blipFill>
-                          <a:blip r:embed="rIdG19"/>
+                          <a:blip r:embed="rIdG21"/>
                           <a:stretch>
                             <a:fillRect/>
                           </a:stretch>
@@ -3894,7 +4519,7 @@
                         <pic:spPr>
                           <a:xfrm>
                             <a:off x="0" y="0"/>
-                            <a:ext cx="3492500" cy="2933700"/>
+                            <a:ext cx="3492500" cy="2684568"/>
                           </a:xfrm>
                           <a:prstGeom prst="rect">
                             <a:avLst/>
@@ -3984,52 +4609,11 @@
     </w:p>
     <w:p>
       <w:pPr>
-        <w:keepNext/>
-        <w:pBdr>
-          <w:left w:val="single" w:sz="24" w:space="8" w:color="F6A304"/>
-        </w:pBdr>
-        <w:shd w:val="clear" w:color="auto" w:fill="FDF3E4"/>
-        <w:ind w:left="198"/>
-        <w:spacing w:before="160" w:after="0"/>
-      </w:pPr>
-      <w:r>
-        <w:rPr>
-          <w:rFonts w:ascii="Area Normal Extrabold" w:hAnsi="Area Normal Extrabold"/>
-        </w:rPr>
-        <w:t xml:space="preserve">Feedback op werk dat al af is?</w:t>
-      </w:r>
-    </w:p>
-    <w:p>
-      <w:pPr>
-        <w:keepNext/>
-        <w:pBdr>
-          <w:left w:val="single" w:sz="24" w:space="8" w:color="F6A304"/>
-        </w:pBdr>
-        <w:shd w:val="clear" w:color="auto" w:fill="FDF3E4"/>
-        <w:ind w:left="198"/>
-        <w:spacing w:after="0"/>
-      </w:pPr>
-      <w:r>
-        <w:t xml:space="preserve">Ook dat gaat via Iets aanvullen of wijzigen. Marketing pakt het dan weer op.</w:t>
-      </w:r>
-    </w:p>
-    <w:p>
-      <w:pPr>
-        <w:pBdr>
-          <w:left w:val="single" w:sz="24" w:space="8" w:color="F6A304"/>
-        </w:pBdr>
-        <w:shd w:val="clear" w:color="auto" w:fill="FDF3E4"/>
-        <w:ind w:left="198"/>
-        <w:spacing w:after="0" w:line="120" w:lineRule="exact"/>
-      </w:pPr>
-    </w:p>
-    <w:p>
-      <w:pPr>
         <w:pStyle w:val="Kop1"/>
         <w:pageBreakBefore/>
       </w:pPr>
       <w:r>
-        <w:t xml:space="preserve">6  Wat gebeurt er daarna?</w:t>
+        <w:t xml:space="preserve">7  Spoed en vragen</w:t>
       </w:r>
     </w:p>
     <w:p>
@@ -4106,16 +4690,7 @@
         <w:tab/>
       </w:r>
       <w:r>
-        <w:t xml:space="preserve">Is het design klaar, dan </w:t>
-      </w:r>
-      <w:r>
-        <w:rPr>
-          <w:rFonts w:ascii="Area Normal Extrabold" w:hAnsi="Area Normal Extrabold"/>
-        </w:rPr>
-        <w:t xml:space="preserve">mailt Marketing je</w:t>
-      </w:r>
-      <w:r>
-        <w:t xml:space="preserve">. Van het formulier zelf krijg je geen mail.</w:t>
+        <w:t xml:space="preserve">Is het design klaar, dan krijg je een mail met de bestanden (hoofdstuk 5).</w:t>
       </w:r>
     </w:p>
     <w:p>
@@ -4125,32 +4700,7 @@
         <w:spacing w:before="240"/>
       </w:pPr>
       <w:r>
-        <w:t xml:space="preserve">Spoed</w:t>
-      </w:r>
-    </w:p>
-    <w:p>
-      <w:pPr/>
-      <w:r>
-        <w:t xml:space="preserve">Zit er minder dan </w:t>
-      </w:r>
-      <w:r>
-        <w:rPr>
-          <w:rFonts w:ascii="Area Normal Extrabold" w:hAnsi="Area Normal Extrabold"/>
-        </w:rPr>
-        <w:t xml:space="preserve">10 werkdagen</w:t>
-      </w:r>
-      <w:r>
-        <w:t xml:space="preserve"> tussen je aanvraag en het event, dan is het een spoedje. Dat wordt automatisch bijgehouden, per aanvrager, en blijft staan als de datum later verschuift. Moet het echt snel? Overleg dan even met Marketing.</w:t>
-      </w:r>
-    </w:p>
-    <w:p>
-      <w:pPr>
-        <w:pStyle w:val="Kop2"/>
-        <w:keepNext/>
-        <w:spacing w:before="240"/>
-      </w:pPr>
-      <w:r>
-        <w:t xml:space="preserve">Wat doe je als…</w:t>
+        <w:t xml:space="preserve">Krappe datums</w:t>
       </w:r>
     </w:p>
     <w:tbl>
@@ -4194,7 +4744,7 @@
                 <w:rFonts w:ascii="Area Normal Extrabold" w:hAnsi="Area Normal Extrabold"/>
                 <w:color w:val="FFFFFF"/>
               </w:rPr>
-              <w:t>Wat er is</w:t>
+              <w:t>Hoeveel tijd</w:t>
             </w:r>
           </w:p>
         </w:tc>
@@ -4218,7 +4768,7 @@
                 <w:rFonts w:ascii="Area Normal Extrabold" w:hAnsi="Area Normal Extrabold"/>
                 <w:color w:val="FFFFFF"/>
               </w:rPr>
-              <w:t>Zo doe je het</w:t>
+              <w:t>Wat het formulier zegt</w:t>
             </w:r>
           </w:p>
         </w:tc>
@@ -4245,7 +4795,7 @@
               <w:rPr>
                 <w:rFonts w:ascii="Area Normal Extrabold" w:hAnsi="Area Normal Extrabold"/>
               </w:rPr>
-              <w:t xml:space="preserve">Iets vergeten in je aanvraag</w:t>
+              <w:t xml:space="preserve">10 werkdagen of meer tot het event</w:t>
             </w:r>
           </w:p>
         </w:tc>
@@ -4264,7 +4814,7 @@
               <w:spacing w:after="40"/>
             </w:pPr>
             <w:r>
-              <w:t xml:space="preserve">Iets aanvullen of wijzigen.</w:t>
+              <w:t xml:space="preserve">Je bent op tijd.</w:t>
             </w:r>
           </w:p>
         </w:tc>
@@ -4291,7 +4841,7 @@
               <w:rPr>
                 <w:rFonts w:ascii="Area Normal Extrabold" w:hAnsi="Area Normal Extrabold"/>
               </w:rPr>
-              <w:t xml:space="preserve">Feedback op het concept</w:t>
+              <w:t xml:space="preserve">Minder dan 10 werkdagen tot het event</w:t>
             </w:r>
           </w:p>
         </w:tc>
@@ -4310,7 +4860,7 @@
               <w:spacing w:after="40"/>
             </w:pPr>
             <w:r>
-              <w:t xml:space="preserve">Iets aanvullen of wijzigen.</w:t>
+              <w:t xml:space="preserve">Een spoedje. Drukwerk dat we bestellen (geprinte menukaart, vlaggen, banners, roll-ups) is waarschijnlijk niet meer op tijd.</w:t>
             </w:r>
           </w:p>
         </w:tc>
@@ -4337,7 +4887,7 @@
               <w:rPr>
                 <w:rFonts w:ascii="Area Normal Extrabold" w:hAnsi="Area Normal Extrabold"/>
               </w:rPr>
-              <w:t xml:space="preserve">Nog een design voor hetzelfde event</w:t>
+              <w:t xml:space="preserve">Deadline over minder dan 5 werkdagen</w:t>
             </w:r>
           </w:p>
         </w:tc>
@@ -4356,7 +4906,326 @@
               <w:spacing w:after="40"/>
             </w:pPr>
             <w:r>
+              <w:t xml:space="preserve">Overleg even met Marketing als het sneller moet.</w:t>
+            </w:r>
+          </w:p>
+        </w:tc>
+      </w:tr>
+      <w:tr>
+        <w:trPr>
+          <w:cantSplit/>
+        </w:trPr>
+        <w:tc>
+          <w:tcPr>
+            <w:tcW w:w="3200" w:type="dxa"/>
+            <w:tcMar>
+              <w:top w:w="90" w:type="dxa"/>
+              <w:left w:w="140" w:type="dxa"/>
+              <w:bottom w:w="50" w:type="dxa"/>
+              <w:right w:w="140" w:type="dxa"/>
+            </w:tcMar>
+          </w:tcPr>
+          <w:p>
+            <w:pPr>
+              <w:spacing w:after="40"/>
+            </w:pPr>
+            <w:r>
+              <w:rPr>
+                <w:rFonts w:ascii="Area Normal Extrabold" w:hAnsi="Area Normal Extrabold"/>
+              </w:rPr>
+              <w:t xml:space="preserve">3 werkdagen of minder</w:t>
+            </w:r>
+          </w:p>
+        </w:tc>
+        <w:tc>
+          <w:tcPr>
+            <w:tcW w:w="5815" w:type="dxa"/>
+            <w:tcMar>
+              <w:top w:w="90" w:type="dxa"/>
+              <w:left w:w="140" w:type="dxa"/>
+              <w:bottom w:w="50" w:type="dxa"/>
+              <w:right w:w="140" w:type="dxa"/>
+            </w:tcMar>
+          </w:tcPr>
+          <w:p>
+            <w:pPr>
+              <w:spacing w:after="40"/>
+            </w:pPr>
+            <w:r>
+              <w:t xml:space="preserve">Verstuur je aanvraag en mail daarna meteen Marketing om te bespreken wat er nog kan.</w:t>
+            </w:r>
+          </w:p>
+        </w:tc>
+      </w:tr>
+    </w:tbl>
+    <w:p>
+      <w:pPr>
+        <w:spacing w:before="160"/>
+      </w:pPr>
+      <w:r>
+        <w:t xml:space="preserve">Spoedjes worden automatisch bijgehouden, per aanvrager, en blijven staan als de datum later verschuift.</w:t>
+      </w:r>
+    </w:p>
+    <w:p>
+      <w:pPr>
+        <w:pStyle w:val="Kop2"/>
+        <w:keepNext/>
+        <w:spacing w:before="240"/>
+      </w:pPr>
+      <w:r>
+        <w:t xml:space="preserve">Wat doe je als…</w:t>
+      </w:r>
+    </w:p>
+    <w:tbl>
+      <w:tblPr>
+        <w:tblW w:w="0" w:type="auto"/>
+        <w:tblBorders>
+          <w:top w:val="nil"/>
+          <w:left w:val="nil"/>
+          <w:bottom w:val="nil"/>
+          <w:right w:val="nil"/>
+          <w:insideH w:val="nil"/>
+          <w:insideV w:val="nil"/>
+        </w:tblBorders>
+        <w:tblLayout w:type="fixed"/>
+      </w:tblPr>
+      <w:tblGrid>
+        <w:gridCol w:w="3200"/>
+        <w:gridCol w:w="5815"/>
+      </w:tblGrid>
+      <w:tr>
+        <w:trPr>
+          <w:cantSplit/>
+        </w:trPr>
+        <w:tc>
+          <w:tcPr>
+            <w:tcW w:w="3200" w:type="dxa"/>
+            <w:shd w:val="clear" w:color="auto" w:fill="229D96"/>
+            <w:tcMar>
+              <w:top w:w="90" w:type="dxa"/>
+              <w:left w:w="140" w:type="dxa"/>
+              <w:bottom w:w="50" w:type="dxa"/>
+              <w:right w:w="140" w:type="dxa"/>
+            </w:tcMar>
+          </w:tcPr>
+          <w:p>
+            <w:pPr>
+              <w:spacing w:after="40"/>
+            </w:pPr>
+            <w:r>
+              <w:rPr>
+                <w:rFonts w:ascii="Area Normal Extrabold" w:hAnsi="Area Normal Extrabold"/>
+                <w:color w:val="FFFFFF"/>
+              </w:rPr>
+              <w:t>Wat er is</w:t>
+            </w:r>
+          </w:p>
+        </w:tc>
+        <w:tc>
+          <w:tcPr>
+            <w:tcW w:w="5815" w:type="dxa"/>
+            <w:shd w:val="clear" w:color="auto" w:fill="229D96"/>
+            <w:tcMar>
+              <w:top w:w="90" w:type="dxa"/>
+              <w:left w:w="140" w:type="dxa"/>
+              <w:bottom w:w="50" w:type="dxa"/>
+              <w:right w:w="140" w:type="dxa"/>
+            </w:tcMar>
+          </w:tcPr>
+          <w:p>
+            <w:pPr>
+              <w:spacing w:after="40"/>
+            </w:pPr>
+            <w:r>
+              <w:rPr>
+                <w:rFonts w:ascii="Area Normal Extrabold" w:hAnsi="Area Normal Extrabold"/>
+                <w:color w:val="FFFFFF"/>
+              </w:rPr>
+              <w:t>Zo doe je het</w:t>
+            </w:r>
+          </w:p>
+        </w:tc>
+      </w:tr>
+      <w:tr>
+        <w:trPr>
+          <w:cantSplit/>
+        </w:trPr>
+        <w:tc>
+          <w:tcPr>
+            <w:tcW w:w="3200" w:type="dxa"/>
+            <w:tcMar>
+              <w:top w:w="90" w:type="dxa"/>
+              <w:left w:w="140" w:type="dxa"/>
+              <w:bottom w:w="50" w:type="dxa"/>
+              <w:right w:w="140" w:type="dxa"/>
+            </w:tcMar>
+          </w:tcPr>
+          <w:p>
+            <w:pPr>
+              <w:spacing w:after="40"/>
+            </w:pPr>
+            <w:r>
+              <w:rPr>
+                <w:rFonts w:ascii="Area Normal Extrabold" w:hAnsi="Area Normal Extrabold"/>
+              </w:rPr>
+              <w:t xml:space="preserve">Feedback op een design</w:t>
+            </w:r>
+          </w:p>
+        </w:tc>
+        <w:tc>
+          <w:tcPr>
+            <w:tcW w:w="5815" w:type="dxa"/>
+            <w:tcMar>
+              <w:top w:w="90" w:type="dxa"/>
+              <w:left w:w="140" w:type="dxa"/>
+              <w:bottom w:w="50" w:type="dxa"/>
+              <w:right w:w="140" w:type="dxa"/>
+            </w:tcMar>
+          </w:tcPr>
+          <w:p>
+            <w:pPr>
+              <w:spacing w:after="40"/>
+            </w:pPr>
+            <w:r>
+              <w:t xml:space="preserve">De knop Feedback geven in de mail (hoofdstuk 5).</w:t>
+            </w:r>
+          </w:p>
+        </w:tc>
+      </w:tr>
+      <w:tr>
+        <w:trPr>
+          <w:cantSplit/>
+        </w:trPr>
+        <w:tc>
+          <w:tcPr>
+            <w:tcW w:w="3200" w:type="dxa"/>
+            <w:tcMar>
+              <w:top w:w="90" w:type="dxa"/>
+              <w:left w:w="140" w:type="dxa"/>
+              <w:bottom w:w="50" w:type="dxa"/>
+              <w:right w:w="140" w:type="dxa"/>
+            </w:tcMar>
+          </w:tcPr>
+          <w:p>
+            <w:pPr>
+              <w:spacing w:after="40"/>
+            </w:pPr>
+            <w:r>
+              <w:rPr>
+                <w:rFonts w:ascii="Area Normal Extrabold" w:hAnsi="Area Normal Extrabold"/>
+              </w:rPr>
+              <w:t xml:space="preserve">Iets vergeten in je aanvraag</w:t>
+            </w:r>
+          </w:p>
+        </w:tc>
+        <w:tc>
+          <w:tcPr>
+            <w:tcW w:w="5815" w:type="dxa"/>
+            <w:tcMar>
+              <w:top w:w="90" w:type="dxa"/>
+              <w:left w:w="140" w:type="dxa"/>
+              <w:bottom w:w="50" w:type="dxa"/>
+              <w:right w:w="140" w:type="dxa"/>
+            </w:tcMar>
+          </w:tcPr>
+          <w:p>
+            <w:pPr>
+              <w:spacing w:after="40"/>
+            </w:pPr>
+            <w:r>
+              <w:t xml:space="preserve">Iets aanvullen of wijzigen.</w:t>
+            </w:r>
+          </w:p>
+        </w:tc>
+      </w:tr>
+      <w:tr>
+        <w:trPr>
+          <w:cantSplit/>
+        </w:trPr>
+        <w:tc>
+          <w:tcPr>
+            <w:tcW w:w="3200" w:type="dxa"/>
+            <w:tcMar>
+              <w:top w:w="90" w:type="dxa"/>
+              <w:left w:w="140" w:type="dxa"/>
+              <w:bottom w:w="50" w:type="dxa"/>
+              <w:right w:w="140" w:type="dxa"/>
+            </w:tcMar>
+          </w:tcPr>
+          <w:p>
+            <w:pPr>
+              <w:spacing w:after="40"/>
+            </w:pPr>
+            <w:r>
+              <w:rPr>
+                <w:rFonts w:ascii="Area Normal Extrabold" w:hAnsi="Area Normal Extrabold"/>
+              </w:rPr>
+              <w:t xml:space="preserve">Nog een design voor hetzelfde event</w:t>
+            </w:r>
+          </w:p>
+        </w:tc>
+        <w:tc>
+          <w:tcPr>
+            <w:tcW w:w="5815" w:type="dxa"/>
+            <w:tcMar>
+              <w:top w:w="90" w:type="dxa"/>
+              <w:left w:w="140" w:type="dxa"/>
+              <w:bottom w:w="50" w:type="dxa"/>
+              <w:right w:w="140" w:type="dxa"/>
+            </w:tcMar>
+          </w:tcPr>
+          <w:p>
+            <w:pPr>
+              <w:spacing w:after="40"/>
+            </w:pPr>
+            <w:r>
               <w:t xml:space="preserve">Iets aanvullen of wijzigen, en zet in de toelichting wat erbij moet.</w:t>
+            </w:r>
+          </w:p>
+        </w:tc>
+      </w:tr>
+      <w:tr>
+        <w:trPr>
+          <w:cantSplit/>
+        </w:trPr>
+        <w:tc>
+          <w:tcPr>
+            <w:tcW w:w="3200" w:type="dxa"/>
+            <w:tcMar>
+              <w:top w:w="90" w:type="dxa"/>
+              <w:left w:w="140" w:type="dxa"/>
+              <w:bottom w:w="50" w:type="dxa"/>
+              <w:right w:w="140" w:type="dxa"/>
+            </w:tcMar>
+          </w:tcPr>
+          <w:p>
+            <w:pPr>
+              <w:spacing w:after="40"/>
+            </w:pPr>
+            <w:r>
+              <w:rPr>
+                <w:rFonts w:ascii="Area Normal Extrabold" w:hAnsi="Area Normal Extrabold"/>
+              </w:rPr>
+              <w:t xml:space="preserve">Het menu verandert</w:t>
+            </w:r>
+          </w:p>
+        </w:tc>
+        <w:tc>
+          <w:tcPr>
+            <w:tcW w:w="5815" w:type="dxa"/>
+            <w:tcMar>
+              <w:top w:w="90" w:type="dxa"/>
+              <w:left w:w="140" w:type="dxa"/>
+              <w:bottom w:w="50" w:type="dxa"/>
+              <w:right w:w="140" w:type="dxa"/>
+            </w:tcMar>
+          </w:tcPr>
+          <w:p>
+            <w:pPr>
+              <w:spacing w:after="40"/>
+            </w:pPr>
+            <w:r>
+              <w:t xml:space="preserve">Iets aanvullen of wijzigen, en dan Menu aanpassen.</w:t>
             </w:r>
           </w:p>
         </w:tc>

</xml_diff>

<commit_message>
Projectengids: tekst en indeling van Marketing, en de app-wens vastgelegd
De gids volgt nu de gecorrigeerde tekst van de manager van Marketing, in de
eigen opmaak met screenshots. Rechtgezet waar de tekst niet klopte met het
formulier: Feedback geven zit in de e-mail, bij aanvullen vul je je naam één
keer in, en het bedankscherm noemt contact opnemen alleen als het erg krap
is. De kaders wijzen alleen nog aan wat de tekst uitlegt; de oranje melding
heeft een eigen screenshot.

De wens om de rode melding te laten zeggen dat Marketing beoordeelt wat
haalbaar is, staat in docs/app-wensen.md voor de volgende ronde.

Co-Authored-By: Claude Opus 5.5 <noreply@anthropic.com>
Claude-Session: https://claude.ai/code/session_01FF5qjJmcy9G5HYxEPWYe11
</commit_message>
<xml_diff>
--- a/docs/gids-projecten/Designs aanvragen - Handleiding voor projecten.docx
+++ b/docs/gids-projecten/Designs aanvragen - Handleiding voor projecten.docx
@@ -16,13 +16,20 @@
           <w:rFonts w:ascii="Area Normal Extrabold" w:hAnsi="Area Normal Extrabold"/>
           <w:color w:val="165E5A"/>
         </w:rPr>
-        <w:t>HANDLEIDING VOOR PROJECTEN</w:t>
+        <w:t xml:space="preserve">HANDLEIDING  </w:t>
+      </w:r>
+      <w:r>
+        <w:rPr>
+          <w:rFonts w:ascii="Area Normal Extrabold" w:hAnsi="Area Normal Extrabold"/>
+          <w:color w:val="F5A300"/>
+        </w:rPr>
+        <w:t>OKTOBER 2026</w:t>
       </w:r>
     </w:p>
     <w:p>
       <w:pPr>
         <w:pStyle w:val="Kop1"/>
-        <w:spacing w:after="240" w:line="240" w:lineRule="auto"/>
+        <w:spacing w:after="360" w:line="240" w:lineRule="auto"/>
       </w:pPr>
       <w:r>
         <w:rPr>
@@ -36,27 +43,6 @@
         </w:rPr>
         <w:br/>
         <w:t>bij Marketing</w:t>
-      </w:r>
-    </w:p>
-    <w:p>
-      <w:pPr>
-        <w:pStyle w:val="Kop2"/>
-        <w:spacing w:after="200"/>
-      </w:pPr>
-      <w:r>
-        <w:t>Kort en stap voor stap, op je computer</w:t>
-      </w:r>
-    </w:p>
-    <w:p>
-      <w:pPr>
-        <w:spacing w:after="240"/>
-      </w:pPr>
-      <w:r>
-        <w:rPr>
-          <w:rFonts w:ascii="Area Normal Extrabold" w:hAnsi="Area Normal Extrabold"/>
-          <w:color w:val="F5A300"/>
-        </w:rPr>
-        <w:t>Oktober 2026</w:t>
       </w:r>
     </w:p>
     <w:p>
@@ -110,7 +96,7 @@
         <w:spacing w:before="240"/>
       </w:pPr>
       <w:r>
-        <w:t>In deze gids</w:t>
+        <w:t>In deze handleiding</w:t>
       </w:r>
     </w:p>
     <w:tbl>
@@ -192,9 +178,6 @@
             <w:pPr>
               <w:spacing w:after="20"/>
             </w:pPr>
-            <w:r>
-              <w:t xml:space="preserve">het startscherm en vier afspraken</w:t>
-            </w:r>
           </w:p>
         </w:tc>
       </w:tr>
@@ -241,7 +224,7 @@
               <w:rPr>
                 <w:rFonts w:ascii="Area Normal Extrabold" w:hAnsi="Area Normal Extrabold"/>
               </w:rPr>
-              <w:t xml:space="preserve">Aanvraag voor een event</w:t>
+              <w:t xml:space="preserve">Een aanvraag voor een event</w:t>
             </w:r>
           </w:p>
         </w:tc>
@@ -259,9 +242,6 @@
             <w:pPr>
               <w:spacing w:after="20"/>
             </w:pPr>
-            <w:r>
-              <w:t xml:space="preserve">van locatie tot Gelukt</w:t>
-            </w:r>
           </w:p>
         </w:tc>
       </w:tr>
@@ -308,7 +288,7 @@
               <w:rPr>
                 <w:rFonts w:ascii="Area Normal Extrabold" w:hAnsi="Area Normal Extrabold"/>
               </w:rPr>
-              <w:t xml:space="preserve">Interne aanvraag</w:t>
+              <w:t xml:space="preserve">Een interne aanvraag voor NBC en Green Village</w:t>
             </w:r>
           </w:p>
         </w:tc>
@@ -326,9 +306,6 @@
             <w:pPr>
               <w:spacing w:after="20"/>
             </w:pPr>
-            <w:r>
-              <w:t xml:space="preserve">iets voor NBC of Green Village zelf</w:t>
-            </w:r>
           </w:p>
         </w:tc>
       </w:tr>
@@ -375,7 +352,7 @@
               <w:rPr>
                 <w:rFonts w:ascii="Area Normal Extrabold" w:hAnsi="Area Normal Extrabold"/>
               </w:rPr>
-              <w:t xml:space="preserve">Menukaart of menuscherm</w:t>
+              <w:t xml:space="preserve">Een menukaart of menuscherm</w:t>
             </w:r>
           </w:p>
         </w:tc>
@@ -393,9 +370,6 @@
             <w:pPr>
               <w:spacing w:after="20"/>
             </w:pPr>
-            <w:r>
-              <w:t xml:space="preserve">een pakket kiezen en aanpassen</w:t>
-            </w:r>
           </w:p>
         </w:tc>
       </w:tr>
@@ -460,9 +434,6 @@
             <w:pPr>
               <w:spacing w:after="20"/>
             </w:pPr>
-            <w:r>
-              <w:t xml:space="preserve">de mail van Marketing en feedback geven</w:t>
-            </w:r>
           </w:p>
         </w:tc>
       </w:tr>
@@ -527,9 +498,6 @@
             <w:pPr>
               <w:spacing w:after="20"/>
             </w:pPr>
-            <w:r>
-              <w:t xml:space="preserve">iets vergeten, iets erbij of een nieuwe datum</w:t>
-            </w:r>
           </w:p>
         </w:tc>
       </w:tr>
@@ -594,9 +562,6 @@
             <w:pPr>
               <w:spacing w:after="20"/>
             </w:pPr>
-            <w:r>
-              <w:t xml:space="preserve">krappe datums en wat je doet als…</w:t>
-            </w:r>
           </w:p>
         </w:tc>
       </w:tr>
@@ -606,7 +571,7 @@
         <w:spacing w:before="200"/>
       </w:pPr>
       <w:r>
-        <w:t xml:space="preserve">De screenshots komen uit het formulier, met een verzonnen event. Een oranje kader met een nummer wijst aan waar je klikt; hetzelfde nummer staat in de tekst ernaast.</w:t>
+        <w:t xml:space="preserve">De screenshots in deze handleiding komen uit het formulier en tonen een fictief event. Een oranje kader met een nummer laat zien waar je moet klikken. Hetzelfde nummer vind je terug in de bijbehorende uitleg.</w:t>
       </w:r>
     </w:p>
     <w:p>
@@ -623,7 +588,7 @@
         <w:keepNext/>
       </w:pPr>
       <w:r>
-        <w:t xml:space="preserve">Met het formulier vraag je een design aan bij Marketing. Je vindt het op </w:t>
+        <w:t xml:space="preserve">Met het formulier dien je eenvoudig een designaanvraag in bij Marketing. Je vindt het formulier via </w:t>
       </w:r>
       <w:r>
         <w:rPr>
@@ -632,7 +597,7 @@
         <w:t xml:space="preserve">marketing-nbc.github.io/designaanvraag</w:t>
       </w:r>
       <w:r>
-        <w:t xml:space="preserve">. Zet die link bij je favorieten.</w:t>
+        <w:t xml:space="preserve">. Voeg de link toe aan je favorieten, zodat je het formulier snel terugvindt.</w:t>
       </w:r>
     </w:p>
     <w:tbl>
@@ -750,36 +715,7 @@
               <w:t xml:space="preserve">Start</w:t>
             </w:r>
             <w:r>
-              <w:t xml:space="preserve">: een nieuwe aanvraag.</w:t>
-            </w:r>
-          </w:p>
-          <w:p>
-            <w:pPr>
-              <w:tabs>
-                <w:tab w:val="left" w:pos="425"/>
-              </w:tabs>
-              <w:spacing w:after="120"/>
-              <w:ind w:left="425" w:hanging="425"/>
-            </w:pPr>
-            <w:r>
-              <w:rPr>
-                <w:rFonts w:ascii="Area Normal Extrabold" w:hAnsi="Area Normal Extrabold"/>
-                <w:color w:val="E8590C"/>
-                <w:sz w:val="22"/>
-              </w:rPr>
-              <w:t>2</w:t>
-            </w:r>
-            <w:r>
-              <w:tab/>
-            </w:r>
-            <w:r>
-              <w:rPr>
-                <w:rFonts w:ascii="Area Normal Extrabold" w:hAnsi="Area Normal Extrabold"/>
-              </w:rPr>
-              <w:t xml:space="preserve">Iets aanvullen of wijzigen</w:t>
-            </w:r>
-            <w:r>
-              <w:t xml:space="preserve">: voor een aanvraag die je al hebt gedaan (hoofdstuk 6).</w:t>
+              <w:t xml:space="preserve">: klik op deze optie om een nieuwe aanvraag in te dienen.</w:t>
             </w:r>
           </w:p>
         </w:tc>
@@ -899,7 +835,7 @@
               <w:tab/>
             </w:r>
             <w:r>
-              <w:t xml:space="preserve">Eén vraag per scherm, met uitleg eronder.</w:t>
+              <w:t xml:space="preserve">Het formulier toont één vraag per scherm, met een korte toelichting.</w:t>
             </w:r>
           </w:p>
           <w:p>
@@ -922,16 +858,7 @@
               <w:tab/>
             </w:r>
             <w:r>
-              <w:t xml:space="preserve">Klik een antwoord aan, of druk op de </w:t>
-            </w:r>
-            <w:r>
-              <w:rPr>
-                <w:rFonts w:ascii="Area Normal Extrabold" w:hAnsi="Area Normal Extrabold"/>
-              </w:rPr>
-              <w:t xml:space="preserve">letter</w:t>
-            </w:r>
-            <w:r>
-              <w:t xml:space="preserve"> ervoor.</w:t>
+              <w:t xml:space="preserve">Selecteer je antwoord…</w:t>
             </w:r>
           </w:p>
           <w:p>
@@ -954,13 +881,16 @@
               <w:tab/>
             </w:r>
             <w:r>
+              <w:t xml:space="preserve">…en klik op </w:t>
+            </w:r>
+            <w:r>
               <w:rPr>
                 <w:rFonts w:ascii="Area Normal Extrabold" w:hAnsi="Area Normal Extrabold"/>
               </w:rPr>
               <w:t xml:space="preserve">Volgende</w:t>
             </w:r>
             <w:r>
-              <w:t xml:space="preserve">, of druk op </w:t>
+              <w:t xml:space="preserve"> of druk op </w:t>
             </w:r>
             <w:r>
               <w:rPr>
@@ -969,7 +899,7 @@
               <w:t xml:space="preserve">Enter</w:t>
             </w:r>
             <w:r>
-              <w:t xml:space="preserve">.</w:t>
+              <w:t xml:space="preserve"> om verder te gaan.</w:t>
             </w:r>
           </w:p>
           <w:p>
@@ -992,7 +922,7 @@
               <w:tab/>
             </w:r>
             <w:r>
-              <w:t xml:space="preserve">Terug naar een vorige vraag. De teller laat zien hoe ver je bent.</w:t>
+              <w:t xml:space="preserve">Je kunt altijd terug naar een vorige vraag. De voortgangsteller onderaan laat zien hoever je bent.</w:t>
             </w:r>
           </w:p>
           <w:p>
@@ -1013,7 +943,7 @@
               <w:tab/>
             </w:r>
             <w:r>
-              <w:t xml:space="preserve">Je antwoorden worden bewaard. Sluit je het venster, dan ga je later verder waar je was.</w:t>
+              <w:t xml:space="preserve">Je antwoorden worden automatisch bewaard. Sluit je het venster tussentijds, dan kun je later verdergaan waar je bent gebleven.</w:t>
             </w:r>
           </w:p>
         </w:tc>
@@ -1023,16 +953,6 @@
       <w:pPr>
         <w:spacing w:after="0" w:line="200" w:lineRule="exact"/>
       </w:pPr>
-    </w:p>
-    <w:p>
-      <w:pPr>
-        <w:pStyle w:val="Kop2"/>
-        <w:keepNext/>
-        <w:spacing w:before="160"/>
-      </w:pPr>
-      <w:r>
-        <w:t xml:space="preserve">Vier afspraken</w:t>
-      </w:r>
     </w:p>
     <w:p>
       <w:pPr>
@@ -1047,10 +967,10 @@
         <w:rPr>
           <w:rFonts w:ascii="Area Normal Extrabold" w:hAnsi="Area Normal Extrabold"/>
         </w:rPr>
-        <w:t xml:space="preserve">Vraag minimaal 10 werkdagen vóór het event aan.</w:t>
+        <w:t xml:space="preserve">Vraag je design minimaal 10 werkdagen vóór het event aan.</w:t>
       </w:r>
       <w:r>
-        <w:t xml:space="preserve"> Korter is een spoedje, en dat wordt bijgehouden.</w:t>
+        <w:t xml:space="preserve"> Is de termijn korter, dan geldt het als spoed en wordt de aanvraag als spoed geregistreerd.</w:t>
       </w:r>
     </w:p>
     <w:p>
@@ -1066,10 +986,10 @@
         <w:rPr>
           <w:rFonts w:ascii="Area Normal Extrabold" w:hAnsi="Area Normal Extrabold"/>
         </w:rPr>
-        <w:t xml:space="preserve">Eén aanvraag per event.</w:t>
+        <w:t xml:space="preserve">Dien één aanvraag per event in.</w:t>
       </w:r>
       <w:r>
-        <w:t xml:space="preserve"> Vink alles aan wat je nodig hebt, dan staat het bij elkaar.</w:t>
+        <w:t xml:space="preserve"> Vink alles aan wat je nodig hebt, zodat alles bij elkaar staat.</w:t>
       </w:r>
     </w:p>
     <w:p>
@@ -1085,10 +1005,10 @@
         <w:rPr>
           <w:rFonts w:ascii="Area Normal Extrabold" w:hAnsi="Area Normal Extrabold"/>
         </w:rPr>
-        <w:t xml:space="preserve">Feedback en wijzigingen gaan via het formulier</w:t>
+        <w:t xml:space="preserve">Kies standaarddesigns</w:t>
       </w:r>
       <w:r>
-        <w:t xml:space="preserve">: met de knop Feedback geven in de mail van Marketing, of met Iets aanvullen of wijzigen. Niet via mail, Teams of WhatsApp.</w:t>
+        <w:t xml:space="preserve">, tenzij de opdrachtgever om een eigen ontwerp vraagt of daarvoor betaalt.</w:t>
       </w:r>
     </w:p>
     <w:p>
@@ -1104,10 +1024,10 @@
         <w:rPr>
           <w:rFonts w:ascii="Area Normal Extrabold" w:hAnsi="Area Normal Extrabold"/>
         </w:rPr>
-        <w:t xml:space="preserve">Kies standaard designs</w:t>
+        <w:t xml:space="preserve">Geef feedback en eventuele wijzigingen door via de knop ‘Feedback geven’</w:t>
       </w:r>
       <w:r>
-        <w:t xml:space="preserve">, tenzij de opdrachtgever om een eigen ontwerp vraagt of ervoor betaalt.</w:t>
+        <w:t xml:space="preserve"> in de e-mail van Marketing, of via ‘Iets aanvullen of wijzigen’ in het formulier. We verwerken feedback uitsluitend via het formulier en niet via losse berichten per e-mail, Teams of WhatsApp.</w:t>
       </w:r>
     </w:p>
     <w:p>
@@ -1124,7 +1044,7 @@
         <w:rPr>
           <w:rFonts w:ascii="Area Normal Extrabold" w:hAnsi="Area Normal Extrabold"/>
         </w:rPr>
-        <w:t xml:space="preserve">Green Village</w:t>
+        <w:t xml:space="preserve">Voor Green Village</w:t>
       </w:r>
     </w:p>
     <w:p>
@@ -1138,7 +1058,7 @@
         <w:spacing w:after="0"/>
       </w:pPr>
       <w:r>
-        <w:t xml:space="preserve">Kies bij de eerste vraag Green Village. Het formulier werkt verder hetzelfde; je kunt alleen geen LED-kolom aanvragen. Het postvak is marketing@green-village.nl.</w:t>
+        <w:t xml:space="preserve">Kies bij de eerste vraag Green Village. Het formulier werkt verder hetzelfde, maar je kunt geen LED-kolom aanvragen. Het e-mailadres is marketing@green-village.nl.</w:t>
       </w:r>
     </w:p>
     <w:p>
@@ -1157,7 +1077,7 @@
         <w:pageBreakBefore/>
       </w:pPr>
       <w:r>
-        <w:t xml:space="preserve">2  Aanvraag voor een event</w:t>
+        <w:t xml:space="preserve">2  Een aanvraag voor een event</w:t>
       </w:r>
     </w:p>
     <w:p>
@@ -1174,16 +1094,7 @@
         <w:t xml:space="preserve">Start</w:t>
       </w:r>
       <w:r>
-        <w:t xml:space="preserve"> en kies de locatie. Kies je </w:t>
-      </w:r>
-      <w:r>
-        <w:rPr>
-          <w:rFonts w:ascii="Area Normal Extrabold" w:hAnsi="Area Normal Extrabold"/>
-        </w:rPr>
-        <w:t xml:space="preserve">naam</w:t>
-      </w:r>
-      <w:r>
-        <w:t xml:space="preserve"> uit de lijst; sta je er niet tussen, typ hem dan gewoon. Kies </w:t>
+        <w:t xml:space="preserve"> en kies de locatie. Selecteer je naam in de lijst. Staat je naam er niet tussen, typ hem dan zelf. Kies </w:t>
       </w:r>
       <w:r>
         <w:rPr>
@@ -1192,7 +1103,7 @@
         <w:t xml:space="preserve">Voor een evenement</w:t>
       </w:r>
       <w:r>
-        <w:t xml:space="preserve"> en vul de naam van het event in zoals de opdrachtgever hem gebruikt.</w:t>
+        <w:t xml:space="preserve"> en vul de naam van het event in zoals de opdrachtgever die gebruikt.</w:t>
       </w:r>
     </w:p>
     <w:tbl>
@@ -1304,7 +1215,7 @@
               <w:tab/>
             </w:r>
             <w:r>
-              <w:t xml:space="preserve">Blader naar de goede maand.</w:t>
+              <w:t xml:space="preserve">Blader naar de juiste maand…</w:t>
             </w:r>
           </w:p>
           <w:p>
@@ -1327,16 +1238,7 @@
               <w:tab/>
             </w:r>
             <w:r>
-              <w:t xml:space="preserve">Klik de </w:t>
-            </w:r>
-            <w:r>
-              <w:rPr>
-                <w:rFonts w:ascii="Area Normal Extrabold" w:hAnsi="Area Normal Extrabold"/>
-              </w:rPr>
-              <w:t xml:space="preserve">eventdatum</w:t>
-            </w:r>
-            <w:r>
-              <w:t xml:space="preserve"> aan. Duurt het event meer dagen, kies dan de eerste dag.</w:t>
+              <w:t xml:space="preserve">…en klik de datum van het event aan. Duurt het event meerdere dagen, kies dan de eerste dag.</w:t>
             </w:r>
           </w:p>
           <w:p>
@@ -1349,38 +1251,15 @@
             </w:pPr>
             <w:r>
               <w:rPr>
-                <w:rFonts w:ascii="Area Normal Extrabold" w:hAnsi="Area Normal Extrabold"/>
                 <w:color w:val="E8590C"/>
-                <w:sz w:val="22"/>
-              </w:rPr>
-              <w:t>3</w:t>
+              </w:rPr>
+              <w:t>•</w:t>
             </w:r>
             <w:r>
               <w:tab/>
             </w:r>
             <w:r>
-              <w:t xml:space="preserve">Ben je op tijd, dan zegt het formulier dat ook.</w:t>
-            </w:r>
-          </w:p>
-          <w:p>
-            <w:pPr>
-              <w:tabs>
-                <w:tab w:val="left" w:pos="425"/>
-              </w:tabs>
-              <w:spacing w:after="120"/>
-              <w:ind w:left="425" w:hanging="425"/>
-            </w:pPr>
-            <w:r>
-              <w:rPr>
-                <w:color w:val="E8590C"/>
-              </w:rPr>
-              <w:t>•</w:t>
-            </w:r>
-            <w:r>
-              <w:tab/>
-            </w:r>
-            <w:r>
-              <w:t xml:space="preserve">Daarna kies je net zo de </w:t>
+              <w:t xml:space="preserve">Kies vervolgens de </w:t>
             </w:r>
             <w:r>
               <w:rPr>
@@ -1389,7 +1268,7 @@
               <w:t xml:space="preserve">deadline</w:t>
             </w:r>
             <w:r>
-              <w:t xml:space="preserve">: de dag waarop het design klaar moet zijn. Die ligt niet na het event.</w:t>
+              <w:t xml:space="preserve">: de datum waarop het design klaar moet zijn. Deze datum mag niet na de eventdatum liggen.</w:t>
             </w:r>
           </w:p>
         </w:tc>
@@ -1442,7 +1321,7 @@
               </w:rPr>
               <w:drawing>
                 <wp:inline distT="0" distB="0" distL="0" distR="0">
-                  <wp:extent cx="3492500" cy="2633345"/>
+                  <wp:extent cx="3492500" cy="2316691"/>
                   <wp:effectExtent l="0" t="0" r="0" b="0"/>
                   <wp:docPr id="105" name="Afbeelding 105"/>
                   <wp:cNvGraphicFramePr>
@@ -1452,7 +1331,7 @@
                     <a:graphicData uri="http://schemas.openxmlformats.org/drawingml/2006/picture">
                       <pic:pic xmlns:pic="http://schemas.openxmlformats.org/drawingml/2006/picture">
                         <pic:nvPicPr>
-                          <pic:cNvPr id="0" name="g04-krap.jpg"/>
+                          <pic:cNvPr id="0" name="g06-bestanden.jpg"/>
                           <pic:cNvPicPr/>
                         </pic:nvPicPr>
                         <pic:blipFill>
@@ -1464,7 +1343,7 @@
                         <pic:spPr>
                           <a:xfrm>
                             <a:off x="0" y="0"/>
-                            <a:ext cx="3492500" cy="2633345"/>
+                            <a:ext cx="3492500" cy="2316691"/>
                           </a:xfrm>
                           <a:prstGeom prst="rect">
                             <a:avLst/>
@@ -1509,16 +1388,7 @@
               <w:tab/>
             </w:r>
             <w:r>
-              <w:t xml:space="preserve">Is het event of de deadline over </w:t>
-            </w:r>
-            <w:r>
-              <w:rPr>
-                <w:rFonts w:ascii="Area Normal Extrabold" w:hAnsi="Area Normal Extrabold"/>
-              </w:rPr>
-              <w:t xml:space="preserve">3 werkdagen of minder</w:t>
-            </w:r>
-            <w:r>
-              <w:t xml:space="preserve">, dan zie je een rode melding. Vul het formulier gewoon in en mail daarna meteen Marketing.</w:t>
+              <w:t xml:space="preserve">Sleep een logo, voorbeelden of briefing naar het daarvoor bestemde vak, of klik erop om bestanden te kiezen.</w:t>
             </w:r>
           </w:p>
           <w:p>
@@ -1531,24 +1401,17 @@
             </w:pPr>
             <w:r>
               <w:rPr>
+                <w:rFonts w:ascii="Area Normal Extrabold" w:hAnsi="Area Normal Extrabold"/>
                 <w:color w:val="E8590C"/>
-              </w:rPr>
-              <w:t>•</w:t>
+                <w:sz w:val="22"/>
+              </w:rPr>
+              <w:t>2</w:t>
             </w:r>
             <w:r>
               <w:tab/>
             </w:r>
             <w:r>
-              <w:t xml:space="preserve">Event over minder dan </w:t>
-            </w:r>
-            <w:r>
-              <w:rPr>
-                <w:rFonts w:ascii="Area Normal Extrabold" w:hAnsi="Area Normal Extrabold"/>
-              </w:rPr>
-              <w:t xml:space="preserve">twee weken</w:t>
-            </w:r>
-            <w:r>
-              <w:t xml:space="preserve">? Dan krijg je een oranje melding: drukwerk dat we bestellen, zoals een geprinte menukaart, vlaggen, banners en roll-ups, is dan waarschijnlijk niet meer op tijd.</w:t>
+              <w:t xml:space="preserve">Staat er een vinkje bij een bestand, dan wordt het meegestuurd.</w:t>
             </w:r>
           </w:p>
           <w:p>
@@ -1569,7 +1432,7 @@
               <w:tab/>
             </w:r>
             <w:r>
-              <w:t xml:space="preserve">Deadline over minder dan 5 werkdagen? Dan krijg je ook een melding. Je kunt door, maar overleg even met Marketing.</w:t>
+              <w:t xml:space="preserve">Je kunt maximaal 5 bestanden van elk 25 MB toevoegen, zoals afbeeldingen, pdf-, Word- en PowerPoint-bestanden. Zijn de bestanden groter of gaat het om bronbestanden (AI, PSD of INDD)? Upload deze dan op de G-schijf en voeg de link naar de bestanden toe aan het formulier.</w:t>
             </w:r>
           </w:p>
         </w:tc>
@@ -1632,7 +1495,7 @@
                     <a:graphicData uri="http://schemas.openxmlformats.org/drawingml/2006/picture">
                       <pic:pic xmlns:pic="http://schemas.openxmlformats.org/drawingml/2006/picture">
                         <pic:nvPicPr>
-                          <pic:cNvPr id="0" name="g06-bestanden.jpg"/>
+                          <pic:cNvPr id="0" name="g05-website.jpg"/>
                           <pic:cNvPicPr/>
                         </pic:nvPicPr>
                         <pic:blipFill>
@@ -1689,7 +1552,16 @@
               <w:tab/>
             </w:r>
             <w:r>
-              <w:t xml:space="preserve">Sleep een logo, voorbeelden of een briefing hierheen, of klik om te kiezen.</w:t>
+              <w:t xml:space="preserve">Vul waar mogelijk de </w:t>
+            </w:r>
+            <w:r>
+              <w:rPr>
+                <w:rFonts w:ascii="Area Normal Extrabold" w:hAnsi="Area Normal Extrabold"/>
+              </w:rPr>
+              <w:t xml:space="preserve">website</w:t>
+            </w:r>
+            <w:r>
+              <w:t xml:space="preserve"> van het bedrijf of event in. Zo kan Marketing de juiste branding, zoals logo’s, kleuren en lettertypen, achterhalen.</w:t>
             </w:r>
           </w:p>
           <w:p>
@@ -1702,77 +1574,15 @@
             </w:pPr>
             <w:r>
               <w:rPr>
-                <w:rFonts w:ascii="Area Normal Extrabold" w:hAnsi="Area Normal Extrabold"/>
                 <w:color w:val="E8590C"/>
-                <w:sz w:val="22"/>
-              </w:rPr>
-              <w:t>2</w:t>
+              </w:rPr>
+              <w:t>•</w:t>
             </w:r>
             <w:r>
               <w:tab/>
             </w:r>
             <w:r>
-              <w:t xml:space="preserve">Staat er een vinkje, dan gaat het bestand mee.</w:t>
-            </w:r>
-          </w:p>
-          <w:p>
-            <w:pPr>
-              <w:tabs>
-                <w:tab w:val="left" w:pos="425"/>
-              </w:tabs>
-              <w:spacing w:after="120"/>
-              <w:ind w:left="425" w:hanging="425"/>
-            </w:pPr>
-            <w:r>
-              <w:rPr>
-                <w:color w:val="E8590C"/>
-              </w:rPr>
-              <w:t>•</w:t>
-            </w:r>
-            <w:r>
-              <w:tab/>
-            </w:r>
-            <w:r>
-              <w:t xml:space="preserve">Afbeeldingen, PDF, Word en PowerPoint; hooguit 5 bestanden van 25 MB. Grotere bestanden en bronbestanden (AI, PSD, INDD) zet je op de schijf.</w:t>
-            </w:r>
-          </w:p>
-          <w:p>
-            <w:pPr>
-              <w:tabs>
-                <w:tab w:val="left" w:pos="425"/>
-              </w:tabs>
-              <w:spacing w:after="120"/>
-              <w:ind w:left="425" w:hanging="425"/>
-            </w:pPr>
-            <w:r>
-              <w:rPr>
-                <w:color w:val="E8590C"/>
-              </w:rPr>
-              <w:t>•</w:t>
-            </w:r>
-            <w:r>
-              <w:tab/>
-            </w:r>
-            <w:r>
-              <w:t xml:space="preserve">Daarvoor vraagt het formulier naar de </w:t>
-            </w:r>
-            <w:r>
-              <w:rPr>
-                <w:rFonts w:ascii="Area Normal Extrabold" w:hAnsi="Area Normal Extrabold"/>
-              </w:rPr>
-              <w:t xml:space="preserve">website</w:t>
-            </w:r>
-            <w:r>
-              <w:t xml:space="preserve"> van het bedrijf of het event (daar halen we logo, kleuren en fonts vandaan) en naar de map op de </w:t>
-            </w:r>
-            <w:r>
-              <w:rPr>
-                <w:rFonts w:ascii="Area Normal Extrabold" w:hAnsi="Area Normal Extrabold"/>
-              </w:rPr>
-              <w:t xml:space="preserve">G:\-schijf</w:t>
-            </w:r>
-            <w:r>
-              <w:t xml:space="preserve">. Allebei mag leeg blijven.</w:t>
+              <w:t xml:space="preserve">Is er geen website beschikbaar? Dan kun je dit veld leeg laten.</w:t>
             </w:r>
           </w:p>
         </w:tc>
@@ -1892,16 +1702,7 @@
               <w:tab/>
             </w:r>
             <w:r>
-              <w:t xml:space="preserve">Vink </w:t>
-            </w:r>
-            <w:r>
-              <w:rPr>
-                <w:rFonts w:ascii="Area Normal Extrabold" w:hAnsi="Area Normal Extrabold"/>
-              </w:rPr>
-              <w:t xml:space="preserve">alles</w:t>
-            </w:r>
-            <w:r>
-              <w:t xml:space="preserve"> aan wat je voor dit event nodig hebt, of druk op de letters.</w:t>
+              <w:t xml:space="preserve">Vink alles aan wat je voor het event nodig hebt.</w:t>
             </w:r>
           </w:p>
           <w:p>
@@ -1922,7 +1723,7 @@
               <w:tab/>
             </w:r>
             <w:r>
-              <w:t xml:space="preserve">Staat het er niet bij? Kies </w:t>
+              <w:t xml:space="preserve">Staat jouw keuze er niet bij? Kies dan </w:t>
             </w:r>
             <w:r>
               <w:rPr>
@@ -1931,28 +1732,7 @@
               <w:t xml:space="preserve">Anders, namelijk…</w:t>
             </w:r>
             <w:r>
-              <w:t xml:space="preserve"> en typ wat het is.</w:t>
-            </w:r>
-          </w:p>
-          <w:p>
-            <w:pPr>
-              <w:tabs>
-                <w:tab w:val="left" w:pos="425"/>
-              </w:tabs>
-              <w:spacing w:after="120"/>
-              <w:ind w:left="425" w:hanging="425"/>
-            </w:pPr>
-            <w:r>
-              <w:rPr>
-                <w:color w:val="E8590C"/>
-              </w:rPr>
-              <w:t>•</w:t>
-            </w:r>
-            <w:r>
-              <w:tab/>
-            </w:r>
-            <w:r>
-              <w:t xml:space="preserve">Een menukaart of menuscherm? Zie hoofdstuk 4.</w:t>
+              <w:t xml:space="preserve"> en beschrijf wat je nodig hebt.</w:t>
             </w:r>
           </w:p>
         </w:tc>
@@ -2075,10 +1855,10 @@
               <w:rPr>
                 <w:rFonts w:ascii="Area Normal Extrabold" w:hAnsi="Area Normal Extrabold"/>
               </w:rPr>
-              <w:t xml:space="preserve">Standaard designs</w:t>
-            </w:r>
-            <w:r>
-              <w:t xml:space="preserve">: onze vaste templates, ingevuld met de gegevens van het event. Dit kies je meestal.</w:t>
+              <w:t xml:space="preserve">Standaarddesigns</w:t>
+            </w:r>
+            <w:r>
+              <w:t xml:space="preserve"> zijn vaste templates die worden ingevuld met de gegevens van het event. Kies deze optie in de meeste gevallen.</w:t>
             </w:r>
           </w:p>
           <w:p>
@@ -2101,13 +1881,16 @@
               <w:tab/>
             </w:r>
             <w:r>
+              <w:t xml:space="preserve">Kies alleen voor </w:t>
+            </w:r>
+            <w:r>
               <w:rPr>
                 <w:rFonts w:ascii="Area Normal Extrabold" w:hAnsi="Area Normal Extrabold"/>
               </w:rPr>
               <w:t xml:space="preserve">Volledig custom</w:t>
             </w:r>
             <w:r>
-              <w:t xml:space="preserve">: alleen als de opdrachtgever om een eigen ontwerp vraagt of ervoor betaalt.</w:t>
+              <w:t xml:space="preserve"> als de opdrachtgever een eigen ontwerp wenst en hiervoor betaalt.</w:t>
             </w:r>
           </w:p>
         </w:tc>
@@ -2227,7 +2010,7 @@
               <w:tab/>
             </w:r>
             <w:r>
-              <w:t xml:space="preserve">Teksten, sfeer, formaten, en alles wat Marketing moet weten. Enter geeft hier een nieuwe regel.</w:t>
+              <w:t xml:space="preserve">Vermeld alle informatie die Marketing nodig heeft, zoals teksten, sfeer en gewenste formaten. Gebruik Enter om een nieuwe regel te beginnen.</w:t>
             </w:r>
           </w:p>
           <w:p>
@@ -2250,6 +2033,9 @@
               <w:tab/>
             </w:r>
             <w:r>
+              <w:t xml:space="preserve">Klik daarna op </w:t>
+            </w:r>
+            <w:r>
               <w:rPr>
                 <w:rFonts w:ascii="Area Normal Extrabold" w:hAnsi="Area Normal Extrabold"/>
               </w:rPr>
@@ -2277,7 +2063,7 @@
               <w:tab/>
             </w:r>
             <w:r>
-              <w:t xml:space="preserve">Moet een collega de mail krijgen als het design klaar is? Zet zijn of haar naam en mailadres hier.</w:t>
+              <w:t xml:space="preserve">Wil je dat een collega een e-mail ontvangt zodra het design klaar is? Vul dan hier de naam en het e-mailadres van deze collega in.</w:t>
             </w:r>
           </w:p>
         </w:tc>
@@ -2397,13 +2183,16 @@
               <w:tab/>
             </w:r>
             <w:r>
+              <w:t xml:space="preserve">Wil je een antwoord aanpassen? Klik op </w:t>
+            </w:r>
+            <w:r>
               <w:rPr>
                 <w:rFonts w:ascii="Area Normal Extrabold" w:hAnsi="Area Normal Extrabold"/>
               </w:rPr>
               <w:t xml:space="preserve">wijzig</w:t>
             </w:r>
             <w:r>
-              <w:t xml:space="preserve">: pas een antwoord aan. Daarna kom je terug op het overzicht.</w:t>
+              <w:t xml:space="preserve">. Je keert daarna terug naar het overzicht.</w:t>
             </w:r>
           </w:p>
           <w:p>
@@ -2426,13 +2215,16 @@
               <w:tab/>
             </w:r>
             <w:r>
+              <w:t xml:space="preserve">Klik op </w:t>
+            </w:r>
+            <w:r>
               <w:rPr>
                 <w:rFonts w:ascii="Area Normal Extrabold" w:hAnsi="Area Normal Extrabold"/>
               </w:rPr>
               <w:t xml:space="preserve">Verstuur aanvraag</w:t>
             </w:r>
             <w:r>
-              <w:t xml:space="preserve">.</w:t>
+              <w:t xml:space="preserve"> om je aanvraag definitief in te dienen.</w:t>
             </w:r>
           </w:p>
         </w:tc>
@@ -2552,7 +2344,7 @@
               <w:tab/>
             </w:r>
             <w:r>
-              <w:t xml:space="preserve">Je aanvraag staat bij Marketing.</w:t>
+              <w:t xml:space="preserve">Je aanvraag is nu ingediend bij Marketing.</w:t>
             </w:r>
           </w:p>
           <w:p>
@@ -2575,7 +2367,7 @@
               <w:tab/>
             </w:r>
             <w:r>
-              <w:t xml:space="preserve">De huisstijl wordt op de achtergrond opgehaald. Je hoeft niet te wachten; je kunt het venster sluiten.</w:t>
+              <w:t xml:space="preserve">De huisstijl wordt op de achtergrond opgehaald; je hoeft hier niet op te wachten en kunt het venster sluiten.</w:t>
             </w:r>
           </w:p>
           <w:p>
@@ -2596,7 +2388,7 @@
               <w:tab/>
             </w:r>
             <w:r>
-              <w:t xml:space="preserve">Was het krap, dan staat hier nog een keer dat je Marketing moet mailen.</w:t>
+              <w:t xml:space="preserve">Is het erg krap? Dan herinnert het formulier je eraan om contact op te nemen met Marketing.</w:t>
             </w:r>
           </w:p>
           <w:p>
@@ -2617,7 +2409,7 @@
               <w:tab/>
             </w:r>
             <w:r>
-              <w:t xml:space="preserve">Iets vergeten? Doe geen tweede aanvraag, maar gebruik </w:t>
+              <w:t xml:space="preserve">Iets vergeten of wil je iets aanpassen? Dien geen tweede aanvraag in, maar kies </w:t>
             </w:r>
             <w:r>
               <w:rPr>
@@ -2626,7 +2418,7 @@
               <w:t xml:space="preserve">Iets aanvullen of wijzigen</w:t>
             </w:r>
             <w:r>
-              <w:t xml:space="preserve"> (hoofdstuk 6).</w:t>
+              <w:t xml:space="preserve">.</w:t>
             </w:r>
           </w:p>
         </w:tc>
@@ -2637,13 +2429,220 @@
         <w:spacing w:after="0" w:line="200" w:lineRule="exact"/>
       </w:pPr>
     </w:p>
+    <w:tbl>
+      <w:tblPr>
+        <w:tblW w:w="0" w:type="auto"/>
+        <w:tblBorders>
+          <w:top w:val="nil"/>
+          <w:left w:val="nil"/>
+          <w:bottom w:val="nil"/>
+          <w:right w:val="nil"/>
+          <w:insideH w:val="nil"/>
+          <w:insideV w:val="nil"/>
+        </w:tblBorders>
+        <w:tblLayout w:type="fixed"/>
+      </w:tblPr>
+      <w:tblGrid>
+        <w:gridCol w:w="5500"/>
+        <w:gridCol w:w="3515"/>
+      </w:tblGrid>
+      <w:tr>
+        <w:trPr>
+          <w:cantSplit/>
+        </w:trPr>
+        <w:tc>
+          <w:tcPr>
+            <w:tcW w:w="5500" w:type="dxa"/>
+            <w:tcMar>
+              <w:top w:w="0" w:type="dxa"/>
+              <w:left w:w="0" w:type="dxa"/>
+              <w:bottom w:w="0" w:type="dxa"/>
+              <w:right w:w="0" w:type="dxa"/>
+            </w:tcMar>
+            <w:vAlign w:val="center"/>
+          </w:tcPr>
+          <w:p>
+            <w:pPr>
+              <w:spacing w:after="0"/>
+            </w:pPr>
+            <w:r>
+              <w:rPr>
+                <w:noProof/>
+              </w:rPr>
+              <w:drawing>
+                <wp:inline distT="0" distB="0" distL="0" distR="0">
+                  <wp:extent cx="3492500" cy="2579793"/>
+                  <wp:effectExtent l="0" t="0" r="0" b="0"/>
+                  <wp:docPr id="112" name="Afbeelding 112"/>
+                  <wp:cNvGraphicFramePr>
+                    <a:graphicFrameLocks xmlns:a="http://schemas.openxmlformats.org/drawingml/2006/main" noChangeAspect="1"/>
+                  </wp:cNvGraphicFramePr>
+                  <a:graphic xmlns:a="http://schemas.openxmlformats.org/drawingml/2006/main">
+                    <a:graphicData uri="http://schemas.openxmlformats.org/drawingml/2006/picture">
+                      <pic:pic xmlns:pic="http://schemas.openxmlformats.org/drawingml/2006/picture">
+                        <pic:nvPicPr>
+                          <pic:cNvPr id="0" name="g04-oranje.jpg"/>
+                          <pic:cNvPicPr/>
+                        </pic:nvPicPr>
+                        <pic:blipFill>
+                          <a:blip r:embed="rIdG12"/>
+                          <a:stretch>
+                            <a:fillRect/>
+                          </a:stretch>
+                        </pic:blipFill>
+                        <pic:spPr>
+                          <a:xfrm>
+                            <a:off x="0" y="0"/>
+                            <a:ext cx="3492500" cy="2579793"/>
+                          </a:xfrm>
+                          <a:prstGeom prst="rect">
+                            <a:avLst/>
+                          </a:prstGeom>
+                        </pic:spPr>
+                      </pic:pic>
+                    </a:graphicData>
+                  </a:graphic>
+                </wp:inline>
+              </w:drawing>
+            </w:r>
+          </w:p>
+        </w:tc>
+        <w:tc>
+          <w:tcPr>
+            <w:tcW w:w="3515" w:type="dxa"/>
+            <w:tcMar>
+              <w:top w:w="120" w:type="dxa"/>
+              <w:left w:w="240" w:type="dxa"/>
+              <w:bottom w:w="0" w:type="dxa"/>
+              <w:right w:w="0" w:type="dxa"/>
+            </w:tcMar>
+            <w:vAlign w:val="center"/>
+          </w:tcPr>
+          <w:p>
+            <w:pPr>
+              <w:tabs>
+                <w:tab w:val="left" w:pos="425"/>
+              </w:tabs>
+              <w:spacing w:after="120"/>
+              <w:ind w:left="425" w:hanging="425"/>
+            </w:pPr>
+            <w:r>
+              <w:rPr>
+                <w:color w:val="E8590C"/>
+              </w:rPr>
+              <w:t>•</w:t>
+            </w:r>
+            <w:r>
+              <w:tab/>
+            </w:r>
+            <w:r>
+              <w:t xml:space="preserve">Valt de eventdatum of deadline binnen </w:t>
+            </w:r>
+            <w:r>
+              <w:rPr>
+                <w:rFonts w:ascii="Area Normal Extrabold" w:hAnsi="Area Normal Extrabold"/>
+              </w:rPr>
+              <w:t xml:space="preserve">3 werkdagen</w:t>
+            </w:r>
+            <w:r>
+              <w:t xml:space="preserve">? Dan verschijnt er een </w:t>
+            </w:r>
+            <w:r>
+              <w:rPr>
+                <w:rFonts w:ascii="Area Normal Extrabold" w:hAnsi="Area Normal Extrabold"/>
+              </w:rPr>
+              <w:t xml:space="preserve">rode melding</w:t>
+            </w:r>
+            <w:r>
+              <w:t xml:space="preserve">. Vul het formulier verder in. Het marketingteam beoordeelt vervolgens wat er binnen de korte deadline haalbaar is.</w:t>
+            </w:r>
+          </w:p>
+          <w:p>
+            <w:pPr>
+              <w:tabs>
+                <w:tab w:val="left" w:pos="425"/>
+              </w:tabs>
+              <w:spacing w:after="120"/>
+              <w:ind w:left="425" w:hanging="425"/>
+            </w:pPr>
+            <w:r>
+              <w:rPr>
+                <w:rFonts w:ascii="Area Normal Extrabold" w:hAnsi="Area Normal Extrabold"/>
+                <w:color w:val="E8590C"/>
+                <w:sz w:val="22"/>
+              </w:rPr>
+              <w:t>1</w:t>
+            </w:r>
+            <w:r>
+              <w:tab/>
+            </w:r>
+            <w:r>
+              <w:t xml:space="preserve">Valt het event binnen </w:t>
+            </w:r>
+            <w:r>
+              <w:rPr>
+                <w:rFonts w:ascii="Area Normal Extrabold" w:hAnsi="Area Normal Extrabold"/>
+              </w:rPr>
+              <w:t xml:space="preserve">twee weken</w:t>
+            </w:r>
+            <w:r>
+              <w:t xml:space="preserve">? Dan verschijnt er een </w:t>
+            </w:r>
+            <w:r>
+              <w:rPr>
+                <w:rFonts w:ascii="Area Normal Extrabold" w:hAnsi="Area Normal Extrabold"/>
+              </w:rPr>
+              <w:t xml:space="preserve">oranje melding</w:t>
+            </w:r>
+            <w:r>
+              <w:t xml:space="preserve">. Drukwerk, zoals geprinte menukaarten, vlaggen, banners en roll-ups, is waarschijnlijk niet meer op tijd klaar.</w:t>
+            </w:r>
+          </w:p>
+          <w:p>
+            <w:pPr>
+              <w:tabs>
+                <w:tab w:val="left" w:pos="425"/>
+              </w:tabs>
+              <w:spacing w:after="120"/>
+              <w:ind w:left="425" w:hanging="425"/>
+            </w:pPr>
+            <w:r>
+              <w:rPr>
+                <w:color w:val="E8590C"/>
+              </w:rPr>
+              <w:t>•</w:t>
+            </w:r>
+            <w:r>
+              <w:tab/>
+            </w:r>
+            <w:r>
+              <w:t xml:space="preserve">Valt de deadline binnen </w:t>
+            </w:r>
+            <w:r>
+              <w:rPr>
+                <w:rFonts w:ascii="Area Normal Extrabold" w:hAnsi="Area Normal Extrabold"/>
+              </w:rPr>
+              <w:t xml:space="preserve">5 werkdagen</w:t>
+            </w:r>
+            <w:r>
+              <w:t xml:space="preserve">? Dan verschijnt er ook een melding. Je kunt de aanvraag verder invullen, maar stem de planning eerst even af met Marketing.</w:t>
+            </w:r>
+          </w:p>
+        </w:tc>
+      </w:tr>
+    </w:tbl>
+    <w:p>
+      <w:pPr>
+        <w:spacing w:after="0" w:line="200" w:lineRule="exact"/>
+      </w:pPr>
+    </w:p>
     <w:p>
       <w:pPr>
         <w:pStyle w:val="Kop1"/>
         <w:pageBreakBefore/>
       </w:pPr>
       <w:r>
-        <w:t xml:space="preserve">3  Interne aanvraag</w:t>
+        <w:t xml:space="preserve">3  Een interne aanvraag</w:t>
       </w:r>
     </w:p>
     <w:p>
@@ -2651,7 +2650,7 @@
         <w:keepNext/>
       </w:pPr>
       <w:r>
-        <w:t xml:space="preserve">Voor iets zonder event, zoals visitekaartjes of een poster voor de kantine. Locatie en naam gaan zoals in hoofdstuk 2. Kies daarna </w:t>
+        <w:t xml:space="preserve">Gebruik deze optie voor aanvragen die niet aan een event gekoppeld zijn, zoals visitekaartjes of een poster voor de kantine. Selecteer de locatie en vul je naam in, zoals eerder beschreven. Kies vervolgens </w:t>
       </w:r>
       <w:r>
         <w:rPr>
@@ -2660,7 +2659,7 @@
         <w:t xml:space="preserve">Intern</w:t>
       </w:r>
       <w:r>
-        <w:t xml:space="preserve">; dan zijn het nog maar twee vragen.</w:t>
+        <w:t xml:space="preserve">. Je hoeft dan nog maar twee vragen te beantwoorden.</w:t>
       </w:r>
     </w:p>
     <w:tbl>
@@ -2707,7 +2706,7 @@
                 <wp:inline distT="0" distB="0" distL="0" distR="0">
                   <wp:extent cx="3492500" cy="2316691"/>
                   <wp:effectExtent l="0" t="0" r="0" b="0"/>
-                  <wp:docPr id="112" name="Afbeelding 112"/>
+                  <wp:docPr id="113" name="Afbeelding 113"/>
                   <wp:cNvGraphicFramePr>
                     <a:graphicFrameLocks xmlns:a="http://schemas.openxmlformats.org/drawingml/2006/main" noChangeAspect="1"/>
                   </wp:cNvGraphicFramePr>
@@ -2719,7 +2718,7 @@
                           <pic:cNvPicPr/>
                         </pic:nvPicPr>
                         <pic:blipFill>
-                          <a:blip r:embed="rIdG12"/>
+                          <a:blip r:embed="rIdG13"/>
                           <a:stretch>
                             <a:fillRect/>
                           </a:stretch>
@@ -2772,7 +2771,7 @@
               <w:tab/>
             </w:r>
             <w:r>
-              <w:t xml:space="preserve">Beschrijf alles in één keer: wat het is, formaat, teksten en voor wie.</w:t>
+              <w:t xml:space="preserve">Beschrijf je aanvraag volledig in één keer. Vermeld wat je nodig hebt, het gewenste formaat, de teksten en voor wie het bedoeld is.</w:t>
             </w:r>
           </w:p>
         </w:tc>
@@ -2827,7 +2826,7 @@
                 <wp:inline distT="0" distB="0" distL="0" distR="0">
                   <wp:extent cx="3492500" cy="2684568"/>
                   <wp:effectExtent l="0" t="0" r="0" b="0"/>
-                  <wp:docPr id="113" name="Afbeelding 113"/>
+                  <wp:docPr id="114" name="Afbeelding 114"/>
                   <wp:cNvGraphicFramePr>
                     <a:graphicFrameLocks xmlns:a="http://schemas.openxmlformats.org/drawingml/2006/main" noChangeAspect="1"/>
                   </wp:cNvGraphicFramePr>
@@ -2839,7 +2838,7 @@
                           <pic:cNvPicPr/>
                         </pic:nvPicPr>
                         <pic:blipFill>
-                          <a:blip r:embed="rIdG13"/>
+                          <a:blip r:embed="rIdG14"/>
                           <a:stretch>
                             <a:fillRect/>
                           </a:stretch>
@@ -2892,7 +2891,7 @@
               <w:tab/>
             </w:r>
             <w:r>
-              <w:t xml:space="preserve">Kies de dag waarop je het nodig hebt…</w:t>
+              <w:t xml:space="preserve">Geef aan wanneer je het nodig hebt.</w:t>
             </w:r>
           </w:p>
           <w:p>
@@ -2915,7 +2914,7 @@
               <w:tab/>
             </w:r>
             <w:r>
-              <w:t xml:space="preserve">…of </w:t>
+              <w:t xml:space="preserve">Is er geen haast bij? Kies dan </w:t>
             </w:r>
             <w:r>
               <w:rPr>
@@ -2924,7 +2923,7 @@
               <w:t xml:space="preserve">Geen deadline</w:t>
             </w:r>
             <w:r>
-              <w:t xml:space="preserve"> als het geen haast heeft. Het mag dan klaar zijn wanneer het past.</w:t>
+              <w:t xml:space="preserve">. Marketing plant de aanvraag dan in op een geschikt moment.</w:t>
             </w:r>
           </w:p>
           <w:p>
@@ -2945,7 +2944,16 @@
               <w:tab/>
             </w:r>
             <w:r>
-              <w:t xml:space="preserve">Komt er later toch een datum? Die geef je door met Iets aanvullen of wijzigen.</w:t>
+              <w:t xml:space="preserve">Ontstaat er later alsnog een deadline? Geef dit dan door via </w:t>
+            </w:r>
+            <w:r>
+              <w:rPr>
+                <w:rFonts w:ascii="Area Normal Extrabold" w:hAnsi="Area Normal Extrabold"/>
+              </w:rPr>
+              <w:t xml:space="preserve">Iets aanvullen of wijzigen</w:t>
+            </w:r>
+            <w:r>
+              <w:t xml:space="preserve">.</w:t>
             </w:r>
           </w:p>
         </w:tc>
@@ -2962,7 +2970,7 @@
         <w:pageBreakBefore/>
       </w:pPr>
       <w:r>
-        <w:t xml:space="preserve">4  Menukaart of menuscherm</w:t>
+        <w:t xml:space="preserve">4  Een menukaart of menuscherm</w:t>
       </w:r>
     </w:p>
     <w:p>
@@ -2970,7 +2978,7 @@
         <w:keepNext/>
       </w:pPr>
       <w:r>
-        <w:t xml:space="preserve">Vink je bij </w:t>
+        <w:t xml:space="preserve">Selecteer bij </w:t>
       </w:r>
       <w:r>
         <w:rPr>
@@ -2979,7 +2987,7 @@
         <w:t xml:space="preserve">Wat wil je aanvragen?</w:t>
       </w:r>
       <w:r>
-        <w:t xml:space="preserve"> </w:t>
+        <w:t xml:space="preserve"> de optie </w:t>
       </w:r>
       <w:r>
         <w:rPr>
@@ -2988,7 +2996,7 @@
         <w:t xml:space="preserve">Menukaart print</w:t>
       </w:r>
       <w:r>
-        <w:t xml:space="preserve"> of </w:t>
+        <w:t xml:space="preserve">, </w:t>
       </w:r>
       <w:r>
         <w:rPr>
@@ -2997,7 +3005,7 @@
         <w:t xml:space="preserve">Menu scherm</w:t>
       </w:r>
       <w:r>
-        <w:t xml:space="preserve"> aan (of allebei), dan komt er één vraag bij: welk menu het is.</w:t>
+        <w:t xml:space="preserve"> of beide. Er verschijnt vervolgens een extra vraag: om welk menu gaat het?</w:t>
       </w:r>
     </w:p>
     <w:tbl>
@@ -3044,7 +3052,7 @@
                 <wp:inline distT="0" distB="0" distL="0" distR="0">
                   <wp:extent cx="3492500" cy="2316691"/>
                   <wp:effectExtent l="0" t="0" r="0" b="0"/>
-                  <wp:docPr id="114" name="Afbeelding 114"/>
+                  <wp:docPr id="115" name="Afbeelding 115"/>
                   <wp:cNvGraphicFramePr>
                     <a:graphicFrameLocks xmlns:a="http://schemas.openxmlformats.org/drawingml/2006/main" noChangeAspect="1"/>
                   </wp:cNvGraphicFramePr>
@@ -3056,7 +3064,7 @@
                           <pic:cNvPicPr/>
                         </pic:nvPicPr>
                         <pic:blipFill>
-                          <a:blip r:embed="rIdG14"/>
+                          <a:blip r:embed="rIdG15"/>
                           <a:stretch>
                             <a:fillRect/>
                           </a:stretch>
@@ -3109,7 +3117,7 @@
               <w:tab/>
             </w:r>
             <w:r>
-              <w:t xml:space="preserve">Kies het </w:t>
+              <w:t xml:space="preserve">Kies het gewenste </w:t>
             </w:r>
             <w:r>
               <w:rPr>
@@ -3118,7 +3126,7 @@
               <w:t xml:space="preserve">pakket</w:t>
             </w:r>
             <w:r>
-              <w:t xml:space="preserve">. Onder de naam zie je welke gangen erin zitten.</w:t>
+              <w:t xml:space="preserve">. Onder de pakketnaam zie je welke gangen zijn inbegrepen.</w:t>
             </w:r>
           </w:p>
         </w:tc>
@@ -3173,7 +3181,7 @@
                 <wp:inline distT="0" distB="0" distL="0" distR="0">
                   <wp:extent cx="3492500" cy="2316691"/>
                   <wp:effectExtent l="0" t="0" r="0" b="0"/>
-                  <wp:docPr id="115" name="Afbeelding 115"/>
+                  <wp:docPr id="116" name="Afbeelding 116"/>
                   <wp:cNvGraphicFramePr>
                     <a:graphicFrameLocks xmlns:a="http://schemas.openxmlformats.org/drawingml/2006/main" noChangeAspect="1"/>
                   </wp:cNvGraphicFramePr>
@@ -3185,7 +3193,7 @@
                           <pic:cNvPicPr/>
                         </pic:nvPicPr>
                         <pic:blipFill>
-                          <a:blip r:embed="rIdG15"/>
+                          <a:blip r:embed="rIdG16"/>
                           <a:stretch>
                             <a:fillRect/>
                           </a:stretch>
@@ -3244,7 +3252,7 @@
               <w:t xml:space="preserve">Wissel</w:t>
             </w:r>
             <w:r>
-              <w:t xml:space="preserve">: kies een ander gerecht.</w:t>
+              <w:t xml:space="preserve">: vervang een gerecht door een ander gerecht.</w:t>
             </w:r>
           </w:p>
           <w:p>
@@ -3273,7 +3281,7 @@
               <w:t xml:space="preserve">×</w:t>
             </w:r>
             <w:r>
-              <w:t xml:space="preserve">: haal een gerecht weg.</w:t>
+              <w:t xml:space="preserve">: verwijder een gerecht.</w:t>
             </w:r>
           </w:p>
           <w:p>
@@ -3302,7 +3310,7 @@
               <w:t xml:space="preserve">+ Gerecht toevoegen</w:t>
             </w:r>
             <w:r>
-              <w:t xml:space="preserve">.</w:t>
+              <w:t xml:space="preserve">: voeg een extra gerecht toe.</w:t>
             </w:r>
           </w:p>
           <w:p>
@@ -3331,7 +3339,7 @@
               <w:t xml:space="preserve">Pakket wijzigen</w:t>
             </w:r>
             <w:r>
-              <w:t xml:space="preserve">: opnieuw kiezen.</w:t>
+              <w:t xml:space="preserve">: kies een ander pakket.</w:t>
             </w:r>
           </w:p>
           <w:p>
@@ -3352,7 +3360,7 @@
               <w:tab/>
             </w:r>
             <w:r>
-              <w:t xml:space="preserve">Kies gerechten uit de lijst. Typ je zelf een gerecht, dan krijg je een melding en kijkt Marketing ernaar.</w:t>
+              <w:t xml:space="preserve">Selecteer de gerechten uit de lijst. Voer je zelf een gerecht in? Dan verschijnt er een melding en beoordeelt Marketing de invoer.</w:t>
             </w:r>
           </w:p>
           <w:p>
@@ -3373,7 +3381,7 @@
               <w:tab/>
             </w:r>
             <w:r>
-              <w:t xml:space="preserve">Verandert het menu later nog? Dat doe je met </w:t>
+              <w:t xml:space="preserve">Menu later aanpassen? Kies dan </w:t>
             </w:r>
             <w:r>
               <w:rPr>
@@ -3382,7 +3390,16 @@
               <w:t xml:space="preserve">Menu aanpassen</w:t>
             </w:r>
             <w:r>
-              <w:t xml:space="preserve"> (hoofdstuk 6).</w:t>
+              <w:t xml:space="preserve"> via </w:t>
+            </w:r>
+            <w:r>
+              <w:rPr>
+                <w:rFonts w:ascii="Area Normal Extrabold" w:hAnsi="Area Normal Extrabold"/>
+              </w:rPr>
+              <w:t xml:space="preserve">Iets aanvullen of wijzigen</w:t>
+            </w:r>
+            <w:r>
+              <w:t xml:space="preserve">.</w:t>
             </w:r>
           </w:p>
         </w:tc>
@@ -3407,7 +3424,7 @@
         <w:keepNext/>
       </w:pPr>
       <w:r>
-        <w:t xml:space="preserve">Is het design klaar, dan krijg je een mail van </w:t>
+        <w:t xml:space="preserve">Zodra je design klaar is, ontvang je een e-mail van </w:t>
       </w:r>
       <w:r>
         <w:rPr>
@@ -3463,7 +3480,7 @@
                 <wp:inline distT="0" distB="0" distL="0" distR="0">
                   <wp:extent cx="2730500" cy="3033337"/>
                   <wp:effectExtent l="0" t="0" r="0" b="0"/>
-                  <wp:docPr id="116" name="Afbeelding 116"/>
+                  <wp:docPr id="117" name="Afbeelding 117"/>
                   <wp:cNvGraphicFramePr>
                     <a:graphicFrameLocks xmlns:a="http://schemas.openxmlformats.org/drawingml/2006/main" noChangeAspect="1"/>
                   </wp:cNvGraphicFramePr>
@@ -3475,7 +3492,7 @@
                           <pic:cNvPicPr/>
                         </pic:nvPicPr>
                         <pic:blipFill>
-                          <a:blip r:embed="rIdG16"/>
+                          <a:blip r:embed="rIdG17"/>
                           <a:stretch>
                             <a:fillRect/>
                           </a:stretch>
@@ -3528,7 +3545,7 @@
               <w:tab/>
             </w:r>
             <w:r>
-              <w:t xml:space="preserve">Het onderwerp begint met </w:t>
+              <w:t xml:space="preserve">Herken de juiste e-mail aan het onderwerp. Dit begint met </w:t>
             </w:r>
             <w:r>
               <w:rPr>
@@ -3537,7 +3554,7 @@
               <w:t xml:space="preserve">Klaar</w:t>
             </w:r>
             <w:r>
-              <w:t xml:space="preserve">, met het event en wat je hebt aangevraagd. Een volgende versie heet </w:t>
+              <w:t xml:space="preserve">, gevolgd door de naam van het event en wat je hebt aangevraagd. Bij een nieuwe versie staat er bijvoorbeeld </w:t>
             </w:r>
             <w:r>
               <w:rPr>
@@ -3569,16 +3586,7 @@
               <w:tab/>
             </w:r>
             <w:r>
-              <w:t xml:space="preserve">De </w:t>
-            </w:r>
-            <w:r>
-              <w:rPr>
-                <w:rFonts w:ascii="Area Normal Extrabold" w:hAnsi="Area Normal Extrabold"/>
-              </w:rPr>
-              <w:t xml:space="preserve">bestanden</w:t>
-            </w:r>
-            <w:r>
-              <w:t xml:space="preserve"> zitten als bijlage bij de mail. Grote drukbestanden staan op de schijf; Marketing zet in de mail waar.</w:t>
+              <w:t xml:space="preserve">Download je bestanden uit de e-mail. De bestanden zijn als bijlage toegevoegd. Grote drukbestanden staan op de schijf. Marketing vermeldt in de e-mail waar je deze kunt vinden.</w:t>
             </w:r>
           </w:p>
           <w:p>
@@ -3601,34 +3609,16 @@
               <w:tab/>
             </w:r>
             <w:r>
+              <w:t xml:space="preserve">Wil je iets aanpassen? Klik dan op </w:t>
+            </w:r>
+            <w:r>
               <w:rPr>
                 <w:rFonts w:ascii="Area Normal Extrabold" w:hAnsi="Area Normal Extrabold"/>
               </w:rPr>
               <w:t xml:space="preserve">Feedback geven</w:t>
             </w:r>
             <w:r>
-              <w:t xml:space="preserve">: iets aan te passen? Klik hierop.</w:t>
-            </w:r>
-          </w:p>
-          <w:p>
-            <w:pPr>
-              <w:tabs>
-                <w:tab w:val="left" w:pos="425"/>
-              </w:tabs>
-              <w:spacing w:after="120"/>
-              <w:ind w:left="425" w:hanging="425"/>
-            </w:pPr>
-            <w:r>
-              <w:rPr>
-                <w:color w:val="E8590C"/>
-              </w:rPr>
-              <w:t>•</w:t>
-            </w:r>
-            <w:r>
-              <w:tab/>
-            </w:r>
-            <w:r>
-              <w:t xml:space="preserve">Antwoord niet op de mail, maar gebruik de knop. Dan komt je feedback meteen bij de juiste aanvraag.</w:t>
+              <w:t xml:space="preserve"> in de e-mail. Beantwoord de e-mail niet rechtstreeks, maar gebruik altijd deze knop. Zo wordt je feedback automatisch aan de juiste aanvraag gekoppeld.</w:t>
             </w:r>
           </w:p>
         </w:tc>
@@ -3683,7 +3673,7 @@
                 <wp:inline distT="0" distB="0" distL="0" distR="0">
                   <wp:extent cx="3492500" cy="2316691"/>
                   <wp:effectExtent l="0" t="0" r="0" b="0"/>
-                  <wp:docPr id="117" name="Afbeelding 117"/>
+                  <wp:docPr id="118" name="Afbeelding 118"/>
                   <wp:cNvGraphicFramePr>
                     <a:graphicFrameLocks xmlns:a="http://schemas.openxmlformats.org/drawingml/2006/main" noChangeAspect="1"/>
                   </wp:cNvGraphicFramePr>
@@ -3695,7 +3685,7 @@
                           <pic:cNvPicPr/>
                         </pic:nvPicPr>
                         <pic:blipFill>
-                          <a:blip r:embed="rIdG17"/>
+                          <a:blip r:embed="rIdG18"/>
                           <a:stretch>
                             <a:fillRect/>
                           </a:stretch>
@@ -3748,7 +3738,7 @@
               <w:tab/>
             </w:r>
             <w:r>
-              <w:t xml:space="preserve">Het formulier opent met je aanvraag al gekozen. Zoeken hoeft niet.</w:t>
+              <w:t xml:space="preserve">Je aanvraag is al geselecteerd wanneer het formulier opent. Je hoeft dus niet opnieuw te zoeken.</w:t>
             </w:r>
           </w:p>
           <w:p>
@@ -3771,16 +3761,16 @@
               <w:tab/>
             </w:r>
             <w:r>
-              <w:t xml:space="preserve">Kies je </w:t>
-            </w:r>
-            <w:r>
-              <w:rPr>
-                <w:rFonts w:ascii="Area Normal Extrabold" w:hAnsi="Area Normal Extrabold"/>
-              </w:rPr>
-              <w:t xml:space="preserve">naam</w:t>
-            </w:r>
-            <w:r>
-              <w:t xml:space="preserve"> en klik op Volgende.</w:t>
+              <w:t xml:space="preserve">Selecteer je naam en klik op </w:t>
+            </w:r>
+            <w:r>
+              <w:rPr>
+                <w:rFonts w:ascii="Area Normal Extrabold" w:hAnsi="Area Normal Extrabold"/>
+              </w:rPr>
+              <w:t xml:space="preserve">Volgende</w:t>
+            </w:r>
+            <w:r>
+              <w:t xml:space="preserve">.</w:t>
             </w:r>
           </w:p>
           <w:p>
@@ -3801,7 +3791,7 @@
               <w:tab/>
             </w:r>
             <w:r>
-              <w:t xml:space="preserve">Daarna typ je je feedback, met eventueel bestanden, een nieuwe deadline of een ander menu. Dat werkt zoals in hoofdstuk 6.</w:t>
+              <w:t xml:space="preserve">Geef je feedback zo volledig mogelijk door en voeg indien nodig bestanden toe. Je kunt ook een nieuwe deadline doorgeven of een ander menu kiezen. Dit werkt op dezelfde manier als eerder beschreven.</w:t>
             </w:r>
           </w:p>
           <w:p>
@@ -3822,7 +3812,7 @@
               <w:tab/>
             </w:r>
             <w:r>
-              <w:t xml:space="preserve">Is je feedback verwerkt, dan krijg je weer een mail: </w:t>
+              <w:t xml:space="preserve">Zodra je feedback is verwerkt, ontvang je opnieuw een e-mail. Hierin vind je de aangepaste versie, bijvoorbeeld met het onderwerp </w:t>
             </w:r>
             <w:r>
               <w:rPr>
@@ -3856,7 +3846,7 @@
         <w:keepNext/>
       </w:pPr>
       <w:r>
-        <w:t xml:space="preserve">Iets vergeten, komt er een design bij, of is een datum verschoven? Dat hoort bij je bestaande aanvraag. Klik op het startscherm op </w:t>
+        <w:t xml:space="preserve">Iets vergeten, een extra design nodig of is de datum gewijzigd? Pas dan je bestaande aanvraag aan. Klik op het startscherm op </w:t>
       </w:r>
       <w:r>
         <w:rPr>
@@ -3865,7 +3855,7 @@
         <w:t xml:space="preserve">Iets aanvullen of wijzigen</w:t>
       </w:r>
       <w:r>
-        <w:t xml:space="preserve"> en kies </w:t>
+        <w:t xml:space="preserve"> en kies voor </w:t>
       </w:r>
       <w:r>
         <w:rPr>
@@ -3930,7 +3920,7 @@
                 <wp:inline distT="0" distB="0" distL="0" distR="0">
                   <wp:extent cx="3492500" cy="2316691"/>
                   <wp:effectExtent l="0" t="0" r="0" b="0"/>
-                  <wp:docPr id="118" name="Afbeelding 118"/>
+                  <wp:docPr id="119" name="Afbeelding 119"/>
                   <wp:cNvGraphicFramePr>
                     <a:graphicFrameLocks xmlns:a="http://schemas.openxmlformats.org/drawingml/2006/main" noChangeAspect="1"/>
                   </wp:cNvGraphicFramePr>
@@ -3942,7 +3932,7 @@
                           <pic:cNvPicPr/>
                         </pic:nvPicPr>
                         <pic:blipFill>
-                          <a:blip r:embed="rIdG18"/>
+                          <a:blip r:embed="rIdG19"/>
                           <a:stretch>
                             <a:fillRect/>
                           </a:stretch>
@@ -3995,16 +3985,7 @@
               <w:tab/>
             </w:r>
             <w:r>
-              <w:t xml:space="preserve">Typ minstens 3 letters van de </w:t>
-            </w:r>
-            <w:r>
-              <w:rPr>
-                <w:rFonts w:ascii="Area Normal Extrabold" w:hAnsi="Area Normal Extrabold"/>
-              </w:rPr>
-              <w:t xml:space="preserve">eventnaam</w:t>
-            </w:r>
-            <w:r>
-              <w:t xml:space="preserve">.</w:t>
+              <w:t xml:space="preserve">Zoek de juiste aanvraag. Typ minimaal drie letters van de eventnaam…</w:t>
             </w:r>
           </w:p>
           <w:p>
@@ -4027,7 +4008,7 @@
               <w:tab/>
             </w:r>
             <w:r>
-              <w:t xml:space="preserve">Klik de aanvraag aan.</w:t>
+              <w:t xml:space="preserve">…en selecteer de juiste aanvraag. Je ziet aanvragen van de afgelopen vier maanden, ook die van collega’s.</w:t>
             </w:r>
           </w:p>
           <w:p>
@@ -4048,7 +4029,7 @@
               <w:tab/>
             </w:r>
             <w:r>
-              <w:t xml:space="preserve">Je ziet de aanvragen van de afgelopen 4 maanden, ook die van collega’s.</w:t>
+              <w:t xml:space="preserve">Vul daarna je naam in, zodat Marketing weet wie de wijziging doorgeeft.</w:t>
             </w:r>
           </w:p>
           <w:p>
@@ -4069,28 +4050,7 @@
               <w:tab/>
             </w:r>
             <w:r>
-              <w:t xml:space="preserve">Intern? Dan vul je je naam in en kies je uit je eigen aanvragen.</w:t>
-            </w:r>
-          </w:p>
-          <w:p>
-            <w:pPr>
-              <w:tabs>
-                <w:tab w:val="left" w:pos="425"/>
-              </w:tabs>
-              <w:spacing w:after="120"/>
-              <w:ind w:left="425" w:hanging="425"/>
-            </w:pPr>
-            <w:r>
-              <w:rPr>
-                <w:color w:val="E8590C"/>
-              </w:rPr>
-              <w:t>•</w:t>
-            </w:r>
-            <w:r>
-              <w:tab/>
-            </w:r>
-            <w:r>
-              <w:t xml:space="preserve">Daarna vul je je naam in, zodat Marketing weet van wie het komt.</w:t>
+              <w:t xml:space="preserve">Bij een interne aanvraag vul je eerst je naam in en selecteer je de gewenste aanvraag uit je eigen aanvragen.</w:t>
             </w:r>
           </w:p>
         </w:tc>
@@ -4145,7 +4105,7 @@
                 <wp:inline distT="0" distB="0" distL="0" distR="0">
                   <wp:extent cx="3492500" cy="2316691"/>
                   <wp:effectExtent l="0" t="0" r="0" b="0"/>
-                  <wp:docPr id="119" name="Afbeelding 119"/>
+                  <wp:docPr id="120" name="Afbeelding 120"/>
                   <wp:cNvGraphicFramePr>
                     <a:graphicFrameLocks xmlns:a="http://schemas.openxmlformats.org/drawingml/2006/main" noChangeAspect="1"/>
                   </wp:cNvGraphicFramePr>
@@ -4157,7 +4117,7 @@
                           <pic:cNvPicPr/>
                         </pic:nvPicPr>
                         <pic:blipFill>
-                          <a:blip r:embed="rIdG19"/>
+                          <a:blip r:embed="rIdG20"/>
                           <a:stretch>
                             <a:fillRect/>
                           </a:stretch>
@@ -4210,7 +4170,7 @@
               <w:tab/>
             </w:r>
             <w:r>
-              <w:t xml:space="preserve">Wat moet erbij of anders. Marketing krijgt er meteen bericht van.</w:t>
+              <w:t xml:space="preserve">Beschrijf wat je wilt aanvullen of wijzigen. Geef duidelijk aan wat erbij moet of wat er anders moet. Marketing ontvangt direct bericht van je wijziging.</w:t>
             </w:r>
           </w:p>
           <w:p>
@@ -4233,7 +4193,7 @@
               <w:tab/>
             </w:r>
             <w:r>
-              <w:t xml:space="preserve">Bestanden meesturen.</w:t>
+              <w:t xml:space="preserve">Je kunt ook bestanden toevoegen.</w:t>
             </w:r>
           </w:p>
           <w:p>
@@ -4262,7 +4222,7 @@
               <w:t xml:space="preserve">Menu aanpassen</w:t>
             </w:r>
             <w:r>
-              <w:t xml:space="preserve">: alleen bij een menukaart of menuscherm. Je krijgt hetzelfde menuscherm als in hoofdstuk 4, met het menu dat er nu staat.</w:t>
+              <w:t xml:space="preserve"> is alleen beschikbaar bij aanvragen voor een menukaart of menuscherm. Je krijgt dan hetzelfde menuoverzicht als in hoofdstuk 4, met het huidige menu al ingevuld. Pas aan wat nodig is.</w:t>
             </w:r>
           </w:p>
         </w:tc>
@@ -4317,7 +4277,7 @@
                 <wp:inline distT="0" distB="0" distL="0" distR="0">
                   <wp:extent cx="3492500" cy="2579793"/>
                   <wp:effectExtent l="0" t="0" r="0" b="0"/>
-                  <wp:docPr id="120" name="Afbeelding 120"/>
+                  <wp:docPr id="121" name="Afbeelding 121"/>
                   <wp:cNvGraphicFramePr>
                     <a:graphicFrameLocks xmlns:a="http://schemas.openxmlformats.org/drawingml/2006/main" noChangeAspect="1"/>
                   </wp:cNvGraphicFramePr>
@@ -4329,7 +4289,7 @@
                           <pic:cNvPicPr/>
                         </pic:nvPicPr>
                         <pic:blipFill>
-                          <a:blip r:embed="rIdG20"/>
+                          <a:blip r:embed="rIdG21"/>
                           <a:stretch>
                             <a:fillRect/>
                           </a:stretch>
@@ -4382,7 +4342,7 @@
               <w:tab/>
             </w:r>
             <w:r>
-              <w:t xml:space="preserve">Is de eventdatum of deadline verschoven? Klik op </w:t>
+              <w:t xml:space="preserve">Is de eventdatum of deadline gewijzigd? Klik dan op </w:t>
             </w:r>
             <w:r>
               <w:rPr>
@@ -4391,60 +4351,7 @@
               <w:t xml:space="preserve">wijzigen</w:t>
             </w:r>
             <w:r>
-              <w:t xml:space="preserve">.</w:t>
-            </w:r>
-          </w:p>
-          <w:p>
-            <w:pPr>
-              <w:tabs>
-                <w:tab w:val="left" w:pos="425"/>
-              </w:tabs>
-              <w:spacing w:after="120"/>
-              <w:ind w:left="425" w:hanging="425"/>
-            </w:pPr>
-            <w:r>
-              <w:rPr>
-                <w:rFonts w:ascii="Area Normal Extrabold" w:hAnsi="Area Normal Extrabold"/>
-                <w:color w:val="E8590C"/>
-                <w:sz w:val="22"/>
-              </w:rPr>
-              <w:t>2</w:t>
-            </w:r>
-            <w:r>
-              <w:tab/>
-            </w:r>
-            <w:r>
-              <w:t xml:space="preserve">Een map op de schijf of een WeTransfer-link.</w:t>
-            </w:r>
-          </w:p>
-          <w:p>
-            <w:pPr>
-              <w:tabs>
-                <w:tab w:val="left" w:pos="425"/>
-              </w:tabs>
-              <w:spacing w:after="120"/>
-              <w:ind w:left="425" w:hanging="425"/>
-            </w:pPr>
-            <w:r>
-              <w:rPr>
-                <w:color w:val="E8590C"/>
-              </w:rPr>
-              <w:t>•</w:t>
-            </w:r>
-            <w:r>
-              <w:tab/>
-            </w:r>
-            <w:r>
-              <w:t xml:space="preserve">Alles op dit scherm mag leeg blijven. Klik op </w:t>
-            </w:r>
-            <w:r>
-              <w:rPr>
-                <w:rFonts w:ascii="Area Normal Extrabold" w:hAnsi="Area Normal Extrabold"/>
-              </w:rPr>
-              <w:t xml:space="preserve">Versturen</w:t>
-            </w:r>
-            <w:r>
-              <w:t xml:space="preserve">.</w:t>
+              <w:t xml:space="preserve"> bij de datum en voer de nieuwe datum in.</w:t>
             </w:r>
           </w:p>
         </w:tc>
@@ -4499,7 +4406,7 @@
                 <wp:inline distT="0" distB="0" distL="0" distR="0">
                   <wp:extent cx="3492500" cy="2684568"/>
                   <wp:effectExtent l="0" t="0" r="0" b="0"/>
-                  <wp:docPr id="121" name="Afbeelding 121"/>
+                  <wp:docPr id="122" name="Afbeelding 122"/>
                   <wp:cNvGraphicFramePr>
                     <a:graphicFrameLocks xmlns:a="http://schemas.openxmlformats.org/drawingml/2006/main" noChangeAspect="1"/>
                   </wp:cNvGraphicFramePr>
@@ -4511,7 +4418,7 @@
                           <pic:cNvPicPr/>
                         </pic:nvPicPr>
                         <pic:blipFill>
-                          <a:blip r:embed="rIdG21"/>
+                          <a:blip r:embed="rIdG22"/>
                           <a:stretch>
                             <a:fillRect/>
                           </a:stretch>
@@ -4564,7 +4471,7 @@
               <w:tab/>
             </w:r>
             <w:r>
-              <w:t xml:space="preserve">Is de deadline al voorbij, dan zie je deze melding.</w:t>
+              <w:t xml:space="preserve">Is de deadline al verstreken? Dan verschijnt er een melding.</w:t>
             </w:r>
           </w:p>
           <w:p>
@@ -4596,7 +4503,7 @@
               <w:t xml:space="preserve">nieuwe deadline</w:t>
             </w:r>
             <w:r>
-              <w:t xml:space="preserve">. Zonder nieuwe deadline kun je niet versturen.</w:t>
+              <w:t xml:space="preserve">. Zonder nieuwe deadline kun je de wijziging niet versturen.</w:t>
             </w:r>
           </w:p>
         </w:tc>
@@ -4621,86 +4528,17 @@
         <w:keepNext/>
       </w:pPr>
       <w:r>
-        <w:t xml:space="preserve">Je aanvraag komt bij Marketing binnen als taak.</w:t>
+        <w:t xml:space="preserve">Je aanvraag komt bij Marketing binnen als taak. Marketing ontvangt een e-mail en ziet de aanvraag in de lijst. Vervolgens plant Marketing de aanvraag in. Is er iets onduidelijk, dan neemt Marketing contact met je op. Zodra het design klaar is, ontvang je een e-mail met de bestanden (zie hoofdstuk 5).</w:t>
       </w:r>
     </w:p>
     <w:p>
       <w:pPr>
-        <w:tabs>
-          <w:tab w:val="left" w:pos="425"/>
-        </w:tabs>
-        <w:spacing w:after="120"/>
-        <w:ind w:left="425" w:hanging="425"/>
-      </w:pPr>
-      <w:r>
-        <w:rPr>
-          <w:rFonts w:ascii="Area Normal Extrabold" w:hAnsi="Area Normal Extrabold"/>
-          <w:color w:val="E8590C"/>
-          <w:sz w:val="22"/>
-        </w:rPr>
-        <w:t>1</w:t>
-      </w:r>
-      <w:r>
-        <w:tab/>
-      </w:r>
-      <w:r>
-        <w:t xml:space="preserve">Marketing krijgt een mail en ziet je aanvraag in de lijst.</w:t>
-      </w:r>
-    </w:p>
-    <w:p>
-      <w:pPr>
-        <w:tabs>
-          <w:tab w:val="left" w:pos="425"/>
-        </w:tabs>
-        <w:spacing w:after="120"/>
-        <w:ind w:left="425" w:hanging="425"/>
-      </w:pPr>
-      <w:r>
-        <w:rPr>
-          <w:rFonts w:ascii="Area Normal Extrabold" w:hAnsi="Area Normal Extrabold"/>
-          <w:color w:val="E8590C"/>
-          <w:sz w:val="22"/>
-        </w:rPr>
-        <w:t>2</w:t>
-      </w:r>
-      <w:r>
-        <w:tab/>
-      </w:r>
-      <w:r>
-        <w:t xml:space="preserve">Marketing plant hem in. Is er iets onduidelijk, dan nemen ze contact met je op.</w:t>
-      </w:r>
-    </w:p>
-    <w:p>
-      <w:pPr>
-        <w:tabs>
-          <w:tab w:val="left" w:pos="425"/>
-        </w:tabs>
-        <w:spacing w:after="120"/>
-        <w:ind w:left="425" w:hanging="425"/>
-      </w:pPr>
-      <w:r>
-        <w:rPr>
-          <w:rFonts w:ascii="Area Normal Extrabold" w:hAnsi="Area Normal Extrabold"/>
-          <w:color w:val="E8590C"/>
-          <w:sz w:val="22"/>
-        </w:rPr>
-        <w:t>3</w:t>
-      </w:r>
-      <w:r>
-        <w:tab/>
-      </w:r>
-      <w:r>
-        <w:t xml:space="preserve">Is het design klaar, dan krijg je een mail met de bestanden (hoofdstuk 5).</w:t>
-      </w:r>
-    </w:p>
-    <w:p>
-      <w:pPr>
         <w:pStyle w:val="Kop2"/>
         <w:keepNext/>
         <w:spacing w:before="240"/>
       </w:pPr>
       <w:r>
-        <w:t xml:space="preserve">Krappe datums</w:t>
+        <w:t xml:space="preserve">Krappe deadlines</w:t>
       </w:r>
     </w:p>
     <w:tbl>
@@ -4727,7 +4565,6 @@
         <w:tc>
           <w:tcPr>
             <w:tcW w:w="3200" w:type="dxa"/>
-            <w:shd w:val="clear" w:color="auto" w:fill="229D96"/>
             <w:tcMar>
               <w:top w:w="90" w:type="dxa"/>
               <w:left w:w="140" w:type="dxa"/>
@@ -4742,16 +4579,14 @@
             <w:r>
               <w:rPr>
                 <w:rFonts w:ascii="Area Normal Extrabold" w:hAnsi="Area Normal Extrabold"/>
-                <w:color w:val="FFFFFF"/>
-              </w:rPr>
-              <w:t>Hoeveel tijd</w:t>
+              </w:rPr>
+              <w:t xml:space="preserve">10 werkdagen of meer tot het event</w:t>
             </w:r>
           </w:p>
         </w:tc>
         <w:tc>
           <w:tcPr>
             <w:tcW w:w="5815" w:type="dxa"/>
-            <w:shd w:val="clear" w:color="auto" w:fill="229D96"/>
             <w:tcMar>
               <w:top w:w="90" w:type="dxa"/>
               <w:left w:w="140" w:type="dxa"/>
@@ -4764,11 +4599,7 @@
               <w:spacing w:after="40"/>
             </w:pPr>
             <w:r>
-              <w:rPr>
-                <w:rFonts w:ascii="Area Normal Extrabold" w:hAnsi="Area Normal Extrabold"/>
-                <w:color w:val="FFFFFF"/>
-              </w:rPr>
-              <w:t>Wat het formulier zegt</w:t>
+              <w:t xml:space="preserve">Je bent op tijd.</w:t>
             </w:r>
           </w:p>
         </w:tc>
@@ -4795,7 +4626,7 @@
               <w:rPr>
                 <w:rFonts w:ascii="Area Normal Extrabold" w:hAnsi="Area Normal Extrabold"/>
               </w:rPr>
-              <w:t xml:space="preserve">10 werkdagen of meer tot het event</w:t>
+              <w:t xml:space="preserve">Minder dan 10 werkdagen tot het event</w:t>
             </w:r>
           </w:p>
         </w:tc>
@@ -4814,7 +4645,7 @@
               <w:spacing w:after="40"/>
             </w:pPr>
             <w:r>
-              <w:t xml:space="preserve">Je bent op tijd.</w:t>
+              <w:t xml:space="preserve">De aanvraag geldt als spoed. Besteld drukwerk (zoals een geprinte menukaart, vlaggen, banners en roll-ups) is waarschijnlijk niet meer op tijd klaar.</w:t>
             </w:r>
           </w:p>
         </w:tc>
@@ -4841,7 +4672,7 @@
               <w:rPr>
                 <w:rFonts w:ascii="Area Normal Extrabold" w:hAnsi="Area Normal Extrabold"/>
               </w:rPr>
-              <w:t xml:space="preserve">Minder dan 10 werkdagen tot het event</w:t>
+              <w:t xml:space="preserve">Deadline binnen 5 werkdagen</w:t>
             </w:r>
           </w:p>
         </w:tc>
@@ -4860,99 +4691,7 @@
               <w:spacing w:after="40"/>
             </w:pPr>
             <w:r>
-              <w:t xml:space="preserve">Een spoedje. Drukwerk dat we bestellen (geprinte menukaart, vlaggen, banners, roll-ups) is waarschijnlijk niet meer op tijd.</w:t>
-            </w:r>
-          </w:p>
-        </w:tc>
-      </w:tr>
-      <w:tr>
-        <w:trPr>
-          <w:cantSplit/>
-        </w:trPr>
-        <w:tc>
-          <w:tcPr>
-            <w:tcW w:w="3200" w:type="dxa"/>
-            <w:tcMar>
-              <w:top w:w="90" w:type="dxa"/>
-              <w:left w:w="140" w:type="dxa"/>
-              <w:bottom w:w="50" w:type="dxa"/>
-              <w:right w:w="140" w:type="dxa"/>
-            </w:tcMar>
-          </w:tcPr>
-          <w:p>
-            <w:pPr>
-              <w:spacing w:after="40"/>
-            </w:pPr>
-            <w:r>
-              <w:rPr>
-                <w:rFonts w:ascii="Area Normal Extrabold" w:hAnsi="Area Normal Extrabold"/>
-              </w:rPr>
-              <w:t xml:space="preserve">Deadline over minder dan 5 werkdagen</w:t>
-            </w:r>
-          </w:p>
-        </w:tc>
-        <w:tc>
-          <w:tcPr>
-            <w:tcW w:w="5815" w:type="dxa"/>
-            <w:tcMar>
-              <w:top w:w="90" w:type="dxa"/>
-              <w:left w:w="140" w:type="dxa"/>
-              <w:bottom w:w="50" w:type="dxa"/>
-              <w:right w:w="140" w:type="dxa"/>
-            </w:tcMar>
-          </w:tcPr>
-          <w:p>
-            <w:pPr>
-              <w:spacing w:after="40"/>
-            </w:pPr>
-            <w:r>
-              <w:t xml:space="preserve">Overleg even met Marketing als het sneller moet.</w:t>
-            </w:r>
-          </w:p>
-        </w:tc>
-      </w:tr>
-      <w:tr>
-        <w:trPr>
-          <w:cantSplit/>
-        </w:trPr>
-        <w:tc>
-          <w:tcPr>
-            <w:tcW w:w="3200" w:type="dxa"/>
-            <w:tcMar>
-              <w:top w:w="90" w:type="dxa"/>
-              <w:left w:w="140" w:type="dxa"/>
-              <w:bottom w:w="50" w:type="dxa"/>
-              <w:right w:w="140" w:type="dxa"/>
-            </w:tcMar>
-          </w:tcPr>
-          <w:p>
-            <w:pPr>
-              <w:spacing w:after="40"/>
-            </w:pPr>
-            <w:r>
-              <w:rPr>
-                <w:rFonts w:ascii="Area Normal Extrabold" w:hAnsi="Area Normal Extrabold"/>
-              </w:rPr>
-              <w:t xml:space="preserve">3 werkdagen of minder</w:t>
-            </w:r>
-          </w:p>
-        </w:tc>
-        <w:tc>
-          <w:tcPr>
-            <w:tcW w:w="5815" w:type="dxa"/>
-            <w:tcMar>
-              <w:top w:w="90" w:type="dxa"/>
-              <w:left w:w="140" w:type="dxa"/>
-              <w:bottom w:w="50" w:type="dxa"/>
-              <w:right w:w="140" w:type="dxa"/>
-            </w:tcMar>
-          </w:tcPr>
-          <w:p>
-            <w:pPr>
-              <w:spacing w:after="40"/>
-            </w:pPr>
-            <w:r>
-              <w:t xml:space="preserve">Verstuur je aanvraag en mail daarna meteen Marketing om te bespreken wat er nog kan.</w:t>
+              <w:t xml:space="preserve">Dien je aanvraag in en mail daarna meteen Marketing om te bespreken wat nog mogelijk is.</w:t>
             </w:r>
           </w:p>
         </w:tc>
@@ -4960,11 +4699,44 @@
     </w:tbl>
     <w:p>
       <w:pPr>
-        <w:spacing w:before="160"/>
+        <w:keepNext/>
+        <w:pBdr>
+          <w:left w:val="single" w:sz="24" w:space="8" w:color="F6A304"/>
+        </w:pBdr>
+        <w:shd w:val="clear" w:color="auto" w:fill="FDF3E4"/>
+        <w:ind w:left="198"/>
+        <w:spacing w:before="160" w:after="0"/>
       </w:pPr>
       <w:r>
-        <w:t xml:space="preserve">Spoedjes worden automatisch bijgehouden, per aanvrager, en blijven staan als de datum later verschuift.</w:t>
+        <w:rPr>
+          <w:rFonts w:ascii="Area Normal Extrabold" w:hAnsi="Area Normal Extrabold"/>
+        </w:rPr>
+        <w:t xml:space="preserve">Spoed wordt bijgehouden</w:t>
       </w:r>
+    </w:p>
+    <w:p>
+      <w:pPr>
+        <w:keepNext/>
+        <w:pBdr>
+          <w:left w:val="single" w:sz="24" w:space="8" w:color="F6A304"/>
+        </w:pBdr>
+        <w:shd w:val="clear" w:color="auto" w:fill="FDF3E4"/>
+        <w:ind w:left="198"/>
+        <w:spacing w:after="0"/>
+      </w:pPr>
+      <w:r>
+        <w:t xml:space="preserve">Spoedaanvragen worden automatisch per aanvrager bijgehouden. Ze blijven als spoed geregistreerd, ook als de datum later verschuift.</w:t>
+      </w:r>
+    </w:p>
+    <w:p>
+      <w:pPr>
+        <w:pBdr>
+          <w:left w:val="single" w:sz="24" w:space="8" w:color="F6A304"/>
+        </w:pBdr>
+        <w:shd w:val="clear" w:color="auto" w:fill="FDF3E4"/>
+        <w:ind w:left="198"/>
+        <w:spacing w:after="0" w:line="120" w:lineRule="exact"/>
+      </w:pPr>
     </w:p>
     <w:p>
       <w:pPr>
@@ -5000,7 +4772,6 @@
         <w:tc>
           <w:tcPr>
             <w:tcW w:w="3200" w:type="dxa"/>
-            <w:shd w:val="clear" w:color="auto" w:fill="229D96"/>
             <w:tcMar>
               <w:top w:w="90" w:type="dxa"/>
               <w:left w:w="140" w:type="dxa"/>
@@ -5015,16 +4786,14 @@
             <w:r>
               <w:rPr>
                 <w:rFonts w:ascii="Area Normal Extrabold" w:hAnsi="Area Normal Extrabold"/>
-                <w:color w:val="FFFFFF"/>
-              </w:rPr>
-              <w:t>Wat er is</w:t>
+              </w:rPr>
+              <w:t xml:space="preserve">Je feedback wilt geven op een design</w:t>
             </w:r>
           </w:p>
         </w:tc>
         <w:tc>
           <w:tcPr>
             <w:tcW w:w="5815" w:type="dxa"/>
-            <w:shd w:val="clear" w:color="auto" w:fill="229D96"/>
             <w:tcMar>
               <w:top w:w="90" w:type="dxa"/>
               <w:left w:w="140" w:type="dxa"/>
@@ -5037,11 +4806,7 @@
               <w:spacing w:after="40"/>
             </w:pPr>
             <w:r>
-              <w:rPr>
-                <w:rFonts w:ascii="Area Normal Extrabold" w:hAnsi="Area Normal Extrabold"/>
-                <w:color w:val="FFFFFF"/>
-              </w:rPr>
-              <w:t>Zo doe je het</w:t>
+              <w:t xml:space="preserve">Gebruik de knop Feedback geven in de e-mail.</w:t>
             </w:r>
           </w:p>
         </w:tc>
@@ -5068,7 +4833,7 @@
               <w:rPr>
                 <w:rFonts w:ascii="Area Normal Extrabold" w:hAnsi="Area Normal Extrabold"/>
               </w:rPr>
-              <w:t xml:space="preserve">Feedback op een design</w:t>
+              <w:t xml:space="preserve">Je iets bent vergeten in je aanvraag</w:t>
             </w:r>
           </w:p>
         </w:tc>
@@ -5087,7 +4852,7 @@
               <w:spacing w:after="40"/>
             </w:pPr>
             <w:r>
-              <w:t xml:space="preserve">De knop Feedback geven in de mail (hoofdstuk 5).</w:t>
+              <w:t xml:space="preserve">Kies Iets aanvullen of wijzigen.</w:t>
             </w:r>
           </w:p>
         </w:tc>
@@ -5114,7 +4879,7 @@
               <w:rPr>
                 <w:rFonts w:ascii="Area Normal Extrabold" w:hAnsi="Area Normal Extrabold"/>
               </w:rPr>
-              <w:t xml:space="preserve">Iets vergeten in je aanvraag</w:t>
+              <w:t xml:space="preserve">Je nog een design nodig hebt voor hetzelfde event</w:t>
             </w:r>
           </w:p>
         </w:tc>
@@ -5133,7 +4898,7 @@
               <w:spacing w:after="40"/>
             </w:pPr>
             <w:r>
-              <w:t xml:space="preserve">Iets aanvullen of wijzigen.</w:t>
+              <w:t xml:space="preserve">Kies Iets aanvullen of wijzigen en vermeld in de toelichting wat erbij moet.</w:t>
             </w:r>
           </w:p>
         </w:tc>
@@ -5160,7 +4925,7 @@
               <w:rPr>
                 <w:rFonts w:ascii="Area Normal Extrabold" w:hAnsi="Area Normal Extrabold"/>
               </w:rPr>
-              <w:t xml:space="preserve">Nog een design voor hetzelfde event</w:t>
+              <w:t xml:space="preserve">Het menu verandert</w:t>
             </w:r>
           </w:p>
         </w:tc>
@@ -5179,7 +4944,7 @@
               <w:spacing w:after="40"/>
             </w:pPr>
             <w:r>
-              <w:t xml:space="preserve">Iets aanvullen of wijzigen, en zet in de toelichting wat erbij moet.</w:t>
+              <w:t xml:space="preserve">Kies Iets aanvullen of wijzigen en vervolgens Menu aanpassen.</w:t>
             </w:r>
           </w:p>
         </w:tc>
@@ -5206,7 +4971,7 @@
               <w:rPr>
                 <w:rFonts w:ascii="Area Normal Extrabold" w:hAnsi="Area Normal Extrabold"/>
               </w:rPr>
-              <w:t xml:space="preserve">Het menu verandert</w:t>
+              <w:t xml:space="preserve">De datum is verschoven</w:t>
             </w:r>
           </w:p>
         </w:tc>
@@ -5225,7 +4990,7 @@
               <w:spacing w:after="40"/>
             </w:pPr>
             <w:r>
-              <w:t xml:space="preserve">Iets aanvullen of wijzigen, en dan Menu aanpassen.</w:t>
+              <w:t xml:space="preserve">Kies Iets aanvullen of wijzigen en klik bij de datum op wijzigen.</w:t>
             </w:r>
           </w:p>
         </w:tc>
@@ -5252,7 +5017,7 @@
               <w:rPr>
                 <w:rFonts w:ascii="Area Normal Extrabold" w:hAnsi="Area Normal Extrabold"/>
               </w:rPr>
-              <w:t xml:space="preserve">Datum verschoven</w:t>
+              <w:t xml:space="preserve">Je een nieuw event wilt aanmelden</w:t>
             </w:r>
           </w:p>
         </w:tc>
@@ -5271,7 +5036,7 @@
               <w:spacing w:after="40"/>
             </w:pPr>
             <w:r>
-              <w:t xml:space="preserve">Iets aanvullen of wijzigen, en klik bij de datum op wijzigen.</w:t>
+              <w:t xml:space="preserve">Start een nieuwe aanvraag via Start.</w:t>
             </w:r>
           </w:p>
         </w:tc>
@@ -5298,7 +5063,7 @@
               <w:rPr>
                 <w:rFonts w:ascii="Area Normal Extrabold" w:hAnsi="Area Normal Extrabold"/>
               </w:rPr>
-              <w:t xml:space="preserve">Een nieuw event</w:t>
+              <w:t xml:space="preserve">Je je aanvraag niet kunt vinden</w:t>
             </w:r>
           </w:p>
         </w:tc>
@@ -5317,7 +5082,7 @@
               <w:spacing w:after="40"/>
             </w:pPr>
             <w:r>
-              <w:t xml:space="preserve">Een nieuwe aanvraag met Start.</w:t>
+              <w:t xml:space="preserve">Is de aanvraag ouder dan 4 maanden of is deze niet via het formulier ingediend? Mail dan Marketing.</w:t>
             </w:r>
           </w:p>
         </w:tc>
@@ -5344,7 +5109,7 @@
               <w:rPr>
                 <w:rFonts w:ascii="Area Normal Extrabold" w:hAnsi="Area Normal Extrabold"/>
               </w:rPr>
-              <w:t xml:space="preserve">Je vindt je aanvraag niet</w:t>
+              <w:t xml:space="preserve">De aanvraag niet doorgaat</w:t>
             </w:r>
           </w:p>
         </w:tc>
@@ -5363,53 +5128,7 @@
               <w:spacing w:after="40"/>
             </w:pPr>
             <w:r>
-              <w:t xml:space="preserve">Ouder dan 4 maanden, of niet via het formulier gedaan? Mail Marketing.</w:t>
-            </w:r>
-          </w:p>
-        </w:tc>
-      </w:tr>
-      <w:tr>
-        <w:trPr>
-          <w:cantSplit/>
-        </w:trPr>
-        <w:tc>
-          <w:tcPr>
-            <w:tcW w:w="3200" w:type="dxa"/>
-            <w:tcMar>
-              <w:top w:w="90" w:type="dxa"/>
-              <w:left w:w="140" w:type="dxa"/>
-              <w:bottom w:w="50" w:type="dxa"/>
-              <w:right w:w="140" w:type="dxa"/>
-            </w:tcMar>
-          </w:tcPr>
-          <w:p>
-            <w:pPr>
-              <w:spacing w:after="40"/>
-            </w:pPr>
-            <w:r>
-              <w:rPr>
-                <w:rFonts w:ascii="Area Normal Extrabold" w:hAnsi="Area Normal Extrabold"/>
-              </w:rPr>
-              <w:t xml:space="preserve">Aanvraag gaat niet door</w:t>
-            </w:r>
-          </w:p>
-        </w:tc>
-        <w:tc>
-          <w:tcPr>
-            <w:tcW w:w="5815" w:type="dxa"/>
-            <w:tcMar>
-              <w:top w:w="90" w:type="dxa"/>
-              <w:left w:w="140" w:type="dxa"/>
-              <w:bottom w:w="50" w:type="dxa"/>
-              <w:right w:w="140" w:type="dxa"/>
-            </w:tcMar>
-          </w:tcPr>
-          <w:p>
-            <w:pPr>
-              <w:spacing w:after="40"/>
-            </w:pPr>
-            <w:r>
-              <w:t xml:space="preserve">Mail Marketing, dan halen zij hem weg.</w:t>
+              <w:t xml:space="preserve">Mail Marketing, zodat de aanvraag kan worden verwijderd.</w:t>
             </w:r>
           </w:p>
         </w:tc>
@@ -5417,7 +5136,13 @@
     </w:tbl>
     <w:p>
       <w:pPr>
-        <w:spacing w:before="240"/>
+        <w:keepNext/>
+        <w:pBdr>
+          <w:left w:val="single" w:sz="24" w:space="8" w:color="F6A304"/>
+        </w:pBdr>
+        <w:shd w:val="clear" w:color="auto" w:fill="FDF3E4"/>
+        <w:ind w:left="198"/>
+        <w:spacing w:before="160" w:after="0"/>
       </w:pPr>
       <w:r>
         <w:rPr>
@@ -5425,27 +5150,30 @@
         </w:rPr>
         <w:t xml:space="preserve">Twijfel je?</w:t>
       </w:r>
+    </w:p>
+    <w:p>
+      <w:pPr>
+        <w:keepNext/>
+        <w:pBdr>
+          <w:left w:val="single" w:sz="24" w:space="8" w:color="F6A304"/>
+        </w:pBdr>
+        <w:shd w:val="clear" w:color="auto" w:fill="FDF3E4"/>
+        <w:ind w:left="198"/>
+        <w:spacing w:after="0"/>
+      </w:pPr>
       <w:r>
-        <w:t xml:space="preserve"> Mail </w:t>
+        <w:t xml:space="preserve">Mail marketing@nbcevents.nl (voor Green Village: marketing@green-village.nl). Liever even vragen dan gokken!</w:t>
       </w:r>
-      <w:r>
-        <w:rPr>
-          <w:rFonts w:ascii="Area Normal Extrabold" w:hAnsi="Area Normal Extrabold"/>
-        </w:rPr>
-        <w:t xml:space="preserve">marketing@nbcevents.nl</w:t>
-      </w:r>
-      <w:r>
-        <w:t xml:space="preserve"> (Green Village: </w:t>
-      </w:r>
-      <w:r>
-        <w:rPr>
-          <w:rFonts w:ascii="Area Normal Extrabold" w:hAnsi="Area Normal Extrabold"/>
-        </w:rPr>
-        <w:t xml:space="preserve">marketing@green-village.nl</w:t>
-      </w:r>
-      <w:r>
-        <w:t xml:space="preserve">). Liever even vragen dan gokken.</w:t>
-      </w:r>
+    </w:p>
+    <w:p>
+      <w:pPr>
+        <w:pBdr>
+          <w:left w:val="single" w:sz="24" w:space="8" w:color="F6A304"/>
+        </w:pBdr>
+        <w:shd w:val="clear" w:color="auto" w:fill="FDF3E4"/>
+        <w:ind w:left="198"/>
+        <w:spacing w:after="0" w:line="120" w:lineRule="exact"/>
+      </w:pPr>
     </w:p>
     <w:sectPr>
       <w:headerReference w:type="default" r:id="rId21"/>

</xml_diff>

<commit_message>
Projectengids op zeven pagina's
Hoofdstukken lopen door op dezelfde pagina, de screenshots zijn kleiner en
waar de tekst op zichzelf duidelijk is staat hij zonder screenshot. De
tekst van Marketing is ongewijzigd. Oktober 2026 staat op de voorkant in
dezelfde kleur als Handleiding.

Co-Authored-By: Claude Opus 5.5 <noreply@anthropic.com>
Claude-Session: https://claude.ai/code/session_01FF5qjJmcy9G5HYxEPWYe11
</commit_message>
<xml_diff>
--- a/docs/gids-projecten/Designs aanvragen - Handleiding voor projecten.docx
+++ b/docs/gids-projecten/Designs aanvragen - Handleiding voor projecten.docx
@@ -21,7 +21,7 @@
       <w:r>
         <w:rPr>
           <w:rFonts w:ascii="Area Normal Extrabold" w:hAnsi="Area Normal Extrabold"/>
-          <w:color w:val="F5A300"/>
+          <w:color w:val="165E5A"/>
         </w:rPr>
         <w:t>OKTOBER 2026</w:t>
       </w:r>
@@ -43,51 +43,6 @@
         </w:rPr>
         <w:br/>
         <w:t>bij Marketing</w:t>
-      </w:r>
-    </w:p>
-    <w:p>
-      <w:pPr>
-        <w:spacing w:after="0"/>
-      </w:pPr>
-      <w:r>
-        <w:rPr>
-          <w:noProof/>
-        </w:rPr>
-        <w:drawing>
-          <wp:inline distT="0" distB="0" distL="0" distR="0">
-            <wp:extent cx="4699000" cy="3117003"/>
-            <wp:effectExtent l="0" t="0" r="0" b="0"/>
-            <wp:docPr id="101" name="Afbeelding 101"/>
-            <wp:cNvGraphicFramePr>
-              <a:graphicFrameLocks xmlns:a="http://schemas.openxmlformats.org/drawingml/2006/main" noChangeAspect="1"/>
-            </wp:cNvGraphicFramePr>
-            <a:graphic xmlns:a="http://schemas.openxmlformats.org/drawingml/2006/main">
-              <a:graphicData uri="http://schemas.openxmlformats.org/drawingml/2006/picture">
-                <pic:pic xmlns:pic="http://schemas.openxmlformats.org/drawingml/2006/picture">
-                  <pic:nvPicPr>
-                    <pic:cNvPr id="0" name="omslag.jpg"/>
-                    <pic:cNvPicPr/>
-                  </pic:nvPicPr>
-                  <pic:blipFill>
-                    <a:blip r:embed="rIdG1"/>
-                    <a:stretch>
-                      <a:fillRect/>
-                    </a:stretch>
-                  </pic:blipFill>
-                  <pic:spPr>
-                    <a:xfrm>
-                      <a:off x="0" y="0"/>
-                      <a:ext cx="4699000" cy="3117003"/>
-                    </a:xfrm>
-                    <a:prstGeom prst="rect">
-                      <a:avLst/>
-                    </a:prstGeom>
-                  </pic:spPr>
-                </pic:pic>
-              </a:graphicData>
-            </a:graphic>
-          </wp:inline>
-        </w:drawing>
       </w:r>
     </w:p>
     <w:p>
@@ -577,7 +532,8 @@
     <w:p>
       <w:pPr>
         <w:pStyle w:val="Kop1"/>
-        <w:pageBreakBefore/>
+        <w:keepNext/>
+        <w:spacing w:before="360"/>
       </w:pPr>
       <w:r>
         <w:t xml:space="preserve">1  Het formulier in het kort</w:t>
@@ -598,6 +554,33 @@
       </w:r>
       <w:r>
         <w:t xml:space="preserve">. Voeg de link toe aan je favorieten, zodat je het formulier snel terugvindt.</w:t>
+      </w:r>
+    </w:p>
+    <w:p>
+      <w:pPr>
+        <w:tabs>
+          <w:tab w:val="left" w:pos="425"/>
+        </w:tabs>
+        <w:spacing w:after="120"/>
+        <w:ind w:left="425" w:hanging="425"/>
+      </w:pPr>
+      <w:r>
+        <w:rPr>
+          <w:color w:val="E8590C"/>
+        </w:rPr>
+        <w:t>•</w:t>
+      </w:r>
+      <w:r>
+        <w:tab/>
+      </w:r>
+      <w:r>
+        <w:rPr>
+          <w:rFonts w:ascii="Area Normal Extrabold" w:hAnsi="Area Normal Extrabold"/>
+        </w:rPr>
+        <w:t xml:space="preserve">Start</w:t>
+      </w:r>
+      <w:r>
+        <w:t xml:space="preserve">: klik op deze optie om een nieuwe aanvraag in te dienen.</w:t>
       </w:r>
     </w:p>
     <w:tbl>
@@ -614,8 +597,8 @@
         <w:tblLayout w:type="fixed"/>
       </w:tblPr>
       <w:tblGrid>
-        <w:gridCol w:w="5500"/>
-        <w:gridCol w:w="3515"/>
+        <w:gridCol w:w="4000"/>
+        <w:gridCol w:w="5015"/>
       </w:tblGrid>
       <w:tr>
         <w:trPr>
@@ -623,7 +606,7 @@
         </w:trPr>
         <w:tc>
           <w:tcPr>
-            <w:tcW w:w="5500" w:type="dxa"/>
+            <w:tcW w:w="4000" w:type="dxa"/>
             <w:tcMar>
               <w:top w:w="0" w:type="dxa"/>
               <w:left w:w="0" w:type="dxa"/>
@@ -642,9 +625,9 @@
               </w:rPr>
               <w:drawing>
                 <wp:inline distT="0" distB="0" distL="0" distR="0">
-                  <wp:extent cx="3492500" cy="2316691"/>
+                  <wp:extent cx="2540000" cy="1684866"/>
                   <wp:effectExtent l="0" t="0" r="0" b="0"/>
-                  <wp:docPr id="102" name="Afbeelding 102"/>
+                  <wp:docPr id="101" name="Afbeelding 101"/>
                   <wp:cNvGraphicFramePr>
                     <a:graphicFrameLocks xmlns:a="http://schemas.openxmlformats.org/drawingml/2006/main" noChangeAspect="1"/>
                   </wp:cNvGraphicFramePr>
@@ -652,11 +635,11 @@
                     <a:graphicData uri="http://schemas.openxmlformats.org/drawingml/2006/picture">
                       <pic:pic xmlns:pic="http://schemas.openxmlformats.org/drawingml/2006/picture">
                         <pic:nvPicPr>
-                          <pic:cNvPr id="0" name="g01-start.jpg"/>
+                          <pic:cNvPr id="0" name="g02-vraag.jpg"/>
                           <pic:cNvPicPr/>
                         </pic:nvPicPr>
                         <pic:blipFill>
-                          <a:blip r:embed="rIdG2"/>
+                          <a:blip r:embed="rIdG1"/>
                           <a:stretch>
                             <a:fillRect/>
                           </a:stretch>
@@ -664,7 +647,7 @@
                         <pic:spPr>
                           <a:xfrm>
                             <a:off x="0" y="0"/>
-                            <a:ext cx="3492500" cy="2316691"/>
+                            <a:ext cx="2540000" cy="1684866"/>
                           </a:xfrm>
                           <a:prstGeom prst="rect">
                             <a:avLst/>
@@ -680,7 +663,7 @@
         </w:tc>
         <w:tc>
           <w:tcPr>
-            <w:tcW w:w="3515" w:type="dxa"/>
+            <w:tcW w:w="5015" w:type="dxa"/>
             <w:tcMar>
               <w:top w:w="120" w:type="dxa"/>
               <w:left w:w="240" w:type="dxa"/>
@@ -709,13 +692,115 @@
               <w:tab/>
             </w:r>
             <w:r>
-              <w:rPr>
-                <w:rFonts w:ascii="Area Normal Extrabold" w:hAnsi="Area Normal Extrabold"/>
-              </w:rPr>
-              <w:t xml:space="preserve">Start</w:t>
-            </w:r>
-            <w:r>
-              <w:t xml:space="preserve">: klik op deze optie om een nieuwe aanvraag in te dienen.</w:t>
+              <w:t xml:space="preserve">Het formulier toont één vraag per scherm, met een korte toelichting.</w:t>
+            </w:r>
+          </w:p>
+          <w:p>
+            <w:pPr>
+              <w:tabs>
+                <w:tab w:val="left" w:pos="425"/>
+              </w:tabs>
+              <w:spacing w:after="120"/>
+              <w:ind w:left="425" w:hanging="425"/>
+            </w:pPr>
+            <w:r>
+              <w:rPr>
+                <w:rFonts w:ascii="Area Normal Extrabold" w:hAnsi="Area Normal Extrabold"/>
+                <w:color w:val="E8590C"/>
+                <w:sz w:val="22"/>
+              </w:rPr>
+              <w:t>2</w:t>
+            </w:r>
+            <w:r>
+              <w:tab/>
+            </w:r>
+            <w:r>
+              <w:t xml:space="preserve">Selecteer je antwoord…</w:t>
+            </w:r>
+          </w:p>
+          <w:p>
+            <w:pPr>
+              <w:tabs>
+                <w:tab w:val="left" w:pos="425"/>
+              </w:tabs>
+              <w:spacing w:after="120"/>
+              <w:ind w:left="425" w:hanging="425"/>
+            </w:pPr>
+            <w:r>
+              <w:rPr>
+                <w:rFonts w:ascii="Area Normal Extrabold" w:hAnsi="Area Normal Extrabold"/>
+                <w:color w:val="E8590C"/>
+                <w:sz w:val="22"/>
+              </w:rPr>
+              <w:t>3</w:t>
+            </w:r>
+            <w:r>
+              <w:tab/>
+            </w:r>
+            <w:r>
+              <w:t xml:space="preserve">…en klik op </w:t>
+            </w:r>
+            <w:r>
+              <w:rPr>
+                <w:rFonts w:ascii="Area Normal Extrabold" w:hAnsi="Area Normal Extrabold"/>
+              </w:rPr>
+              <w:t xml:space="preserve">Volgende</w:t>
+            </w:r>
+            <w:r>
+              <w:t xml:space="preserve"> of druk op </w:t>
+            </w:r>
+            <w:r>
+              <w:rPr>
+                <w:rFonts w:ascii="Area Normal Extrabold" w:hAnsi="Area Normal Extrabold"/>
+              </w:rPr>
+              <w:t xml:space="preserve">Enter</w:t>
+            </w:r>
+            <w:r>
+              <w:t xml:space="preserve"> om verder te gaan.</w:t>
+            </w:r>
+          </w:p>
+          <w:p>
+            <w:pPr>
+              <w:tabs>
+                <w:tab w:val="left" w:pos="425"/>
+              </w:tabs>
+              <w:spacing w:after="120"/>
+              <w:ind w:left="425" w:hanging="425"/>
+            </w:pPr>
+            <w:r>
+              <w:rPr>
+                <w:rFonts w:ascii="Area Normal Extrabold" w:hAnsi="Area Normal Extrabold"/>
+                <w:color w:val="E8590C"/>
+                <w:sz w:val="22"/>
+              </w:rPr>
+              <w:t>4</w:t>
+            </w:r>
+            <w:r>
+              <w:tab/>
+            </w:r>
+            <w:r>
+              <w:t xml:space="preserve">Je kunt altijd terug naar een vorige vraag. De voortgangsteller onderaan laat zien hoever je bent.</w:t>
+            </w:r>
+          </w:p>
+          <w:p>
+            <w:pPr>
+              <w:tabs>
+                <w:tab w:val="left" w:pos="425"/>
+              </w:tabs>
+              <w:spacing w:after="120"/>
+              <w:ind w:left="425" w:hanging="425"/>
+            </w:pPr>
+            <w:r>
+              <w:rPr>
+                <w:color w:val="E8590C"/>
+              </w:rPr>
+              <w:t>•</w:t>
+            </w:r>
+            <w:r>
+              <w:tab/>
+            </w:r>
+            <w:r>
+              <w:t xml:space="preserve">Je antwoorden worden automatisch bewaard. Sluit je het venster tussentijds, dan kun je later verdergaan waar je bent gebleven.</w:t>
             </w:r>
           </w:p>
         </w:tc>
@@ -725,6 +810,163 @@
       <w:pPr>
         <w:spacing w:after="0" w:line="200" w:lineRule="exact"/>
       </w:pPr>
+    </w:p>
+    <w:p>
+      <w:pPr>
+        <w:pStyle w:val="Lijstalinea"/>
+        <w:numPr>
+          <w:ilvl w:val="0"/>
+          <w:numId w:val="2"/>
+        </w:numPr>
+        <w:keepNext/>
+        <w:spacing w:after="60"/>
+      </w:pPr>
+      <w:r>
+        <w:rPr>
+          <w:rFonts w:ascii="Area Normal Extrabold" w:hAnsi="Area Normal Extrabold"/>
+        </w:rPr>
+        <w:t xml:space="preserve">Vraag je design minimaal 10 werkdagen vóór het event aan.</w:t>
+      </w:r>
+      <w:r>
+        <w:t xml:space="preserve"> Is de termijn korter, dan geldt het als spoed en wordt de aanvraag als spoed geregistreerd.</w:t>
+      </w:r>
+    </w:p>
+    <w:p>
+      <w:pPr>
+        <w:pStyle w:val="Lijstalinea"/>
+        <w:numPr>
+          <w:ilvl w:val="0"/>
+          <w:numId w:val="2"/>
+        </w:numPr>
+        <w:keepNext/>
+        <w:spacing w:after="60"/>
+      </w:pPr>
+      <w:r>
+        <w:rPr>
+          <w:rFonts w:ascii="Area Normal Extrabold" w:hAnsi="Area Normal Extrabold"/>
+        </w:rPr>
+        <w:t xml:space="preserve">Dien één aanvraag per event in.</w:t>
+      </w:r>
+      <w:r>
+        <w:t xml:space="preserve"> Vink alles aan wat je nodig hebt, zodat alles bij elkaar staat.</w:t>
+      </w:r>
+    </w:p>
+    <w:p>
+      <w:pPr>
+        <w:pStyle w:val="Lijstalinea"/>
+        <w:numPr>
+          <w:ilvl w:val="0"/>
+          <w:numId w:val="2"/>
+        </w:numPr>
+        <w:keepNext/>
+        <w:spacing w:after="60"/>
+      </w:pPr>
+      <w:r>
+        <w:rPr>
+          <w:rFonts w:ascii="Area Normal Extrabold" w:hAnsi="Area Normal Extrabold"/>
+        </w:rPr>
+        <w:t xml:space="preserve">Kies standaarddesigns</w:t>
+      </w:r>
+      <w:r>
+        <w:t xml:space="preserve">, tenzij de opdrachtgever om een eigen ontwerp vraagt of daarvoor betaalt.</w:t>
+      </w:r>
+    </w:p>
+    <w:p>
+      <w:pPr>
+        <w:pStyle w:val="Lijstalinea"/>
+        <w:numPr>
+          <w:ilvl w:val="0"/>
+          <w:numId w:val="2"/>
+        </w:numPr>
+        <w:keepNext/>
+        <w:spacing w:after="60"/>
+      </w:pPr>
+      <w:r>
+        <w:rPr>
+          <w:rFonts w:ascii="Area Normal Extrabold" w:hAnsi="Area Normal Extrabold"/>
+        </w:rPr>
+        <w:t xml:space="preserve">Geef feedback en eventuele wijzigingen door via de knop ‘Feedback geven’</w:t>
+      </w:r>
+      <w:r>
+        <w:t xml:space="preserve"> in de e-mail van Marketing, of via ‘Iets aanvullen of wijzigen’ in het formulier. We verwerken feedback uitsluitend via het formulier en niet via losse berichten per e-mail, Teams of WhatsApp.</w:t>
+      </w:r>
+    </w:p>
+    <w:p>
+      <w:pPr>
+        <w:keepNext/>
+        <w:pBdr>
+          <w:left w:val="single" w:sz="24" w:space="8" w:color="F6A304"/>
+        </w:pBdr>
+        <w:shd w:val="clear" w:color="auto" w:fill="FDF3E4"/>
+        <w:ind w:left="198"/>
+        <w:spacing w:before="160" w:after="0"/>
+      </w:pPr>
+      <w:r>
+        <w:rPr>
+          <w:rFonts w:ascii="Area Normal Extrabold" w:hAnsi="Area Normal Extrabold"/>
+        </w:rPr>
+        <w:t xml:space="preserve">Voor Green Village</w:t>
+      </w:r>
+    </w:p>
+    <w:p>
+      <w:pPr>
+        <w:keepNext/>
+        <w:pBdr>
+          <w:left w:val="single" w:sz="24" w:space="8" w:color="F6A304"/>
+        </w:pBdr>
+        <w:shd w:val="clear" w:color="auto" w:fill="FDF3E4"/>
+        <w:ind w:left="198"/>
+        <w:spacing w:after="0"/>
+      </w:pPr>
+      <w:r>
+        <w:t xml:space="preserve">Kies bij de eerste vraag Green Village. Het formulier werkt verder hetzelfde, maar je kunt geen LED-kolom aanvragen. Het e-mailadres is marketing@green-village.nl.</w:t>
+      </w:r>
+    </w:p>
+    <w:p>
+      <w:pPr>
+        <w:pBdr>
+          <w:left w:val="single" w:sz="24" w:space="8" w:color="F6A304"/>
+        </w:pBdr>
+        <w:shd w:val="clear" w:color="auto" w:fill="FDF3E4"/>
+        <w:ind w:left="198"/>
+        <w:spacing w:after="0" w:line="120" w:lineRule="exact"/>
+      </w:pPr>
+    </w:p>
+    <w:p>
+      <w:pPr>
+        <w:pStyle w:val="Kop1"/>
+        <w:keepNext/>
+        <w:spacing w:before="360"/>
+      </w:pPr>
+      <w:r>
+        <w:t xml:space="preserve">2  Een aanvraag voor een event</w:t>
+      </w:r>
+    </w:p>
+    <w:p>
+      <w:pPr>
+        <w:keepNext/>
+      </w:pPr>
+      <w:r>
+        <w:t xml:space="preserve">Klik op </w:t>
+      </w:r>
+      <w:r>
+        <w:rPr>
+          <w:rFonts w:ascii="Area Normal Extrabold" w:hAnsi="Area Normal Extrabold"/>
+        </w:rPr>
+        <w:t xml:space="preserve">Start</w:t>
+      </w:r>
+      <w:r>
+        <w:t xml:space="preserve"> en kies de locatie. Selecteer je naam in de lijst. Staat je naam er niet tussen, typ hem dan zelf. Kies </w:t>
+      </w:r>
+      <w:r>
+        <w:rPr>
+          <w:rFonts w:ascii="Area Normal Extrabold" w:hAnsi="Area Normal Extrabold"/>
+        </w:rPr>
+        <w:t xml:space="preserve">Voor een evenement</w:t>
+      </w:r>
+      <w:r>
+        <w:t xml:space="preserve"> en vul de naam van het event in zoals de opdrachtgever die gebruikt.</w:t>
+      </w:r>
     </w:p>
     <w:tbl>
       <w:tblPr>
@@ -740,8 +982,8 @@
         <w:tblLayout w:type="fixed"/>
       </w:tblPr>
       <w:tblGrid>
-        <w:gridCol w:w="5500"/>
-        <w:gridCol w:w="3515"/>
+        <w:gridCol w:w="4000"/>
+        <w:gridCol w:w="5015"/>
       </w:tblGrid>
       <w:tr>
         <w:trPr>
@@ -749,7 +991,7 @@
         </w:trPr>
         <w:tc>
           <w:tcPr>
-            <w:tcW w:w="5500" w:type="dxa"/>
+            <w:tcW w:w="4000" w:type="dxa"/>
             <w:tcMar>
               <w:top w:w="0" w:type="dxa"/>
               <w:left w:w="0" w:type="dxa"/>
@@ -768,9 +1010,9 @@
               </w:rPr>
               <w:drawing>
                 <wp:inline distT="0" distB="0" distL="0" distR="0">
-                  <wp:extent cx="3492500" cy="2316691"/>
+                  <wp:extent cx="2540000" cy="1684866"/>
                   <wp:effectExtent l="0" t="0" r="0" b="0"/>
-                  <wp:docPr id="103" name="Afbeelding 103"/>
+                  <wp:docPr id="102" name="Afbeelding 102"/>
                   <wp:cNvGraphicFramePr>
                     <a:graphicFrameLocks xmlns:a="http://schemas.openxmlformats.org/drawingml/2006/main" noChangeAspect="1"/>
                   </wp:cNvGraphicFramePr>
@@ -778,11 +1020,11 @@
                     <a:graphicData uri="http://schemas.openxmlformats.org/drawingml/2006/picture">
                       <pic:pic xmlns:pic="http://schemas.openxmlformats.org/drawingml/2006/picture">
                         <pic:nvPicPr>
-                          <pic:cNvPr id="0" name="g02-vraag.jpg"/>
+                          <pic:cNvPr id="0" name="g03-eventdatum.jpg"/>
                           <pic:cNvPicPr/>
                         </pic:nvPicPr>
                         <pic:blipFill>
-                          <a:blip r:embed="rIdG3"/>
+                          <a:blip r:embed="rIdG2"/>
                           <a:stretch>
                             <a:fillRect/>
                           </a:stretch>
@@ -790,7 +1032,7 @@
                         <pic:spPr>
                           <a:xfrm>
                             <a:off x="0" y="0"/>
-                            <a:ext cx="3492500" cy="2316691"/>
+                            <a:ext cx="2540000" cy="1684866"/>
                           </a:xfrm>
                           <a:prstGeom prst="rect">
                             <a:avLst/>
@@ -806,7 +1048,7 @@
         </w:tc>
         <w:tc>
           <w:tcPr>
-            <w:tcW w:w="3515" w:type="dxa"/>
+            <w:tcW w:w="5015" w:type="dxa"/>
             <w:tcMar>
               <w:top w:w="120" w:type="dxa"/>
               <w:left w:w="240" w:type="dxa"/>
@@ -835,7 +1077,7 @@
               <w:tab/>
             </w:r>
             <w:r>
-              <w:t xml:space="preserve">Het formulier toont één vraag per scherm, met een korte toelichting.</w:t>
+              <w:t xml:space="preserve">Blader naar de juiste maand…</w:t>
             </w:r>
           </w:p>
           <w:p>
@@ -858,7 +1100,7 @@
               <w:tab/>
             </w:r>
             <w:r>
-              <w:t xml:space="preserve">Selecteer je antwoord…</w:t>
+              <w:t xml:space="preserve">…en klik de datum van het event aan. Duurt het event meerdere dagen, kies dan de eerste dag.</w:t>
             </w:r>
           </w:p>
           <w:p>
@@ -871,79 +1113,24 @@
             </w:pPr>
             <w:r>
               <w:rPr>
-                <w:rFonts w:ascii="Area Normal Extrabold" w:hAnsi="Area Normal Extrabold"/>
                 <w:color w:val="E8590C"/>
-                <w:sz w:val="22"/>
-              </w:rPr>
-              <w:t>3</w:t>
+              </w:rPr>
+              <w:t>•</w:t>
             </w:r>
             <w:r>
               <w:tab/>
             </w:r>
             <w:r>
-              <w:t xml:space="preserve">…en klik op </w:t>
-            </w:r>
-            <w:r>
-              <w:rPr>
-                <w:rFonts w:ascii="Area Normal Extrabold" w:hAnsi="Area Normal Extrabold"/>
-              </w:rPr>
-              <w:t xml:space="preserve">Volgende</w:t>
-            </w:r>
-            <w:r>
-              <w:t xml:space="preserve"> of druk op </w:t>
-            </w:r>
-            <w:r>
-              <w:rPr>
-                <w:rFonts w:ascii="Area Normal Extrabold" w:hAnsi="Area Normal Extrabold"/>
-              </w:rPr>
-              <w:t xml:space="preserve">Enter</w:t>
-            </w:r>
-            <w:r>
-              <w:t xml:space="preserve"> om verder te gaan.</w:t>
-            </w:r>
-          </w:p>
-          <w:p>
-            <w:pPr>
-              <w:tabs>
-                <w:tab w:val="left" w:pos="425"/>
-              </w:tabs>
-              <w:spacing w:after="120"/>
-              <w:ind w:left="425" w:hanging="425"/>
-            </w:pPr>
-            <w:r>
-              <w:rPr>
-                <w:rFonts w:ascii="Area Normal Extrabold" w:hAnsi="Area Normal Extrabold"/>
-                <w:color w:val="E8590C"/>
-                <w:sz w:val="22"/>
-              </w:rPr>
-              <w:t>4</w:t>
-            </w:r>
-            <w:r>
-              <w:tab/>
-            </w:r>
-            <w:r>
-              <w:t xml:space="preserve">Je kunt altijd terug naar een vorige vraag. De voortgangsteller onderaan laat zien hoever je bent.</w:t>
-            </w:r>
-          </w:p>
-          <w:p>
-            <w:pPr>
-              <w:tabs>
-                <w:tab w:val="left" w:pos="425"/>
-              </w:tabs>
-              <w:spacing w:after="120"/>
-              <w:ind w:left="425" w:hanging="425"/>
-            </w:pPr>
-            <w:r>
-              <w:rPr>
-                <w:color w:val="E8590C"/>
-              </w:rPr>
-              <w:t>•</w:t>
-            </w:r>
-            <w:r>
-              <w:tab/>
-            </w:r>
-            <w:r>
-              <w:t xml:space="preserve">Je antwoorden worden automatisch bewaard. Sluit je het venster tussentijds, dan kun je later verdergaan waar je bent gebleven.</w:t>
+              <w:t xml:space="preserve">Kies vervolgens de </w:t>
+            </w:r>
+            <w:r>
+              <w:rPr>
+                <w:rFonts w:ascii="Area Normal Extrabold" w:hAnsi="Area Normal Extrabold"/>
+              </w:rPr>
+              <w:t xml:space="preserve">deadline</w:t>
+            </w:r>
+            <w:r>
+              <w:t xml:space="preserve">: de datum waarop het design klaar moet zijn. Deze datum mag niet na de eventdatum liggen.</w:t>
             </w:r>
           </w:p>
         </w:tc>
@@ -953,158 +1140,6 @@
       <w:pPr>
         <w:spacing w:after="0" w:line="200" w:lineRule="exact"/>
       </w:pPr>
-    </w:p>
-    <w:p>
-      <w:pPr>
-        <w:pStyle w:val="Lijstalinea"/>
-        <w:numPr>
-          <w:ilvl w:val="0"/>
-          <w:numId w:val="2"/>
-        </w:numPr>
-        <w:spacing w:after="60"/>
-      </w:pPr>
-      <w:r>
-        <w:rPr>
-          <w:rFonts w:ascii="Area Normal Extrabold" w:hAnsi="Area Normal Extrabold"/>
-        </w:rPr>
-        <w:t xml:space="preserve">Vraag je design minimaal 10 werkdagen vóór het event aan.</w:t>
-      </w:r>
-      <w:r>
-        <w:t xml:space="preserve"> Is de termijn korter, dan geldt het als spoed en wordt de aanvraag als spoed geregistreerd.</w:t>
-      </w:r>
-    </w:p>
-    <w:p>
-      <w:pPr>
-        <w:pStyle w:val="Lijstalinea"/>
-        <w:numPr>
-          <w:ilvl w:val="0"/>
-          <w:numId w:val="2"/>
-        </w:numPr>
-        <w:spacing w:after="60"/>
-      </w:pPr>
-      <w:r>
-        <w:rPr>
-          <w:rFonts w:ascii="Area Normal Extrabold" w:hAnsi="Area Normal Extrabold"/>
-        </w:rPr>
-        <w:t xml:space="preserve">Dien één aanvraag per event in.</w:t>
-      </w:r>
-      <w:r>
-        <w:t xml:space="preserve"> Vink alles aan wat je nodig hebt, zodat alles bij elkaar staat.</w:t>
-      </w:r>
-    </w:p>
-    <w:p>
-      <w:pPr>
-        <w:pStyle w:val="Lijstalinea"/>
-        <w:numPr>
-          <w:ilvl w:val="0"/>
-          <w:numId w:val="2"/>
-        </w:numPr>
-        <w:spacing w:after="60"/>
-      </w:pPr>
-      <w:r>
-        <w:rPr>
-          <w:rFonts w:ascii="Area Normal Extrabold" w:hAnsi="Area Normal Extrabold"/>
-        </w:rPr>
-        <w:t xml:space="preserve">Kies standaarddesigns</w:t>
-      </w:r>
-      <w:r>
-        <w:t xml:space="preserve">, tenzij de opdrachtgever om een eigen ontwerp vraagt of daarvoor betaalt.</w:t>
-      </w:r>
-    </w:p>
-    <w:p>
-      <w:pPr>
-        <w:pStyle w:val="Lijstalinea"/>
-        <w:numPr>
-          <w:ilvl w:val="0"/>
-          <w:numId w:val="2"/>
-        </w:numPr>
-        <w:spacing w:after="60"/>
-      </w:pPr>
-      <w:r>
-        <w:rPr>
-          <w:rFonts w:ascii="Area Normal Extrabold" w:hAnsi="Area Normal Extrabold"/>
-        </w:rPr>
-        <w:t xml:space="preserve">Geef feedback en eventuele wijzigingen door via de knop ‘Feedback geven’</w:t>
-      </w:r>
-      <w:r>
-        <w:t xml:space="preserve"> in de e-mail van Marketing, of via ‘Iets aanvullen of wijzigen’ in het formulier. We verwerken feedback uitsluitend via het formulier en niet via losse berichten per e-mail, Teams of WhatsApp.</w:t>
-      </w:r>
-    </w:p>
-    <w:p>
-      <w:pPr>
-        <w:keepNext/>
-        <w:pBdr>
-          <w:left w:val="single" w:sz="24" w:space="8" w:color="F6A304"/>
-        </w:pBdr>
-        <w:shd w:val="clear" w:color="auto" w:fill="FDF3E4"/>
-        <w:ind w:left="198"/>
-        <w:spacing w:before="160" w:after="0"/>
-      </w:pPr>
-      <w:r>
-        <w:rPr>
-          <w:rFonts w:ascii="Area Normal Extrabold" w:hAnsi="Area Normal Extrabold"/>
-        </w:rPr>
-        <w:t xml:space="preserve">Voor Green Village</w:t>
-      </w:r>
-    </w:p>
-    <w:p>
-      <w:pPr>
-        <w:keepNext/>
-        <w:pBdr>
-          <w:left w:val="single" w:sz="24" w:space="8" w:color="F6A304"/>
-        </w:pBdr>
-        <w:shd w:val="clear" w:color="auto" w:fill="FDF3E4"/>
-        <w:ind w:left="198"/>
-        <w:spacing w:after="0"/>
-      </w:pPr>
-      <w:r>
-        <w:t xml:space="preserve">Kies bij de eerste vraag Green Village. Het formulier werkt verder hetzelfde, maar je kunt geen LED-kolom aanvragen. Het e-mailadres is marketing@green-village.nl.</w:t>
-      </w:r>
-    </w:p>
-    <w:p>
-      <w:pPr>
-        <w:pBdr>
-          <w:left w:val="single" w:sz="24" w:space="8" w:color="F6A304"/>
-        </w:pBdr>
-        <w:shd w:val="clear" w:color="auto" w:fill="FDF3E4"/>
-        <w:ind w:left="198"/>
-        <w:spacing w:after="0" w:line="120" w:lineRule="exact"/>
-      </w:pPr>
-    </w:p>
-    <w:p>
-      <w:pPr>
-        <w:pStyle w:val="Kop1"/>
-        <w:pageBreakBefore/>
-      </w:pPr>
-      <w:r>
-        <w:t xml:space="preserve">2  Een aanvraag voor een event</w:t>
-      </w:r>
-    </w:p>
-    <w:p>
-      <w:pPr>
-        <w:keepNext/>
-      </w:pPr>
-      <w:r>
-        <w:t xml:space="preserve">Klik op </w:t>
-      </w:r>
-      <w:r>
-        <w:rPr>
-          <w:rFonts w:ascii="Area Normal Extrabold" w:hAnsi="Area Normal Extrabold"/>
-        </w:rPr>
-        <w:t xml:space="preserve">Start</w:t>
-      </w:r>
-      <w:r>
-        <w:t xml:space="preserve"> en kies de locatie. Selecteer je naam in de lijst. Staat je naam er niet tussen, typ hem dan zelf. Kies </w:t>
-      </w:r>
-      <w:r>
-        <w:rPr>
-          <w:rFonts w:ascii="Area Normal Extrabold" w:hAnsi="Area Normal Extrabold"/>
-        </w:rPr>
-        <w:t xml:space="preserve">Voor een evenement</w:t>
-      </w:r>
-      <w:r>
-        <w:t xml:space="preserve"> en vul de naam van het event in zoals de opdrachtgever die gebruikt.</w:t>
-      </w:r>
     </w:p>
     <w:tbl>
       <w:tblPr>
@@ -1120,8 +1155,8 @@
         <w:tblLayout w:type="fixed"/>
       </w:tblPr>
       <w:tblGrid>
-        <w:gridCol w:w="5500"/>
-        <w:gridCol w:w="3515"/>
+        <w:gridCol w:w="4000"/>
+        <w:gridCol w:w="5015"/>
       </w:tblGrid>
       <w:tr>
         <w:trPr>
@@ -1129,7 +1164,7 @@
         </w:trPr>
         <w:tc>
           <w:tcPr>
-            <w:tcW w:w="5500" w:type="dxa"/>
+            <w:tcW w:w="4000" w:type="dxa"/>
             <w:tcMar>
               <w:top w:w="0" w:type="dxa"/>
               <w:left w:w="0" w:type="dxa"/>
@@ -1148,9 +1183,9 @@
               </w:rPr>
               <w:drawing>
                 <wp:inline distT="0" distB="0" distL="0" distR="0">
-                  <wp:extent cx="3492500" cy="2316691"/>
+                  <wp:extent cx="2540000" cy="1684866"/>
                   <wp:effectExtent l="0" t="0" r="0" b="0"/>
-                  <wp:docPr id="104" name="Afbeelding 104"/>
+                  <wp:docPr id="103" name="Afbeelding 103"/>
                   <wp:cNvGraphicFramePr>
                     <a:graphicFrameLocks xmlns:a="http://schemas.openxmlformats.org/drawingml/2006/main" noChangeAspect="1"/>
                   </wp:cNvGraphicFramePr>
@@ -1158,11 +1193,11 @@
                     <a:graphicData uri="http://schemas.openxmlformats.org/drawingml/2006/picture">
                       <pic:pic xmlns:pic="http://schemas.openxmlformats.org/drawingml/2006/picture">
                         <pic:nvPicPr>
-                          <pic:cNvPr id="0" name="g03-eventdatum.jpg"/>
+                          <pic:cNvPr id="0" name="g06-bestanden.jpg"/>
                           <pic:cNvPicPr/>
                         </pic:nvPicPr>
                         <pic:blipFill>
-                          <a:blip r:embed="rIdG4"/>
+                          <a:blip r:embed="rIdG3"/>
                           <a:stretch>
                             <a:fillRect/>
                           </a:stretch>
@@ -1170,7 +1205,7 @@
                         <pic:spPr>
                           <a:xfrm>
                             <a:off x="0" y="0"/>
-                            <a:ext cx="3492500" cy="2316691"/>
+                            <a:ext cx="2540000" cy="1684866"/>
                           </a:xfrm>
                           <a:prstGeom prst="rect">
                             <a:avLst/>
@@ -1186,7 +1221,7 @@
         </w:tc>
         <w:tc>
           <w:tcPr>
-            <w:tcW w:w="3515" w:type="dxa"/>
+            <w:tcW w:w="5015" w:type="dxa"/>
             <w:tcMar>
               <w:top w:w="120" w:type="dxa"/>
               <w:left w:w="240" w:type="dxa"/>
@@ -1215,7 +1250,7 @@
               <w:tab/>
             </w:r>
             <w:r>
-              <w:t xml:space="preserve">Blader naar de juiste maand…</w:t>
+              <w:t xml:space="preserve">Sleep een logo, voorbeelden of briefing naar het daarvoor bestemde vak, of klik erop om bestanden te kiezen.</w:t>
             </w:r>
           </w:p>
           <w:p>
@@ -1238,7 +1273,7 @@
               <w:tab/>
             </w:r>
             <w:r>
-              <w:t xml:space="preserve">…en klik de datum van het event aan. Duurt het event meerdere dagen, kies dan de eerste dag.</w:t>
+              <w:t xml:space="preserve">Staat er een vinkje bij een bestand, dan wordt het meegestuurd.</w:t>
             </w:r>
           </w:p>
           <w:p>
@@ -1259,16 +1294,7 @@
               <w:tab/>
             </w:r>
             <w:r>
-              <w:t xml:space="preserve">Kies vervolgens de </w:t>
-            </w:r>
-            <w:r>
-              <w:rPr>
-                <w:rFonts w:ascii="Area Normal Extrabold" w:hAnsi="Area Normal Extrabold"/>
-              </w:rPr>
-              <w:t xml:space="preserve">deadline</w:t>
-            </w:r>
-            <w:r>
-              <w:t xml:space="preserve">: de datum waarop het design klaar moet zijn. Deze datum mag niet na de eventdatum liggen.</w:t>
+              <w:t xml:space="preserve">Je kunt maximaal 5 bestanden van elk 25 MB toevoegen, zoals afbeeldingen, pdf-, Word- en PowerPoint-bestanden. Zijn de bestanden groter of gaat het om bronbestanden (AI, PSD of INDD)? Upload deze dan op de G-schijf en voeg de link naar de bestanden toe aan het formulier.</w:t>
             </w:r>
           </w:p>
         </w:tc>
@@ -1278,6 +1304,67 @@
       <w:pPr>
         <w:spacing w:after="0" w:line="200" w:lineRule="exact"/>
       </w:pPr>
+    </w:p>
+    <w:p>
+      <w:pPr>
+        <w:keepNext/>
+        <w:tabs>
+          <w:tab w:val="left" w:pos="425"/>
+        </w:tabs>
+        <w:spacing w:after="120"/>
+        <w:ind w:left="425" w:hanging="425"/>
+      </w:pPr>
+      <w:r>
+        <w:rPr>
+          <w:color w:val="E8590C"/>
+        </w:rPr>
+        <w:t>•</w:t>
+      </w:r>
+      <w:r>
+        <w:tab/>
+      </w:r>
+      <w:r>
+        <w:t xml:space="preserve">Vul waar mogelijk de </w:t>
+      </w:r>
+      <w:r>
+        <w:rPr>
+          <w:rFonts w:ascii="Area Normal Extrabold" w:hAnsi="Area Normal Extrabold"/>
+        </w:rPr>
+        <w:t xml:space="preserve">website</w:t>
+      </w:r>
+      <w:r>
+        <w:t xml:space="preserve"> van het bedrijf of event in. Zo kan Marketing de juiste branding, zoals logo’s, kleuren en lettertypen, achterhalen. Is er geen website beschikbaar? Dan kun je dit veld leeg laten.</w:t>
+      </w:r>
+    </w:p>
+    <w:p>
+      <w:pPr>
+        <w:tabs>
+          <w:tab w:val="left" w:pos="425"/>
+        </w:tabs>
+        <w:spacing w:after="120"/>
+        <w:ind w:left="425" w:hanging="425"/>
+      </w:pPr>
+      <w:r>
+        <w:rPr>
+          <w:color w:val="E8590C"/>
+        </w:rPr>
+        <w:t>•</w:t>
+      </w:r>
+      <w:r>
+        <w:tab/>
+      </w:r>
+      <w:r>
+        <w:t xml:space="preserve">Vink alles aan wat je voor het event nodig hebt. Staat jouw keuze er niet bij? Kies dan </w:t>
+      </w:r>
+      <w:r>
+        <w:rPr>
+          <w:rFonts w:ascii="Area Normal Extrabold" w:hAnsi="Area Normal Extrabold"/>
+        </w:rPr>
+        <w:t xml:space="preserve">Anders, namelijk…</w:t>
+      </w:r>
+      <w:r>
+        <w:t xml:space="preserve"> en beschrijf wat je nodig hebt.</w:t>
+      </w:r>
     </w:p>
     <w:tbl>
       <w:tblPr>
@@ -1293,8 +1380,8 @@
         <w:tblLayout w:type="fixed"/>
       </w:tblPr>
       <w:tblGrid>
-        <w:gridCol w:w="5500"/>
-        <w:gridCol w:w="3515"/>
+        <w:gridCol w:w="4000"/>
+        <w:gridCol w:w="5015"/>
       </w:tblGrid>
       <w:tr>
         <w:trPr>
@@ -1302,7 +1389,7 @@
         </w:trPr>
         <w:tc>
           <w:tcPr>
-            <w:tcW w:w="5500" w:type="dxa"/>
+            <w:tcW w:w="4000" w:type="dxa"/>
             <w:tcMar>
               <w:top w:w="0" w:type="dxa"/>
               <w:left w:w="0" w:type="dxa"/>
@@ -1321,9 +1408,9 @@
               </w:rPr>
               <w:drawing>
                 <wp:inline distT="0" distB="0" distL="0" distR="0">
-                  <wp:extent cx="3492500" cy="2316691"/>
+                  <wp:extent cx="2540000" cy="1684866"/>
                   <wp:effectExtent l="0" t="0" r="0" b="0"/>
-                  <wp:docPr id="105" name="Afbeelding 105"/>
+                  <wp:docPr id="104" name="Afbeelding 104"/>
                   <wp:cNvGraphicFramePr>
                     <a:graphicFrameLocks xmlns:a="http://schemas.openxmlformats.org/drawingml/2006/main" noChangeAspect="1"/>
                   </wp:cNvGraphicFramePr>
@@ -1331,11 +1418,11 @@
                     <a:graphicData uri="http://schemas.openxmlformats.org/drawingml/2006/picture">
                       <pic:pic xmlns:pic="http://schemas.openxmlformats.org/drawingml/2006/picture">
                         <pic:nvPicPr>
-                          <pic:cNvPr id="0" name="g06-bestanden.jpg"/>
+                          <pic:cNvPr id="0" name="g08-modus.jpg"/>
                           <pic:cNvPicPr/>
                         </pic:nvPicPr>
                         <pic:blipFill>
-                          <a:blip r:embed="rIdG5"/>
+                          <a:blip r:embed="rIdG4"/>
                           <a:stretch>
                             <a:fillRect/>
                           </a:stretch>
@@ -1343,7 +1430,7 @@
                         <pic:spPr>
                           <a:xfrm>
                             <a:off x="0" y="0"/>
-                            <a:ext cx="3492500" cy="2316691"/>
+                            <a:ext cx="2540000" cy="1684866"/>
                           </a:xfrm>
                           <a:prstGeom prst="rect">
                             <a:avLst/>
@@ -1359,7 +1446,7 @@
         </w:tc>
         <w:tc>
           <w:tcPr>
-            <w:tcW w:w="3515" w:type="dxa"/>
+            <w:tcW w:w="5015" w:type="dxa"/>
             <w:tcMar>
               <w:top w:w="120" w:type="dxa"/>
               <w:left w:w="240" w:type="dxa"/>
@@ -1388,7 +1475,13 @@
               <w:tab/>
             </w:r>
             <w:r>
-              <w:t xml:space="preserve">Sleep een logo, voorbeelden of briefing naar het daarvoor bestemde vak, of klik erop om bestanden te kiezen.</w:t>
+              <w:rPr>
+                <w:rFonts w:ascii="Area Normal Extrabold" w:hAnsi="Area Normal Extrabold"/>
+              </w:rPr>
+              <w:t xml:space="preserve">Standaarddesigns</w:t>
+            </w:r>
+            <w:r>
+              <w:t xml:space="preserve"> zijn vaste templates die worden ingevuld met de gegevens van het event. Kies deze optie in de meeste gevallen.</w:t>
             </w:r>
           </w:p>
           <w:p>
@@ -1411,28 +1504,16 @@
               <w:tab/>
             </w:r>
             <w:r>
-              <w:t xml:space="preserve">Staat er een vinkje bij een bestand, dan wordt het meegestuurd.</w:t>
-            </w:r>
-          </w:p>
-          <w:p>
-            <w:pPr>
-              <w:tabs>
-                <w:tab w:val="left" w:pos="425"/>
-              </w:tabs>
-              <w:spacing w:after="120"/>
-              <w:ind w:left="425" w:hanging="425"/>
-            </w:pPr>
-            <w:r>
-              <w:rPr>
-                <w:color w:val="E8590C"/>
-              </w:rPr>
-              <w:t>•</w:t>
-            </w:r>
-            <w:r>
-              <w:tab/>
-            </w:r>
-            <w:r>
-              <w:t xml:space="preserve">Je kunt maximaal 5 bestanden van elk 25 MB toevoegen, zoals afbeeldingen, pdf-, Word- en PowerPoint-bestanden. Zijn de bestanden groter of gaat het om bronbestanden (AI, PSD of INDD)? Upload deze dan op de G-schijf en voeg de link naar de bestanden toe aan het formulier.</w:t>
+              <w:t xml:space="preserve">Kies alleen voor </w:t>
+            </w:r>
+            <w:r>
+              <w:rPr>
+                <w:rFonts w:ascii="Area Normal Extrabold" w:hAnsi="Area Normal Extrabold"/>
+              </w:rPr>
+              <w:t xml:space="preserve">Volledig custom</w:t>
+            </w:r>
+            <w:r>
+              <w:t xml:space="preserve"> als de opdrachtgever een eigen ontwerp wenst en hiervoor betaalt.</w:t>
             </w:r>
           </w:p>
         </w:tc>
@@ -1457,8 +1538,8 @@
         <w:tblLayout w:type="fixed"/>
       </w:tblPr>
       <w:tblGrid>
-        <w:gridCol w:w="5500"/>
-        <w:gridCol w:w="3515"/>
+        <w:gridCol w:w="4000"/>
+        <w:gridCol w:w="5015"/>
       </w:tblGrid>
       <w:tr>
         <w:trPr>
@@ -1466,7 +1547,7 @@
         </w:trPr>
         <w:tc>
           <w:tcPr>
-            <w:tcW w:w="5500" w:type="dxa"/>
+            <w:tcW w:w="4000" w:type="dxa"/>
             <w:tcMar>
               <w:top w:w="0" w:type="dxa"/>
               <w:left w:w="0" w:type="dxa"/>
@@ -1485,9 +1566,9 @@
               </w:rPr>
               <w:drawing>
                 <wp:inline distT="0" distB="0" distL="0" distR="0">
-                  <wp:extent cx="3492500" cy="2316691"/>
+                  <wp:extent cx="2540000" cy="1684866"/>
                   <wp:effectExtent l="0" t="0" r="0" b="0"/>
-                  <wp:docPr id="106" name="Afbeelding 106"/>
+                  <wp:docPr id="105" name="Afbeelding 105"/>
                   <wp:cNvGraphicFramePr>
                     <a:graphicFrameLocks xmlns:a="http://schemas.openxmlformats.org/drawingml/2006/main" noChangeAspect="1"/>
                   </wp:cNvGraphicFramePr>
@@ -1495,11 +1576,11 @@
                     <a:graphicData uri="http://schemas.openxmlformats.org/drawingml/2006/picture">
                       <pic:pic xmlns:pic="http://schemas.openxmlformats.org/drawingml/2006/picture">
                         <pic:nvPicPr>
-                          <pic:cNvPr id="0" name="g05-website.jpg"/>
+                          <pic:cNvPr id="0" name="g09-wensen.jpg"/>
                           <pic:cNvPicPr/>
                         </pic:nvPicPr>
                         <pic:blipFill>
-                          <a:blip r:embed="rIdG6"/>
+                          <a:blip r:embed="rIdG5"/>
                           <a:stretch>
                             <a:fillRect/>
                           </a:stretch>
@@ -1507,7 +1588,7 @@
                         <pic:spPr>
                           <a:xfrm>
                             <a:off x="0" y="0"/>
-                            <a:ext cx="3492500" cy="2316691"/>
+                            <a:ext cx="2540000" cy="1684866"/>
                           </a:xfrm>
                           <a:prstGeom prst="rect">
                             <a:avLst/>
@@ -1523,7 +1604,7 @@
         </w:tc>
         <w:tc>
           <w:tcPr>
-            <w:tcW w:w="3515" w:type="dxa"/>
+            <w:tcW w:w="5015" w:type="dxa"/>
             <w:tcMar>
               <w:top w:w="120" w:type="dxa"/>
               <w:left w:w="240" w:type="dxa"/>
@@ -1552,16 +1633,7 @@
               <w:tab/>
             </w:r>
             <w:r>
-              <w:t xml:space="preserve">Vul waar mogelijk de </w:t>
-            </w:r>
-            <w:r>
-              <w:rPr>
-                <w:rFonts w:ascii="Area Normal Extrabold" w:hAnsi="Area Normal Extrabold"/>
-              </w:rPr>
-              <w:t xml:space="preserve">website</w:t>
-            </w:r>
-            <w:r>
-              <w:t xml:space="preserve"> van het bedrijf of event in. Zo kan Marketing de juiste branding, zoals logo’s, kleuren en lettertypen, achterhalen.</w:t>
+              <w:t xml:space="preserve">Vermeld alle informatie die Marketing nodig heeft, zoals teksten, sfeer en gewenste formaten. Gebruik Enter om een nieuwe regel te beginnen.</w:t>
             </w:r>
           </w:p>
           <w:p>
@@ -1574,7 +1646,39 @@
             </w:pPr>
             <w:r>
               <w:rPr>
+                <w:rFonts w:ascii="Area Normal Extrabold" w:hAnsi="Area Normal Extrabold"/>
                 <w:color w:val="E8590C"/>
+                <w:sz w:val="22"/>
+              </w:rPr>
+              <w:t>2</w:t>
+            </w:r>
+            <w:r>
+              <w:tab/>
+            </w:r>
+            <w:r>
+              <w:t xml:space="preserve">Klik daarna op </w:t>
+            </w:r>
+            <w:r>
+              <w:rPr>
+                <w:rFonts w:ascii="Area Normal Extrabold" w:hAnsi="Area Normal Extrabold"/>
+              </w:rPr>
+              <w:t xml:space="preserve">Naar overzicht</w:t>
+            </w:r>
+            <w:r>
+              <w:t xml:space="preserve">.</w:t>
+            </w:r>
+          </w:p>
+          <w:p>
+            <w:pPr>
+              <w:tabs>
+                <w:tab w:val="left" w:pos="425"/>
+              </w:tabs>
+              <w:spacing w:after="120"/>
+              <w:ind w:left="425" w:hanging="425"/>
+            </w:pPr>
+            <w:r>
+              <w:rPr>
+                <w:color w:val="E8590C"/>
               </w:rPr>
               <w:t>•</w:t>
             </w:r>
@@ -1582,7 +1686,7 @@
               <w:tab/>
             </w:r>
             <w:r>
-              <w:t xml:space="preserve">Is er geen website beschikbaar? Dan kun je dit veld leeg laten.</w:t>
+              <w:t xml:space="preserve">Wil je dat een collega een e-mail ontvangt zodra het design klaar is? Vul dan hier de naam en het e-mailadres van deze collega in.</w:t>
             </w:r>
           </w:p>
         </w:tc>
@@ -1607,8 +1711,8 @@
         <w:tblLayout w:type="fixed"/>
       </w:tblPr>
       <w:tblGrid>
-        <w:gridCol w:w="5500"/>
-        <w:gridCol w:w="3515"/>
+        <w:gridCol w:w="4000"/>
+        <w:gridCol w:w="5015"/>
       </w:tblGrid>
       <w:tr>
         <w:trPr>
@@ -1616,7 +1720,7 @@
         </w:trPr>
         <w:tc>
           <w:tcPr>
-            <w:tcW w:w="5500" w:type="dxa"/>
+            <w:tcW w:w="4000" w:type="dxa"/>
             <w:tcMar>
               <w:top w:w="0" w:type="dxa"/>
               <w:left w:w="0" w:type="dxa"/>
@@ -1635,9 +1739,9 @@
               </w:rPr>
               <w:drawing>
                 <wp:inline distT="0" distB="0" distL="0" distR="0">
-                  <wp:extent cx="3492500" cy="2316691"/>
+                  <wp:extent cx="2540000" cy="1684866"/>
                   <wp:effectExtent l="0" t="0" r="0" b="0"/>
-                  <wp:docPr id="107" name="Afbeelding 107"/>
+                  <wp:docPr id="106" name="Afbeelding 106"/>
                   <wp:cNvGraphicFramePr>
                     <a:graphicFrameLocks xmlns:a="http://schemas.openxmlformats.org/drawingml/2006/main" noChangeAspect="1"/>
                   </wp:cNvGraphicFramePr>
@@ -1645,11 +1749,11 @@
                     <a:graphicData uri="http://schemas.openxmlformats.org/drawingml/2006/picture">
                       <pic:pic xmlns:pic="http://schemas.openxmlformats.org/drawingml/2006/picture">
                         <pic:nvPicPr>
-                          <pic:cNvPr id="0" name="g07-types.jpg"/>
+                          <pic:cNvPr id="0" name="g10-overzicht.jpg"/>
                           <pic:cNvPicPr/>
                         </pic:nvPicPr>
                         <pic:blipFill>
-                          <a:blip r:embed="rIdG7"/>
+                          <a:blip r:embed="rIdG6"/>
                           <a:stretch>
                             <a:fillRect/>
                           </a:stretch>
@@ -1657,7 +1761,7 @@
                         <pic:spPr>
                           <a:xfrm>
                             <a:off x="0" y="0"/>
-                            <a:ext cx="3492500" cy="2316691"/>
+                            <a:ext cx="2540000" cy="1684866"/>
                           </a:xfrm>
                           <a:prstGeom prst="rect">
                             <a:avLst/>
@@ -1673,7 +1777,7 @@
         </w:tc>
         <w:tc>
           <w:tcPr>
-            <w:tcW w:w="3515" w:type="dxa"/>
+            <w:tcW w:w="5015" w:type="dxa"/>
             <w:tcMar>
               <w:top w:w="120" w:type="dxa"/>
               <w:left w:w="240" w:type="dxa"/>
@@ -1702,7 +1806,16 @@
               <w:tab/>
             </w:r>
             <w:r>
-              <w:t xml:space="preserve">Vink alles aan wat je voor het event nodig hebt.</w:t>
+              <w:t xml:space="preserve">Wil je een antwoord aanpassen? Klik op </w:t>
+            </w:r>
+            <w:r>
+              <w:rPr>
+                <w:rFonts w:ascii="Area Normal Extrabold" w:hAnsi="Area Normal Extrabold"/>
+              </w:rPr>
+              <w:t xml:space="preserve">wijzig</w:t>
+            </w:r>
+            <w:r>
+              <w:t xml:space="preserve">. Je keert daarna terug naar het overzicht.</w:t>
             </w:r>
           </w:p>
           <w:p>
@@ -1715,24 +1828,26 @@
             </w:pPr>
             <w:r>
               <w:rPr>
+                <w:rFonts w:ascii="Area Normal Extrabold" w:hAnsi="Area Normal Extrabold"/>
                 <w:color w:val="E8590C"/>
-              </w:rPr>
-              <w:t>•</w:t>
+                <w:sz w:val="22"/>
+              </w:rPr>
+              <w:t>2</w:t>
             </w:r>
             <w:r>
               <w:tab/>
             </w:r>
             <w:r>
-              <w:t xml:space="preserve">Staat jouw keuze er niet bij? Kies dan </w:t>
-            </w:r>
-            <w:r>
-              <w:rPr>
-                <w:rFonts w:ascii="Area Normal Extrabold" w:hAnsi="Area Normal Extrabold"/>
-              </w:rPr>
-              <w:t xml:space="preserve">Anders, namelijk…</w:t>
-            </w:r>
-            <w:r>
-              <w:t xml:space="preserve"> en beschrijf wat je nodig hebt.</w:t>
+              <w:t xml:space="preserve">Klik op </w:t>
+            </w:r>
+            <w:r>
+              <w:rPr>
+                <w:rFonts w:ascii="Area Normal Extrabold" w:hAnsi="Area Normal Extrabold"/>
+              </w:rPr>
+              <w:t xml:space="preserve">Verstuur aanvraag</w:t>
+            </w:r>
+            <w:r>
+              <w:t xml:space="preserve"> om je aanvraag definitief in te dienen.</w:t>
             </w:r>
           </w:p>
         </w:tc>
@@ -1757,8 +1872,8 @@
         <w:tblLayout w:type="fixed"/>
       </w:tblPr>
       <w:tblGrid>
-        <w:gridCol w:w="5500"/>
-        <w:gridCol w:w="3515"/>
+        <w:gridCol w:w="4000"/>
+        <w:gridCol w:w="5015"/>
       </w:tblGrid>
       <w:tr>
         <w:trPr>
@@ -1766,7 +1881,7 @@
         </w:trPr>
         <w:tc>
           <w:tcPr>
-            <w:tcW w:w="5500" w:type="dxa"/>
+            <w:tcW w:w="4000" w:type="dxa"/>
             <w:tcMar>
               <w:top w:w="0" w:type="dxa"/>
               <w:left w:w="0" w:type="dxa"/>
@@ -1785,9 +1900,9 @@
               </w:rPr>
               <w:drawing>
                 <wp:inline distT="0" distB="0" distL="0" distR="0">
-                  <wp:extent cx="3492500" cy="2316691"/>
+                  <wp:extent cx="2540000" cy="1684866"/>
                   <wp:effectExtent l="0" t="0" r="0" b="0"/>
-                  <wp:docPr id="108" name="Afbeelding 108"/>
+                  <wp:docPr id="107" name="Afbeelding 107"/>
                   <wp:cNvGraphicFramePr>
                     <a:graphicFrameLocks xmlns:a="http://schemas.openxmlformats.org/drawingml/2006/main" noChangeAspect="1"/>
                   </wp:cNvGraphicFramePr>
@@ -1795,11 +1910,11 @@
                     <a:graphicData uri="http://schemas.openxmlformats.org/drawingml/2006/picture">
                       <pic:pic xmlns:pic="http://schemas.openxmlformats.org/drawingml/2006/picture">
                         <pic:nvPicPr>
-                          <pic:cNvPr id="0" name="g08-modus.jpg"/>
+                          <pic:cNvPr id="0" name="g11-gelukt.jpg"/>
                           <pic:cNvPicPr/>
                         </pic:nvPicPr>
                         <pic:blipFill>
-                          <a:blip r:embed="rIdG8"/>
+                          <a:blip r:embed="rIdG7"/>
                           <a:stretch>
                             <a:fillRect/>
                           </a:stretch>
@@ -1807,7 +1922,7 @@
                         <pic:spPr>
                           <a:xfrm>
                             <a:off x="0" y="0"/>
-                            <a:ext cx="3492500" cy="2316691"/>
+                            <a:ext cx="2540000" cy="1684866"/>
                           </a:xfrm>
                           <a:prstGeom prst="rect">
                             <a:avLst/>
@@ -1823,7 +1938,7 @@
         </w:tc>
         <w:tc>
           <w:tcPr>
-            <w:tcW w:w="3515" w:type="dxa"/>
+            <w:tcW w:w="5015" w:type="dxa"/>
             <w:tcMar>
               <w:top w:w="120" w:type="dxa"/>
               <w:left w:w="240" w:type="dxa"/>
@@ -1852,13 +1967,7 @@
               <w:tab/>
             </w:r>
             <w:r>
-              <w:rPr>
-                <w:rFonts w:ascii="Area Normal Extrabold" w:hAnsi="Area Normal Extrabold"/>
-              </w:rPr>
-              <w:t xml:space="preserve">Standaarddesigns</w:t>
-            </w:r>
-            <w:r>
-              <w:t xml:space="preserve"> zijn vaste templates die worden ingevuld met de gegevens van het event. Kies deze optie in de meeste gevallen.</w:t>
+              <w:t xml:space="preserve">Je aanvraag is nu ingediend bij Marketing.</w:t>
             </w:r>
           </w:p>
           <w:p>
@@ -1881,16 +1990,58 @@
               <w:tab/>
             </w:r>
             <w:r>
-              <w:t xml:space="preserve">Kies alleen voor </w:t>
-            </w:r>
-            <w:r>
-              <w:rPr>
-                <w:rFonts w:ascii="Area Normal Extrabold" w:hAnsi="Area Normal Extrabold"/>
-              </w:rPr>
-              <w:t xml:space="preserve">Volledig custom</w:t>
-            </w:r>
-            <w:r>
-              <w:t xml:space="preserve"> als de opdrachtgever een eigen ontwerp wenst en hiervoor betaalt.</w:t>
+              <w:t xml:space="preserve">De huisstijl wordt op de achtergrond opgehaald; je hoeft hier niet op te wachten en kunt het venster sluiten.</w:t>
+            </w:r>
+          </w:p>
+          <w:p>
+            <w:pPr>
+              <w:tabs>
+                <w:tab w:val="left" w:pos="425"/>
+              </w:tabs>
+              <w:spacing w:after="120"/>
+              <w:ind w:left="425" w:hanging="425"/>
+            </w:pPr>
+            <w:r>
+              <w:rPr>
+                <w:color w:val="E8590C"/>
+              </w:rPr>
+              <w:t>•</w:t>
+            </w:r>
+            <w:r>
+              <w:tab/>
+            </w:r>
+            <w:r>
+              <w:t xml:space="preserve">Is het erg krap? Dan herinnert het formulier je eraan om contact op te nemen met Marketing.</w:t>
+            </w:r>
+          </w:p>
+          <w:p>
+            <w:pPr>
+              <w:tabs>
+                <w:tab w:val="left" w:pos="425"/>
+              </w:tabs>
+              <w:spacing w:after="120"/>
+              <w:ind w:left="425" w:hanging="425"/>
+            </w:pPr>
+            <w:r>
+              <w:rPr>
+                <w:color w:val="E8590C"/>
+              </w:rPr>
+              <w:t>•</w:t>
+            </w:r>
+            <w:r>
+              <w:tab/>
+            </w:r>
+            <w:r>
+              <w:t xml:space="preserve">Iets vergeten of wil je iets aanpassen? Dien geen tweede aanvraag in, maar kies </w:t>
+            </w:r>
+            <w:r>
+              <w:rPr>
+                <w:rFonts w:ascii="Area Normal Extrabold" w:hAnsi="Area Normal Extrabold"/>
+              </w:rPr>
+              <w:t xml:space="preserve">Iets aanvullen of wijzigen</w:t>
+            </w:r>
+            <w:r>
+              <w:t xml:space="preserve">.</w:t>
             </w:r>
           </w:p>
         </w:tc>
@@ -1900,6 +2051,164 @@
       <w:pPr>
         <w:spacing w:after="0" w:line="200" w:lineRule="exact"/>
       </w:pPr>
+    </w:p>
+    <w:p>
+      <w:pPr>
+        <w:keepNext/>
+        <w:tabs>
+          <w:tab w:val="left" w:pos="425"/>
+        </w:tabs>
+        <w:spacing w:after="120"/>
+        <w:ind w:left="425" w:hanging="425"/>
+      </w:pPr>
+      <w:r>
+        <w:rPr>
+          <w:color w:val="E8590C"/>
+        </w:rPr>
+        <w:t>•</w:t>
+      </w:r>
+      <w:r>
+        <w:tab/>
+      </w:r>
+      <w:r>
+        <w:t xml:space="preserve">Valt de eventdatum of deadline binnen </w:t>
+      </w:r>
+      <w:r>
+        <w:rPr>
+          <w:rFonts w:ascii="Area Normal Extrabold" w:hAnsi="Area Normal Extrabold"/>
+        </w:rPr>
+        <w:t xml:space="preserve">3 werkdagen</w:t>
+      </w:r>
+      <w:r>
+        <w:t xml:space="preserve">? Dan verschijnt er een </w:t>
+      </w:r>
+      <w:r>
+        <w:rPr>
+          <w:rFonts w:ascii="Area Normal Extrabold" w:hAnsi="Area Normal Extrabold"/>
+        </w:rPr>
+        <w:t xml:space="preserve">rode melding</w:t>
+      </w:r>
+      <w:r>
+        <w:t xml:space="preserve">. Vul het formulier verder in. Het marketingteam beoordeelt vervolgens wat er binnen de korte deadline haalbaar is.</w:t>
+      </w:r>
+    </w:p>
+    <w:p>
+      <w:pPr>
+        <w:keepNext/>
+        <w:tabs>
+          <w:tab w:val="left" w:pos="425"/>
+        </w:tabs>
+        <w:spacing w:after="120"/>
+        <w:ind w:left="425" w:hanging="425"/>
+      </w:pPr>
+      <w:r>
+        <w:rPr>
+          <w:color w:val="E8590C"/>
+        </w:rPr>
+        <w:t>•</w:t>
+      </w:r>
+      <w:r>
+        <w:tab/>
+      </w:r>
+      <w:r>
+        <w:t xml:space="preserve">Valt het event binnen </w:t>
+      </w:r>
+      <w:r>
+        <w:rPr>
+          <w:rFonts w:ascii="Area Normal Extrabold" w:hAnsi="Area Normal Extrabold"/>
+        </w:rPr>
+        <w:t xml:space="preserve">twee weken</w:t>
+      </w:r>
+      <w:r>
+        <w:t xml:space="preserve">? Dan verschijnt er een </w:t>
+      </w:r>
+      <w:r>
+        <w:rPr>
+          <w:rFonts w:ascii="Area Normal Extrabold" w:hAnsi="Area Normal Extrabold"/>
+        </w:rPr>
+        <w:t xml:space="preserve">oranje melding</w:t>
+      </w:r>
+      <w:r>
+        <w:t xml:space="preserve">. Drukwerk, zoals geprinte menukaarten, vlaggen, banners en roll-ups, is waarschijnlijk niet meer op tijd klaar.</w:t>
+      </w:r>
+    </w:p>
+    <w:p>
+      <w:pPr>
+        <w:tabs>
+          <w:tab w:val="left" w:pos="425"/>
+        </w:tabs>
+        <w:spacing w:after="120"/>
+        <w:ind w:left="425" w:hanging="425"/>
+      </w:pPr>
+      <w:r>
+        <w:rPr>
+          <w:color w:val="E8590C"/>
+        </w:rPr>
+        <w:t>•</w:t>
+      </w:r>
+      <w:r>
+        <w:tab/>
+      </w:r>
+      <w:r>
+        <w:t xml:space="preserve">Valt de deadline binnen </w:t>
+      </w:r>
+      <w:r>
+        <w:rPr>
+          <w:rFonts w:ascii="Area Normal Extrabold" w:hAnsi="Area Normal Extrabold"/>
+        </w:rPr>
+        <w:t xml:space="preserve">5 werkdagen</w:t>
+      </w:r>
+      <w:r>
+        <w:t xml:space="preserve">? Dan verschijnt er ook een melding. Je kunt de aanvraag verder invullen, maar stem de planning eerst even af met Marketing.</w:t>
+      </w:r>
+    </w:p>
+    <w:p>
+      <w:pPr>
+        <w:pStyle w:val="Kop1"/>
+        <w:keepNext/>
+        <w:spacing w:before="360"/>
+      </w:pPr>
+      <w:r>
+        <w:t xml:space="preserve">3  Een interne aanvraag</w:t>
+      </w:r>
+    </w:p>
+    <w:p>
+      <w:pPr>
+        <w:keepNext/>
+      </w:pPr>
+      <w:r>
+        <w:t xml:space="preserve">Gebruik deze optie voor aanvragen die niet aan een event gekoppeld zijn, zoals visitekaartjes of een poster voor de kantine. Selecteer de locatie en vul je naam in, zoals eerder beschreven. Kies vervolgens </w:t>
+      </w:r>
+      <w:r>
+        <w:rPr>
+          <w:rFonts w:ascii="Area Normal Extrabold" w:hAnsi="Area Normal Extrabold"/>
+        </w:rPr>
+        <w:t xml:space="preserve">Intern</w:t>
+      </w:r>
+      <w:r>
+        <w:t xml:space="preserve">. Je hoeft dan nog maar twee vragen te beantwoorden.</w:t>
+      </w:r>
+    </w:p>
+    <w:p>
+      <w:pPr>
+        <w:tabs>
+          <w:tab w:val="left" w:pos="425"/>
+        </w:tabs>
+        <w:spacing w:after="120"/>
+        <w:ind w:left="425" w:hanging="425"/>
+      </w:pPr>
+      <w:r>
+        <w:rPr>
+          <w:color w:val="E8590C"/>
+        </w:rPr>
+        <w:t>•</w:t>
+      </w:r>
+      <w:r>
+        <w:tab/>
+      </w:r>
+      <w:r>
+        <w:t xml:space="preserve">Beschrijf je aanvraag volledig in één keer. Vermeld wat je nodig hebt, het gewenste formaat, de teksten en voor wie het bedoeld is.</w:t>
+      </w:r>
     </w:p>
     <w:tbl>
       <w:tblPr>
@@ -1915,8 +2224,8 @@
         <w:tblLayout w:type="fixed"/>
       </w:tblPr>
       <w:tblGrid>
-        <w:gridCol w:w="5500"/>
-        <w:gridCol w:w="3515"/>
+        <w:gridCol w:w="4000"/>
+        <w:gridCol w:w="5015"/>
       </w:tblGrid>
       <w:tr>
         <w:trPr>
@@ -1924,7 +2233,7 @@
         </w:trPr>
         <w:tc>
           <w:tcPr>
-            <w:tcW w:w="5500" w:type="dxa"/>
+            <w:tcW w:w="4000" w:type="dxa"/>
             <w:tcMar>
               <w:top w:w="0" w:type="dxa"/>
               <w:left w:w="0" w:type="dxa"/>
@@ -1943,9 +2252,9 @@
               </w:rPr>
               <w:drawing>
                 <wp:inline distT="0" distB="0" distL="0" distR="0">
-                  <wp:extent cx="3492500" cy="2316691"/>
+                  <wp:extent cx="2540000" cy="1952413"/>
                   <wp:effectExtent l="0" t="0" r="0" b="0"/>
-                  <wp:docPr id="109" name="Afbeelding 109"/>
+                  <wp:docPr id="108" name="Afbeelding 108"/>
                   <wp:cNvGraphicFramePr>
                     <a:graphicFrameLocks xmlns:a="http://schemas.openxmlformats.org/drawingml/2006/main" noChangeAspect="1"/>
                   </wp:cNvGraphicFramePr>
@@ -1953,11 +2262,11 @@
                     <a:graphicData uri="http://schemas.openxmlformats.org/drawingml/2006/picture">
                       <pic:pic xmlns:pic="http://schemas.openxmlformats.org/drawingml/2006/picture">
                         <pic:nvPicPr>
-                          <pic:cNvPr id="0" name="g09-wensen.jpg"/>
+                          <pic:cNvPr id="0" name="g22-intern-deadline.jpg"/>
                           <pic:cNvPicPr/>
                         </pic:nvPicPr>
                         <pic:blipFill>
-                          <a:blip r:embed="rIdG9"/>
+                          <a:blip r:embed="rIdG8"/>
                           <a:stretch>
                             <a:fillRect/>
                           </a:stretch>
@@ -1965,7 +2274,7 @@
                         <pic:spPr>
                           <a:xfrm>
                             <a:off x="0" y="0"/>
-                            <a:ext cx="3492500" cy="2316691"/>
+                            <a:ext cx="2540000" cy="1952413"/>
                           </a:xfrm>
                           <a:prstGeom prst="rect">
                             <a:avLst/>
@@ -1981,7 +2290,7 @@
         </w:tc>
         <w:tc>
           <w:tcPr>
-            <w:tcW w:w="3515" w:type="dxa"/>
+            <w:tcW w:w="5015" w:type="dxa"/>
             <w:tcMar>
               <w:top w:w="120" w:type="dxa"/>
               <w:left w:w="240" w:type="dxa"/>
@@ -2010,7 +2319,7 @@
               <w:tab/>
             </w:r>
             <w:r>
-              <w:t xml:space="preserve">Vermeld alle informatie die Marketing nodig heeft, zoals teksten, sfeer en gewenste formaten. Gebruik Enter om een nieuwe regel te beginnen.</w:t>
+              <w:t xml:space="preserve">Geef aan wanneer je het nodig hebt.</w:t>
             </w:r>
           </w:p>
           <w:p>
@@ -2033,16 +2342,16 @@
               <w:tab/>
             </w:r>
             <w:r>
-              <w:t xml:space="preserve">Klik daarna op </w:t>
-            </w:r>
-            <w:r>
-              <w:rPr>
-                <w:rFonts w:ascii="Area Normal Extrabold" w:hAnsi="Area Normal Extrabold"/>
-              </w:rPr>
-              <w:t xml:space="preserve">Naar overzicht</w:t>
-            </w:r>
-            <w:r>
-              <w:t xml:space="preserve">.</w:t>
+              <w:t xml:space="preserve">Is er geen haast bij? Kies dan </w:t>
+            </w:r>
+            <w:r>
+              <w:rPr>
+                <w:rFonts w:ascii="Area Normal Extrabold" w:hAnsi="Area Normal Extrabold"/>
+              </w:rPr>
+              <w:t xml:space="preserve">Geen deadline</w:t>
+            </w:r>
+            <w:r>
+              <w:t xml:space="preserve">. Marketing plant de aanvraag dan in op een geschikt moment.</w:t>
             </w:r>
           </w:p>
           <w:p>
@@ -2063,7 +2372,16 @@
               <w:tab/>
             </w:r>
             <w:r>
-              <w:t xml:space="preserve">Wil je dat een collega een e-mail ontvangt zodra het design klaar is? Vul dan hier de naam en het e-mailadres van deze collega in.</w:t>
+              <w:t xml:space="preserve">Ontstaat er later alsnog een deadline? Geef dit dan door via </w:t>
+            </w:r>
+            <w:r>
+              <w:rPr>
+                <w:rFonts w:ascii="Area Normal Extrabold" w:hAnsi="Area Normal Extrabold"/>
+              </w:rPr>
+              <w:t xml:space="preserve">Iets aanvullen of wijzigen</w:t>
+            </w:r>
+            <w:r>
+              <w:t xml:space="preserve">.</w:t>
             </w:r>
           </w:p>
         </w:tc>
@@ -2073,6 +2391,81 @@
       <w:pPr>
         <w:spacing w:after="0" w:line="200" w:lineRule="exact"/>
       </w:pPr>
+    </w:p>
+    <w:p>
+      <w:pPr>
+        <w:pStyle w:val="Kop1"/>
+        <w:keepNext/>
+        <w:spacing w:before="360"/>
+      </w:pPr>
+      <w:r>
+        <w:t xml:space="preserve">4  Een menukaart of menuscherm</w:t>
+      </w:r>
+    </w:p>
+    <w:p>
+      <w:pPr>
+        <w:keepNext/>
+      </w:pPr>
+      <w:r>
+        <w:t xml:space="preserve">Selecteer bij </w:t>
+      </w:r>
+      <w:r>
+        <w:rPr>
+          <w:rFonts w:ascii="Area Normal Extrabold" w:hAnsi="Area Normal Extrabold"/>
+        </w:rPr>
+        <w:t xml:space="preserve">Wat wil je aanvragen?</w:t>
+      </w:r>
+      <w:r>
+        <w:t xml:space="preserve"> de optie </w:t>
+      </w:r>
+      <w:r>
+        <w:rPr>
+          <w:rFonts w:ascii="Area Normal Extrabold" w:hAnsi="Area Normal Extrabold"/>
+        </w:rPr>
+        <w:t xml:space="preserve">Menukaart print</w:t>
+      </w:r>
+      <w:r>
+        <w:t xml:space="preserve">, </w:t>
+      </w:r>
+      <w:r>
+        <w:rPr>
+          <w:rFonts w:ascii="Area Normal Extrabold" w:hAnsi="Area Normal Extrabold"/>
+        </w:rPr>
+        <w:t xml:space="preserve">Menu scherm</w:t>
+      </w:r>
+      <w:r>
+        <w:t xml:space="preserve"> of beide. Er verschijnt vervolgens een extra vraag: om welk menu gaat het?</w:t>
+      </w:r>
+    </w:p>
+    <w:p>
+      <w:pPr>
+        <w:tabs>
+          <w:tab w:val="left" w:pos="425"/>
+        </w:tabs>
+        <w:spacing w:after="120"/>
+        <w:ind w:left="425" w:hanging="425"/>
+      </w:pPr>
+      <w:r>
+        <w:rPr>
+          <w:color w:val="E8590C"/>
+        </w:rPr>
+        <w:t>•</w:t>
+      </w:r>
+      <w:r>
+        <w:tab/>
+      </w:r>
+      <w:r>
+        <w:t xml:space="preserve">Kies het gewenste </w:t>
+      </w:r>
+      <w:r>
+        <w:rPr>
+          <w:rFonts w:ascii="Area Normal Extrabold" w:hAnsi="Area Normal Extrabold"/>
+        </w:rPr>
+        <w:t xml:space="preserve">pakket</w:t>
+      </w:r>
+      <w:r>
+        <w:t xml:space="preserve">. Onder de pakketnaam zie je welke gangen zijn inbegrepen.</w:t>
+      </w:r>
     </w:p>
     <w:tbl>
       <w:tblPr>
@@ -2088,8 +2481,8 @@
         <w:tblLayout w:type="fixed"/>
       </w:tblPr>
       <w:tblGrid>
-        <w:gridCol w:w="5500"/>
-        <w:gridCol w:w="3515"/>
+        <w:gridCol w:w="4000"/>
+        <w:gridCol w:w="5015"/>
       </w:tblGrid>
       <w:tr>
         <w:trPr>
@@ -2097,7 +2490,7 @@
         </w:trPr>
         <w:tc>
           <w:tcPr>
-            <w:tcW w:w="5500" w:type="dxa"/>
+            <w:tcW w:w="4000" w:type="dxa"/>
             <w:tcMar>
               <w:top w:w="0" w:type="dxa"/>
               <w:left w:w="0" w:type="dxa"/>
@@ -2116,9 +2509,9 @@
               </w:rPr>
               <w:drawing>
                 <wp:inline distT="0" distB="0" distL="0" distR="0">
-                  <wp:extent cx="3492500" cy="2316691"/>
+                  <wp:extent cx="2540000" cy="1684866"/>
                   <wp:effectExtent l="0" t="0" r="0" b="0"/>
-                  <wp:docPr id="110" name="Afbeelding 110"/>
+                  <wp:docPr id="109" name="Afbeelding 109"/>
                   <wp:cNvGraphicFramePr>
                     <a:graphicFrameLocks xmlns:a="http://schemas.openxmlformats.org/drawingml/2006/main" noChangeAspect="1"/>
                   </wp:cNvGraphicFramePr>
@@ -2126,11 +2519,11 @@
                     <a:graphicData uri="http://schemas.openxmlformats.org/drawingml/2006/picture">
                       <pic:pic xmlns:pic="http://schemas.openxmlformats.org/drawingml/2006/picture">
                         <pic:nvPicPr>
-                          <pic:cNvPr id="0" name="g10-overzicht.jpg"/>
+                          <pic:cNvPr id="0" name="g32-menu-inhoud.jpg"/>
                           <pic:cNvPicPr/>
                         </pic:nvPicPr>
                         <pic:blipFill>
-                          <a:blip r:embed="rIdG10"/>
+                          <a:blip r:embed="rIdG9"/>
                           <a:stretch>
                             <a:fillRect/>
                           </a:stretch>
@@ -2138,7 +2531,7 @@
                         <pic:spPr>
                           <a:xfrm>
                             <a:off x="0" y="0"/>
-                            <a:ext cx="3492500" cy="2316691"/>
+                            <a:ext cx="2540000" cy="1684866"/>
                           </a:xfrm>
                           <a:prstGeom prst="rect">
                             <a:avLst/>
@@ -2154,7 +2547,7 @@
         </w:tc>
         <w:tc>
           <w:tcPr>
-            <w:tcW w:w="3515" w:type="dxa"/>
+            <w:tcW w:w="5015" w:type="dxa"/>
             <w:tcMar>
               <w:top w:w="120" w:type="dxa"/>
               <w:left w:w="240" w:type="dxa"/>
@@ -2183,16 +2576,13 @@
               <w:tab/>
             </w:r>
             <w:r>
-              <w:t xml:space="preserve">Wil je een antwoord aanpassen? Klik op </w:t>
-            </w:r>
-            <w:r>
-              <w:rPr>
-                <w:rFonts w:ascii="Area Normal Extrabold" w:hAnsi="Area Normal Extrabold"/>
-              </w:rPr>
-              <w:t xml:space="preserve">wijzig</w:t>
-            </w:r>
-            <w:r>
-              <w:t xml:space="preserve">. Je keert daarna terug naar het overzicht.</w:t>
+              <w:rPr>
+                <w:rFonts w:ascii="Area Normal Extrabold" w:hAnsi="Area Normal Extrabold"/>
+              </w:rPr>
+              <w:t xml:space="preserve">Wissel</w:t>
+            </w:r>
+            <w:r>
+              <w:t xml:space="preserve">: vervang een gerecht door een ander gerecht.</w:t>
             </w:r>
           </w:p>
           <w:p>
@@ -2215,16 +2605,131 @@
               <w:tab/>
             </w:r>
             <w:r>
-              <w:t xml:space="preserve">Klik op </w:t>
-            </w:r>
-            <w:r>
-              <w:rPr>
-                <w:rFonts w:ascii="Area Normal Extrabold" w:hAnsi="Area Normal Extrabold"/>
-              </w:rPr>
-              <w:t xml:space="preserve">Verstuur aanvraag</w:t>
-            </w:r>
-            <w:r>
-              <w:t xml:space="preserve"> om je aanvraag definitief in te dienen.</w:t>
+              <w:rPr>
+                <w:rFonts w:ascii="Area Normal Extrabold" w:hAnsi="Area Normal Extrabold"/>
+              </w:rPr>
+              <w:t xml:space="preserve">×</w:t>
+            </w:r>
+            <w:r>
+              <w:t xml:space="preserve">: verwijder een gerecht.</w:t>
+            </w:r>
+          </w:p>
+          <w:p>
+            <w:pPr>
+              <w:tabs>
+                <w:tab w:val="left" w:pos="425"/>
+              </w:tabs>
+              <w:spacing w:after="120"/>
+              <w:ind w:left="425" w:hanging="425"/>
+            </w:pPr>
+            <w:r>
+              <w:rPr>
+                <w:rFonts w:ascii="Area Normal Extrabold" w:hAnsi="Area Normal Extrabold"/>
+                <w:color w:val="E8590C"/>
+                <w:sz w:val="22"/>
+              </w:rPr>
+              <w:t>3</w:t>
+            </w:r>
+            <w:r>
+              <w:tab/>
+            </w:r>
+            <w:r>
+              <w:rPr>
+                <w:rFonts w:ascii="Area Normal Extrabold" w:hAnsi="Area Normal Extrabold"/>
+              </w:rPr>
+              <w:t xml:space="preserve">+ Gerecht toevoegen</w:t>
+            </w:r>
+            <w:r>
+              <w:t xml:space="preserve">: voeg een extra gerecht toe.</w:t>
+            </w:r>
+          </w:p>
+          <w:p>
+            <w:pPr>
+              <w:tabs>
+                <w:tab w:val="left" w:pos="425"/>
+              </w:tabs>
+              <w:spacing w:after="120"/>
+              <w:ind w:left="425" w:hanging="425"/>
+            </w:pPr>
+            <w:r>
+              <w:rPr>
+                <w:rFonts w:ascii="Area Normal Extrabold" w:hAnsi="Area Normal Extrabold"/>
+                <w:color w:val="E8590C"/>
+                <w:sz w:val="22"/>
+              </w:rPr>
+              <w:t>4</w:t>
+            </w:r>
+            <w:r>
+              <w:tab/>
+            </w:r>
+            <w:r>
+              <w:rPr>
+                <w:rFonts w:ascii="Area Normal Extrabold" w:hAnsi="Area Normal Extrabold"/>
+              </w:rPr>
+              <w:t xml:space="preserve">Pakket wijzigen</w:t>
+            </w:r>
+            <w:r>
+              <w:t xml:space="preserve">: kies een ander pakket.</w:t>
+            </w:r>
+          </w:p>
+          <w:p>
+            <w:pPr>
+              <w:tabs>
+                <w:tab w:val="left" w:pos="425"/>
+              </w:tabs>
+              <w:spacing w:after="120"/>
+              <w:ind w:left="425" w:hanging="425"/>
+            </w:pPr>
+            <w:r>
+              <w:rPr>
+                <w:color w:val="E8590C"/>
+              </w:rPr>
+              <w:t>•</w:t>
+            </w:r>
+            <w:r>
+              <w:tab/>
+            </w:r>
+            <w:r>
+              <w:t xml:space="preserve">Selecteer de gerechten uit de lijst. Voer je zelf een gerecht in? Dan verschijnt er een melding en beoordeelt Marketing de invoer.</w:t>
+            </w:r>
+          </w:p>
+          <w:p>
+            <w:pPr>
+              <w:tabs>
+                <w:tab w:val="left" w:pos="425"/>
+              </w:tabs>
+              <w:spacing w:after="120"/>
+              <w:ind w:left="425" w:hanging="425"/>
+            </w:pPr>
+            <w:r>
+              <w:rPr>
+                <w:color w:val="E8590C"/>
+              </w:rPr>
+              <w:t>•</w:t>
+            </w:r>
+            <w:r>
+              <w:tab/>
+            </w:r>
+            <w:r>
+              <w:t xml:space="preserve">Menu later aanpassen? Kies dan </w:t>
+            </w:r>
+            <w:r>
+              <w:rPr>
+                <w:rFonts w:ascii="Area Normal Extrabold" w:hAnsi="Area Normal Extrabold"/>
+              </w:rPr>
+              <w:t xml:space="preserve">Menu aanpassen</w:t>
+            </w:r>
+            <w:r>
+              <w:t xml:space="preserve"> via </w:t>
+            </w:r>
+            <w:r>
+              <w:rPr>
+                <w:rFonts w:ascii="Area Normal Extrabold" w:hAnsi="Area Normal Extrabold"/>
+              </w:rPr>
+              <w:t xml:space="preserve">Iets aanvullen of wijzigen</w:t>
+            </w:r>
+            <w:r>
+              <w:t xml:space="preserve">.</w:t>
             </w:r>
           </w:p>
         </w:tc>
@@ -2234,6 +2739,33 @@
       <w:pPr>
         <w:spacing w:after="0" w:line="200" w:lineRule="exact"/>
       </w:pPr>
+    </w:p>
+    <w:p>
+      <w:pPr>
+        <w:pStyle w:val="Kop1"/>
+        <w:keepNext/>
+        <w:spacing w:before="360"/>
+      </w:pPr>
+      <w:r>
+        <w:t xml:space="preserve">5  Je design is klaar</w:t>
+      </w:r>
+    </w:p>
+    <w:p>
+      <w:pPr>
+        <w:keepNext/>
+      </w:pPr>
+      <w:r>
+        <w:t xml:space="preserve">Zodra je design klaar is, ontvang je een e-mail van </w:t>
+      </w:r>
+      <w:r>
+        <w:rPr>
+          <w:rFonts w:ascii="Area Normal Extrabold" w:hAnsi="Area Normal Extrabold"/>
+        </w:rPr>
+        <w:t xml:space="preserve">Designaanvraag</w:t>
+      </w:r>
+      <w:r>
+        <w:t xml:space="preserve"> (designaanvraag@nbcevents.nl).</w:t>
+      </w:r>
     </w:p>
     <w:tbl>
       <w:tblPr>
@@ -2249,8 +2781,8 @@
         <w:tblLayout w:type="fixed"/>
       </w:tblPr>
       <w:tblGrid>
-        <w:gridCol w:w="5500"/>
-        <w:gridCol w:w="3515"/>
+        <w:gridCol w:w="3300"/>
+        <w:gridCol w:w="5715"/>
       </w:tblGrid>
       <w:tr>
         <w:trPr>
@@ -2258,7 +2790,7 @@
         </w:trPr>
         <w:tc>
           <w:tcPr>
-            <w:tcW w:w="5500" w:type="dxa"/>
+            <w:tcW w:w="3300" w:type="dxa"/>
             <w:tcMar>
               <w:top w:w="0" w:type="dxa"/>
               <w:left w:w="0" w:type="dxa"/>
@@ -2277,9 +2809,9 @@
               </w:rPr>
               <w:drawing>
                 <wp:inline distT="0" distB="0" distL="0" distR="0">
-                  <wp:extent cx="3492500" cy="2316691"/>
+                  <wp:extent cx="2095500" cy="2327910"/>
                   <wp:effectExtent l="0" t="0" r="0" b="0"/>
-                  <wp:docPr id="111" name="Afbeelding 111"/>
+                  <wp:docPr id="110" name="Afbeelding 110"/>
                   <wp:cNvGraphicFramePr>
                     <a:graphicFrameLocks xmlns:a="http://schemas.openxmlformats.org/drawingml/2006/main" noChangeAspect="1"/>
                   </wp:cNvGraphicFramePr>
@@ -2287,11 +2819,11 @@
                     <a:graphicData uri="http://schemas.openxmlformats.org/drawingml/2006/picture">
                       <pic:pic xmlns:pic="http://schemas.openxmlformats.org/drawingml/2006/picture">
                         <pic:nvPicPr>
-                          <pic:cNvPr id="0" name="g11-gelukt.jpg"/>
+                          <pic:cNvPr id="0" name="g50-mail.jpg"/>
                           <pic:cNvPicPr/>
                         </pic:nvPicPr>
                         <pic:blipFill>
-                          <a:blip r:embed="rIdG11"/>
+                          <a:blip r:embed="rIdG10"/>
                           <a:stretch>
                             <a:fillRect/>
                           </a:stretch>
@@ -2299,7 +2831,7 @@
                         <pic:spPr>
                           <a:xfrm>
                             <a:off x="0" y="0"/>
-                            <a:ext cx="3492500" cy="2316691"/>
+                            <a:ext cx="2095500" cy="2327910"/>
                           </a:xfrm>
                           <a:prstGeom prst="rect">
                             <a:avLst/>
@@ -2315,7 +2847,7 @@
         </w:tc>
         <w:tc>
           <w:tcPr>
-            <w:tcW w:w="3515" w:type="dxa"/>
+            <w:tcW w:w="5715" w:type="dxa"/>
             <w:tcMar>
               <w:top w:w="120" w:type="dxa"/>
               <w:left w:w="240" w:type="dxa"/>
@@ -2344,7 +2876,25 @@
               <w:tab/>
             </w:r>
             <w:r>
-              <w:t xml:space="preserve">Je aanvraag is nu ingediend bij Marketing.</w:t>
+              <w:t xml:space="preserve">Herken de juiste e-mail aan het onderwerp. Dit begint met </w:t>
+            </w:r>
+            <w:r>
+              <w:rPr>
+                <w:rFonts w:ascii="Area Normal Extrabold" w:hAnsi="Area Normal Extrabold"/>
+              </w:rPr>
+              <w:t xml:space="preserve">Klaar</w:t>
+            </w:r>
+            <w:r>
+              <w:t xml:space="preserve">, gevolgd door de naam van het event en wat je hebt aangevraagd. Bij een nieuwe versie staat er bijvoorbeeld </w:t>
+            </w:r>
+            <w:r>
+              <w:rPr>
+                <w:rFonts w:ascii="Area Normal Extrabold" w:hAnsi="Area Normal Extrabold"/>
+              </w:rPr>
+              <w:t xml:space="preserve">Versie 2 klaar</w:t>
+            </w:r>
+            <w:r>
+              <w:t xml:space="preserve">.</w:t>
             </w:r>
           </w:p>
           <w:p>
@@ -2367,7 +2917,7 @@
               <w:tab/>
             </w:r>
             <w:r>
-              <w:t xml:space="preserve">De huisstijl wordt op de achtergrond opgehaald; je hoeft hier niet op te wachten en kunt het venster sluiten.</w:t>
+              <w:t xml:space="preserve">Download je bestanden uit de e-mail. De bestanden zijn als bijlage toegevoegd. Grote drukbestanden staan op de schijf. Marketing vermeldt in de e-mail waar je deze kunt vinden.</w:t>
             </w:r>
           </w:p>
           <w:p>
@@ -2380,45 +2930,26 @@
             </w:pPr>
             <w:r>
               <w:rPr>
+                <w:rFonts w:ascii="Area Normal Extrabold" w:hAnsi="Area Normal Extrabold"/>
                 <w:color w:val="E8590C"/>
-              </w:rPr>
-              <w:t>•</w:t>
+                <w:sz w:val="22"/>
+              </w:rPr>
+              <w:t>3</w:t>
             </w:r>
             <w:r>
               <w:tab/>
             </w:r>
             <w:r>
-              <w:t xml:space="preserve">Is het erg krap? Dan herinnert het formulier je eraan om contact op te nemen met Marketing.</w:t>
-            </w:r>
-          </w:p>
-          <w:p>
-            <w:pPr>
-              <w:tabs>
-                <w:tab w:val="left" w:pos="425"/>
-              </w:tabs>
-              <w:spacing w:after="120"/>
-              <w:ind w:left="425" w:hanging="425"/>
-            </w:pPr>
-            <w:r>
-              <w:rPr>
-                <w:color w:val="E8590C"/>
-              </w:rPr>
-              <w:t>•</w:t>
-            </w:r>
-            <w:r>
-              <w:tab/>
-            </w:r>
-            <w:r>
-              <w:t xml:space="preserve">Iets vergeten of wil je iets aanpassen? Dien geen tweede aanvraag in, maar kies </w:t>
-            </w:r>
-            <w:r>
-              <w:rPr>
-                <w:rFonts w:ascii="Area Normal Extrabold" w:hAnsi="Area Normal Extrabold"/>
-              </w:rPr>
-              <w:t xml:space="preserve">Iets aanvullen of wijzigen</w:t>
-            </w:r>
-            <w:r>
-              <w:t xml:space="preserve">.</w:t>
+              <w:t xml:space="preserve">Wil je iets aanpassen? Klik dan op </w:t>
+            </w:r>
+            <w:r>
+              <w:rPr>
+                <w:rFonts w:ascii="Area Normal Extrabold" w:hAnsi="Area Normal Extrabold"/>
+              </w:rPr>
+              <w:t xml:space="preserve">Feedback geven</w:t>
+            </w:r>
+            <w:r>
+              <w:t xml:space="preserve"> in de e-mail. Beantwoord de e-mail niet rechtstreeks, maar gebruik altijd deze knop. Zo wordt je feedback automatisch aan de juiste aanvraag gekoppeld.</w:t>
             </w:r>
           </w:p>
         </w:tc>
@@ -2443,8 +2974,8 @@
         <w:tblLayout w:type="fixed"/>
       </w:tblPr>
       <w:tblGrid>
-        <w:gridCol w:w="5500"/>
-        <w:gridCol w:w="3515"/>
+        <w:gridCol w:w="4000"/>
+        <w:gridCol w:w="5015"/>
       </w:tblGrid>
       <w:tr>
         <w:trPr>
@@ -2452,7 +2983,7 @@
         </w:trPr>
         <w:tc>
           <w:tcPr>
-            <w:tcW w:w="5500" w:type="dxa"/>
+            <w:tcW w:w="4000" w:type="dxa"/>
             <w:tcMar>
               <w:top w:w="0" w:type="dxa"/>
               <w:left w:w="0" w:type="dxa"/>
@@ -2471,9 +3002,9 @@
               </w:rPr>
               <w:drawing>
                 <wp:inline distT="0" distB="0" distL="0" distR="0">
-                  <wp:extent cx="3492500" cy="2579793"/>
+                  <wp:extent cx="2540000" cy="1684866"/>
                   <wp:effectExtent l="0" t="0" r="0" b="0"/>
-                  <wp:docPr id="112" name="Afbeelding 112"/>
+                  <wp:docPr id="111" name="Afbeelding 111"/>
                   <wp:cNvGraphicFramePr>
                     <a:graphicFrameLocks xmlns:a="http://schemas.openxmlformats.org/drawingml/2006/main" noChangeAspect="1"/>
                   </wp:cNvGraphicFramePr>
@@ -2481,11 +3012,11 @@
                     <a:graphicData uri="http://schemas.openxmlformats.org/drawingml/2006/picture">
                       <pic:pic xmlns:pic="http://schemas.openxmlformats.org/drawingml/2006/picture">
                         <pic:nvPicPr>
-                          <pic:cNvPr id="0" name="g04-oranje.jpg"/>
+                          <pic:cNvPr id="0" name="g51-feedback.jpg"/>
                           <pic:cNvPicPr/>
                         </pic:nvPicPr>
                         <pic:blipFill>
-                          <a:blip r:embed="rIdG12"/>
+                          <a:blip r:embed="rIdG11"/>
                           <a:stretch>
                             <a:fillRect/>
                           </a:stretch>
@@ -2493,7 +3024,7 @@
                         <pic:spPr>
                           <a:xfrm>
                             <a:off x="0" y="0"/>
-                            <a:ext cx="3492500" cy="2579793"/>
+                            <a:ext cx="2540000" cy="1684866"/>
                           </a:xfrm>
                           <a:prstGeom prst="rect">
                             <a:avLst/>
@@ -2509,7 +3040,7 @@
         </w:tc>
         <w:tc>
           <w:tcPr>
-            <w:tcW w:w="3515" w:type="dxa"/>
+            <w:tcW w:w="5015" w:type="dxa"/>
             <w:tcMar>
               <w:top w:w="120" w:type="dxa"/>
               <w:left w:w="240" w:type="dxa"/>
@@ -2528,33 +3059,17 @@
             </w:pPr>
             <w:r>
               <w:rPr>
+                <w:rFonts w:ascii="Area Normal Extrabold" w:hAnsi="Area Normal Extrabold"/>
                 <w:color w:val="E8590C"/>
-              </w:rPr>
-              <w:t>•</w:t>
+                <w:sz w:val="22"/>
+              </w:rPr>
+              <w:t>1</w:t>
             </w:r>
             <w:r>
               <w:tab/>
             </w:r>
             <w:r>
-              <w:t xml:space="preserve">Valt de eventdatum of deadline binnen </w:t>
-            </w:r>
-            <w:r>
-              <w:rPr>
-                <w:rFonts w:ascii="Area Normal Extrabold" w:hAnsi="Area Normal Extrabold"/>
-              </w:rPr>
-              <w:t xml:space="preserve">3 werkdagen</w:t>
-            </w:r>
-            <w:r>
-              <w:t xml:space="preserve">? Dan verschijnt er een </w:t>
-            </w:r>
-            <w:r>
-              <w:rPr>
-                <w:rFonts w:ascii="Area Normal Extrabold" w:hAnsi="Area Normal Extrabold"/>
-              </w:rPr>
-              <w:t xml:space="preserve">rode melding</w:t>
-            </w:r>
-            <w:r>
-              <w:t xml:space="preserve">. Vul het formulier verder in. Het marketingteam beoordeelt vervolgens wat er binnen de korte deadline haalbaar is.</w:t>
+              <w:t xml:space="preserve">Je aanvraag is al geselecteerd wanneer het formulier opent. Je hoeft dus niet opnieuw te zoeken.</w:t>
             </w:r>
           </w:p>
           <w:p>
@@ -2571,31 +3086,22 @@
                 <w:color w:val="E8590C"/>
                 <w:sz w:val="22"/>
               </w:rPr>
-              <w:t>1</w:t>
+              <w:t>2</w:t>
             </w:r>
             <w:r>
               <w:tab/>
             </w:r>
             <w:r>
-              <w:t xml:space="preserve">Valt het event binnen </w:t>
-            </w:r>
-            <w:r>
-              <w:rPr>
-                <w:rFonts w:ascii="Area Normal Extrabold" w:hAnsi="Area Normal Extrabold"/>
-              </w:rPr>
-              <w:t xml:space="preserve">twee weken</w:t>
-            </w:r>
-            <w:r>
-              <w:t xml:space="preserve">? Dan verschijnt er een </w:t>
-            </w:r>
-            <w:r>
-              <w:rPr>
-                <w:rFonts w:ascii="Area Normal Extrabold" w:hAnsi="Area Normal Extrabold"/>
-              </w:rPr>
-              <w:t xml:space="preserve">oranje melding</w:t>
-            </w:r>
-            <w:r>
-              <w:t xml:space="preserve">. Drukwerk, zoals geprinte menukaarten, vlaggen, banners en roll-ups, is waarschijnlijk niet meer op tijd klaar.</w:t>
+              <w:t xml:space="preserve">Selecteer je naam en klik op </w:t>
+            </w:r>
+            <w:r>
+              <w:rPr>
+                <w:rFonts w:ascii="Area Normal Extrabold" w:hAnsi="Area Normal Extrabold"/>
+              </w:rPr>
+              <w:t xml:space="preserve">Volgende</w:t>
+            </w:r>
+            <w:r>
+              <w:t xml:space="preserve">.</w:t>
             </w:r>
           </w:p>
           <w:p>
@@ -2616,16 +3122,37 @@
               <w:tab/>
             </w:r>
             <w:r>
-              <w:t xml:space="preserve">Valt de deadline binnen </w:t>
-            </w:r>
-            <w:r>
-              <w:rPr>
-                <w:rFonts w:ascii="Area Normal Extrabold" w:hAnsi="Area Normal Extrabold"/>
-              </w:rPr>
-              <w:t xml:space="preserve">5 werkdagen</w:t>
-            </w:r>
-            <w:r>
-              <w:t xml:space="preserve">? Dan verschijnt er ook een melding. Je kunt de aanvraag verder invullen, maar stem de planning eerst even af met Marketing.</w:t>
+              <w:t xml:space="preserve">Geef je feedback zo volledig mogelijk door en voeg indien nodig bestanden toe. Je kunt ook een nieuwe deadline doorgeven of een ander menu kiezen. Dit werkt op dezelfde manier als eerder beschreven.</w:t>
+            </w:r>
+          </w:p>
+          <w:p>
+            <w:pPr>
+              <w:tabs>
+                <w:tab w:val="left" w:pos="425"/>
+              </w:tabs>
+              <w:spacing w:after="120"/>
+              <w:ind w:left="425" w:hanging="425"/>
+            </w:pPr>
+            <w:r>
+              <w:rPr>
+                <w:color w:val="E8590C"/>
+              </w:rPr>
+              <w:t>•</w:t>
+            </w:r>
+            <w:r>
+              <w:tab/>
+            </w:r>
+            <w:r>
+              <w:t xml:space="preserve">Zodra je feedback is verwerkt, ontvang je opnieuw een e-mail. Hierin vind je de aangepaste versie, bijvoorbeeld met het onderwerp </w:t>
+            </w:r>
+            <w:r>
+              <w:rPr>
+                <w:rFonts w:ascii="Area Normal Extrabold" w:hAnsi="Area Normal Extrabold"/>
+              </w:rPr>
+              <w:t xml:space="preserve">Versie 2 klaar</w:t>
+            </w:r>
+            <w:r>
+              <w:t xml:space="preserve">.</w:t>
             </w:r>
           </w:p>
         </w:tc>
@@ -2639,18 +3166,37 @@
     <w:p>
       <w:pPr>
         <w:pStyle w:val="Kop1"/>
-        <w:pageBreakBefore/>
-      </w:pPr>
-      <w:r>
-        <w:t xml:space="preserve">3  Een interne aanvraag</w:t>
-      </w:r>
-    </w:p>
-    <w:p>
-      <w:pPr>
         <w:keepNext/>
-      </w:pPr>
-      <w:r>
-        <w:t xml:space="preserve">Gebruik deze optie voor aanvragen die niet aan een event gekoppeld zijn, zoals visitekaartjes of een poster voor de kantine. Selecteer de locatie en vul je naam in, zoals eerder beschreven. Kies vervolgens </w:t>
+        <w:spacing w:before="360"/>
+      </w:pPr>
+      <w:r>
+        <w:t xml:space="preserve">6  Aanvullen of wijzigen</w:t>
+      </w:r>
+    </w:p>
+    <w:p>
+      <w:pPr>
+        <w:keepNext/>
+      </w:pPr>
+      <w:r>
+        <w:t xml:space="preserve">Iets vergeten, een extra design nodig of is de datum gewijzigd? Pas dan je bestaande aanvraag aan. Klik op het startscherm op </w:t>
+      </w:r>
+      <w:r>
+        <w:rPr>
+          <w:rFonts w:ascii="Area Normal Extrabold" w:hAnsi="Area Normal Extrabold"/>
+        </w:rPr>
+        <w:t xml:space="preserve">Iets aanvullen of wijzigen</w:t>
+      </w:r>
+      <w:r>
+        <w:t xml:space="preserve"> en kies voor </w:t>
+      </w:r>
+      <w:r>
+        <w:rPr>
+          <w:rFonts w:ascii="Area Normal Extrabold" w:hAnsi="Area Normal Extrabold"/>
+        </w:rPr>
+        <w:t xml:space="preserve">Voor een evenement</w:t>
+      </w:r>
+      <w:r>
+        <w:t xml:space="preserve"> of </w:t>
       </w:r>
       <w:r>
         <w:rPr>
@@ -2659,7 +3205,7 @@
         <w:t xml:space="preserve">Intern</w:t>
       </w:r>
       <w:r>
-        <w:t xml:space="preserve">. Je hoeft dan nog maar twee vragen te beantwoorden.</w:t>
+        <w:t xml:space="preserve">.</w:t>
       </w:r>
     </w:p>
     <w:tbl>
@@ -2676,8 +3222,8 @@
         <w:tblLayout w:type="fixed"/>
       </w:tblPr>
       <w:tblGrid>
-        <w:gridCol w:w="5500"/>
-        <w:gridCol w:w="3515"/>
+        <w:gridCol w:w="4000"/>
+        <w:gridCol w:w="5015"/>
       </w:tblGrid>
       <w:tr>
         <w:trPr>
@@ -2685,7 +3231,7 @@
         </w:trPr>
         <w:tc>
           <w:tcPr>
-            <w:tcW w:w="5500" w:type="dxa"/>
+            <w:tcW w:w="4000" w:type="dxa"/>
             <w:tcMar>
               <w:top w:w="0" w:type="dxa"/>
               <w:left w:w="0" w:type="dxa"/>
@@ -2704,9 +3250,9 @@
               </w:rPr>
               <w:drawing>
                 <wp:inline distT="0" distB="0" distL="0" distR="0">
-                  <wp:extent cx="3492500" cy="2316691"/>
+                  <wp:extent cx="2540000" cy="1684866"/>
                   <wp:effectExtent l="0" t="0" r="0" b="0"/>
-                  <wp:docPr id="113" name="Afbeelding 113"/>
+                  <wp:docPr id="112" name="Afbeelding 112"/>
                   <wp:cNvGraphicFramePr>
                     <a:graphicFrameLocks xmlns:a="http://schemas.openxmlformats.org/drawingml/2006/main" noChangeAspect="1"/>
                   </wp:cNvGraphicFramePr>
@@ -2714,11 +3260,11 @@
                     <a:graphicData uri="http://schemas.openxmlformats.org/drawingml/2006/picture">
                       <pic:pic xmlns:pic="http://schemas.openxmlformats.org/drawingml/2006/picture">
                         <pic:nvPicPr>
-                          <pic:cNvPr id="0" name="g21-intern-wens.jpg"/>
+                          <pic:cNvPr id="0" name="g40-aanv-zoek.jpg"/>
                           <pic:cNvPicPr/>
                         </pic:nvPicPr>
                         <pic:blipFill>
-                          <a:blip r:embed="rIdG13"/>
+                          <a:blip r:embed="rIdG12"/>
                           <a:stretch>
                             <a:fillRect/>
                           </a:stretch>
@@ -2726,7 +3272,7 @@
                         <pic:spPr>
                           <a:xfrm>
                             <a:off x="0" y="0"/>
-                            <a:ext cx="3492500" cy="2316691"/>
+                            <a:ext cx="2540000" cy="1684866"/>
                           </a:xfrm>
                           <a:prstGeom prst="rect">
                             <a:avLst/>
@@ -2742,7 +3288,7 @@
         </w:tc>
         <w:tc>
           <w:tcPr>
-            <w:tcW w:w="3515" w:type="dxa"/>
+            <w:tcW w:w="5015" w:type="dxa"/>
             <w:tcMar>
               <w:top w:w="120" w:type="dxa"/>
               <w:left w:w="240" w:type="dxa"/>
@@ -2771,7 +3317,72 @@
               <w:tab/>
             </w:r>
             <w:r>
-              <w:t xml:space="preserve">Beschrijf je aanvraag volledig in één keer. Vermeld wat je nodig hebt, het gewenste formaat, de teksten en voor wie het bedoeld is.</w:t>
+              <w:t xml:space="preserve">Zoek de juiste aanvraag. Typ minimaal drie letters van de eventnaam…</w:t>
+            </w:r>
+          </w:p>
+          <w:p>
+            <w:pPr>
+              <w:tabs>
+                <w:tab w:val="left" w:pos="425"/>
+              </w:tabs>
+              <w:spacing w:after="120"/>
+              <w:ind w:left="425" w:hanging="425"/>
+            </w:pPr>
+            <w:r>
+              <w:rPr>
+                <w:rFonts w:ascii="Area Normal Extrabold" w:hAnsi="Area Normal Extrabold"/>
+                <w:color w:val="E8590C"/>
+                <w:sz w:val="22"/>
+              </w:rPr>
+              <w:t>2</w:t>
+            </w:r>
+            <w:r>
+              <w:tab/>
+            </w:r>
+            <w:r>
+              <w:t xml:space="preserve">…en selecteer de juiste aanvraag. Je ziet aanvragen van de afgelopen vier maanden, ook die van collega’s.</w:t>
+            </w:r>
+          </w:p>
+          <w:p>
+            <w:pPr>
+              <w:tabs>
+                <w:tab w:val="left" w:pos="425"/>
+              </w:tabs>
+              <w:spacing w:after="120"/>
+              <w:ind w:left="425" w:hanging="425"/>
+            </w:pPr>
+            <w:r>
+              <w:rPr>
+                <w:color w:val="E8590C"/>
+              </w:rPr>
+              <w:t>•</w:t>
+            </w:r>
+            <w:r>
+              <w:tab/>
+            </w:r>
+            <w:r>
+              <w:t xml:space="preserve">Vul daarna je naam in, zodat Marketing weet wie de wijziging doorgeeft.</w:t>
+            </w:r>
+          </w:p>
+          <w:p>
+            <w:pPr>
+              <w:tabs>
+                <w:tab w:val="left" w:pos="425"/>
+              </w:tabs>
+              <w:spacing w:after="120"/>
+              <w:ind w:left="425" w:hanging="425"/>
+            </w:pPr>
+            <w:r>
+              <w:rPr>
+                <w:color w:val="E8590C"/>
+              </w:rPr>
+              <w:t>•</w:t>
+            </w:r>
+            <w:r>
+              <w:tab/>
+            </w:r>
+            <w:r>
+              <w:t xml:space="preserve">Bij een interne aanvraag vul je eerst je naam in en selecteer je de gewenste aanvraag uit je eigen aanvragen.</w:t>
             </w:r>
           </w:p>
         </w:tc>
@@ -2796,8 +3407,8 @@
         <w:tblLayout w:type="fixed"/>
       </w:tblPr>
       <w:tblGrid>
-        <w:gridCol w:w="5500"/>
-        <w:gridCol w:w="3515"/>
+        <w:gridCol w:w="4000"/>
+        <w:gridCol w:w="5015"/>
       </w:tblGrid>
       <w:tr>
         <w:trPr>
@@ -2805,7 +3416,7 @@
         </w:trPr>
         <w:tc>
           <w:tcPr>
-            <w:tcW w:w="5500" w:type="dxa"/>
+            <w:tcW w:w="4000" w:type="dxa"/>
             <w:tcMar>
               <w:top w:w="0" w:type="dxa"/>
               <w:left w:w="0" w:type="dxa"/>
@@ -2824,9 +3435,9 @@
               </w:rPr>
               <w:drawing>
                 <wp:inline distT="0" distB="0" distL="0" distR="0">
-                  <wp:extent cx="3492500" cy="2684568"/>
+                  <wp:extent cx="2540000" cy="1684866"/>
                   <wp:effectExtent l="0" t="0" r="0" b="0"/>
-                  <wp:docPr id="114" name="Afbeelding 114"/>
+                  <wp:docPr id="113" name="Afbeelding 113"/>
                   <wp:cNvGraphicFramePr>
                     <a:graphicFrameLocks xmlns:a="http://schemas.openxmlformats.org/drawingml/2006/main" noChangeAspect="1"/>
                   </wp:cNvGraphicFramePr>
@@ -2834,11 +3445,11 @@
                     <a:graphicData uri="http://schemas.openxmlformats.org/drawingml/2006/picture">
                       <pic:pic xmlns:pic="http://schemas.openxmlformats.org/drawingml/2006/picture">
                         <pic:nvPicPr>
-                          <pic:cNvPr id="0" name="g22-intern-deadline.jpg"/>
+                          <pic:cNvPr id="0" name="g41-aanv-wat.jpg"/>
                           <pic:cNvPicPr/>
                         </pic:nvPicPr>
                         <pic:blipFill>
-                          <a:blip r:embed="rIdG14"/>
+                          <a:blip r:embed="rIdG13"/>
                           <a:stretch>
                             <a:fillRect/>
                           </a:stretch>
@@ -2846,7 +3457,7 @@
                         <pic:spPr>
                           <a:xfrm>
                             <a:off x="0" y="0"/>
-                            <a:ext cx="3492500" cy="2684568"/>
+                            <a:ext cx="2540000" cy="1684866"/>
                           </a:xfrm>
                           <a:prstGeom prst="rect">
                             <a:avLst/>
@@ -2862,7 +3473,7 @@
         </w:tc>
         <w:tc>
           <w:tcPr>
-            <w:tcW w:w="3515" w:type="dxa"/>
+            <w:tcW w:w="5015" w:type="dxa"/>
             <w:tcMar>
               <w:top w:w="120" w:type="dxa"/>
               <w:left w:w="240" w:type="dxa"/>
@@ -2891,7 +3502,7 @@
               <w:tab/>
             </w:r>
             <w:r>
-              <w:t xml:space="preserve">Geef aan wanneer je het nodig hebt.</w:t>
+              <w:t xml:space="preserve">Beschrijf wat je wilt aanvullen of wijzigen. Geef duidelijk aan wat erbij moet of wat er anders moet. Marketing ontvangt direct bericht van je wijziging.</w:t>
             </w:r>
           </w:p>
           <w:p>
@@ -2914,16 +3525,7 @@
               <w:tab/>
             </w:r>
             <w:r>
-              <w:t xml:space="preserve">Is er geen haast bij? Kies dan </w:t>
-            </w:r>
-            <w:r>
-              <w:rPr>
-                <w:rFonts w:ascii="Area Normal Extrabold" w:hAnsi="Area Normal Extrabold"/>
-              </w:rPr>
-              <w:t xml:space="preserve">Geen deadline</w:t>
-            </w:r>
-            <w:r>
-              <w:t xml:space="preserve">. Marketing plant de aanvraag dan in op een geschikt moment.</w:t>
+              <w:t xml:space="preserve">Je kunt ook bestanden toevoegen.</w:t>
             </w:r>
           </w:p>
           <w:p>
@@ -2936,7 +3538,36 @@
             </w:pPr>
             <w:r>
               <w:rPr>
+                <w:rFonts w:ascii="Area Normal Extrabold" w:hAnsi="Area Normal Extrabold"/>
                 <w:color w:val="E8590C"/>
+                <w:sz w:val="22"/>
+              </w:rPr>
+              <w:t>3</w:t>
+            </w:r>
+            <w:r>
+              <w:tab/>
+            </w:r>
+            <w:r>
+              <w:rPr>
+                <w:rFonts w:ascii="Area Normal Extrabold" w:hAnsi="Area Normal Extrabold"/>
+              </w:rPr>
+              <w:t xml:space="preserve">Menu aanpassen</w:t>
+            </w:r>
+            <w:r>
+              <w:t xml:space="preserve"> is alleen beschikbaar bij aanvragen voor een menukaart of menuscherm. Je krijgt dan hetzelfde menuoverzicht als in hoofdstuk 4, met het huidige menu al ingevuld. Pas aan wat nodig is.</w:t>
+            </w:r>
+          </w:p>
+          <w:p>
+            <w:pPr>
+              <w:tabs>
+                <w:tab w:val="left" w:pos="425"/>
+              </w:tabs>
+              <w:spacing w:after="120"/>
+              <w:ind w:left="425" w:hanging="425"/>
+            </w:pPr>
+            <w:r>
+              <w:rPr>
+                <w:color w:val="E8590C"/>
               </w:rPr>
               <w:t>•</w:t>
             </w:r>
@@ -2944,16 +3575,16 @@
               <w:tab/>
             </w:r>
             <w:r>
-              <w:t xml:space="preserve">Ontstaat er later alsnog een deadline? Geef dit dan door via </w:t>
-            </w:r>
-            <w:r>
-              <w:rPr>
-                <w:rFonts w:ascii="Area Normal Extrabold" w:hAnsi="Area Normal Extrabold"/>
-              </w:rPr>
-              <w:t xml:space="preserve">Iets aanvullen of wijzigen</w:t>
-            </w:r>
-            <w:r>
-              <w:t xml:space="preserve">.</w:t>
+              <w:t xml:space="preserve">Is de eventdatum of deadline gewijzigd? Klik dan op </w:t>
+            </w:r>
+            <w:r>
+              <w:rPr>
+                <w:rFonts w:ascii="Area Normal Extrabold" w:hAnsi="Area Normal Extrabold"/>
+              </w:rPr>
+              <w:t xml:space="preserve">wijzigen</w:t>
+            </w:r>
+            <w:r>
+              <w:t xml:space="preserve"> bij de datum en voer de nieuwe datum in.</w:t>
             </w:r>
           </w:p>
         </w:tc>
@@ -2963,50 +3594,6 @@
       <w:pPr>
         <w:spacing w:after="0" w:line="200" w:lineRule="exact"/>
       </w:pPr>
-    </w:p>
-    <w:p>
-      <w:pPr>
-        <w:pStyle w:val="Kop1"/>
-        <w:pageBreakBefore/>
-      </w:pPr>
-      <w:r>
-        <w:t xml:space="preserve">4  Een menukaart of menuscherm</w:t>
-      </w:r>
-    </w:p>
-    <w:p>
-      <w:pPr>
-        <w:keepNext/>
-      </w:pPr>
-      <w:r>
-        <w:t xml:space="preserve">Selecteer bij </w:t>
-      </w:r>
-      <w:r>
-        <w:rPr>
-          <w:rFonts w:ascii="Area Normal Extrabold" w:hAnsi="Area Normal Extrabold"/>
-        </w:rPr>
-        <w:t xml:space="preserve">Wat wil je aanvragen?</w:t>
-      </w:r>
-      <w:r>
-        <w:t xml:space="preserve"> de optie </w:t>
-      </w:r>
-      <w:r>
-        <w:rPr>
-          <w:rFonts w:ascii="Area Normal Extrabold" w:hAnsi="Area Normal Extrabold"/>
-        </w:rPr>
-        <w:t xml:space="preserve">Menukaart print</w:t>
-      </w:r>
-      <w:r>
-        <w:t xml:space="preserve">, </w:t>
-      </w:r>
-      <w:r>
-        <w:rPr>
-          <w:rFonts w:ascii="Area Normal Extrabold" w:hAnsi="Area Normal Extrabold"/>
-        </w:rPr>
-        <w:t xml:space="preserve">Menu scherm</w:t>
-      </w:r>
-      <w:r>
-        <w:t xml:space="preserve"> of beide. Er verschijnt vervolgens een extra vraag: om welk menu gaat het?</w:t>
-      </w:r>
     </w:p>
     <w:tbl>
       <w:tblPr>
@@ -3022,8 +3609,8 @@
         <w:tblLayout w:type="fixed"/>
       </w:tblPr>
       <w:tblGrid>
-        <w:gridCol w:w="5500"/>
-        <w:gridCol w:w="3515"/>
+        <w:gridCol w:w="4000"/>
+        <w:gridCol w:w="5015"/>
       </w:tblGrid>
       <w:tr>
         <w:trPr>
@@ -3031,7 +3618,7 @@
         </w:trPr>
         <w:tc>
           <w:tcPr>
-            <w:tcW w:w="5500" w:type="dxa"/>
+            <w:tcW w:w="4000" w:type="dxa"/>
             <w:tcMar>
               <w:top w:w="0" w:type="dxa"/>
               <w:left w:w="0" w:type="dxa"/>
@@ -3050,1363 +3637,9 @@
               </w:rPr>
               <w:drawing>
                 <wp:inline distT="0" distB="0" distL="0" distR="0">
-                  <wp:extent cx="3492500" cy="2316691"/>
+                  <wp:extent cx="2540000" cy="1952413"/>
                   <wp:effectExtent l="0" t="0" r="0" b="0"/>
-                  <wp:docPr id="115" name="Afbeelding 115"/>
-                  <wp:cNvGraphicFramePr>
-                    <a:graphicFrameLocks xmlns:a="http://schemas.openxmlformats.org/drawingml/2006/main" noChangeAspect="1"/>
-                  </wp:cNvGraphicFramePr>
-                  <a:graphic xmlns:a="http://schemas.openxmlformats.org/drawingml/2006/main">
-                    <a:graphicData uri="http://schemas.openxmlformats.org/drawingml/2006/picture">
-                      <pic:pic xmlns:pic="http://schemas.openxmlformats.org/drawingml/2006/picture">
-                        <pic:nvPicPr>
-                          <pic:cNvPr id="0" name="g31-menu-pakket.jpg"/>
-                          <pic:cNvPicPr/>
-                        </pic:nvPicPr>
-                        <pic:blipFill>
-                          <a:blip r:embed="rIdG15"/>
-                          <a:stretch>
-                            <a:fillRect/>
-                          </a:stretch>
-                        </pic:blipFill>
-                        <pic:spPr>
-                          <a:xfrm>
-                            <a:off x="0" y="0"/>
-                            <a:ext cx="3492500" cy="2316691"/>
-                          </a:xfrm>
-                          <a:prstGeom prst="rect">
-                            <a:avLst/>
-                          </a:prstGeom>
-                        </pic:spPr>
-                      </pic:pic>
-                    </a:graphicData>
-                  </a:graphic>
-                </wp:inline>
-              </w:drawing>
-            </w:r>
-          </w:p>
-        </w:tc>
-        <w:tc>
-          <w:tcPr>
-            <w:tcW w:w="3515" w:type="dxa"/>
-            <w:tcMar>
-              <w:top w:w="120" w:type="dxa"/>
-              <w:left w:w="240" w:type="dxa"/>
-              <w:bottom w:w="0" w:type="dxa"/>
-              <w:right w:w="0" w:type="dxa"/>
-            </w:tcMar>
-            <w:vAlign w:val="center"/>
-          </w:tcPr>
-          <w:p>
-            <w:pPr>
-              <w:tabs>
-                <w:tab w:val="left" w:pos="425"/>
-              </w:tabs>
-              <w:spacing w:after="120"/>
-              <w:ind w:left="425" w:hanging="425"/>
-            </w:pPr>
-            <w:r>
-              <w:rPr>
-                <w:rFonts w:ascii="Area Normal Extrabold" w:hAnsi="Area Normal Extrabold"/>
-                <w:color w:val="E8590C"/>
-                <w:sz w:val="22"/>
-              </w:rPr>
-              <w:t>1</w:t>
-            </w:r>
-            <w:r>
-              <w:tab/>
-            </w:r>
-            <w:r>
-              <w:t xml:space="preserve">Kies het gewenste </w:t>
-            </w:r>
-            <w:r>
-              <w:rPr>
-                <w:rFonts w:ascii="Area Normal Extrabold" w:hAnsi="Area Normal Extrabold"/>
-              </w:rPr>
-              <w:t xml:space="preserve">pakket</w:t>
-            </w:r>
-            <w:r>
-              <w:t xml:space="preserve">. Onder de pakketnaam zie je welke gangen zijn inbegrepen.</w:t>
-            </w:r>
-          </w:p>
-        </w:tc>
-      </w:tr>
-    </w:tbl>
-    <w:p>
-      <w:pPr>
-        <w:spacing w:after="0" w:line="200" w:lineRule="exact"/>
-      </w:pPr>
-    </w:p>
-    <w:tbl>
-      <w:tblPr>
-        <w:tblW w:w="0" w:type="auto"/>
-        <w:tblBorders>
-          <w:top w:val="nil"/>
-          <w:left w:val="nil"/>
-          <w:bottom w:val="nil"/>
-          <w:right w:val="nil"/>
-          <w:insideH w:val="nil"/>
-          <w:insideV w:val="nil"/>
-        </w:tblBorders>
-        <w:tblLayout w:type="fixed"/>
-      </w:tblPr>
-      <w:tblGrid>
-        <w:gridCol w:w="5500"/>
-        <w:gridCol w:w="3515"/>
-      </w:tblGrid>
-      <w:tr>
-        <w:trPr>
-          <w:cantSplit/>
-        </w:trPr>
-        <w:tc>
-          <w:tcPr>
-            <w:tcW w:w="5500" w:type="dxa"/>
-            <w:tcMar>
-              <w:top w:w="0" w:type="dxa"/>
-              <w:left w:w="0" w:type="dxa"/>
-              <w:bottom w:w="0" w:type="dxa"/>
-              <w:right w:w="0" w:type="dxa"/>
-            </w:tcMar>
-            <w:vAlign w:val="center"/>
-          </w:tcPr>
-          <w:p>
-            <w:pPr>
-              <w:spacing w:after="0"/>
-            </w:pPr>
-            <w:r>
-              <w:rPr>
-                <w:noProof/>
-              </w:rPr>
-              <w:drawing>
-                <wp:inline distT="0" distB="0" distL="0" distR="0">
-                  <wp:extent cx="3492500" cy="2316691"/>
-                  <wp:effectExtent l="0" t="0" r="0" b="0"/>
-                  <wp:docPr id="116" name="Afbeelding 116"/>
-                  <wp:cNvGraphicFramePr>
-                    <a:graphicFrameLocks xmlns:a="http://schemas.openxmlformats.org/drawingml/2006/main" noChangeAspect="1"/>
-                  </wp:cNvGraphicFramePr>
-                  <a:graphic xmlns:a="http://schemas.openxmlformats.org/drawingml/2006/main">
-                    <a:graphicData uri="http://schemas.openxmlformats.org/drawingml/2006/picture">
-                      <pic:pic xmlns:pic="http://schemas.openxmlformats.org/drawingml/2006/picture">
-                        <pic:nvPicPr>
-                          <pic:cNvPr id="0" name="g32-menu-inhoud.jpg"/>
-                          <pic:cNvPicPr/>
-                        </pic:nvPicPr>
-                        <pic:blipFill>
-                          <a:blip r:embed="rIdG16"/>
-                          <a:stretch>
-                            <a:fillRect/>
-                          </a:stretch>
-                        </pic:blipFill>
-                        <pic:spPr>
-                          <a:xfrm>
-                            <a:off x="0" y="0"/>
-                            <a:ext cx="3492500" cy="2316691"/>
-                          </a:xfrm>
-                          <a:prstGeom prst="rect">
-                            <a:avLst/>
-                          </a:prstGeom>
-                        </pic:spPr>
-                      </pic:pic>
-                    </a:graphicData>
-                  </a:graphic>
-                </wp:inline>
-              </w:drawing>
-            </w:r>
-          </w:p>
-        </w:tc>
-        <w:tc>
-          <w:tcPr>
-            <w:tcW w:w="3515" w:type="dxa"/>
-            <w:tcMar>
-              <w:top w:w="120" w:type="dxa"/>
-              <w:left w:w="240" w:type="dxa"/>
-              <w:bottom w:w="0" w:type="dxa"/>
-              <w:right w:w="0" w:type="dxa"/>
-            </w:tcMar>
-            <w:vAlign w:val="center"/>
-          </w:tcPr>
-          <w:p>
-            <w:pPr>
-              <w:tabs>
-                <w:tab w:val="left" w:pos="425"/>
-              </w:tabs>
-              <w:spacing w:after="120"/>
-              <w:ind w:left="425" w:hanging="425"/>
-            </w:pPr>
-            <w:r>
-              <w:rPr>
-                <w:rFonts w:ascii="Area Normal Extrabold" w:hAnsi="Area Normal Extrabold"/>
-                <w:color w:val="E8590C"/>
-                <w:sz w:val="22"/>
-              </w:rPr>
-              <w:t>1</w:t>
-            </w:r>
-            <w:r>
-              <w:tab/>
-            </w:r>
-            <w:r>
-              <w:rPr>
-                <w:rFonts w:ascii="Area Normal Extrabold" w:hAnsi="Area Normal Extrabold"/>
-              </w:rPr>
-              <w:t xml:space="preserve">Wissel</w:t>
-            </w:r>
-            <w:r>
-              <w:t xml:space="preserve">: vervang een gerecht door een ander gerecht.</w:t>
-            </w:r>
-          </w:p>
-          <w:p>
-            <w:pPr>
-              <w:tabs>
-                <w:tab w:val="left" w:pos="425"/>
-              </w:tabs>
-              <w:spacing w:after="120"/>
-              <w:ind w:left="425" w:hanging="425"/>
-            </w:pPr>
-            <w:r>
-              <w:rPr>
-                <w:rFonts w:ascii="Area Normal Extrabold" w:hAnsi="Area Normal Extrabold"/>
-                <w:color w:val="E8590C"/>
-                <w:sz w:val="22"/>
-              </w:rPr>
-              <w:t>2</w:t>
-            </w:r>
-            <w:r>
-              <w:tab/>
-            </w:r>
-            <w:r>
-              <w:rPr>
-                <w:rFonts w:ascii="Area Normal Extrabold" w:hAnsi="Area Normal Extrabold"/>
-              </w:rPr>
-              <w:t xml:space="preserve">×</w:t>
-            </w:r>
-            <w:r>
-              <w:t xml:space="preserve">: verwijder een gerecht.</w:t>
-            </w:r>
-          </w:p>
-          <w:p>
-            <w:pPr>
-              <w:tabs>
-                <w:tab w:val="left" w:pos="425"/>
-              </w:tabs>
-              <w:spacing w:after="120"/>
-              <w:ind w:left="425" w:hanging="425"/>
-            </w:pPr>
-            <w:r>
-              <w:rPr>
-                <w:rFonts w:ascii="Area Normal Extrabold" w:hAnsi="Area Normal Extrabold"/>
-                <w:color w:val="E8590C"/>
-                <w:sz w:val="22"/>
-              </w:rPr>
-              <w:t>3</w:t>
-            </w:r>
-            <w:r>
-              <w:tab/>
-            </w:r>
-            <w:r>
-              <w:rPr>
-                <w:rFonts w:ascii="Area Normal Extrabold" w:hAnsi="Area Normal Extrabold"/>
-              </w:rPr>
-              <w:t xml:space="preserve">+ Gerecht toevoegen</w:t>
-            </w:r>
-            <w:r>
-              <w:t xml:space="preserve">: voeg een extra gerecht toe.</w:t>
-            </w:r>
-          </w:p>
-          <w:p>
-            <w:pPr>
-              <w:tabs>
-                <w:tab w:val="left" w:pos="425"/>
-              </w:tabs>
-              <w:spacing w:after="120"/>
-              <w:ind w:left="425" w:hanging="425"/>
-            </w:pPr>
-            <w:r>
-              <w:rPr>
-                <w:rFonts w:ascii="Area Normal Extrabold" w:hAnsi="Area Normal Extrabold"/>
-                <w:color w:val="E8590C"/>
-                <w:sz w:val="22"/>
-              </w:rPr>
-              <w:t>4</w:t>
-            </w:r>
-            <w:r>
-              <w:tab/>
-            </w:r>
-            <w:r>
-              <w:rPr>
-                <w:rFonts w:ascii="Area Normal Extrabold" w:hAnsi="Area Normal Extrabold"/>
-              </w:rPr>
-              <w:t xml:space="preserve">Pakket wijzigen</w:t>
-            </w:r>
-            <w:r>
-              <w:t xml:space="preserve">: kies een ander pakket.</w:t>
-            </w:r>
-          </w:p>
-          <w:p>
-            <w:pPr>
-              <w:tabs>
-                <w:tab w:val="left" w:pos="425"/>
-              </w:tabs>
-              <w:spacing w:after="120"/>
-              <w:ind w:left="425" w:hanging="425"/>
-            </w:pPr>
-            <w:r>
-              <w:rPr>
-                <w:color w:val="E8590C"/>
-              </w:rPr>
-              <w:t>•</w:t>
-            </w:r>
-            <w:r>
-              <w:tab/>
-            </w:r>
-            <w:r>
-              <w:t xml:space="preserve">Selecteer de gerechten uit de lijst. Voer je zelf een gerecht in? Dan verschijnt er een melding en beoordeelt Marketing de invoer.</w:t>
-            </w:r>
-          </w:p>
-          <w:p>
-            <w:pPr>
-              <w:tabs>
-                <w:tab w:val="left" w:pos="425"/>
-              </w:tabs>
-              <w:spacing w:after="120"/>
-              <w:ind w:left="425" w:hanging="425"/>
-            </w:pPr>
-            <w:r>
-              <w:rPr>
-                <w:color w:val="E8590C"/>
-              </w:rPr>
-              <w:t>•</w:t>
-            </w:r>
-            <w:r>
-              <w:tab/>
-            </w:r>
-            <w:r>
-              <w:t xml:space="preserve">Menu later aanpassen? Kies dan </w:t>
-            </w:r>
-            <w:r>
-              <w:rPr>
-                <w:rFonts w:ascii="Area Normal Extrabold" w:hAnsi="Area Normal Extrabold"/>
-              </w:rPr>
-              <w:t xml:space="preserve">Menu aanpassen</w:t>
-            </w:r>
-            <w:r>
-              <w:t xml:space="preserve"> via </w:t>
-            </w:r>
-            <w:r>
-              <w:rPr>
-                <w:rFonts w:ascii="Area Normal Extrabold" w:hAnsi="Area Normal Extrabold"/>
-              </w:rPr>
-              <w:t xml:space="preserve">Iets aanvullen of wijzigen</w:t>
-            </w:r>
-            <w:r>
-              <w:t xml:space="preserve">.</w:t>
-            </w:r>
-          </w:p>
-        </w:tc>
-      </w:tr>
-    </w:tbl>
-    <w:p>
-      <w:pPr>
-        <w:spacing w:after="0" w:line="200" w:lineRule="exact"/>
-      </w:pPr>
-    </w:p>
-    <w:p>
-      <w:pPr>
-        <w:pStyle w:val="Kop1"/>
-        <w:pageBreakBefore/>
-      </w:pPr>
-      <w:r>
-        <w:t xml:space="preserve">5  Je design is klaar</w:t>
-      </w:r>
-    </w:p>
-    <w:p>
-      <w:pPr>
-        <w:keepNext/>
-      </w:pPr>
-      <w:r>
-        <w:t xml:space="preserve">Zodra je design klaar is, ontvang je een e-mail van </w:t>
-      </w:r>
-      <w:r>
-        <w:rPr>
-          <w:rFonts w:ascii="Area Normal Extrabold" w:hAnsi="Area Normal Extrabold"/>
-        </w:rPr>
-        <w:t xml:space="preserve">Designaanvraag</w:t>
-      </w:r>
-      <w:r>
-        <w:t xml:space="preserve"> (designaanvraag@nbcevents.nl).</w:t>
-      </w:r>
-    </w:p>
-    <w:tbl>
-      <w:tblPr>
-        <w:tblW w:w="0" w:type="auto"/>
-        <w:tblBorders>
-          <w:top w:val="nil"/>
-          <w:left w:val="nil"/>
-          <w:bottom w:val="nil"/>
-          <w:right w:val="nil"/>
-          <w:insideH w:val="nil"/>
-          <w:insideV w:val="nil"/>
-        </w:tblBorders>
-        <w:tblLayout w:type="fixed"/>
-      </w:tblPr>
-      <w:tblGrid>
-        <w:gridCol w:w="4300"/>
-        <w:gridCol w:w="4715"/>
-      </w:tblGrid>
-      <w:tr>
-        <w:trPr>
-          <w:cantSplit/>
-        </w:trPr>
-        <w:tc>
-          <w:tcPr>
-            <w:tcW w:w="4300" w:type="dxa"/>
-            <w:tcMar>
-              <w:top w:w="0" w:type="dxa"/>
-              <w:left w:w="0" w:type="dxa"/>
-              <w:bottom w:w="0" w:type="dxa"/>
-              <w:right w:w="0" w:type="dxa"/>
-            </w:tcMar>
-            <w:vAlign w:val="center"/>
-          </w:tcPr>
-          <w:p>
-            <w:pPr>
-              <w:spacing w:after="0"/>
-            </w:pPr>
-            <w:r>
-              <w:rPr>
-                <w:noProof/>
-              </w:rPr>
-              <w:drawing>
-                <wp:inline distT="0" distB="0" distL="0" distR="0">
-                  <wp:extent cx="2730500" cy="3033337"/>
-                  <wp:effectExtent l="0" t="0" r="0" b="0"/>
-                  <wp:docPr id="117" name="Afbeelding 117"/>
-                  <wp:cNvGraphicFramePr>
-                    <a:graphicFrameLocks xmlns:a="http://schemas.openxmlformats.org/drawingml/2006/main" noChangeAspect="1"/>
-                  </wp:cNvGraphicFramePr>
-                  <a:graphic xmlns:a="http://schemas.openxmlformats.org/drawingml/2006/main">
-                    <a:graphicData uri="http://schemas.openxmlformats.org/drawingml/2006/picture">
-                      <pic:pic xmlns:pic="http://schemas.openxmlformats.org/drawingml/2006/picture">
-                        <pic:nvPicPr>
-                          <pic:cNvPr id="0" name="g50-mail.jpg"/>
-                          <pic:cNvPicPr/>
-                        </pic:nvPicPr>
-                        <pic:blipFill>
-                          <a:blip r:embed="rIdG17"/>
-                          <a:stretch>
-                            <a:fillRect/>
-                          </a:stretch>
-                        </pic:blipFill>
-                        <pic:spPr>
-                          <a:xfrm>
-                            <a:off x="0" y="0"/>
-                            <a:ext cx="2730500" cy="3033337"/>
-                          </a:xfrm>
-                          <a:prstGeom prst="rect">
-                            <a:avLst/>
-                          </a:prstGeom>
-                        </pic:spPr>
-                      </pic:pic>
-                    </a:graphicData>
-                  </a:graphic>
-                </wp:inline>
-              </w:drawing>
-            </w:r>
-          </w:p>
-        </w:tc>
-        <w:tc>
-          <w:tcPr>
-            <w:tcW w:w="4715" w:type="dxa"/>
-            <w:tcMar>
-              <w:top w:w="120" w:type="dxa"/>
-              <w:left w:w="240" w:type="dxa"/>
-              <w:bottom w:w="0" w:type="dxa"/>
-              <w:right w:w="0" w:type="dxa"/>
-            </w:tcMar>
-            <w:vAlign w:val="center"/>
-          </w:tcPr>
-          <w:p>
-            <w:pPr>
-              <w:tabs>
-                <w:tab w:val="left" w:pos="425"/>
-              </w:tabs>
-              <w:spacing w:after="120"/>
-              <w:ind w:left="425" w:hanging="425"/>
-            </w:pPr>
-            <w:r>
-              <w:rPr>
-                <w:rFonts w:ascii="Area Normal Extrabold" w:hAnsi="Area Normal Extrabold"/>
-                <w:color w:val="E8590C"/>
-                <w:sz w:val="22"/>
-              </w:rPr>
-              <w:t>1</w:t>
-            </w:r>
-            <w:r>
-              <w:tab/>
-            </w:r>
-            <w:r>
-              <w:t xml:space="preserve">Herken de juiste e-mail aan het onderwerp. Dit begint met </w:t>
-            </w:r>
-            <w:r>
-              <w:rPr>
-                <w:rFonts w:ascii="Area Normal Extrabold" w:hAnsi="Area Normal Extrabold"/>
-              </w:rPr>
-              <w:t xml:space="preserve">Klaar</w:t>
-            </w:r>
-            <w:r>
-              <w:t xml:space="preserve">, gevolgd door de naam van het event en wat je hebt aangevraagd. Bij een nieuwe versie staat er bijvoorbeeld </w:t>
-            </w:r>
-            <w:r>
-              <w:rPr>
-                <w:rFonts w:ascii="Area Normal Extrabold" w:hAnsi="Area Normal Extrabold"/>
-              </w:rPr>
-              <w:t xml:space="preserve">Versie 2 klaar</w:t>
-            </w:r>
-            <w:r>
-              <w:t xml:space="preserve">.</w:t>
-            </w:r>
-          </w:p>
-          <w:p>
-            <w:pPr>
-              <w:tabs>
-                <w:tab w:val="left" w:pos="425"/>
-              </w:tabs>
-              <w:spacing w:after="120"/>
-              <w:ind w:left="425" w:hanging="425"/>
-            </w:pPr>
-            <w:r>
-              <w:rPr>
-                <w:rFonts w:ascii="Area Normal Extrabold" w:hAnsi="Area Normal Extrabold"/>
-                <w:color w:val="E8590C"/>
-                <w:sz w:val="22"/>
-              </w:rPr>
-              <w:t>2</w:t>
-            </w:r>
-            <w:r>
-              <w:tab/>
-            </w:r>
-            <w:r>
-              <w:t xml:space="preserve">Download je bestanden uit de e-mail. De bestanden zijn als bijlage toegevoegd. Grote drukbestanden staan op de schijf. Marketing vermeldt in de e-mail waar je deze kunt vinden.</w:t>
-            </w:r>
-          </w:p>
-          <w:p>
-            <w:pPr>
-              <w:tabs>
-                <w:tab w:val="left" w:pos="425"/>
-              </w:tabs>
-              <w:spacing w:after="120"/>
-              <w:ind w:left="425" w:hanging="425"/>
-            </w:pPr>
-            <w:r>
-              <w:rPr>
-                <w:rFonts w:ascii="Area Normal Extrabold" w:hAnsi="Area Normal Extrabold"/>
-                <w:color w:val="E8590C"/>
-                <w:sz w:val="22"/>
-              </w:rPr>
-              <w:t>3</w:t>
-            </w:r>
-            <w:r>
-              <w:tab/>
-            </w:r>
-            <w:r>
-              <w:t xml:space="preserve">Wil je iets aanpassen? Klik dan op </w:t>
-            </w:r>
-            <w:r>
-              <w:rPr>
-                <w:rFonts w:ascii="Area Normal Extrabold" w:hAnsi="Area Normal Extrabold"/>
-              </w:rPr>
-              <w:t xml:space="preserve">Feedback geven</w:t>
-            </w:r>
-            <w:r>
-              <w:t xml:space="preserve"> in de e-mail. Beantwoord de e-mail niet rechtstreeks, maar gebruik altijd deze knop. Zo wordt je feedback automatisch aan de juiste aanvraag gekoppeld.</w:t>
-            </w:r>
-          </w:p>
-        </w:tc>
-      </w:tr>
-    </w:tbl>
-    <w:p>
-      <w:pPr>
-        <w:spacing w:after="0" w:line="200" w:lineRule="exact"/>
-      </w:pPr>
-    </w:p>
-    <w:tbl>
-      <w:tblPr>
-        <w:tblW w:w="0" w:type="auto"/>
-        <w:tblBorders>
-          <w:top w:val="nil"/>
-          <w:left w:val="nil"/>
-          <w:bottom w:val="nil"/>
-          <w:right w:val="nil"/>
-          <w:insideH w:val="nil"/>
-          <w:insideV w:val="nil"/>
-        </w:tblBorders>
-        <w:tblLayout w:type="fixed"/>
-      </w:tblPr>
-      <w:tblGrid>
-        <w:gridCol w:w="5500"/>
-        <w:gridCol w:w="3515"/>
-      </w:tblGrid>
-      <w:tr>
-        <w:trPr>
-          <w:cantSplit/>
-        </w:trPr>
-        <w:tc>
-          <w:tcPr>
-            <w:tcW w:w="5500" w:type="dxa"/>
-            <w:tcMar>
-              <w:top w:w="0" w:type="dxa"/>
-              <w:left w:w="0" w:type="dxa"/>
-              <w:bottom w:w="0" w:type="dxa"/>
-              <w:right w:w="0" w:type="dxa"/>
-            </w:tcMar>
-            <w:vAlign w:val="center"/>
-          </w:tcPr>
-          <w:p>
-            <w:pPr>
-              <w:spacing w:after="0"/>
-            </w:pPr>
-            <w:r>
-              <w:rPr>
-                <w:noProof/>
-              </w:rPr>
-              <w:drawing>
-                <wp:inline distT="0" distB="0" distL="0" distR="0">
-                  <wp:extent cx="3492500" cy="2316691"/>
-                  <wp:effectExtent l="0" t="0" r="0" b="0"/>
-                  <wp:docPr id="118" name="Afbeelding 118"/>
-                  <wp:cNvGraphicFramePr>
-                    <a:graphicFrameLocks xmlns:a="http://schemas.openxmlformats.org/drawingml/2006/main" noChangeAspect="1"/>
-                  </wp:cNvGraphicFramePr>
-                  <a:graphic xmlns:a="http://schemas.openxmlformats.org/drawingml/2006/main">
-                    <a:graphicData uri="http://schemas.openxmlformats.org/drawingml/2006/picture">
-                      <pic:pic xmlns:pic="http://schemas.openxmlformats.org/drawingml/2006/picture">
-                        <pic:nvPicPr>
-                          <pic:cNvPr id="0" name="g51-feedback.jpg"/>
-                          <pic:cNvPicPr/>
-                        </pic:nvPicPr>
-                        <pic:blipFill>
-                          <a:blip r:embed="rIdG18"/>
-                          <a:stretch>
-                            <a:fillRect/>
-                          </a:stretch>
-                        </pic:blipFill>
-                        <pic:spPr>
-                          <a:xfrm>
-                            <a:off x="0" y="0"/>
-                            <a:ext cx="3492500" cy="2316691"/>
-                          </a:xfrm>
-                          <a:prstGeom prst="rect">
-                            <a:avLst/>
-                          </a:prstGeom>
-                        </pic:spPr>
-                      </pic:pic>
-                    </a:graphicData>
-                  </a:graphic>
-                </wp:inline>
-              </w:drawing>
-            </w:r>
-          </w:p>
-        </w:tc>
-        <w:tc>
-          <w:tcPr>
-            <w:tcW w:w="3515" w:type="dxa"/>
-            <w:tcMar>
-              <w:top w:w="120" w:type="dxa"/>
-              <w:left w:w="240" w:type="dxa"/>
-              <w:bottom w:w="0" w:type="dxa"/>
-              <w:right w:w="0" w:type="dxa"/>
-            </w:tcMar>
-            <w:vAlign w:val="center"/>
-          </w:tcPr>
-          <w:p>
-            <w:pPr>
-              <w:tabs>
-                <w:tab w:val="left" w:pos="425"/>
-              </w:tabs>
-              <w:spacing w:after="120"/>
-              <w:ind w:left="425" w:hanging="425"/>
-            </w:pPr>
-            <w:r>
-              <w:rPr>
-                <w:rFonts w:ascii="Area Normal Extrabold" w:hAnsi="Area Normal Extrabold"/>
-                <w:color w:val="E8590C"/>
-                <w:sz w:val="22"/>
-              </w:rPr>
-              <w:t>1</w:t>
-            </w:r>
-            <w:r>
-              <w:tab/>
-            </w:r>
-            <w:r>
-              <w:t xml:space="preserve">Je aanvraag is al geselecteerd wanneer het formulier opent. Je hoeft dus niet opnieuw te zoeken.</w:t>
-            </w:r>
-          </w:p>
-          <w:p>
-            <w:pPr>
-              <w:tabs>
-                <w:tab w:val="left" w:pos="425"/>
-              </w:tabs>
-              <w:spacing w:after="120"/>
-              <w:ind w:left="425" w:hanging="425"/>
-            </w:pPr>
-            <w:r>
-              <w:rPr>
-                <w:rFonts w:ascii="Area Normal Extrabold" w:hAnsi="Area Normal Extrabold"/>
-                <w:color w:val="E8590C"/>
-                <w:sz w:val="22"/>
-              </w:rPr>
-              <w:t>2</w:t>
-            </w:r>
-            <w:r>
-              <w:tab/>
-            </w:r>
-            <w:r>
-              <w:t xml:space="preserve">Selecteer je naam en klik op </w:t>
-            </w:r>
-            <w:r>
-              <w:rPr>
-                <w:rFonts w:ascii="Area Normal Extrabold" w:hAnsi="Area Normal Extrabold"/>
-              </w:rPr>
-              <w:t xml:space="preserve">Volgende</w:t>
-            </w:r>
-            <w:r>
-              <w:t xml:space="preserve">.</w:t>
-            </w:r>
-          </w:p>
-          <w:p>
-            <w:pPr>
-              <w:tabs>
-                <w:tab w:val="left" w:pos="425"/>
-              </w:tabs>
-              <w:spacing w:after="120"/>
-              <w:ind w:left="425" w:hanging="425"/>
-            </w:pPr>
-            <w:r>
-              <w:rPr>
-                <w:color w:val="E8590C"/>
-              </w:rPr>
-              <w:t>•</w:t>
-            </w:r>
-            <w:r>
-              <w:tab/>
-            </w:r>
-            <w:r>
-              <w:t xml:space="preserve">Geef je feedback zo volledig mogelijk door en voeg indien nodig bestanden toe. Je kunt ook een nieuwe deadline doorgeven of een ander menu kiezen. Dit werkt op dezelfde manier als eerder beschreven.</w:t>
-            </w:r>
-          </w:p>
-          <w:p>
-            <w:pPr>
-              <w:tabs>
-                <w:tab w:val="left" w:pos="425"/>
-              </w:tabs>
-              <w:spacing w:after="120"/>
-              <w:ind w:left="425" w:hanging="425"/>
-            </w:pPr>
-            <w:r>
-              <w:rPr>
-                <w:color w:val="E8590C"/>
-              </w:rPr>
-              <w:t>•</w:t>
-            </w:r>
-            <w:r>
-              <w:tab/>
-            </w:r>
-            <w:r>
-              <w:t xml:space="preserve">Zodra je feedback is verwerkt, ontvang je opnieuw een e-mail. Hierin vind je de aangepaste versie, bijvoorbeeld met het onderwerp </w:t>
-            </w:r>
-            <w:r>
-              <w:rPr>
-                <w:rFonts w:ascii="Area Normal Extrabold" w:hAnsi="Area Normal Extrabold"/>
-              </w:rPr>
-              <w:t xml:space="preserve">Versie 2 klaar</w:t>
-            </w:r>
-            <w:r>
-              <w:t xml:space="preserve">.</w:t>
-            </w:r>
-          </w:p>
-        </w:tc>
-      </w:tr>
-    </w:tbl>
-    <w:p>
-      <w:pPr>
-        <w:spacing w:after="0" w:line="200" w:lineRule="exact"/>
-      </w:pPr>
-    </w:p>
-    <w:p>
-      <w:pPr>
-        <w:pStyle w:val="Kop1"/>
-        <w:pageBreakBefore/>
-      </w:pPr>
-      <w:r>
-        <w:t xml:space="preserve">6  Aanvullen of wijzigen</w:t>
-      </w:r>
-    </w:p>
-    <w:p>
-      <w:pPr>
-        <w:keepNext/>
-      </w:pPr>
-      <w:r>
-        <w:t xml:space="preserve">Iets vergeten, een extra design nodig of is de datum gewijzigd? Pas dan je bestaande aanvraag aan. Klik op het startscherm op </w:t>
-      </w:r>
-      <w:r>
-        <w:rPr>
-          <w:rFonts w:ascii="Area Normal Extrabold" w:hAnsi="Area Normal Extrabold"/>
-        </w:rPr>
-        <w:t xml:space="preserve">Iets aanvullen of wijzigen</w:t>
-      </w:r>
-      <w:r>
-        <w:t xml:space="preserve"> en kies voor </w:t>
-      </w:r>
-      <w:r>
-        <w:rPr>
-          <w:rFonts w:ascii="Area Normal Extrabold" w:hAnsi="Area Normal Extrabold"/>
-        </w:rPr>
-        <w:t xml:space="preserve">Voor een evenement</w:t>
-      </w:r>
-      <w:r>
-        <w:t xml:space="preserve"> of </w:t>
-      </w:r>
-      <w:r>
-        <w:rPr>
-          <w:rFonts w:ascii="Area Normal Extrabold" w:hAnsi="Area Normal Extrabold"/>
-        </w:rPr>
-        <w:t xml:space="preserve">Intern</w:t>
-      </w:r>
-      <w:r>
-        <w:t xml:space="preserve">.</w:t>
-      </w:r>
-    </w:p>
-    <w:tbl>
-      <w:tblPr>
-        <w:tblW w:w="0" w:type="auto"/>
-        <w:tblBorders>
-          <w:top w:val="nil"/>
-          <w:left w:val="nil"/>
-          <w:bottom w:val="nil"/>
-          <w:right w:val="nil"/>
-          <w:insideH w:val="nil"/>
-          <w:insideV w:val="nil"/>
-        </w:tblBorders>
-        <w:tblLayout w:type="fixed"/>
-      </w:tblPr>
-      <w:tblGrid>
-        <w:gridCol w:w="5500"/>
-        <w:gridCol w:w="3515"/>
-      </w:tblGrid>
-      <w:tr>
-        <w:trPr>
-          <w:cantSplit/>
-        </w:trPr>
-        <w:tc>
-          <w:tcPr>
-            <w:tcW w:w="5500" w:type="dxa"/>
-            <w:tcMar>
-              <w:top w:w="0" w:type="dxa"/>
-              <w:left w:w="0" w:type="dxa"/>
-              <w:bottom w:w="0" w:type="dxa"/>
-              <w:right w:w="0" w:type="dxa"/>
-            </w:tcMar>
-            <w:vAlign w:val="center"/>
-          </w:tcPr>
-          <w:p>
-            <w:pPr>
-              <w:spacing w:after="0"/>
-            </w:pPr>
-            <w:r>
-              <w:rPr>
-                <w:noProof/>
-              </w:rPr>
-              <w:drawing>
-                <wp:inline distT="0" distB="0" distL="0" distR="0">
-                  <wp:extent cx="3492500" cy="2316691"/>
-                  <wp:effectExtent l="0" t="0" r="0" b="0"/>
-                  <wp:docPr id="119" name="Afbeelding 119"/>
-                  <wp:cNvGraphicFramePr>
-                    <a:graphicFrameLocks xmlns:a="http://schemas.openxmlformats.org/drawingml/2006/main" noChangeAspect="1"/>
-                  </wp:cNvGraphicFramePr>
-                  <a:graphic xmlns:a="http://schemas.openxmlformats.org/drawingml/2006/main">
-                    <a:graphicData uri="http://schemas.openxmlformats.org/drawingml/2006/picture">
-                      <pic:pic xmlns:pic="http://schemas.openxmlformats.org/drawingml/2006/picture">
-                        <pic:nvPicPr>
-                          <pic:cNvPr id="0" name="g40-aanv-zoek.jpg"/>
-                          <pic:cNvPicPr/>
-                        </pic:nvPicPr>
-                        <pic:blipFill>
-                          <a:blip r:embed="rIdG19"/>
-                          <a:stretch>
-                            <a:fillRect/>
-                          </a:stretch>
-                        </pic:blipFill>
-                        <pic:spPr>
-                          <a:xfrm>
-                            <a:off x="0" y="0"/>
-                            <a:ext cx="3492500" cy="2316691"/>
-                          </a:xfrm>
-                          <a:prstGeom prst="rect">
-                            <a:avLst/>
-                          </a:prstGeom>
-                        </pic:spPr>
-                      </pic:pic>
-                    </a:graphicData>
-                  </a:graphic>
-                </wp:inline>
-              </w:drawing>
-            </w:r>
-          </w:p>
-        </w:tc>
-        <w:tc>
-          <w:tcPr>
-            <w:tcW w:w="3515" w:type="dxa"/>
-            <w:tcMar>
-              <w:top w:w="120" w:type="dxa"/>
-              <w:left w:w="240" w:type="dxa"/>
-              <w:bottom w:w="0" w:type="dxa"/>
-              <w:right w:w="0" w:type="dxa"/>
-            </w:tcMar>
-            <w:vAlign w:val="center"/>
-          </w:tcPr>
-          <w:p>
-            <w:pPr>
-              <w:tabs>
-                <w:tab w:val="left" w:pos="425"/>
-              </w:tabs>
-              <w:spacing w:after="120"/>
-              <w:ind w:left="425" w:hanging="425"/>
-            </w:pPr>
-            <w:r>
-              <w:rPr>
-                <w:rFonts w:ascii="Area Normal Extrabold" w:hAnsi="Area Normal Extrabold"/>
-                <w:color w:val="E8590C"/>
-                <w:sz w:val="22"/>
-              </w:rPr>
-              <w:t>1</w:t>
-            </w:r>
-            <w:r>
-              <w:tab/>
-            </w:r>
-            <w:r>
-              <w:t xml:space="preserve">Zoek de juiste aanvraag. Typ minimaal drie letters van de eventnaam…</w:t>
-            </w:r>
-          </w:p>
-          <w:p>
-            <w:pPr>
-              <w:tabs>
-                <w:tab w:val="left" w:pos="425"/>
-              </w:tabs>
-              <w:spacing w:after="120"/>
-              <w:ind w:left="425" w:hanging="425"/>
-            </w:pPr>
-            <w:r>
-              <w:rPr>
-                <w:rFonts w:ascii="Area Normal Extrabold" w:hAnsi="Area Normal Extrabold"/>
-                <w:color w:val="E8590C"/>
-                <w:sz w:val="22"/>
-              </w:rPr>
-              <w:t>2</w:t>
-            </w:r>
-            <w:r>
-              <w:tab/>
-            </w:r>
-            <w:r>
-              <w:t xml:space="preserve">…en selecteer de juiste aanvraag. Je ziet aanvragen van de afgelopen vier maanden, ook die van collega’s.</w:t>
-            </w:r>
-          </w:p>
-          <w:p>
-            <w:pPr>
-              <w:tabs>
-                <w:tab w:val="left" w:pos="425"/>
-              </w:tabs>
-              <w:spacing w:after="120"/>
-              <w:ind w:left="425" w:hanging="425"/>
-            </w:pPr>
-            <w:r>
-              <w:rPr>
-                <w:color w:val="E8590C"/>
-              </w:rPr>
-              <w:t>•</w:t>
-            </w:r>
-            <w:r>
-              <w:tab/>
-            </w:r>
-            <w:r>
-              <w:t xml:space="preserve">Vul daarna je naam in, zodat Marketing weet wie de wijziging doorgeeft.</w:t>
-            </w:r>
-          </w:p>
-          <w:p>
-            <w:pPr>
-              <w:tabs>
-                <w:tab w:val="left" w:pos="425"/>
-              </w:tabs>
-              <w:spacing w:after="120"/>
-              <w:ind w:left="425" w:hanging="425"/>
-            </w:pPr>
-            <w:r>
-              <w:rPr>
-                <w:color w:val="E8590C"/>
-              </w:rPr>
-              <w:t>•</w:t>
-            </w:r>
-            <w:r>
-              <w:tab/>
-            </w:r>
-            <w:r>
-              <w:t xml:space="preserve">Bij een interne aanvraag vul je eerst je naam in en selecteer je de gewenste aanvraag uit je eigen aanvragen.</w:t>
-            </w:r>
-          </w:p>
-        </w:tc>
-      </w:tr>
-    </w:tbl>
-    <w:p>
-      <w:pPr>
-        <w:spacing w:after="0" w:line="200" w:lineRule="exact"/>
-      </w:pPr>
-    </w:p>
-    <w:tbl>
-      <w:tblPr>
-        <w:tblW w:w="0" w:type="auto"/>
-        <w:tblBorders>
-          <w:top w:val="nil"/>
-          <w:left w:val="nil"/>
-          <w:bottom w:val="nil"/>
-          <w:right w:val="nil"/>
-          <w:insideH w:val="nil"/>
-          <w:insideV w:val="nil"/>
-        </w:tblBorders>
-        <w:tblLayout w:type="fixed"/>
-      </w:tblPr>
-      <w:tblGrid>
-        <w:gridCol w:w="5500"/>
-        <w:gridCol w:w="3515"/>
-      </w:tblGrid>
-      <w:tr>
-        <w:trPr>
-          <w:cantSplit/>
-        </w:trPr>
-        <w:tc>
-          <w:tcPr>
-            <w:tcW w:w="5500" w:type="dxa"/>
-            <w:tcMar>
-              <w:top w:w="0" w:type="dxa"/>
-              <w:left w:w="0" w:type="dxa"/>
-              <w:bottom w:w="0" w:type="dxa"/>
-              <w:right w:w="0" w:type="dxa"/>
-            </w:tcMar>
-            <w:vAlign w:val="center"/>
-          </w:tcPr>
-          <w:p>
-            <w:pPr>
-              <w:spacing w:after="0"/>
-            </w:pPr>
-            <w:r>
-              <w:rPr>
-                <w:noProof/>
-              </w:rPr>
-              <w:drawing>
-                <wp:inline distT="0" distB="0" distL="0" distR="0">
-                  <wp:extent cx="3492500" cy="2316691"/>
-                  <wp:effectExtent l="0" t="0" r="0" b="0"/>
-                  <wp:docPr id="120" name="Afbeelding 120"/>
-                  <wp:cNvGraphicFramePr>
-                    <a:graphicFrameLocks xmlns:a="http://schemas.openxmlformats.org/drawingml/2006/main" noChangeAspect="1"/>
-                  </wp:cNvGraphicFramePr>
-                  <a:graphic xmlns:a="http://schemas.openxmlformats.org/drawingml/2006/main">
-                    <a:graphicData uri="http://schemas.openxmlformats.org/drawingml/2006/picture">
-                      <pic:pic xmlns:pic="http://schemas.openxmlformats.org/drawingml/2006/picture">
-                        <pic:nvPicPr>
-                          <pic:cNvPr id="0" name="g41-aanv-wat.jpg"/>
-                          <pic:cNvPicPr/>
-                        </pic:nvPicPr>
-                        <pic:blipFill>
-                          <a:blip r:embed="rIdG20"/>
-                          <a:stretch>
-                            <a:fillRect/>
-                          </a:stretch>
-                        </pic:blipFill>
-                        <pic:spPr>
-                          <a:xfrm>
-                            <a:off x="0" y="0"/>
-                            <a:ext cx="3492500" cy="2316691"/>
-                          </a:xfrm>
-                          <a:prstGeom prst="rect">
-                            <a:avLst/>
-                          </a:prstGeom>
-                        </pic:spPr>
-                      </pic:pic>
-                    </a:graphicData>
-                  </a:graphic>
-                </wp:inline>
-              </w:drawing>
-            </w:r>
-          </w:p>
-        </w:tc>
-        <w:tc>
-          <w:tcPr>
-            <w:tcW w:w="3515" w:type="dxa"/>
-            <w:tcMar>
-              <w:top w:w="120" w:type="dxa"/>
-              <w:left w:w="240" w:type="dxa"/>
-              <w:bottom w:w="0" w:type="dxa"/>
-              <w:right w:w="0" w:type="dxa"/>
-            </w:tcMar>
-            <w:vAlign w:val="center"/>
-          </w:tcPr>
-          <w:p>
-            <w:pPr>
-              <w:tabs>
-                <w:tab w:val="left" w:pos="425"/>
-              </w:tabs>
-              <w:spacing w:after="120"/>
-              <w:ind w:left="425" w:hanging="425"/>
-            </w:pPr>
-            <w:r>
-              <w:rPr>
-                <w:rFonts w:ascii="Area Normal Extrabold" w:hAnsi="Area Normal Extrabold"/>
-                <w:color w:val="E8590C"/>
-                <w:sz w:val="22"/>
-              </w:rPr>
-              <w:t>1</w:t>
-            </w:r>
-            <w:r>
-              <w:tab/>
-            </w:r>
-            <w:r>
-              <w:t xml:space="preserve">Beschrijf wat je wilt aanvullen of wijzigen. Geef duidelijk aan wat erbij moet of wat er anders moet. Marketing ontvangt direct bericht van je wijziging.</w:t>
-            </w:r>
-          </w:p>
-          <w:p>
-            <w:pPr>
-              <w:tabs>
-                <w:tab w:val="left" w:pos="425"/>
-              </w:tabs>
-              <w:spacing w:after="120"/>
-              <w:ind w:left="425" w:hanging="425"/>
-            </w:pPr>
-            <w:r>
-              <w:rPr>
-                <w:rFonts w:ascii="Area Normal Extrabold" w:hAnsi="Area Normal Extrabold"/>
-                <w:color w:val="E8590C"/>
-                <w:sz w:val="22"/>
-              </w:rPr>
-              <w:t>2</w:t>
-            </w:r>
-            <w:r>
-              <w:tab/>
-            </w:r>
-            <w:r>
-              <w:t xml:space="preserve">Je kunt ook bestanden toevoegen.</w:t>
-            </w:r>
-          </w:p>
-          <w:p>
-            <w:pPr>
-              <w:tabs>
-                <w:tab w:val="left" w:pos="425"/>
-              </w:tabs>
-              <w:spacing w:after="120"/>
-              <w:ind w:left="425" w:hanging="425"/>
-            </w:pPr>
-            <w:r>
-              <w:rPr>
-                <w:rFonts w:ascii="Area Normal Extrabold" w:hAnsi="Area Normal Extrabold"/>
-                <w:color w:val="E8590C"/>
-                <w:sz w:val="22"/>
-              </w:rPr>
-              <w:t>3</w:t>
-            </w:r>
-            <w:r>
-              <w:tab/>
-            </w:r>
-            <w:r>
-              <w:rPr>
-                <w:rFonts w:ascii="Area Normal Extrabold" w:hAnsi="Area Normal Extrabold"/>
-              </w:rPr>
-              <w:t xml:space="preserve">Menu aanpassen</w:t>
-            </w:r>
-            <w:r>
-              <w:t xml:space="preserve"> is alleen beschikbaar bij aanvragen voor een menukaart of menuscherm. Je krijgt dan hetzelfde menuoverzicht als in hoofdstuk 4, met het huidige menu al ingevuld. Pas aan wat nodig is.</w:t>
-            </w:r>
-          </w:p>
-        </w:tc>
-      </w:tr>
-    </w:tbl>
-    <w:p>
-      <w:pPr>
-        <w:spacing w:after="0" w:line="200" w:lineRule="exact"/>
-      </w:pPr>
-    </w:p>
-    <w:tbl>
-      <w:tblPr>
-        <w:tblW w:w="0" w:type="auto"/>
-        <w:tblBorders>
-          <w:top w:val="nil"/>
-          <w:left w:val="nil"/>
-          <w:bottom w:val="nil"/>
-          <w:right w:val="nil"/>
-          <w:insideH w:val="nil"/>
-          <w:insideV w:val="nil"/>
-        </w:tblBorders>
-        <w:tblLayout w:type="fixed"/>
-      </w:tblPr>
-      <w:tblGrid>
-        <w:gridCol w:w="5500"/>
-        <w:gridCol w:w="3515"/>
-      </w:tblGrid>
-      <w:tr>
-        <w:trPr>
-          <w:cantSplit/>
-        </w:trPr>
-        <w:tc>
-          <w:tcPr>
-            <w:tcW w:w="5500" w:type="dxa"/>
-            <w:tcMar>
-              <w:top w:w="0" w:type="dxa"/>
-              <w:left w:w="0" w:type="dxa"/>
-              <w:bottom w:w="0" w:type="dxa"/>
-              <w:right w:w="0" w:type="dxa"/>
-            </w:tcMar>
-            <w:vAlign w:val="center"/>
-          </w:tcPr>
-          <w:p>
-            <w:pPr>
-              <w:spacing w:after="0"/>
-            </w:pPr>
-            <w:r>
-              <w:rPr>
-                <w:noProof/>
-              </w:rPr>
-              <w:drawing>
-                <wp:inline distT="0" distB="0" distL="0" distR="0">
-                  <wp:extent cx="3492500" cy="2579793"/>
-                  <wp:effectExtent l="0" t="0" r="0" b="0"/>
-                  <wp:docPr id="121" name="Afbeelding 121"/>
-                  <wp:cNvGraphicFramePr>
-                    <a:graphicFrameLocks xmlns:a="http://schemas.openxmlformats.org/drawingml/2006/main" noChangeAspect="1"/>
-                  </wp:cNvGraphicFramePr>
-                  <a:graphic xmlns:a="http://schemas.openxmlformats.org/drawingml/2006/main">
-                    <a:graphicData uri="http://schemas.openxmlformats.org/drawingml/2006/picture">
-                      <pic:pic xmlns:pic="http://schemas.openxmlformats.org/drawingml/2006/picture">
-                        <pic:nvPicPr>
-                          <pic:cNvPr id="0" name="g42-aanv-extra.jpg"/>
-                          <pic:cNvPicPr/>
-                        </pic:nvPicPr>
-                        <pic:blipFill>
-                          <a:blip r:embed="rIdG21"/>
-                          <a:stretch>
-                            <a:fillRect/>
-                          </a:stretch>
-                        </pic:blipFill>
-                        <pic:spPr>
-                          <a:xfrm>
-                            <a:off x="0" y="0"/>
-                            <a:ext cx="3492500" cy="2579793"/>
-                          </a:xfrm>
-                          <a:prstGeom prst="rect">
-                            <a:avLst/>
-                          </a:prstGeom>
-                        </pic:spPr>
-                      </pic:pic>
-                    </a:graphicData>
-                  </a:graphic>
-                </wp:inline>
-              </w:drawing>
-            </w:r>
-          </w:p>
-        </w:tc>
-        <w:tc>
-          <w:tcPr>
-            <w:tcW w:w="3515" w:type="dxa"/>
-            <w:tcMar>
-              <w:top w:w="120" w:type="dxa"/>
-              <w:left w:w="240" w:type="dxa"/>
-              <w:bottom w:w="0" w:type="dxa"/>
-              <w:right w:w="0" w:type="dxa"/>
-            </w:tcMar>
-            <w:vAlign w:val="center"/>
-          </w:tcPr>
-          <w:p>
-            <w:pPr>
-              <w:tabs>
-                <w:tab w:val="left" w:pos="425"/>
-              </w:tabs>
-              <w:spacing w:after="120"/>
-              <w:ind w:left="425" w:hanging="425"/>
-            </w:pPr>
-            <w:r>
-              <w:rPr>
-                <w:rFonts w:ascii="Area Normal Extrabold" w:hAnsi="Area Normal Extrabold"/>
-                <w:color w:val="E8590C"/>
-                <w:sz w:val="22"/>
-              </w:rPr>
-              <w:t>1</w:t>
-            </w:r>
-            <w:r>
-              <w:tab/>
-            </w:r>
-            <w:r>
-              <w:t xml:space="preserve">Is de eventdatum of deadline gewijzigd? Klik dan op </w:t>
-            </w:r>
-            <w:r>
-              <w:rPr>
-                <w:rFonts w:ascii="Area Normal Extrabold" w:hAnsi="Area Normal Extrabold"/>
-              </w:rPr>
-              <w:t xml:space="preserve">wijzigen</w:t>
-            </w:r>
-            <w:r>
-              <w:t xml:space="preserve"> bij de datum en voer de nieuwe datum in.</w:t>
-            </w:r>
-          </w:p>
-        </w:tc>
-      </w:tr>
-    </w:tbl>
-    <w:p>
-      <w:pPr>
-        <w:spacing w:after="0" w:line="200" w:lineRule="exact"/>
-      </w:pPr>
-    </w:p>
-    <w:tbl>
-      <w:tblPr>
-        <w:tblW w:w="0" w:type="auto"/>
-        <w:tblBorders>
-          <w:top w:val="nil"/>
-          <w:left w:val="nil"/>
-          <w:bottom w:val="nil"/>
-          <w:right w:val="nil"/>
-          <w:insideH w:val="nil"/>
-          <w:insideV w:val="nil"/>
-        </w:tblBorders>
-        <w:tblLayout w:type="fixed"/>
-      </w:tblPr>
-      <w:tblGrid>
-        <w:gridCol w:w="5500"/>
-        <w:gridCol w:w="3515"/>
-      </w:tblGrid>
-      <w:tr>
-        <w:trPr>
-          <w:cantSplit/>
-        </w:trPr>
-        <w:tc>
-          <w:tcPr>
-            <w:tcW w:w="5500" w:type="dxa"/>
-            <w:tcMar>
-              <w:top w:w="0" w:type="dxa"/>
-              <w:left w:w="0" w:type="dxa"/>
-              <w:bottom w:w="0" w:type="dxa"/>
-              <w:right w:w="0" w:type="dxa"/>
-            </w:tcMar>
-            <w:vAlign w:val="center"/>
-          </w:tcPr>
-          <w:p>
-            <w:pPr>
-              <w:spacing w:after="0"/>
-            </w:pPr>
-            <w:r>
-              <w:rPr>
-                <w:noProof/>
-              </w:rPr>
-              <w:drawing>
-                <wp:inline distT="0" distB="0" distL="0" distR="0">
-                  <wp:extent cx="3492500" cy="2684568"/>
-                  <wp:effectExtent l="0" t="0" r="0" b="0"/>
-                  <wp:docPr id="122" name="Afbeelding 122"/>
+                  <wp:docPr id="114" name="Afbeelding 114"/>
                   <wp:cNvGraphicFramePr>
                     <a:graphicFrameLocks xmlns:a="http://schemas.openxmlformats.org/drawingml/2006/main" noChangeAspect="1"/>
                   </wp:cNvGraphicFramePr>
@@ -4418,7 +3651,7 @@
                           <pic:cNvPicPr/>
                         </pic:nvPicPr>
                         <pic:blipFill>
-                          <a:blip r:embed="rIdG22"/>
+                          <a:blip r:embed="rIdG14"/>
                           <a:stretch>
                             <a:fillRect/>
                           </a:stretch>
@@ -4426,7 +3659,7 @@
                         <pic:spPr>
                           <a:xfrm>
                             <a:off x="0" y="0"/>
-                            <a:ext cx="3492500" cy="2684568"/>
+                            <a:ext cx="2540000" cy="1952413"/>
                           </a:xfrm>
                           <a:prstGeom prst="rect">
                             <a:avLst/>
@@ -4442,7 +3675,7 @@
         </w:tc>
         <w:tc>
           <w:tcPr>
-            <w:tcW w:w="3515" w:type="dxa"/>
+            <w:tcW w:w="5015" w:type="dxa"/>
             <w:tcMar>
               <w:top w:w="120" w:type="dxa"/>
               <w:left w:w="240" w:type="dxa"/>
@@ -4517,7 +3750,8 @@
     <w:p>
       <w:pPr>
         <w:pStyle w:val="Kop1"/>
-        <w:pageBreakBefore/>
+        <w:keepNext/>
+        <w:spacing w:before="360"/>
       </w:pPr>
       <w:r>
         <w:t xml:space="preserve">7  Spoed en vragen</w:t>

</xml_diff>

<commit_message>
Projectengids: hoofdstuk 1 zonder screenshot, op één pagina
Haar tekst staat er weer als gewone alinea's, zoals in haar document, en
het hele hoofdstuk blijft bij elkaar op de eerste pagina.

Co-Authored-By: Claude Opus 5.5 <noreply@anthropic.com>
Claude-Session: https://claude.ai/code/session_01FF5qjJmcy9G5HYxEPWYe11
</commit_message>
<xml_diff>
--- a/docs/gids-projecten/Designs aanvragen - Handleiding voor projecten.docx
+++ b/docs/gids-projecten/Designs aanvragen - Handleiding voor projecten.docx
@@ -549,21 +549,9 @@
     </w:p>
     <w:p>
       <w:pPr>
-        <w:tabs>
-          <w:tab w:val="left" w:pos="425"/>
-        </w:tabs>
-        <w:spacing w:after="120"/>
-        <w:ind w:left="425" w:hanging="425"/>
-      </w:pPr>
-      <w:r>
-        <w:rPr>
-          <w:color w:val="E8590C"/>
-        </w:rPr>
-        <w:t>•</w:t>
-      </w:r>
-      <w:r>
-        <w:tab/>
-      </w:r>
+        <w:keepNext/>
+        <w:keepLines/>
+      </w:pPr>
       <w:r>
         <w:rPr>
           <w:rFonts w:ascii="Area Normal Extrabold" w:hAnsi="Area Normal Extrabold"/>
@@ -572,6 +560,106 @@
       </w:r>
       <w:r>
         <w:t xml:space="preserve"> klik op deze optie om een nieuwe aanvraag in te dienen.</w:t>
+      </w:r>
+    </w:p>
+    <w:p>
+      <w:pPr>
+        <w:keepNext/>
+        <w:keepLines/>
+      </w:pPr>
+      <w:r>
+        <w:t xml:space="preserve">Het formulier toont één vraag per scherm, met een korte toelichting. Selecteer je antwoord en klik op </w:t>
+      </w:r>
+      <w:r>
+        <w:rPr>
+          <w:rFonts w:ascii="Area Normal Extrabold" w:hAnsi="Area Normal Extrabold"/>
+        </w:rPr>
+        <w:t xml:space="preserve">‘Volgende’</w:t>
+      </w:r>
+      <w:r>
+        <w:t xml:space="preserve"> of druk op Enter om verder te gaan. Je kunt altijd terug naar een vorige vraag. De voortgangsteller onderaan laat zien hoever je bent.</w:t>
+      </w:r>
+    </w:p>
+    <w:p>
+      <w:pPr>
+        <w:keepNext/>
+        <w:keepLines/>
+      </w:pPr>
+      <w:r>
+        <w:t xml:space="preserve">Je antwoorden worden automatisch bewaard. Sluit je het venster tussentijds, dan kun je later verdergaan waar je bent gebleven.</w:t>
+      </w:r>
+    </w:p>
+    <w:p>
+      <w:pPr>
+        <w:pStyle w:val="Lijstalinea"/>
+        <w:numPr>
+          <w:ilvl w:val="0"/>
+          <w:numId w:val="2"/>
+        </w:numPr>
+        <w:keepNext/>
+        <w:spacing w:after="60"/>
+      </w:pPr>
+      <w:r>
+        <w:t xml:space="preserve">Vraag je design minimaal 10 werkdagen vóór het event aan. Is de termijn korter, dan geldt het als spoed en wordt de aanvraag als spoed geregistreerd.</w:t>
+      </w:r>
+    </w:p>
+    <w:p>
+      <w:pPr>
+        <w:pStyle w:val="Lijstalinea"/>
+        <w:numPr>
+          <w:ilvl w:val="0"/>
+          <w:numId w:val="2"/>
+        </w:numPr>
+        <w:keepNext/>
+        <w:spacing w:after="60"/>
+      </w:pPr>
+      <w:r>
+        <w:t xml:space="preserve">Dien één aanvraag per event in. Vink alles aan wat je nodig hebt, zodat alles bij elkaar staat.</w:t>
+      </w:r>
+    </w:p>
+    <w:p>
+      <w:pPr>
+        <w:pStyle w:val="Lijstalinea"/>
+        <w:numPr>
+          <w:ilvl w:val="0"/>
+          <w:numId w:val="2"/>
+        </w:numPr>
+        <w:keepNext/>
+        <w:spacing w:after="60"/>
+      </w:pPr>
+      <w:r>
+        <w:t xml:space="preserve">Kies standaarddesigns, tenzij de opdrachtgever om een eigen ontwerp vraagt of daarvoor betaalt.</w:t>
+      </w:r>
+    </w:p>
+    <w:p>
+      <w:pPr>
+        <w:pStyle w:val="Lijstalinea"/>
+        <w:numPr>
+          <w:ilvl w:val="0"/>
+          <w:numId w:val="2"/>
+        </w:numPr>
+        <w:spacing w:after="60"/>
+      </w:pPr>
+      <w:r>
+        <w:t xml:space="preserve">Geef feedback en geef eventuele wijzigingen door via de knop ‘Feedback geven’ in de e-mail. We verwerken feedback uitsluitend via het formulier en niet via losse berichten per e-mail, Teams of WhatsApp.</w:t>
+      </w:r>
+    </w:p>
+    <w:p>
+      <w:pPr>
+        <w:pStyle w:val="Kop1"/>
+        <w:keepNext/>
+        <w:spacing w:before="280"/>
+      </w:pPr>
+      <w:r>
+        <w:t xml:space="preserve">2  Een aanvraag voor een event</w:t>
+      </w:r>
+    </w:p>
+    <w:p>
+      <w:pPr>
+        <w:keepNext/>
+      </w:pPr>
+      <w:r>
+        <w:t xml:space="preserve">Klik op start en kies de locatie. Selecteer je naam in de lijst. Staat je naam er niet tussen, typ hem dan zelf. Kies voor een evenement en vul de naam van het event in zoals de opdrachtgever die gebruikt.</w:t>
       </w:r>
     </w:p>
     <w:tbl>
@@ -626,7 +714,7 @@
                     <a:graphicData uri="http://schemas.openxmlformats.org/drawingml/2006/picture">
                       <pic:pic xmlns:pic="http://schemas.openxmlformats.org/drawingml/2006/picture">
                         <pic:nvPicPr>
-                          <pic:cNvPr id="0" name="g02-vraag.jpg"/>
+                          <pic:cNvPr id="0" name="g03-eventdatum.jpg"/>
                           <pic:cNvPicPr/>
                         </pic:nvPicPr>
                         <pic:blipFill>
@@ -683,7 +771,7 @@
               <w:tab/>
             </w:r>
             <w:r>
-              <w:t xml:space="preserve">Het formulier toont één vraag per scherm, met een korte toelichting.</w:t>
+              <w:t xml:space="preserve">Blader naar de juiste maand en klik de datum van het event aan. Duurt het event meerdere dagen, kies dan de eerste dag.</w:t>
             </w:r>
           </w:p>
           <w:p>
@@ -696,70 +784,15 @@
             </w:pPr>
             <w:r>
               <w:rPr>
-                <w:rFonts w:ascii="Area Normal Extrabold" w:hAnsi="Area Normal Extrabold"/>
                 <w:color w:val="E8590C"/>
-                <w:sz w:val="22"/>
-              </w:rPr>
-              <w:t>2</w:t>
+              </w:rPr>
+              <w:t>•</w:t>
             </w:r>
             <w:r>
               <w:tab/>
             </w:r>
             <w:r>
-              <w:t xml:space="preserve">Selecteer je antwoord en klik op </w:t>
-            </w:r>
-            <w:r>
-              <w:rPr>
-                <w:rFonts w:ascii="Area Normal Extrabold" w:hAnsi="Area Normal Extrabold"/>
-              </w:rPr>
-              <w:t xml:space="preserve">‘Volgende’</w:t>
-            </w:r>
-            <w:r>
-              <w:t xml:space="preserve"> of druk op Enter om verder te gaan.</w:t>
-            </w:r>
-          </w:p>
-          <w:p>
-            <w:pPr>
-              <w:tabs>
-                <w:tab w:val="left" w:pos="425"/>
-              </w:tabs>
-              <w:spacing w:after="120"/>
-              <w:ind w:left="425" w:hanging="425"/>
-            </w:pPr>
-            <w:r>
-              <w:rPr>
-                <w:rFonts w:ascii="Area Normal Extrabold" w:hAnsi="Area Normal Extrabold"/>
-                <w:color w:val="E8590C"/>
-                <w:sz w:val="22"/>
-              </w:rPr>
-              <w:t>3</w:t>
-            </w:r>
-            <w:r>
-              <w:tab/>
-            </w:r>
-            <w:r>
-              <w:t xml:space="preserve">Je kunt altijd terug naar een vorige vraag. De voortgangsteller onderaan laat zien hoever je bent.</w:t>
-            </w:r>
-          </w:p>
-          <w:p>
-            <w:pPr>
-              <w:tabs>
-                <w:tab w:val="left" w:pos="425"/>
-              </w:tabs>
-              <w:spacing w:after="120"/>
-              <w:ind w:left="425" w:hanging="425"/>
-            </w:pPr>
-            <w:r>
-              <w:rPr>
-                <w:color w:val="E8590C"/>
-              </w:rPr>
-              <w:t>•</w:t>
-            </w:r>
-            <w:r>
-              <w:tab/>
-            </w:r>
-            <w:r>
-              <w:t xml:space="preserve">Je antwoorden worden automatisch bewaard. Sluit je het venster tussentijds, dan kun je later verdergaan waar je bent gebleven.</w:t>
+              <w:t xml:space="preserve">Kies vervolgens de deadline: de datum waarop het design klaar moet zijn. Deze datum mag niet na de eventdatum liggen.</w:t>
             </w:r>
           </w:p>
         </w:tc>
@@ -769,79 +802,6 @@
       <w:pPr>
         <w:spacing w:after="0" w:line="120" w:lineRule="exact"/>
       </w:pPr>
-    </w:p>
-    <w:p>
-      <w:pPr>
-        <w:pStyle w:val="Lijstalinea"/>
-        <w:numPr>
-          <w:ilvl w:val="0"/>
-          <w:numId w:val="2"/>
-        </w:numPr>
-        <w:keepNext/>
-        <w:spacing w:after="60"/>
-      </w:pPr>
-      <w:r>
-        <w:t xml:space="preserve">Vraag je design minimaal 10 werkdagen vóór het event aan. Is de termijn korter, dan geldt het als spoed en wordt de aanvraag als spoed geregistreerd.</w:t>
-      </w:r>
-    </w:p>
-    <w:p>
-      <w:pPr>
-        <w:pStyle w:val="Lijstalinea"/>
-        <w:numPr>
-          <w:ilvl w:val="0"/>
-          <w:numId w:val="2"/>
-        </w:numPr>
-        <w:keepNext/>
-        <w:spacing w:after="60"/>
-      </w:pPr>
-      <w:r>
-        <w:t xml:space="preserve">Dien één aanvraag per event in. Vink alles aan wat je nodig hebt, zodat alles bij elkaar staat.</w:t>
-      </w:r>
-    </w:p>
-    <w:p>
-      <w:pPr>
-        <w:pStyle w:val="Lijstalinea"/>
-        <w:numPr>
-          <w:ilvl w:val="0"/>
-          <w:numId w:val="2"/>
-        </w:numPr>
-        <w:keepNext/>
-        <w:spacing w:after="60"/>
-      </w:pPr>
-      <w:r>
-        <w:t xml:space="preserve">Kies standaarddesigns, tenzij de opdrachtgever om een eigen ontwerp vraagt of daarvoor betaalt.</w:t>
-      </w:r>
-    </w:p>
-    <w:p>
-      <w:pPr>
-        <w:pStyle w:val="Lijstalinea"/>
-        <w:numPr>
-          <w:ilvl w:val="0"/>
-          <w:numId w:val="2"/>
-        </w:numPr>
-        <w:spacing w:after="60"/>
-      </w:pPr>
-      <w:r>
-        <w:t xml:space="preserve">Geef feedback en geef eventuele wijzigingen door via de knop ‘Feedback geven’ in de e-mail. We verwerken feedback uitsluitend via het formulier en niet via losse berichten per e-mail, Teams of WhatsApp.</w:t>
-      </w:r>
-    </w:p>
-    <w:p>
-      <w:pPr>
-        <w:pStyle w:val="Kop1"/>
-        <w:keepNext/>
-        <w:spacing w:before="280"/>
-      </w:pPr>
-      <w:r>
-        <w:t xml:space="preserve">2  Een aanvraag voor een event</w:t>
-      </w:r>
-    </w:p>
-    <w:p>
-      <w:pPr>
-        <w:keepNext/>
-      </w:pPr>
-      <w:r>
-        <w:t xml:space="preserve">Klik op start en kies de locatie. Selecteer je naam in de lijst. Staat je naam er niet tussen, typ hem dan zelf. Kies voor een evenement en vul de naam van het event in zoals de opdrachtgever die gebruikt.</w:t>
-      </w:r>
     </w:p>
     <w:tbl>
       <w:tblPr>
@@ -895,7 +855,7 @@
                     <a:graphicData uri="http://schemas.openxmlformats.org/drawingml/2006/picture">
                       <pic:pic xmlns:pic="http://schemas.openxmlformats.org/drawingml/2006/picture">
                         <pic:nvPicPr>
-                          <pic:cNvPr id="0" name="g03-eventdatum.jpg"/>
+                          <pic:cNvPr id="0" name="g06-bestanden.jpg"/>
                           <pic:cNvPicPr/>
                         </pic:nvPicPr>
                         <pic:blipFill>
@@ -952,7 +912,7 @@
               <w:tab/>
             </w:r>
             <w:r>
-              <w:t xml:space="preserve">Blader naar de juiste maand en klik de datum van het event aan. Duurt het event meerdere dagen, kies dan de eerste dag.</w:t>
+              <w:t xml:space="preserve">Sleep een logo, voorbeelden of briefing naar het daarvoor bestemde vak, of klik erop om bestanden te kiezen.</w:t>
             </w:r>
           </w:p>
           <w:p>
@@ -965,7 +925,30 @@
             </w:pPr>
             <w:r>
               <w:rPr>
+                <w:rFonts w:ascii="Area Normal Extrabold" w:hAnsi="Area Normal Extrabold"/>
                 <w:color w:val="E8590C"/>
+                <w:sz w:val="22"/>
+              </w:rPr>
+              <w:t>2</w:t>
+            </w:r>
+            <w:r>
+              <w:tab/>
+            </w:r>
+            <w:r>
+              <w:t xml:space="preserve">Staat er een vinkje bij een bestand, dan wordt het meegestuurd.</w:t>
+            </w:r>
+          </w:p>
+          <w:p>
+            <w:pPr>
+              <w:tabs>
+                <w:tab w:val="left" w:pos="425"/>
+              </w:tabs>
+              <w:spacing w:after="120"/>
+              <w:ind w:left="425" w:hanging="425"/>
+            </w:pPr>
+            <w:r>
+              <w:rPr>
+                <w:color w:val="E8590C"/>
               </w:rPr>
               <w:t>•</w:t>
             </w:r>
@@ -973,7 +956,7 @@
               <w:tab/>
             </w:r>
             <w:r>
-              <w:t xml:space="preserve">Kies vervolgens de deadline: de datum waarop het design klaar moet zijn. Deze datum mag niet na de eventdatum liggen.</w:t>
+              <w:t xml:space="preserve">Je kunt maximaal 5 bestanden van elk 25 MB toevoegen, zoals afbeeldingen, pdf-, Word- en PowerPoint-bestanden. Zijn de bestanden groter of gaat het om bronbestanden (AI, PSD of INDD)? Upload deze dan op de G-schijf en voeg de link naar de bestanden toe aan het formulier.</w:t>
             </w:r>
           </w:p>
         </w:tc>
@@ -983,6 +966,49 @@
       <w:pPr>
         <w:spacing w:after="0" w:line="120" w:lineRule="exact"/>
       </w:pPr>
+    </w:p>
+    <w:p>
+      <w:pPr>
+        <w:keepNext/>
+        <w:tabs>
+          <w:tab w:val="left" w:pos="425"/>
+        </w:tabs>
+        <w:spacing w:after="120"/>
+        <w:ind w:left="425" w:hanging="425"/>
+      </w:pPr>
+      <w:r>
+        <w:rPr>
+          <w:color w:val="E8590C"/>
+        </w:rPr>
+        <w:t>•</w:t>
+      </w:r>
+      <w:r>
+        <w:tab/>
+      </w:r>
+      <w:r>
+        <w:t xml:space="preserve">Vul waar mogelijk de website van het bedrijf of event in. Zo kan Marketing de juiste branding, zoals logo’s, kleuren en lettertypen, achterhalen. Is er geen website beschikbaar? Dan kun je dit veld leeg laten.</w:t>
+      </w:r>
+    </w:p>
+    <w:p>
+      <w:pPr>
+        <w:tabs>
+          <w:tab w:val="left" w:pos="425"/>
+        </w:tabs>
+        <w:spacing w:after="120"/>
+        <w:ind w:left="425" w:hanging="425"/>
+      </w:pPr>
+      <w:r>
+        <w:rPr>
+          <w:color w:val="E8590C"/>
+        </w:rPr>
+        <w:t>•</w:t>
+      </w:r>
+      <w:r>
+        <w:tab/>
+      </w:r>
+      <w:r>
+        <w:t xml:space="preserve">Vink alles aan wat je voor het event nodig hebt. Staat jouw keuze er niet bij? Kies dan ‘Anders, namelijk…’ en beschrijf wat je nodig hebt.</w:t>
+      </w:r>
     </w:p>
     <w:tbl>
       <w:tblPr>
@@ -1036,7 +1062,7 @@
                     <a:graphicData uri="http://schemas.openxmlformats.org/drawingml/2006/picture">
                       <pic:pic xmlns:pic="http://schemas.openxmlformats.org/drawingml/2006/picture">
                         <pic:nvPicPr>
-                          <pic:cNvPr id="0" name="g06-bestanden.jpg"/>
+                          <pic:cNvPr id="0" name="g08-modus.jpg"/>
                           <pic:cNvPicPr/>
                         </pic:nvPicPr>
                         <pic:blipFill>
@@ -1093,7 +1119,7 @@
               <w:tab/>
             </w:r>
             <w:r>
-              <w:t xml:space="preserve">Sleep een logo, voorbeelden of briefing naar het daarvoor bestemde vak, of klik erop om bestanden te kiezen.</w:t>
+              <w:t xml:space="preserve">Standaarddesigns zijn vaste templates die worden ingevuld met de gegevens van het event. Kies deze optie in de meeste gevallen.</w:t>
             </w:r>
           </w:p>
           <w:p>
@@ -1116,28 +1142,7 @@
               <w:tab/>
             </w:r>
             <w:r>
-              <w:t xml:space="preserve">Staat er een vinkje bij een bestand, dan wordt het meegestuurd.</w:t>
-            </w:r>
-          </w:p>
-          <w:p>
-            <w:pPr>
-              <w:tabs>
-                <w:tab w:val="left" w:pos="425"/>
-              </w:tabs>
-              <w:spacing w:after="120"/>
-              <w:ind w:left="425" w:hanging="425"/>
-            </w:pPr>
-            <w:r>
-              <w:rPr>
-                <w:color w:val="E8590C"/>
-              </w:rPr>
-              <w:t>•</w:t>
-            </w:r>
-            <w:r>
-              <w:tab/>
-            </w:r>
-            <w:r>
-              <w:t xml:space="preserve">Je kunt maximaal 5 bestanden van elk 25 MB toevoegen, zoals afbeeldingen, pdf-, Word- en PowerPoint-bestanden. Zijn de bestanden groter of gaat het om bronbestanden (AI, PSD of INDD)? Upload deze dan op de G-schijf en voeg de link naar de bestanden toe aan het formulier.</w:t>
+              <w:t xml:space="preserve">Kies alleen voor ‘Volledig custom’ als de opdrachtgever een eigen ontwerp wenst en hiervoor betaalt.</w:t>
             </w:r>
           </w:p>
         </w:tc>
@@ -1147,49 +1152,6 @@
       <w:pPr>
         <w:spacing w:after="0" w:line="120" w:lineRule="exact"/>
       </w:pPr>
-    </w:p>
-    <w:p>
-      <w:pPr>
-        <w:keepNext/>
-        <w:tabs>
-          <w:tab w:val="left" w:pos="425"/>
-        </w:tabs>
-        <w:spacing w:after="120"/>
-        <w:ind w:left="425" w:hanging="425"/>
-      </w:pPr>
-      <w:r>
-        <w:rPr>
-          <w:color w:val="E8590C"/>
-        </w:rPr>
-        <w:t>•</w:t>
-      </w:r>
-      <w:r>
-        <w:tab/>
-      </w:r>
-      <w:r>
-        <w:t xml:space="preserve">Vul waar mogelijk de website van het bedrijf of event in. Zo kan Marketing de juiste branding, zoals logo’s, kleuren en lettertypen, achterhalen. Is er geen website beschikbaar? Dan kun je dit veld leeg laten.</w:t>
-      </w:r>
-    </w:p>
-    <w:p>
-      <w:pPr>
-        <w:tabs>
-          <w:tab w:val="left" w:pos="425"/>
-        </w:tabs>
-        <w:spacing w:after="120"/>
-        <w:ind w:left="425" w:hanging="425"/>
-      </w:pPr>
-      <w:r>
-        <w:rPr>
-          <w:color w:val="E8590C"/>
-        </w:rPr>
-        <w:t>•</w:t>
-      </w:r>
-      <w:r>
-        <w:tab/>
-      </w:r>
-      <w:r>
-        <w:t xml:space="preserve">Vink alles aan wat je voor het event nodig hebt. Staat jouw keuze er niet bij? Kies dan ‘Anders, namelijk…’ en beschrijf wat je nodig hebt.</w:t>
-      </w:r>
     </w:p>
     <w:tbl>
       <w:tblPr>
@@ -1243,7 +1205,7 @@
                     <a:graphicData uri="http://schemas.openxmlformats.org/drawingml/2006/picture">
                       <pic:pic xmlns:pic="http://schemas.openxmlformats.org/drawingml/2006/picture">
                         <pic:nvPicPr>
-                          <pic:cNvPr id="0" name="g08-modus.jpg"/>
+                          <pic:cNvPr id="0" name="g09-wensen.jpg"/>
                           <pic:cNvPicPr/>
                         </pic:nvPicPr>
                         <pic:blipFill>
@@ -1300,7 +1262,7 @@
               <w:tab/>
             </w:r>
             <w:r>
-              <w:t xml:space="preserve">Standaarddesigns zijn vaste templates die worden ingevuld met de gegevens van het event. Kies deze optie in de meeste gevallen.</w:t>
+              <w:t xml:space="preserve">Vermeld alle informatie die Marketing nodig heeft, zoals teksten, sfeer en gewenste formaten. Gebruik Enter om een nieuwe regel te beginnen.</w:t>
             </w:r>
           </w:p>
           <w:p>
@@ -1323,7 +1285,28 @@
               <w:tab/>
             </w:r>
             <w:r>
-              <w:t xml:space="preserve">Kies alleen voor ‘Volledig custom’ als de opdrachtgever een eigen ontwerp wenst en hiervoor betaalt.</w:t>
+              <w:t xml:space="preserve">Klik daarna op ‘Naar overzicht’.</w:t>
+            </w:r>
+          </w:p>
+          <w:p>
+            <w:pPr>
+              <w:tabs>
+                <w:tab w:val="left" w:pos="425"/>
+              </w:tabs>
+              <w:spacing w:after="120"/>
+              <w:ind w:left="425" w:hanging="425"/>
+            </w:pPr>
+            <w:r>
+              <w:rPr>
+                <w:color w:val="E8590C"/>
+              </w:rPr>
+              <w:t>•</w:t>
+            </w:r>
+            <w:r>
+              <w:tab/>
+            </w:r>
+            <w:r>
+              <w:t xml:space="preserve">Wil je dat een collega een e-mail ontvangt zodra het design klaar is? Vul dan hier de naam en het e-mailadres van deze collega in.</w:t>
             </w:r>
           </w:p>
         </w:tc>
@@ -1386,7 +1369,7 @@
                     <a:graphicData uri="http://schemas.openxmlformats.org/drawingml/2006/picture">
                       <pic:pic xmlns:pic="http://schemas.openxmlformats.org/drawingml/2006/picture">
                         <pic:nvPicPr>
-                          <pic:cNvPr id="0" name="g09-wensen.jpg"/>
+                          <pic:cNvPr id="0" name="g10-overzicht.jpg"/>
                           <pic:cNvPicPr/>
                         </pic:nvPicPr>
                         <pic:blipFill>
@@ -1443,7 +1426,7 @@
               <w:tab/>
             </w:r>
             <w:r>
-              <w:t xml:space="preserve">Vermeld alle informatie die Marketing nodig heeft, zoals teksten, sfeer en gewenste formaten. Gebruik Enter om een nieuwe regel te beginnen.</w:t>
+              <w:t xml:space="preserve">Wil je een antwoord aanpassen? Klik op ‘Wijzig’. Je keert daarna terug naar het overzicht.</w:t>
             </w:r>
           </w:p>
           <w:p>
@@ -1466,28 +1449,7 @@
               <w:tab/>
             </w:r>
             <w:r>
-              <w:t xml:space="preserve">Klik daarna op ‘Naar overzicht’.</w:t>
-            </w:r>
-          </w:p>
-          <w:p>
-            <w:pPr>
-              <w:tabs>
-                <w:tab w:val="left" w:pos="425"/>
-              </w:tabs>
-              <w:spacing w:after="120"/>
-              <w:ind w:left="425" w:hanging="425"/>
-            </w:pPr>
-            <w:r>
-              <w:rPr>
-                <w:color w:val="E8590C"/>
-              </w:rPr>
-              <w:t>•</w:t>
-            </w:r>
-            <w:r>
-              <w:tab/>
-            </w:r>
-            <w:r>
-              <w:t xml:space="preserve">Wil je dat een collega een e-mail ontvangt zodra het design klaar is? Vul dan hier de naam en het e-mailadres van deze collega in.</w:t>
+              <w:t xml:space="preserve">Klik op ‘Verstuur aanvraag’ om je aanvraag definitief in te dienen.</w:t>
             </w:r>
           </w:p>
         </w:tc>
@@ -1550,7 +1512,7 @@
                     <a:graphicData uri="http://schemas.openxmlformats.org/drawingml/2006/picture">
                       <pic:pic xmlns:pic="http://schemas.openxmlformats.org/drawingml/2006/picture">
                         <pic:nvPicPr>
-                          <pic:cNvPr id="0" name="g10-overzicht.jpg"/>
+                          <pic:cNvPr id="0" name="g11-gelukt.jpg"/>
                           <pic:cNvPicPr/>
                         </pic:nvPicPr>
                         <pic:blipFill>
@@ -1607,7 +1569,7 @@
               <w:tab/>
             </w:r>
             <w:r>
-              <w:t xml:space="preserve">Wil je een antwoord aanpassen? Klik op ‘Wijzig’. Je keert daarna terug naar het overzicht.</w:t>
+              <w:t xml:space="preserve">Je aanvraag is nu ingediend bij Marketing.</w:t>
             </w:r>
           </w:p>
           <w:p>
@@ -1630,7 +1592,49 @@
               <w:tab/>
             </w:r>
             <w:r>
-              <w:t xml:space="preserve">Klik op ‘Verstuur aanvraag’ om je aanvraag definitief in te dienen.</w:t>
+              <w:t xml:space="preserve">De huisstijl wordt op de achtergrond opgehaald; je hoeft hier niet op te wachten en kunt het venster sluiten.</w:t>
+            </w:r>
+          </w:p>
+          <w:p>
+            <w:pPr>
+              <w:tabs>
+                <w:tab w:val="left" w:pos="425"/>
+              </w:tabs>
+              <w:spacing w:after="120"/>
+              <w:ind w:left="425" w:hanging="425"/>
+            </w:pPr>
+            <w:r>
+              <w:rPr>
+                <w:color w:val="E8590C"/>
+              </w:rPr>
+              <w:t>•</w:t>
+            </w:r>
+            <w:r>
+              <w:tab/>
+            </w:r>
+            <w:r>
+              <w:t xml:space="preserve">Is het erg krap? Dan herinnert het formulier je eraan om contact op te nemen met Marketing.</w:t>
+            </w:r>
+          </w:p>
+          <w:p>
+            <w:pPr>
+              <w:tabs>
+                <w:tab w:val="left" w:pos="425"/>
+              </w:tabs>
+              <w:spacing w:after="120"/>
+              <w:ind w:left="425" w:hanging="425"/>
+            </w:pPr>
+            <w:r>
+              <w:rPr>
+                <w:color w:val="E8590C"/>
+              </w:rPr>
+              <w:t>•</w:t>
+            </w:r>
+            <w:r>
+              <w:tab/>
+            </w:r>
+            <w:r>
+              <w:t xml:space="preserve">Iets vergeten of wil je iets aanpassen? Dien geen tweede aanvraag in, maar kies ‘Iets aanvullen of wijzigen’.</w:t>
             </w:r>
           </w:p>
         </w:tc>
@@ -1640,6 +1644,110 @@
       <w:pPr>
         <w:spacing w:after="0" w:line="120" w:lineRule="exact"/>
       </w:pPr>
+    </w:p>
+    <w:p>
+      <w:pPr>
+        <w:keepNext/>
+        <w:tabs>
+          <w:tab w:val="left" w:pos="425"/>
+        </w:tabs>
+        <w:spacing w:after="120"/>
+        <w:ind w:left="425" w:hanging="425"/>
+      </w:pPr>
+      <w:r>
+        <w:rPr>
+          <w:color w:val="E8590C"/>
+        </w:rPr>
+        <w:t>•</w:t>
+      </w:r>
+      <w:r>
+        <w:tab/>
+      </w:r>
+      <w:r>
+        <w:t xml:space="preserve">Valt de eventdatum of deadline binnen 3 werkdagen? Dan verschijnt er een rode melding. Vul het formulier verder in. Het marketingteam beoordeelt vervolgens wat er binnen de korte deadline haalbaar is.</w:t>
+      </w:r>
+    </w:p>
+    <w:p>
+      <w:pPr>
+        <w:keepNext/>
+        <w:tabs>
+          <w:tab w:val="left" w:pos="425"/>
+        </w:tabs>
+        <w:spacing w:after="120"/>
+        <w:ind w:left="425" w:hanging="425"/>
+      </w:pPr>
+      <w:r>
+        <w:rPr>
+          <w:color w:val="E8590C"/>
+        </w:rPr>
+        <w:t>•</w:t>
+      </w:r>
+      <w:r>
+        <w:tab/>
+      </w:r>
+      <w:r>
+        <w:t xml:space="preserve">Valt het event binnen twee weken? Dan verschijnt er een oranje melding. Drukwerk, zoals geprinte menukaarten, vlaggen, banners en roll-ups, is waarschijnlijk niet meer op tijd klaar.</w:t>
+      </w:r>
+    </w:p>
+    <w:p>
+      <w:pPr>
+        <w:tabs>
+          <w:tab w:val="left" w:pos="425"/>
+        </w:tabs>
+        <w:spacing w:after="120"/>
+        <w:ind w:left="425" w:hanging="425"/>
+      </w:pPr>
+      <w:r>
+        <w:rPr>
+          <w:color w:val="E8590C"/>
+        </w:rPr>
+        <w:t>•</w:t>
+      </w:r>
+      <w:r>
+        <w:tab/>
+      </w:r>
+      <w:r>
+        <w:t xml:space="preserve">Valt de deadline binnen 5 werkdagen? Dan verschijnt er ook een melding. Je kunt de aanvraag verder invullen, maar stem de planning eerst even af met Marketing.</w:t>
+      </w:r>
+    </w:p>
+    <w:p>
+      <w:pPr>
+        <w:pStyle w:val="Kop1"/>
+        <w:keepNext/>
+        <w:spacing w:before="280"/>
+      </w:pPr>
+      <w:r>
+        <w:t xml:space="preserve">3  Een interne aanvraag</w:t>
+      </w:r>
+    </w:p>
+    <w:p>
+      <w:pPr>
+        <w:keepNext/>
+      </w:pPr>
+      <w:r>
+        <w:t xml:space="preserve">Gebruik deze optie voor aanvragen die niet aan een event gekoppeld zijn, zoals visitekaartjes of een poster voor de kantine. Selecteer de locatie en vul je naam in, zoals eerder beschreven. Kies vervolgens ‘Intern’. Je hoeft dan nog maar twee vragen te beantwoorden.</w:t>
+      </w:r>
+    </w:p>
+    <w:p>
+      <w:pPr>
+        <w:tabs>
+          <w:tab w:val="left" w:pos="425"/>
+        </w:tabs>
+        <w:spacing w:after="120"/>
+        <w:ind w:left="425" w:hanging="425"/>
+      </w:pPr>
+      <w:r>
+        <w:rPr>
+          <w:color w:val="E8590C"/>
+        </w:rPr>
+        <w:t>•</w:t>
+      </w:r>
+      <w:r>
+        <w:tab/>
+      </w:r>
+      <w:r>
+        <w:t xml:space="preserve">Beschrijf je aanvraag volledig in één keer. Vermeld wat je nodig hebt, het gewenste formaat, de teksten en voor wie het bedoeld is.</w:t>
+      </w:r>
     </w:p>
     <w:tbl>
       <w:tblPr>
@@ -1683,7 +1791,7 @@
               </w:rPr>
               <w:drawing>
                 <wp:inline distT="0" distB="0" distL="0" distR="0">
-                  <wp:extent cx="2349500" cy="1558501"/>
+                  <wp:extent cx="2349500" cy="1805982"/>
                   <wp:effectExtent l="0" t="0" r="0" b="0"/>
                   <wp:docPr id="107" name="Afbeelding 107"/>
                   <wp:cNvGraphicFramePr>
@@ -1693,7 +1801,7 @@
                     <a:graphicData uri="http://schemas.openxmlformats.org/drawingml/2006/picture">
                       <pic:pic xmlns:pic="http://schemas.openxmlformats.org/drawingml/2006/picture">
                         <pic:nvPicPr>
-                          <pic:cNvPr id="0" name="g11-gelukt.jpg"/>
+                          <pic:cNvPr id="0" name="g22-intern-deadline.jpg"/>
                           <pic:cNvPicPr/>
                         </pic:nvPicPr>
                         <pic:blipFill>
@@ -1705,7 +1813,7 @@
                         <pic:spPr>
                           <a:xfrm>
                             <a:off x="0" y="0"/>
-                            <a:ext cx="2349500" cy="1558501"/>
+                            <a:ext cx="2349500" cy="1805982"/>
                           </a:xfrm>
                           <a:prstGeom prst="rect">
                             <a:avLst/>
@@ -1750,7 +1858,7 @@
               <w:tab/>
             </w:r>
             <w:r>
-              <w:t xml:space="preserve">Je aanvraag is nu ingediend bij Marketing.</w:t>
+              <w:t xml:space="preserve">Geef aan wanneer je het nodig hebt.</w:t>
             </w:r>
           </w:p>
           <w:p>
@@ -1773,7 +1881,7 @@
               <w:tab/>
             </w:r>
             <w:r>
-              <w:t xml:space="preserve">De huisstijl wordt op de achtergrond opgehaald; je hoeft hier niet op te wachten en kunt het venster sluiten.</w:t>
+              <w:t xml:space="preserve">Is er geen haast bij? Kies dan ‘Geen deadline’. Marketing plant de aanvraag dan in op een geschikt moment.</w:t>
             </w:r>
           </w:p>
           <w:p>
@@ -1794,28 +1902,7 @@
               <w:tab/>
             </w:r>
             <w:r>
-              <w:t xml:space="preserve">Is het erg krap? Dan herinnert het formulier je eraan om contact op te nemen met Marketing.</w:t>
-            </w:r>
-          </w:p>
-          <w:p>
-            <w:pPr>
-              <w:tabs>
-                <w:tab w:val="left" w:pos="425"/>
-              </w:tabs>
-              <w:spacing w:after="120"/>
-              <w:ind w:left="425" w:hanging="425"/>
-            </w:pPr>
-            <w:r>
-              <w:rPr>
-                <w:color w:val="E8590C"/>
-              </w:rPr>
-              <w:t>•</w:t>
-            </w:r>
-            <w:r>
-              <w:tab/>
-            </w:r>
-            <w:r>
-              <w:t xml:space="preserve">Iets vergeten of wil je iets aanpassen? Dien geen tweede aanvraag in, maar kies ‘Iets aanvullen of wijzigen’.</w:t>
+              <w:t xml:space="preserve">Ontstaat er later alsnog een deadline? Geef dit dan door via ‘Iets aanvullen of wijzigen’.</w:t>
             </w:r>
           </w:p>
         </w:tc>
@@ -1828,7 +1915,24 @@
     </w:p>
     <w:p>
       <w:pPr>
+        <w:pStyle w:val="Kop1"/>
         <w:keepNext/>
+        <w:spacing w:before="280"/>
+      </w:pPr>
+      <w:r>
+        <w:t xml:space="preserve">4  Een menukaart of menuscherm</w:t>
+      </w:r>
+    </w:p>
+    <w:p>
+      <w:pPr>
+        <w:keepNext/>
+      </w:pPr>
+      <w:r>
+        <w:t xml:space="preserve">Selecteer bij ‘Wat wil je aanvragen?’ de optie ‘Menukaart print’, ‘Menu scherm’ of beide. Er verschijnt vervolgens een extra vraag: om welk menu gaat het?</w:t>
+      </w:r>
+    </w:p>
+    <w:p>
+      <w:pPr>
         <w:tabs>
           <w:tab w:val="left" w:pos="425"/>
         </w:tabs>
@@ -1845,89 +1949,15 @@
         <w:tab/>
       </w:r>
       <w:r>
-        <w:t xml:space="preserve">Valt de eventdatum of deadline binnen 3 werkdagen? Dan verschijnt er een rode melding. Vul het formulier verder in. Het marketingteam beoordeelt vervolgens wat er binnen de korte deadline haalbaar is.</w:t>
+        <w:t xml:space="preserve">Kies het gewenste pakket. Onder de pakketnaam zie je welke gangen zijn inbegrepen.</w:t>
       </w:r>
     </w:p>
     <w:p>
       <w:pPr>
         <w:keepNext/>
-        <w:tabs>
-          <w:tab w:val="left" w:pos="425"/>
-        </w:tabs>
-        <w:spacing w:after="120"/>
-        <w:ind w:left="425" w:hanging="425"/>
-      </w:pPr>
-      <w:r>
-        <w:rPr>
-          <w:color w:val="E8590C"/>
-        </w:rPr>
-        <w:t>•</w:t>
-      </w:r>
-      <w:r>
-        <w:tab/>
-      </w:r>
-      <w:r>
-        <w:t xml:space="preserve">Valt het event binnen twee weken? Dan verschijnt er een oranje melding. Drukwerk, zoals geprinte menukaarten, vlaggen, banners en roll-ups, is waarschijnlijk niet meer op tijd klaar.</w:t>
-      </w:r>
-    </w:p>
-    <w:p>
-      <w:pPr>
-        <w:tabs>
-          <w:tab w:val="left" w:pos="425"/>
-        </w:tabs>
-        <w:spacing w:after="120"/>
-        <w:ind w:left="425" w:hanging="425"/>
-      </w:pPr>
-      <w:r>
-        <w:rPr>
-          <w:color w:val="E8590C"/>
-        </w:rPr>
-        <w:t>•</w:t>
-      </w:r>
-      <w:r>
-        <w:tab/>
-      </w:r>
-      <w:r>
-        <w:t xml:space="preserve">Valt de deadline binnen 5 werkdagen? Dan verschijnt er ook een melding. Je kunt de aanvraag verder invullen, maar stem de planning eerst even af met Marketing.</w:t>
-      </w:r>
-    </w:p>
-    <w:p>
-      <w:pPr>
-        <w:pStyle w:val="Kop1"/>
-        <w:keepNext/>
-        <w:spacing w:before="280"/>
-      </w:pPr>
-      <w:r>
-        <w:t xml:space="preserve">3  Een interne aanvraag</w:t>
-      </w:r>
-    </w:p>
-    <w:p>
-      <w:pPr>
-        <w:keepNext/>
-      </w:pPr>
-      <w:r>
-        <w:t xml:space="preserve">Gebruik deze optie voor aanvragen die niet aan een event gekoppeld zijn, zoals visitekaartjes of een poster voor de kantine. Selecteer de locatie en vul je naam in, zoals eerder beschreven. Kies vervolgens ‘Intern’. Je hoeft dan nog maar twee vragen te beantwoorden.</w:t>
-      </w:r>
-    </w:p>
-    <w:p>
-      <w:pPr>
-        <w:tabs>
-          <w:tab w:val="left" w:pos="425"/>
-        </w:tabs>
-        <w:spacing w:after="120"/>
-        <w:ind w:left="425" w:hanging="425"/>
-      </w:pPr>
-      <w:r>
-        <w:rPr>
-          <w:color w:val="E8590C"/>
-        </w:rPr>
-        <w:t>•</w:t>
-      </w:r>
-      <w:r>
-        <w:tab/>
-      </w:r>
-      <w:r>
-        <w:t xml:space="preserve">Beschrijf je aanvraag volledig in één keer. Vermeld wat je nodig hebt, het gewenste formaat, de teksten en voor wie het bedoeld is.</w:t>
+      </w:pPr>
+      <w:r>
+        <w:t xml:space="preserve">Pas het menu aan waar nodig:</w:t>
       </w:r>
     </w:p>
     <w:tbl>
@@ -1972,7 +2002,7 @@
               </w:rPr>
               <w:drawing>
                 <wp:inline distT="0" distB="0" distL="0" distR="0">
-                  <wp:extent cx="2349500" cy="1805982"/>
+                  <wp:extent cx="2349500" cy="1558501"/>
                   <wp:effectExtent l="0" t="0" r="0" b="0"/>
                   <wp:docPr id="108" name="Afbeelding 108"/>
                   <wp:cNvGraphicFramePr>
@@ -1982,7 +2012,7 @@
                     <a:graphicData uri="http://schemas.openxmlformats.org/drawingml/2006/picture">
                       <pic:pic xmlns:pic="http://schemas.openxmlformats.org/drawingml/2006/picture">
                         <pic:nvPicPr>
-                          <pic:cNvPr id="0" name="g22-intern-deadline.jpg"/>
+                          <pic:cNvPr id="0" name="g32-menu-inhoud.jpg"/>
                           <pic:cNvPicPr/>
                         </pic:nvPicPr>
                         <pic:blipFill>
@@ -1994,7 +2024,7 @@
                         <pic:spPr>
                           <a:xfrm>
                             <a:off x="0" y="0"/>
-                            <a:ext cx="2349500" cy="1805982"/>
+                            <a:ext cx="2349500" cy="1558501"/>
                           </a:xfrm>
                           <a:prstGeom prst="rect">
                             <a:avLst/>
@@ -2039,7 +2069,7 @@
               <w:tab/>
             </w:r>
             <w:r>
-              <w:t xml:space="preserve">Geef aan wanneer je het nodig hebt.</w:t>
+              <w:t xml:space="preserve">Wissel: vervang een gerecht door een ander gerecht.</w:t>
             </w:r>
           </w:p>
           <w:p>
@@ -2062,7 +2092,7 @@
               <w:tab/>
             </w:r>
             <w:r>
-              <w:t xml:space="preserve">Is er geen haast bij? Kies dan ‘Geen deadline’. Marketing plant de aanvraag dan in op een geschikt moment.</w:t>
+              <w:t xml:space="preserve">×: verwijder een gerecht.</w:t>
             </w:r>
           </w:p>
           <w:p>
@@ -2075,7 +2105,53 @@
             </w:pPr>
             <w:r>
               <w:rPr>
+                <w:rFonts w:ascii="Area Normal Extrabold" w:hAnsi="Area Normal Extrabold"/>
                 <w:color w:val="E8590C"/>
+                <w:sz w:val="22"/>
+              </w:rPr>
+              <w:t>3</w:t>
+            </w:r>
+            <w:r>
+              <w:tab/>
+            </w:r>
+            <w:r>
+              <w:t xml:space="preserve">+ Gerecht toevoegen: voeg een extra gerecht toe.</w:t>
+            </w:r>
+          </w:p>
+          <w:p>
+            <w:pPr>
+              <w:tabs>
+                <w:tab w:val="left" w:pos="425"/>
+              </w:tabs>
+              <w:spacing w:after="120"/>
+              <w:ind w:left="425" w:hanging="425"/>
+            </w:pPr>
+            <w:r>
+              <w:rPr>
+                <w:rFonts w:ascii="Area Normal Extrabold" w:hAnsi="Area Normal Extrabold"/>
+                <w:color w:val="E8590C"/>
+                <w:sz w:val="22"/>
+              </w:rPr>
+              <w:t>4</w:t>
+            </w:r>
+            <w:r>
+              <w:tab/>
+            </w:r>
+            <w:r>
+              <w:t xml:space="preserve">Pakket wijzigen: kies een ander pakket.</w:t>
+            </w:r>
+          </w:p>
+          <w:p>
+            <w:pPr>
+              <w:tabs>
+                <w:tab w:val="left" w:pos="425"/>
+              </w:tabs>
+              <w:spacing w:after="120"/>
+              <w:ind w:left="425" w:hanging="425"/>
+            </w:pPr>
+            <w:r>
+              <w:rPr>
+                <w:color w:val="E8590C"/>
               </w:rPr>
               <w:t>•</w:t>
             </w:r>
@@ -2083,7 +2159,28 @@
               <w:tab/>
             </w:r>
             <w:r>
-              <w:t xml:space="preserve">Ontstaat er later alsnog een deadline? Geef dit dan door via ‘Iets aanvullen of wijzigen’.</w:t>
+              <w:t xml:space="preserve">Selecteer de gerechten uit de lijst. Voer je zelf een gerecht in? Dan verschijnt er een melding en beoordeelt Marketing de invoer.</w:t>
+            </w:r>
+          </w:p>
+          <w:p>
+            <w:pPr>
+              <w:tabs>
+                <w:tab w:val="left" w:pos="425"/>
+              </w:tabs>
+              <w:spacing w:after="120"/>
+              <w:ind w:left="425" w:hanging="425"/>
+            </w:pPr>
+            <w:r>
+              <w:rPr>
+                <w:color w:val="E8590C"/>
+              </w:rPr>
+              <w:t>•</w:t>
+            </w:r>
+            <w:r>
+              <w:tab/>
+            </w:r>
+            <w:r>
+              <w:t xml:space="preserve">Menu later aanpassen? Kies dan ‘Menu aanpassen’ via ‘Iets aanvullen of wijzigen’.</w:t>
             </w:r>
           </w:p>
         </w:tc>
@@ -2101,7 +2198,7 @@
         <w:spacing w:before="280"/>
       </w:pPr>
       <w:r>
-        <w:t xml:space="preserve">4  Een menukaart of menuscherm</w:t>
+        <w:t xml:space="preserve">5  Je design is klaar</w:t>
       </w:r>
     </w:p>
     <w:p>
@@ -2109,37 +2206,174 @@
         <w:keepNext/>
       </w:pPr>
       <w:r>
-        <w:t xml:space="preserve">Selecteer bij ‘Wat wil je aanvragen?’ de optie ‘Menukaart print’, ‘Menu scherm’ of beide. Er verschijnt vervolgens een extra vraag: om welk menu gaat het?</w:t>
-      </w:r>
-    </w:p>
-    <w:p>
-      <w:pPr>
-        <w:tabs>
-          <w:tab w:val="left" w:pos="425"/>
-        </w:tabs>
-        <w:spacing w:after="120"/>
-        <w:ind w:left="425" w:hanging="425"/>
-      </w:pPr>
-      <w:r>
-        <w:rPr>
-          <w:color w:val="E8590C"/>
-        </w:rPr>
-        <w:t>•</w:t>
-      </w:r>
-      <w:r>
-        <w:tab/>
-      </w:r>
-      <w:r>
-        <w:t xml:space="preserve">Kies het gewenste pakket. Onder de pakketnaam zie je welke gangen zijn inbegrepen.</w:t>
-      </w:r>
-    </w:p>
-    <w:p>
-      <w:pPr>
-        <w:keepNext/>
-      </w:pPr>
-      <w:r>
-        <w:t xml:space="preserve">Pas het menu aan waar nodig:</w:t>
-      </w:r>
+        <w:t xml:space="preserve">Zodra je design klaar is, ontvang je een e-mail van Designaanvraag (designaanvraag@nbcevents.nl).</w:t>
+      </w:r>
+    </w:p>
+    <w:tbl>
+      <w:tblPr>
+        <w:tblW w:w="0" w:type="auto"/>
+        <w:tblBorders>
+          <w:top w:val="nil"/>
+          <w:left w:val="nil"/>
+          <w:bottom w:val="nil"/>
+          <w:right w:val="nil"/>
+          <w:insideH w:val="nil"/>
+          <w:insideV w:val="nil"/>
+        </w:tblBorders>
+        <w:tblLayout w:type="fixed"/>
+      </w:tblPr>
+      <w:tblGrid>
+        <w:gridCol w:w="3300"/>
+        <w:gridCol w:w="5715"/>
+      </w:tblGrid>
+      <w:tr>
+        <w:trPr>
+          <w:cantSplit/>
+        </w:trPr>
+        <w:tc>
+          <w:tcPr>
+            <w:tcW w:w="3300" w:type="dxa"/>
+            <w:tcMar>
+              <w:top w:w="0" w:type="dxa"/>
+              <w:left w:w="0" w:type="dxa"/>
+              <w:bottom w:w="0" w:type="dxa"/>
+              <w:right w:w="0" w:type="dxa"/>
+            </w:tcMar>
+            <w:vAlign w:val="center"/>
+          </w:tcPr>
+          <w:p>
+            <w:pPr>
+              <w:spacing w:after="0"/>
+            </w:pPr>
+            <w:r>
+              <w:rPr>
+                <w:noProof/>
+              </w:rPr>
+              <w:drawing>
+                <wp:inline distT="0" distB="0" distL="0" distR="0">
+                  <wp:extent cx="2095500" cy="2327910"/>
+                  <wp:effectExtent l="0" t="0" r="0" b="0"/>
+                  <wp:docPr id="109" name="Afbeelding 109"/>
+                  <wp:cNvGraphicFramePr>
+                    <a:graphicFrameLocks xmlns:a="http://schemas.openxmlformats.org/drawingml/2006/main" noChangeAspect="1"/>
+                  </wp:cNvGraphicFramePr>
+                  <a:graphic xmlns:a="http://schemas.openxmlformats.org/drawingml/2006/main">
+                    <a:graphicData uri="http://schemas.openxmlformats.org/drawingml/2006/picture">
+                      <pic:pic xmlns:pic="http://schemas.openxmlformats.org/drawingml/2006/picture">
+                        <pic:nvPicPr>
+                          <pic:cNvPr id="0" name="g50-mail.jpg"/>
+                          <pic:cNvPicPr/>
+                        </pic:nvPicPr>
+                        <pic:blipFill>
+                          <a:blip r:embed="rIdG9"/>
+                          <a:stretch>
+                            <a:fillRect/>
+                          </a:stretch>
+                        </pic:blipFill>
+                        <pic:spPr>
+                          <a:xfrm>
+                            <a:off x="0" y="0"/>
+                            <a:ext cx="2095500" cy="2327910"/>
+                          </a:xfrm>
+                          <a:prstGeom prst="rect">
+                            <a:avLst/>
+                          </a:prstGeom>
+                        </pic:spPr>
+                      </pic:pic>
+                    </a:graphicData>
+                  </a:graphic>
+                </wp:inline>
+              </w:drawing>
+            </w:r>
+          </w:p>
+        </w:tc>
+        <w:tc>
+          <w:tcPr>
+            <w:tcW w:w="5715" w:type="dxa"/>
+            <w:tcMar>
+              <w:top w:w="120" w:type="dxa"/>
+              <w:left w:w="240" w:type="dxa"/>
+              <w:bottom w:w="0" w:type="dxa"/>
+              <w:right w:w="0" w:type="dxa"/>
+            </w:tcMar>
+            <w:vAlign w:val="center"/>
+          </w:tcPr>
+          <w:p>
+            <w:pPr>
+              <w:tabs>
+                <w:tab w:val="left" w:pos="425"/>
+              </w:tabs>
+              <w:spacing w:after="120"/>
+              <w:ind w:left="425" w:hanging="425"/>
+            </w:pPr>
+            <w:r>
+              <w:rPr>
+                <w:rFonts w:ascii="Area Normal Extrabold" w:hAnsi="Area Normal Extrabold"/>
+                <w:color w:val="E8590C"/>
+                <w:sz w:val="22"/>
+              </w:rPr>
+              <w:t>1</w:t>
+            </w:r>
+            <w:r>
+              <w:tab/>
+            </w:r>
+            <w:r>
+              <w:t xml:space="preserve">Herken de juiste e-mail aan het onderwerp. Dit begint met ‘Klaar’, gevolgd door de naam van het event en wat je hebt aangevraagd. Bij een nieuwe versie staat er bijvoorbeeld ‘Versie 2 klaar’.</w:t>
+            </w:r>
+          </w:p>
+          <w:p>
+            <w:pPr>
+              <w:tabs>
+                <w:tab w:val="left" w:pos="425"/>
+              </w:tabs>
+              <w:spacing w:after="120"/>
+              <w:ind w:left="425" w:hanging="425"/>
+            </w:pPr>
+            <w:r>
+              <w:rPr>
+                <w:rFonts w:ascii="Area Normal Extrabold" w:hAnsi="Area Normal Extrabold"/>
+                <w:color w:val="E8590C"/>
+                <w:sz w:val="22"/>
+              </w:rPr>
+              <w:t>2</w:t>
+            </w:r>
+            <w:r>
+              <w:tab/>
+            </w:r>
+            <w:r>
+              <w:t xml:space="preserve">Download je bestanden uit de e-mail. De bestanden zijn als bijlage toegevoegd. Grote drukbestanden staan op de schijf. Marketing vermeldt in de e-mail waar je deze kunt vinden.</w:t>
+            </w:r>
+          </w:p>
+          <w:p>
+            <w:pPr>
+              <w:tabs>
+                <w:tab w:val="left" w:pos="425"/>
+              </w:tabs>
+              <w:spacing w:after="120"/>
+              <w:ind w:left="425" w:hanging="425"/>
+            </w:pPr>
+            <w:r>
+              <w:rPr>
+                <w:rFonts w:ascii="Area Normal Extrabold" w:hAnsi="Area Normal Extrabold"/>
+                <w:color w:val="E8590C"/>
+                <w:sz w:val="22"/>
+              </w:rPr>
+              <w:t>3</w:t>
+            </w:r>
+            <w:r>
+              <w:tab/>
+            </w:r>
+            <w:r>
+              <w:t xml:space="preserve">Wil je iets aanpassen? Klik dan op ‘Feedback geven’ in de e-mail. Beantwoord de e-mail niet rechtstreeks, maar gebruik altijd deze knop. Zo wordt je feedback automatisch aan de juiste aanvraag gekoppeld.</w:t>
+            </w:r>
+          </w:p>
+        </w:tc>
+      </w:tr>
+    </w:tbl>
+    <w:p>
+      <w:pPr>
+        <w:spacing w:after="0" w:line="120" w:lineRule="exact"/>
+      </w:pPr>
     </w:p>
     <w:tbl>
       <w:tblPr>
@@ -2185,7 +2419,7 @@
                 <wp:inline distT="0" distB="0" distL="0" distR="0">
                   <wp:extent cx="2349500" cy="1558501"/>
                   <wp:effectExtent l="0" t="0" r="0" b="0"/>
-                  <wp:docPr id="109" name="Afbeelding 109"/>
+                  <wp:docPr id="110" name="Afbeelding 110"/>
                   <wp:cNvGraphicFramePr>
                     <a:graphicFrameLocks xmlns:a="http://schemas.openxmlformats.org/drawingml/2006/main" noChangeAspect="1"/>
                   </wp:cNvGraphicFramePr>
@@ -2193,11 +2427,11 @@
                     <a:graphicData uri="http://schemas.openxmlformats.org/drawingml/2006/picture">
                       <pic:pic xmlns:pic="http://schemas.openxmlformats.org/drawingml/2006/picture">
                         <pic:nvPicPr>
-                          <pic:cNvPr id="0" name="g32-menu-inhoud.jpg"/>
+                          <pic:cNvPr id="0" name="g51-feedback.jpg"/>
                           <pic:cNvPicPr/>
                         </pic:nvPicPr>
                         <pic:blipFill>
-                          <a:blip r:embed="rIdG9"/>
+                          <a:blip r:embed="rIdG10"/>
                           <a:stretch>
                             <a:fillRect/>
                           </a:stretch>
@@ -2250,7 +2484,7 @@
               <w:tab/>
             </w:r>
             <w:r>
-              <w:t xml:space="preserve">Wissel: vervang een gerecht door een ander gerecht.</w:t>
+              <w:t xml:space="preserve">Je aanvraag is al geselecteerd wanneer het formulier opent. Je hoeft dus niet opnieuw te zoeken.</w:t>
             </w:r>
           </w:p>
           <w:p>
@@ -2273,7 +2507,7 @@
               <w:tab/>
             </w:r>
             <w:r>
-              <w:t xml:space="preserve">×: verwijder een gerecht.</w:t>
+              <w:t xml:space="preserve">Selecteer je naam en klik op ‘Volgende’.</w:t>
             </w:r>
           </w:p>
           <w:p>
@@ -2286,17 +2520,15 @@
             </w:pPr>
             <w:r>
               <w:rPr>
-                <w:rFonts w:ascii="Area Normal Extrabold" w:hAnsi="Area Normal Extrabold"/>
                 <w:color w:val="E8590C"/>
-                <w:sz w:val="22"/>
-              </w:rPr>
-              <w:t>3</w:t>
+              </w:rPr>
+              <w:t>•</w:t>
             </w:r>
             <w:r>
               <w:tab/>
             </w:r>
             <w:r>
-              <w:t xml:space="preserve">+ Gerecht toevoegen: voeg een extra gerecht toe.</w:t>
+              <w:t xml:space="preserve">Geef je feedback zo volledig mogelijk door en voeg indien nodig bestanden toe. Je kunt ook een nieuwe deadline doorgeven of een ander menu kiezen. Dit werkt op dezelfde manier als eerder beschreven.</w:t>
             </w:r>
           </w:p>
           <w:p>
@@ -2309,59 +2541,15 @@
             </w:pPr>
             <w:r>
               <w:rPr>
-                <w:rFonts w:ascii="Area Normal Extrabold" w:hAnsi="Area Normal Extrabold"/>
                 <w:color w:val="E8590C"/>
-                <w:sz w:val="22"/>
-              </w:rPr>
-              <w:t>4</w:t>
+              </w:rPr>
+              <w:t>•</w:t>
             </w:r>
             <w:r>
               <w:tab/>
             </w:r>
             <w:r>
-              <w:t xml:space="preserve">Pakket wijzigen: kies een ander pakket.</w:t>
-            </w:r>
-          </w:p>
-          <w:p>
-            <w:pPr>
-              <w:tabs>
-                <w:tab w:val="left" w:pos="425"/>
-              </w:tabs>
-              <w:spacing w:after="120"/>
-              <w:ind w:left="425" w:hanging="425"/>
-            </w:pPr>
-            <w:r>
-              <w:rPr>
-                <w:color w:val="E8590C"/>
-              </w:rPr>
-              <w:t>•</w:t>
-            </w:r>
-            <w:r>
-              <w:tab/>
-            </w:r>
-            <w:r>
-              <w:t xml:space="preserve">Selecteer de gerechten uit de lijst. Voer je zelf een gerecht in? Dan verschijnt er een melding en beoordeelt Marketing de invoer.</w:t>
-            </w:r>
-          </w:p>
-          <w:p>
-            <w:pPr>
-              <w:tabs>
-                <w:tab w:val="left" w:pos="425"/>
-              </w:tabs>
-              <w:spacing w:after="120"/>
-              <w:ind w:left="425" w:hanging="425"/>
-            </w:pPr>
-            <w:r>
-              <w:rPr>
-                <w:color w:val="E8590C"/>
-              </w:rPr>
-              <w:t>•</w:t>
-            </w:r>
-            <w:r>
-              <w:tab/>
-            </w:r>
-            <w:r>
-              <w:t xml:space="preserve">Menu later aanpassen? Kies dan ‘Menu aanpassen’ via ‘Iets aanvullen of wijzigen’.</w:t>
+              <w:t xml:space="preserve">Zodra je feedback is verwerkt, ontvang je opnieuw een e-mail. Hierin vind je de aangepaste versie, bijvoorbeeld met het onderwerp ‘Versie 2 klaar’.</w:t>
             </w:r>
           </w:p>
         </w:tc>
@@ -2379,7 +2567,7 @@
         <w:spacing w:before="280"/>
       </w:pPr>
       <w:r>
-        <w:t xml:space="preserve">5  Je design is klaar</w:t>
+        <w:t xml:space="preserve">6  Aanvullen of wijzigen</w:t>
       </w:r>
     </w:p>
     <w:p>
@@ -2387,174 +2575,8 @@
         <w:keepNext/>
       </w:pPr>
       <w:r>
-        <w:t xml:space="preserve">Zodra je design klaar is, ontvang je een e-mail van Designaanvraag (designaanvraag@nbcevents.nl).</w:t>
-      </w:r>
-    </w:p>
-    <w:tbl>
-      <w:tblPr>
-        <w:tblW w:w="0" w:type="auto"/>
-        <w:tblBorders>
-          <w:top w:val="nil"/>
-          <w:left w:val="nil"/>
-          <w:bottom w:val="nil"/>
-          <w:right w:val="nil"/>
-          <w:insideH w:val="nil"/>
-          <w:insideV w:val="nil"/>
-        </w:tblBorders>
-        <w:tblLayout w:type="fixed"/>
-      </w:tblPr>
-      <w:tblGrid>
-        <w:gridCol w:w="3300"/>
-        <w:gridCol w:w="5715"/>
-      </w:tblGrid>
-      <w:tr>
-        <w:trPr>
-          <w:cantSplit/>
-        </w:trPr>
-        <w:tc>
-          <w:tcPr>
-            <w:tcW w:w="3300" w:type="dxa"/>
-            <w:tcMar>
-              <w:top w:w="0" w:type="dxa"/>
-              <w:left w:w="0" w:type="dxa"/>
-              <w:bottom w:w="0" w:type="dxa"/>
-              <w:right w:w="0" w:type="dxa"/>
-            </w:tcMar>
-            <w:vAlign w:val="center"/>
-          </w:tcPr>
-          <w:p>
-            <w:pPr>
-              <w:spacing w:after="0"/>
-            </w:pPr>
-            <w:r>
-              <w:rPr>
-                <w:noProof/>
-              </w:rPr>
-              <w:drawing>
-                <wp:inline distT="0" distB="0" distL="0" distR="0">
-                  <wp:extent cx="2095500" cy="2327910"/>
-                  <wp:effectExtent l="0" t="0" r="0" b="0"/>
-                  <wp:docPr id="110" name="Afbeelding 110"/>
-                  <wp:cNvGraphicFramePr>
-                    <a:graphicFrameLocks xmlns:a="http://schemas.openxmlformats.org/drawingml/2006/main" noChangeAspect="1"/>
-                  </wp:cNvGraphicFramePr>
-                  <a:graphic xmlns:a="http://schemas.openxmlformats.org/drawingml/2006/main">
-                    <a:graphicData uri="http://schemas.openxmlformats.org/drawingml/2006/picture">
-                      <pic:pic xmlns:pic="http://schemas.openxmlformats.org/drawingml/2006/picture">
-                        <pic:nvPicPr>
-                          <pic:cNvPr id="0" name="g50-mail.jpg"/>
-                          <pic:cNvPicPr/>
-                        </pic:nvPicPr>
-                        <pic:blipFill>
-                          <a:blip r:embed="rIdG10"/>
-                          <a:stretch>
-                            <a:fillRect/>
-                          </a:stretch>
-                        </pic:blipFill>
-                        <pic:spPr>
-                          <a:xfrm>
-                            <a:off x="0" y="0"/>
-                            <a:ext cx="2095500" cy="2327910"/>
-                          </a:xfrm>
-                          <a:prstGeom prst="rect">
-                            <a:avLst/>
-                          </a:prstGeom>
-                        </pic:spPr>
-                      </pic:pic>
-                    </a:graphicData>
-                  </a:graphic>
-                </wp:inline>
-              </w:drawing>
-            </w:r>
-          </w:p>
-        </w:tc>
-        <w:tc>
-          <w:tcPr>
-            <w:tcW w:w="5715" w:type="dxa"/>
-            <w:tcMar>
-              <w:top w:w="120" w:type="dxa"/>
-              <w:left w:w="240" w:type="dxa"/>
-              <w:bottom w:w="0" w:type="dxa"/>
-              <w:right w:w="0" w:type="dxa"/>
-            </w:tcMar>
-            <w:vAlign w:val="center"/>
-          </w:tcPr>
-          <w:p>
-            <w:pPr>
-              <w:tabs>
-                <w:tab w:val="left" w:pos="425"/>
-              </w:tabs>
-              <w:spacing w:after="120"/>
-              <w:ind w:left="425" w:hanging="425"/>
-            </w:pPr>
-            <w:r>
-              <w:rPr>
-                <w:rFonts w:ascii="Area Normal Extrabold" w:hAnsi="Area Normal Extrabold"/>
-                <w:color w:val="E8590C"/>
-                <w:sz w:val="22"/>
-              </w:rPr>
-              <w:t>1</w:t>
-            </w:r>
-            <w:r>
-              <w:tab/>
-            </w:r>
-            <w:r>
-              <w:t xml:space="preserve">Herken de juiste e-mail aan het onderwerp. Dit begint met ‘Klaar’, gevolgd door de naam van het event en wat je hebt aangevraagd. Bij een nieuwe versie staat er bijvoorbeeld ‘Versie 2 klaar’.</w:t>
-            </w:r>
-          </w:p>
-          <w:p>
-            <w:pPr>
-              <w:tabs>
-                <w:tab w:val="left" w:pos="425"/>
-              </w:tabs>
-              <w:spacing w:after="120"/>
-              <w:ind w:left="425" w:hanging="425"/>
-            </w:pPr>
-            <w:r>
-              <w:rPr>
-                <w:rFonts w:ascii="Area Normal Extrabold" w:hAnsi="Area Normal Extrabold"/>
-                <w:color w:val="E8590C"/>
-                <w:sz w:val="22"/>
-              </w:rPr>
-              <w:t>2</w:t>
-            </w:r>
-            <w:r>
-              <w:tab/>
-            </w:r>
-            <w:r>
-              <w:t xml:space="preserve">Download je bestanden uit de e-mail. De bestanden zijn als bijlage toegevoegd. Grote drukbestanden staan op de schijf. Marketing vermeldt in de e-mail waar je deze kunt vinden.</w:t>
-            </w:r>
-          </w:p>
-          <w:p>
-            <w:pPr>
-              <w:tabs>
-                <w:tab w:val="left" w:pos="425"/>
-              </w:tabs>
-              <w:spacing w:after="120"/>
-              <w:ind w:left="425" w:hanging="425"/>
-            </w:pPr>
-            <w:r>
-              <w:rPr>
-                <w:rFonts w:ascii="Area Normal Extrabold" w:hAnsi="Area Normal Extrabold"/>
-                <w:color w:val="E8590C"/>
-                <w:sz w:val="22"/>
-              </w:rPr>
-              <w:t>3</w:t>
-            </w:r>
-            <w:r>
-              <w:tab/>
-            </w:r>
-            <w:r>
-              <w:t xml:space="preserve">Wil je iets aanpassen? Klik dan op ‘Feedback geven’ in de e-mail. Beantwoord de e-mail niet rechtstreeks, maar gebruik altijd deze knop. Zo wordt je feedback automatisch aan de juiste aanvraag gekoppeld.</w:t>
-            </w:r>
-          </w:p>
-        </w:tc>
-      </w:tr>
-    </w:tbl>
-    <w:p>
-      <w:pPr>
-        <w:spacing w:after="0" w:line="120" w:lineRule="exact"/>
-      </w:pPr>
+        <w:t xml:space="preserve">Iets vergeten, een extra design nodig of is de datum gewijzigd? Pas dan je bestaande aanvraag aan. Klik op het startscherm op ‘Iets aanvullen of wijzigen’ en kies voor ‘Voor een evenement’ of ‘Intern’.</w:t>
+      </w:r>
     </w:p>
     <w:tbl>
       <w:tblPr>
@@ -2608,7 +2630,7 @@
                     <a:graphicData uri="http://schemas.openxmlformats.org/drawingml/2006/picture">
                       <pic:pic xmlns:pic="http://schemas.openxmlformats.org/drawingml/2006/picture">
                         <pic:nvPicPr>
-                          <pic:cNvPr id="0" name="g51-feedback.jpg"/>
+                          <pic:cNvPr id="0" name="g40-aanv-zoek.jpg"/>
                           <pic:cNvPicPr/>
                         </pic:nvPicPr>
                         <pic:blipFill>
@@ -2665,7 +2687,7 @@
               <w:tab/>
             </w:r>
             <w:r>
-              <w:t xml:space="preserve">Je aanvraag is al geselecteerd wanneer het formulier opent. Je hoeft dus niet opnieuw te zoeken.</w:t>
+              <w:t xml:space="preserve">Zoek de juiste aanvraag. Typ minimaal drie letters van de eventnaam en selecteer de juiste aanvraag. Je ziet aanvragen van de afgelopen vier maanden, ook die van collega’s.</w:t>
             </w:r>
           </w:p>
           <w:p>
@@ -2678,17 +2700,15 @@
             </w:pPr>
             <w:r>
               <w:rPr>
-                <w:rFonts w:ascii="Area Normal Extrabold" w:hAnsi="Area Normal Extrabold"/>
                 <w:color w:val="E8590C"/>
-                <w:sz w:val="22"/>
-              </w:rPr>
-              <w:t>2</w:t>
+              </w:rPr>
+              <w:t>•</w:t>
             </w:r>
             <w:r>
               <w:tab/>
             </w:r>
             <w:r>
-              <w:t xml:space="preserve">Selecteer je naam en klik op ‘Volgende’.</w:t>
+              <w:t xml:space="preserve">Vul daarna je naam in, zodat Marketing weet wie de wijziging doorgeeft.</w:t>
             </w:r>
           </w:p>
           <w:p>
@@ -2709,28 +2729,7 @@
               <w:tab/>
             </w:r>
             <w:r>
-              <w:t xml:space="preserve">Geef je feedback zo volledig mogelijk door en voeg indien nodig bestanden toe. Je kunt ook een nieuwe deadline doorgeven of een ander menu kiezen. Dit werkt op dezelfde manier als eerder beschreven.</w:t>
-            </w:r>
-          </w:p>
-          <w:p>
-            <w:pPr>
-              <w:tabs>
-                <w:tab w:val="left" w:pos="425"/>
-              </w:tabs>
-              <w:spacing w:after="120"/>
-              <w:ind w:left="425" w:hanging="425"/>
-            </w:pPr>
-            <w:r>
-              <w:rPr>
-                <w:color w:val="E8590C"/>
-              </w:rPr>
-              <w:t>•</w:t>
-            </w:r>
-            <w:r>
-              <w:tab/>
-            </w:r>
-            <w:r>
-              <w:t xml:space="preserve">Zodra je feedback is verwerkt, ontvang je opnieuw een e-mail. Hierin vind je de aangepaste versie, bijvoorbeeld met het onderwerp ‘Versie 2 klaar’.</w:t>
+              <w:t xml:space="preserve">Bij een interne aanvraag vul je eerst je naam in en selecteer je de gewenste aanvraag uit je eigen aanvragen.</w:t>
             </w:r>
           </w:p>
         </w:tc>
@@ -2740,24 +2739,6 @@
       <w:pPr>
         <w:spacing w:after="0" w:line="120" w:lineRule="exact"/>
       </w:pPr>
-    </w:p>
-    <w:p>
-      <w:pPr>
-        <w:pStyle w:val="Kop1"/>
-        <w:keepNext/>
-        <w:spacing w:before="280"/>
-      </w:pPr>
-      <w:r>
-        <w:t xml:space="preserve">6  Aanvullen of wijzigen</w:t>
-      </w:r>
-    </w:p>
-    <w:p>
-      <w:pPr>
-        <w:keepNext/>
-      </w:pPr>
-      <w:r>
-        <w:t xml:space="preserve">Iets vergeten, een extra design nodig of is de datum gewijzigd? Pas dan je bestaande aanvraag aan. Klik op het startscherm op ‘Iets aanvullen of wijzigen’ en kies voor ‘Voor een evenement’ of ‘Intern’.</w:t>
-      </w:r>
     </w:p>
     <w:tbl>
       <w:tblPr>
@@ -2811,7 +2792,7 @@
                     <a:graphicData uri="http://schemas.openxmlformats.org/drawingml/2006/picture">
                       <pic:pic xmlns:pic="http://schemas.openxmlformats.org/drawingml/2006/picture">
                         <pic:nvPicPr>
-                          <pic:cNvPr id="0" name="g40-aanv-zoek.jpg"/>
+                          <pic:cNvPr id="0" name="g41-aanv-wat.jpg"/>
                           <pic:cNvPicPr/>
                         </pic:nvPicPr>
                         <pic:blipFill>
@@ -2868,7 +2849,7 @@
               <w:tab/>
             </w:r>
             <w:r>
-              <w:t xml:space="preserve">Zoek de juiste aanvraag. Typ minimaal drie letters van de eventnaam en selecteer de juiste aanvraag. Je ziet aanvragen van de afgelopen vier maanden, ook die van collega’s.</w:t>
+              <w:t xml:space="preserve">Beschrijf wat je wilt aanvullen of wijzigen. Geef duidelijk aan wat erbij moet of wat er anders moet.</w:t>
             </w:r>
           </w:p>
           <w:p>
@@ -2881,15 +2862,17 @@
             </w:pPr>
             <w:r>
               <w:rPr>
+                <w:rFonts w:ascii="Area Normal Extrabold" w:hAnsi="Area Normal Extrabold"/>
                 <w:color w:val="E8590C"/>
-              </w:rPr>
-              <w:t>•</w:t>
+                <w:sz w:val="22"/>
+              </w:rPr>
+              <w:t>2</w:t>
             </w:r>
             <w:r>
               <w:tab/>
             </w:r>
             <w:r>
-              <w:t xml:space="preserve">Vul daarna je naam in, zodat Marketing weet wie de wijziging doorgeeft.</w:t>
+              <w:t xml:space="preserve">Je kunt ook bestanden toevoegen. Marketing ontvangt direct bericht van je wijziging.</w:t>
             </w:r>
           </w:p>
           <w:p>
@@ -2902,7 +2885,30 @@
             </w:pPr>
             <w:r>
               <w:rPr>
+                <w:rFonts w:ascii="Area Normal Extrabold" w:hAnsi="Area Normal Extrabold"/>
                 <w:color w:val="E8590C"/>
+                <w:sz w:val="22"/>
+              </w:rPr>
+              <w:t>3</w:t>
+            </w:r>
+            <w:r>
+              <w:tab/>
+            </w:r>
+            <w:r>
+              <w:t xml:space="preserve">Menu aanpassen is alleen beschikbaar bij aanvragen voor een menukaart of menuscherm. Je krijgt dan hetzelfde menuoverzicht als in hoofdstuk 4, met het huidige menu al ingevuld. Pas aan wat nodig is.</w:t>
+            </w:r>
+          </w:p>
+          <w:p>
+            <w:pPr>
+              <w:tabs>
+                <w:tab w:val="left" w:pos="425"/>
+              </w:tabs>
+              <w:spacing w:after="120"/>
+              <w:ind w:left="425" w:hanging="425"/>
+            </w:pPr>
+            <w:r>
+              <w:rPr>
+                <w:color w:val="E8590C"/>
               </w:rPr>
               <w:t>•</w:t>
             </w:r>
@@ -2910,7 +2916,7 @@
               <w:tab/>
             </w:r>
             <w:r>
-              <w:t xml:space="preserve">Bij een interne aanvraag vul je eerst je naam in en selecteer je de gewenste aanvraag uit je eigen aanvragen.</w:t>
+              <w:t xml:space="preserve">Is de eventdatum of deadline gewijzigd? Klik dan op ‘Wijzigen’ bij de datum en voer de nieuwe datum in.</w:t>
             </w:r>
           </w:p>
         </w:tc>
@@ -2963,196 +2969,9 @@
               </w:rPr>
               <w:drawing>
                 <wp:inline distT="0" distB="0" distL="0" distR="0">
-                  <wp:extent cx="2349500" cy="1558501"/>
+                  <wp:extent cx="2349500" cy="1805982"/>
                   <wp:effectExtent l="0" t="0" r="0" b="0"/>
                   <wp:docPr id="113" name="Afbeelding 113"/>
-                  <wp:cNvGraphicFramePr>
-                    <a:graphicFrameLocks xmlns:a="http://schemas.openxmlformats.org/drawingml/2006/main" noChangeAspect="1"/>
-                  </wp:cNvGraphicFramePr>
-                  <a:graphic xmlns:a="http://schemas.openxmlformats.org/drawingml/2006/main">
-                    <a:graphicData uri="http://schemas.openxmlformats.org/drawingml/2006/picture">
-                      <pic:pic xmlns:pic="http://schemas.openxmlformats.org/drawingml/2006/picture">
-                        <pic:nvPicPr>
-                          <pic:cNvPr id="0" name="g41-aanv-wat.jpg"/>
-                          <pic:cNvPicPr/>
-                        </pic:nvPicPr>
-                        <pic:blipFill>
-                          <a:blip r:embed="rIdG13"/>
-                          <a:stretch>
-                            <a:fillRect/>
-                          </a:stretch>
-                        </pic:blipFill>
-                        <pic:spPr>
-                          <a:xfrm>
-                            <a:off x="0" y="0"/>
-                            <a:ext cx="2349500" cy="1558501"/>
-                          </a:xfrm>
-                          <a:prstGeom prst="rect">
-                            <a:avLst/>
-                          </a:prstGeom>
-                        </pic:spPr>
-                      </pic:pic>
-                    </a:graphicData>
-                  </a:graphic>
-                </wp:inline>
-              </w:drawing>
-            </w:r>
-          </w:p>
-        </w:tc>
-        <w:tc>
-          <w:tcPr>
-            <w:tcW w:w="5315" w:type="dxa"/>
-            <w:tcMar>
-              <w:top w:w="120" w:type="dxa"/>
-              <w:left w:w="240" w:type="dxa"/>
-              <w:bottom w:w="0" w:type="dxa"/>
-              <w:right w:w="0" w:type="dxa"/>
-            </w:tcMar>
-            <w:vAlign w:val="center"/>
-          </w:tcPr>
-          <w:p>
-            <w:pPr>
-              <w:tabs>
-                <w:tab w:val="left" w:pos="425"/>
-              </w:tabs>
-              <w:spacing w:after="120"/>
-              <w:ind w:left="425" w:hanging="425"/>
-            </w:pPr>
-            <w:r>
-              <w:rPr>
-                <w:rFonts w:ascii="Area Normal Extrabold" w:hAnsi="Area Normal Extrabold"/>
-                <w:color w:val="E8590C"/>
-                <w:sz w:val="22"/>
-              </w:rPr>
-              <w:t>1</w:t>
-            </w:r>
-            <w:r>
-              <w:tab/>
-            </w:r>
-            <w:r>
-              <w:t xml:space="preserve">Beschrijf wat je wilt aanvullen of wijzigen. Geef duidelijk aan wat erbij moet of wat er anders moet.</w:t>
-            </w:r>
-          </w:p>
-          <w:p>
-            <w:pPr>
-              <w:tabs>
-                <w:tab w:val="left" w:pos="425"/>
-              </w:tabs>
-              <w:spacing w:after="120"/>
-              <w:ind w:left="425" w:hanging="425"/>
-            </w:pPr>
-            <w:r>
-              <w:rPr>
-                <w:rFonts w:ascii="Area Normal Extrabold" w:hAnsi="Area Normal Extrabold"/>
-                <w:color w:val="E8590C"/>
-                <w:sz w:val="22"/>
-              </w:rPr>
-              <w:t>2</w:t>
-            </w:r>
-            <w:r>
-              <w:tab/>
-            </w:r>
-            <w:r>
-              <w:t xml:space="preserve">Je kunt ook bestanden toevoegen. Marketing ontvangt direct bericht van je wijziging.</w:t>
-            </w:r>
-          </w:p>
-          <w:p>
-            <w:pPr>
-              <w:tabs>
-                <w:tab w:val="left" w:pos="425"/>
-              </w:tabs>
-              <w:spacing w:after="120"/>
-              <w:ind w:left="425" w:hanging="425"/>
-            </w:pPr>
-            <w:r>
-              <w:rPr>
-                <w:rFonts w:ascii="Area Normal Extrabold" w:hAnsi="Area Normal Extrabold"/>
-                <w:color w:val="E8590C"/>
-                <w:sz w:val="22"/>
-              </w:rPr>
-              <w:t>3</w:t>
-            </w:r>
-            <w:r>
-              <w:tab/>
-            </w:r>
-            <w:r>
-              <w:t xml:space="preserve">Menu aanpassen is alleen beschikbaar bij aanvragen voor een menukaart of menuscherm. Je krijgt dan hetzelfde menuoverzicht als in hoofdstuk 4, met het huidige menu al ingevuld. Pas aan wat nodig is.</w:t>
-            </w:r>
-          </w:p>
-          <w:p>
-            <w:pPr>
-              <w:tabs>
-                <w:tab w:val="left" w:pos="425"/>
-              </w:tabs>
-              <w:spacing w:after="120"/>
-              <w:ind w:left="425" w:hanging="425"/>
-            </w:pPr>
-            <w:r>
-              <w:rPr>
-                <w:color w:val="E8590C"/>
-              </w:rPr>
-              <w:t>•</w:t>
-            </w:r>
-            <w:r>
-              <w:tab/>
-            </w:r>
-            <w:r>
-              <w:t xml:space="preserve">Is de eventdatum of deadline gewijzigd? Klik dan op ‘Wijzigen’ bij de datum en voer de nieuwe datum in.</w:t>
-            </w:r>
-          </w:p>
-        </w:tc>
-      </w:tr>
-    </w:tbl>
-    <w:p>
-      <w:pPr>
-        <w:spacing w:after="0" w:line="120" w:lineRule="exact"/>
-      </w:pPr>
-    </w:p>
-    <w:tbl>
-      <w:tblPr>
-        <w:tblW w:w="0" w:type="auto"/>
-        <w:tblBorders>
-          <w:top w:val="nil"/>
-          <w:left w:val="nil"/>
-          <w:bottom w:val="nil"/>
-          <w:right w:val="nil"/>
-          <w:insideH w:val="nil"/>
-          <w:insideV w:val="nil"/>
-        </w:tblBorders>
-        <w:tblLayout w:type="fixed"/>
-      </w:tblPr>
-      <w:tblGrid>
-        <w:gridCol w:w="3700"/>
-        <w:gridCol w:w="5315"/>
-      </w:tblGrid>
-      <w:tr>
-        <w:trPr>
-          <w:cantSplit/>
-        </w:trPr>
-        <w:tc>
-          <w:tcPr>
-            <w:tcW w:w="3700" w:type="dxa"/>
-            <w:tcMar>
-              <w:top w:w="0" w:type="dxa"/>
-              <w:left w:w="0" w:type="dxa"/>
-              <w:bottom w:w="0" w:type="dxa"/>
-              <w:right w:w="0" w:type="dxa"/>
-            </w:tcMar>
-            <w:vAlign w:val="center"/>
-          </w:tcPr>
-          <w:p>
-            <w:pPr>
-              <w:spacing w:after="0"/>
-            </w:pPr>
-            <w:r>
-              <w:rPr>
-                <w:noProof/>
-              </w:rPr>
-              <w:drawing>
-                <wp:inline distT="0" distB="0" distL="0" distR="0">
-                  <wp:extent cx="2349500" cy="1805982"/>
-                  <wp:effectExtent l="0" t="0" r="0" b="0"/>
-                  <wp:docPr id="114" name="Afbeelding 114"/>
                   <wp:cNvGraphicFramePr>
                     <a:graphicFrameLocks xmlns:a="http://schemas.openxmlformats.org/drawingml/2006/main" noChangeAspect="1"/>
                   </wp:cNvGraphicFramePr>
@@ -3164,7 +2983,7 @@
                           <pic:cNvPicPr/>
                         </pic:nvPicPr>
                         <pic:blipFill>
-                          <a:blip r:embed="rIdG14"/>
+                          <a:blip r:embed="rIdG13"/>
                           <a:stretch>
                             <a:fillRect/>
                           </a:stretch>

</xml_diff>

<commit_message>
Projectengids: stijlwijzigingen uit V4 overgenomen
De Word-versie V4 is de nieuwe basis. Het bouwscript doet nu hetzelfde:
de tekst in de gele blokken staat links, de tussenkopjes hebben geen extra
ruimte erboven, en hoofdstuktitels hebben meer ruimte eronder (stijl
Kop 1). Opnieuw gebouwd is hij per alinea gelijk aan V4, op zeven pagina's.

Co-Authored-By: Claude Opus 5.5 <noreply@anthropic.com>
Claude-Session: https://claude.ai/code/session_01FF5qjJmcy9G5HYxEPWYe11
</commit_message>
<xml_diff>
--- a/docs/gids-projecten/Designs aanvragen - Handleiding voor projecten.docx
+++ b/docs/gids-projecten/Designs aanvragen - Handleiding voor projecten.docx
@@ -48,10 +48,9 @@
     <w:p>
       <w:pPr>
         <w:pStyle w:val="Kop2"/>
-        <w:spacing w:before="240"/>
-      </w:pPr>
-      <w:r>
-        <w:t>In deze handleiding</w:t>
+      </w:pPr>
+      <w:r>
+        <w:t xml:space="preserve">In deze handleiding</w:t>
       </w:r>
     </w:p>
     <w:tbl>
@@ -3091,8 +3090,6 @@
     <w:p>
       <w:pPr>
         <w:pStyle w:val="Kop2"/>
-        <w:keepNext/>
-        <w:spacing w:before="240"/>
       </w:pPr>
       <w:r>
         <w:t xml:space="preserve">Krappe deadlines</w:t>
@@ -3295,8 +3292,7 @@
           <w:p>
             <w:pPr>
               <w:keepNext/>
-              <w:jc w:val="center"/>
-              <w:spacing w:before="0" w:after="0"/>
+              <w:spacing w:after="0"/>
             </w:pPr>
             <w:r>
               <w:rPr>
@@ -3307,8 +3303,7 @@
           </w:p>
           <w:p>
             <w:pPr>
-              <w:jc w:val="center"/>
-              <w:spacing w:before="0" w:after="0"/>
+              <w:spacing w:after="0"/>
             </w:pPr>
             <w:r>
               <w:t xml:space="preserve">Ze blijven als spoed geregistreerd, ook als de datum later verschuift!</w:t>
@@ -3325,8 +3320,6 @@
     <w:p>
       <w:pPr>
         <w:pStyle w:val="Kop2"/>
-        <w:keepNext/>
-        <w:spacing w:before="240"/>
       </w:pPr>
       <w:r>
         <w:t xml:space="preserve">Wat doe je als…</w:t>
@@ -3759,8 +3752,7 @@
           <w:p>
             <w:pPr>
               <w:keepNext/>
-              <w:jc w:val="center"/>
-              <w:spacing w:before="0" w:after="0"/>
+              <w:spacing w:after="0"/>
             </w:pPr>
             <w:r>
               <w:rPr>
@@ -3771,8 +3763,7 @@
           </w:p>
           <w:p>
             <w:pPr>
-              <w:jc w:val="center"/>
-              <w:spacing w:before="0" w:after="0"/>
+              <w:spacing w:after="0"/>
             </w:pPr>
             <w:r>
               <w:t xml:space="preserve">Mail marketing@nbcevents.nl (voor Green Village: marketing@green-village.nl). Liever even vragen dan gokken!</w:t>
@@ -3840,7 +3831,7 @@
           <wp:extent cx="1428750" cy="867410"/>
           <wp:effectExtent l="0" t="0" r="0" b="0"/>
           <wp:wrapSquare wrapText="bothSides"/>
-          <wp:docPr id="1260838392" name="Afbeelding 1" descr="Afbeelding met Graphics, grafische vormgeving, schermopname, Lettertype&#10;&#10;Door AI gegenereerde inhoud is mogelijk onjuist."/>
+          <wp:docPr id="632809028" name="Afbeelding 1" descr="Afbeelding met Graphics, grafische vormgeving, schermopname, Lettertype&#10;&#10;Door AI gegenereerde inhoud is mogelijk onjuist."/>
           <wp:cNvGraphicFramePr>
             <a:graphicFrameLocks xmlns:a="http://schemas.openxmlformats.org/drawingml/2006/main" noChangeAspect="1"/>
           </wp:cNvGraphicFramePr>
@@ -4002,7 +3993,7 @@
                               <wp:inline distT="0" distB="0" distL="0" distR="0" wp14:anchorId="77096505" wp14:editId="62978981">
                                 <wp:extent cx="1986280" cy="39370"/>
                                 <wp:effectExtent l="0" t="0" r="0" b="0"/>
-                                <wp:docPr id="1744697675" name="Afbeelding 2"/>
+                                <wp:docPr id="2071231899" name="Afbeelding 2"/>
                                 <wp:cNvGraphicFramePr>
                                   <a:graphicFrameLocks xmlns:a="http://schemas.openxmlformats.org/drawingml/2006/main" noChangeAspect="1"/>
                                 </wp:cNvGraphicFramePr>
@@ -4093,7 +4084,7 @@
                         <wp:inline distT="0" distB="0" distL="0" distR="0" wp14:anchorId="77096505" wp14:editId="62978981">
                           <wp:extent cx="1986280" cy="39370"/>
                           <wp:effectExtent l="0" t="0" r="0" b="0"/>
-                          <wp:docPr id="1744697675" name="Afbeelding 2"/>
+                          <wp:docPr id="2071231899" name="Afbeelding 2"/>
                           <wp:cNvGraphicFramePr>
                             <a:graphicFrameLocks xmlns:a="http://schemas.openxmlformats.org/drawingml/2006/main" noChangeAspect="1"/>
                           </wp:cNvGraphicFramePr>
@@ -4802,11 +4793,11 @@
     <w:link w:val="Kop1Char"/>
     <w:uiPriority w:val="9"/>
     <w:qFormat/>
-    <w:rsid w:val="008271DC"/>
+    <w:rsid w:val="000E6D96"/>
     <w:pPr>
       <w:keepNext/>
       <w:keepLines/>
-      <w:spacing w:after="0"/>
+      <w:spacing w:after="120"/>
       <w:outlineLvl w:val="0"/>
     </w:pPr>
     <w:rPr>
@@ -4886,7 +4877,7 @@
     <w:basedOn w:val="Standaardalinea-lettertype"/>
     <w:link w:val="Kop1"/>
     <w:uiPriority w:val="9"/>
-    <w:rsid w:val="008271DC"/>
+    <w:rsid w:val="000E6D96"/>
     <w:rPr>
       <w:rFonts w:ascii="Pockota Med" w:eastAsiaTheme="majorEastAsia" w:hAnsi="Pockota Med"/>
       <w:bCs/>

</xml_diff>

<commit_message>
Projectengids: de basis vooraan, bolletjes in het stappenplan
- Pagina 1 legt de basis uit, zonder screenshots, met de tekst van Marketing
  zoals aangeleverd en klikbare links naar het formulier en de postvakken.
- Het stappenplan begint op de pagina erna. Geen nummers meer: bolletjes in
  de tekst, en kaders zonder nummer in de screenshots.
- De app is veranderd (#37): standaard of custom komt direct na de deadline,
  en bij standaard kun je alleen LED-kolom, Torenscherm en Menu scherm
  kiezen. De screenshots en de volgorde in hoofdstuk 2 volgen dat; de
  voorbeeldmail noemt geen vlaggen meer.

Co-Authored-By: Claude Opus 5.5 <noreply@anthropic.com>
Claude-Session: https://claude.ai/code/session_01FF5qjJmcy9G5HYxEPWYe11
</commit_message>
<xml_diff>
--- a/docs/gids-projecten/Designs aanvragen - Handleiding voor projecten.docx
+++ b/docs/gids-projecten/Designs aanvragen - Handleiding voor projecten.docx
@@ -2,11 +2,6 @@
 <file path=word/document.xml><?xml version="1.0" encoding="utf-8"?>
 <w:document xmlns:wpc="http://schemas.microsoft.com/office/word/2010/wordprocessingCanvas" xmlns:cx="http://schemas.microsoft.com/office/drawing/2014/chartex" xmlns:cx1="http://schemas.microsoft.com/office/drawing/2015/9/8/chartex" xmlns:cx2="http://schemas.microsoft.com/office/drawing/2015/10/21/chartex" xmlns:cx3="http://schemas.microsoft.com/office/drawing/2016/5/9/chartex" xmlns:cx4="http://schemas.microsoft.com/office/drawing/2016/5/10/chartex" xmlns:cx5="http://schemas.microsoft.com/office/drawing/2016/5/11/chartex" xmlns:cx6="http://schemas.microsoft.com/office/drawing/2016/5/12/chartex" xmlns:cx7="http://schemas.microsoft.com/office/drawing/2016/5/13/chartex" xmlns:cx8="http://schemas.microsoft.com/office/drawing/2016/5/14/chartex" xmlns:mc="http://schemas.openxmlformats.org/markup-compatibility/2006" xmlns:aink="http://schemas.microsoft.com/office/drawing/2016/ink" xmlns:am3d="http://schemas.microsoft.com/office/drawing/2017/model3d" xmlns:o="urn:schemas-microsoft-com:office:office" xmlns:oel="http://schemas.microsoft.com/office/2019/extlst" xmlns:r="http://schemas.openxmlformats.org/officeDocument/2006/relationships" xmlns:m="http://schemas.openxmlformats.org/officeDocument/2006/math" xmlns:v="urn:schemas-microsoft-com:vml" xmlns:wp14="http://schemas.microsoft.com/office/word/2010/wordprocessingDrawing" xmlns:wp="http://schemas.openxmlformats.org/drawingml/2006/wordprocessingDrawing" xmlns:w10="urn:schemas-microsoft-com:office:word" xmlns:w="http://schemas.openxmlformats.org/wordprocessingml/2006/main" xmlns:w14="http://schemas.microsoft.com/office/word/2010/wordml" xmlns:w15="http://schemas.microsoft.com/office/word/2012/wordml" xmlns:w16cex="http://schemas.microsoft.com/office/word/2018/wordml/cex" xmlns:w16cid="http://schemas.microsoft.com/office/word/2016/wordml/cid" xmlns:w16="http://schemas.microsoft.com/office/word/2018/wordml" xmlns:w16du="http://schemas.microsoft.com/office/word/2023/wordml/word16du" xmlns:w16sdtdh="http://schemas.microsoft.com/office/word/2020/wordml/sdtdatahash" xmlns:w16sdtfl="http://schemas.microsoft.com/office/word/2024/wordml/sdtformatlock" xmlns:w16se="http://schemas.microsoft.com/office/word/2015/wordml/symex" xmlns:wpg="http://schemas.microsoft.com/office/word/2010/wordprocessingGroup" xmlns:wpi="http://schemas.microsoft.com/office/word/2010/wordprocessingInk" xmlns:wne="http://schemas.microsoft.com/office/word/2006/wordml" xmlns:wps="http://schemas.microsoft.com/office/word/2010/wordprocessingShape" mc:Ignorable="w14 w15 w16se w16cid w16 w16cex w16sdtdh w16sdtfl w16du wp14">
   <w:body>
-    <w:p>
-      <w:pPr>
-        <w:spacing w:before="200"/>
-      </w:pPr>
-    </w:p>
     <w:p>
       <w:pPr>
         <w:spacing w:after="120"/>
@@ -29,7 +24,7 @@
     <w:p>
       <w:pPr>
         <w:pStyle w:val="Kop1"/>
-        <w:spacing w:after="360" w:line="240" w:lineRule="auto"/>
+        <w:spacing w:after="120" w:line="240" w:lineRule="auto"/>
       </w:pPr>
       <w:r>
         <w:rPr>
@@ -47,10 +42,312 @@
     </w:p>
     <w:p>
       <w:pPr>
+        <w:pStyle w:val="Kop1"/>
+        <w:keepNext/>
+        <w:spacing w:before="120"/>
+      </w:pPr>
+      <w:r>
+        <w:t xml:space="preserve">Design aanvraag</w:t>
+      </w:r>
+    </w:p>
+    <w:p>
+      <w:pPr/>
+      <w:r>
+        <w:t xml:space="preserve">Via het formulier </w:t>
+      </w:r>
+      <w:hyperlink r:id="rIdL1">
+        <w:r>
+          <w:rPr>
+            <w:color w:val="229D96"/>
+            <w:u w:val="single"/>
+          </w:rPr>
+          <w:t xml:space="preserve">Designaanvraag</w:t>
+        </w:r>
+      </w:hyperlink>
+      <w:r>
+        <w:t xml:space="preserve"> vraag je eenvoudig designs aan voor events en interne doeleinden, zoals visitekaartjes of posters. Volg onderstaande afspraken om je aanvraag zo soepel mogelijk te laten verlopen.</w:t>
+      </w:r>
+    </w:p>
+    <w:p>
+      <w:pPr>
         <w:pStyle w:val="Kop2"/>
       </w:pPr>
       <w:r>
-        <w:t xml:space="preserve">In deze handleiding</w:t>
+        <w:t xml:space="preserve">1. Dien je aanvraag op tijd in</w:t>
+      </w:r>
+    </w:p>
+    <w:p>
+      <w:pPr>
+        <w:pStyle w:val="Lijstalinea"/>
+        <w:numPr>
+          <w:ilvl w:val="0"/>
+          <w:numId w:val="2"/>
+        </w:numPr>
+        <w:spacing w:after="60"/>
+      </w:pPr>
+      <w:r>
+        <w:t xml:space="preserve">Vraag je design minimaal 10 werkdagen vóór het event aan.</w:t>
+      </w:r>
+    </w:p>
+    <w:p>
+      <w:pPr>
+        <w:pStyle w:val="Lijstalinea"/>
+        <w:numPr>
+          <w:ilvl w:val="0"/>
+          <w:numId w:val="2"/>
+        </w:numPr>
+        <w:spacing w:after="60"/>
+      </w:pPr>
+      <w:r>
+        <w:t xml:space="preserve">Is de deadline korter? Dan geldt de aanvraag als spoed. Stem deadlines binnen 5 werkdagen altijd af met marketing.</w:t>
+      </w:r>
+    </w:p>
+    <w:p>
+      <w:pPr>
+        <w:pStyle w:val="Lijstalinea"/>
+        <w:numPr>
+          <w:ilvl w:val="0"/>
+          <w:numId w:val="2"/>
+        </w:numPr>
+        <w:spacing w:after="60"/>
+      </w:pPr>
+      <w:r>
+        <w:t xml:space="preserve">Houd er rekening mee dat drukwerk bij korte deadlines mogelijk niet op tijd klaar is.</w:t>
+      </w:r>
+    </w:p>
+    <w:p>
+      <w:pPr>
+        <w:pStyle w:val="Kop2"/>
+      </w:pPr>
+      <w:r>
+        <w:t xml:space="preserve">2. Dien één aanvraag per event in</w:t>
+      </w:r>
+    </w:p>
+    <w:p>
+      <w:pPr>
+        <w:pStyle w:val="Lijstalinea"/>
+        <w:numPr>
+          <w:ilvl w:val="0"/>
+          <w:numId w:val="2"/>
+        </w:numPr>
+        <w:spacing w:after="60"/>
+      </w:pPr>
+      <w:r>
+        <w:t xml:space="preserve">Vink alle designs aan die je voor het event nodig hebt.</w:t>
+      </w:r>
+    </w:p>
+    <w:p>
+      <w:pPr>
+        <w:pStyle w:val="Lijstalinea"/>
+        <w:numPr>
+          <w:ilvl w:val="0"/>
+          <w:numId w:val="2"/>
+        </w:numPr>
+        <w:spacing w:after="60"/>
+      </w:pPr>
+      <w:r>
+        <w:t xml:space="preserve">Voeg waar mogelijk een briefing, logo’s, voorbeelden en de website van het event of bedrijf toe.</w:t>
+      </w:r>
+    </w:p>
+    <w:p>
+      <w:pPr>
+        <w:pStyle w:val="Lijstalinea"/>
+        <w:numPr>
+          <w:ilvl w:val="0"/>
+          <w:numId w:val="2"/>
+        </w:numPr>
+        <w:spacing w:after="60"/>
+      </w:pPr>
+      <w:r>
+        <w:t xml:space="preserve">Geef duidelijk aan welke teksten, formaten en overige wensen van toepassing zijn.</w:t>
+      </w:r>
+    </w:p>
+    <w:p>
+      <w:pPr>
+        <w:pStyle w:val="Lijstalinea"/>
+        <w:numPr>
+          <w:ilvl w:val="0"/>
+          <w:numId w:val="2"/>
+        </w:numPr>
+        <w:spacing w:after="60"/>
+      </w:pPr>
+      <w:r>
+        <w:t xml:space="preserve">Kies standaarddesigns, tenzij de opdrachtgever een eigen ontwerp wenst en hiervoor betaalt.</w:t>
+      </w:r>
+    </w:p>
+    <w:p>
+      <w:pPr>
+        <w:pStyle w:val="Kop2"/>
+      </w:pPr>
+      <w:r>
+        <w:t xml:space="preserve">3. Verstuur je aanvraag via het formulier</w:t>
+      </w:r>
+    </w:p>
+    <w:p>
+      <w:pPr>
+        <w:pStyle w:val="Lijstalinea"/>
+        <w:numPr>
+          <w:ilvl w:val="0"/>
+          <w:numId w:val="2"/>
+        </w:numPr>
+        <w:spacing w:after="60"/>
+      </w:pPr>
+      <w:r>
+        <w:t xml:space="preserve">Vul alle vragen in en controleer je antwoorden in het overzicht.</w:t>
+      </w:r>
+    </w:p>
+    <w:p>
+      <w:pPr>
+        <w:pStyle w:val="Lijstalinea"/>
+        <w:numPr>
+          <w:ilvl w:val="0"/>
+          <w:numId w:val="2"/>
+        </w:numPr>
+        <w:spacing w:after="60"/>
+      </w:pPr>
+      <w:r>
+        <w:t xml:space="preserve">Klik op Verstuur aanvraag om je aanvraag definitief in te dienen.</w:t>
+      </w:r>
+    </w:p>
+    <w:p>
+      <w:pPr>
+        <w:pStyle w:val="Lijstalinea"/>
+        <w:numPr>
+          <w:ilvl w:val="0"/>
+          <w:numId w:val="2"/>
+        </w:numPr>
+        <w:spacing w:after="60"/>
+      </w:pPr>
+      <w:r>
+        <w:t xml:space="preserve">Je antwoorden worden automatisch bewaard, zodat je later verder kunt gaan als dat nodig is.</w:t>
+      </w:r>
+    </w:p>
+    <w:p>
+      <w:pPr>
+        <w:pStyle w:val="Kop2"/>
+      </w:pPr>
+      <w:r>
+        <w:t xml:space="preserve">4. Geef feedback en wijzigingen altijd door via het formulier</w:t>
+      </w:r>
+    </w:p>
+    <w:p>
+      <w:pPr>
+        <w:pStyle w:val="Lijstalinea"/>
+        <w:numPr>
+          <w:ilvl w:val="0"/>
+          <w:numId w:val="2"/>
+        </w:numPr>
+        <w:spacing w:after="60"/>
+      </w:pPr>
+      <w:r>
+        <w:t xml:space="preserve">Gebruik de knop Feedback geven in de e-mail die je ontvangt zodra je design klaar is.</w:t>
+      </w:r>
+    </w:p>
+    <w:p>
+      <w:pPr>
+        <w:pStyle w:val="Lijstalinea"/>
+        <w:numPr>
+          <w:ilvl w:val="0"/>
+          <w:numId w:val="2"/>
+        </w:numPr>
+        <w:spacing w:after="60"/>
+      </w:pPr>
+      <w:r>
+        <w:t xml:space="preserve">Iets vergeten, een extra design nodig of een datum gewijzigd? Kies dan Iets aanvullen of wijzigen.</w:t>
+      </w:r>
+    </w:p>
+    <w:p>
+      <w:pPr>
+        <w:pStyle w:val="Lijstalinea"/>
+        <w:numPr>
+          <w:ilvl w:val="0"/>
+          <w:numId w:val="2"/>
+        </w:numPr>
+        <w:spacing w:after="60"/>
+      </w:pPr>
+      <w:r>
+        <w:t xml:space="preserve">Dien hiervoor geen nieuwe aanvraag in en geef wijzigingen niet door via losse e-mails, Teams of WhatsApp.</w:t>
+      </w:r>
+    </w:p>
+    <w:p>
+      <w:pPr>
+        <w:pStyle w:val="Kop2"/>
+      </w:pPr>
+      <w:r>
+        <w:t xml:space="preserve">5. Je design is klaar</w:t>
+      </w:r>
+    </w:p>
+    <w:p>
+      <w:pPr/>
+      <w:r>
+        <w:t xml:space="preserve">Je ontvangt een e-mail van designaanvraag (</w:t>
+      </w:r>
+      <w:hyperlink r:id="rIdL2">
+        <w:r>
+          <w:rPr>
+            <w:color w:val="229D96"/>
+            <w:u w:val="single"/>
+          </w:rPr>
+          <w:t xml:space="preserve">designaanvraag@nbcevents.nl</w:t>
+        </w:r>
+      </w:hyperlink>
+      <w:r>
+        <w:t xml:space="preserve">) met de bestanden of informatie over waar je deze kunt vinden. Wil je nog iets aanpassen? Gebruik dan de knop Feedback geven in deze e-mail.</w:t>
+      </w:r>
+    </w:p>
+    <w:p>
+      <w:pPr>
+        <w:pStyle w:val="Kop2"/>
+      </w:pPr>
+      <w:r>
+        <w:t xml:space="preserve">Hulp nodig of twijfel je?</w:t>
+      </w:r>
+    </w:p>
+    <w:p>
+      <w:pPr/>
+      <w:r>
+        <w:t xml:space="preserve">Mail marketing via </w:t>
+      </w:r>
+      <w:hyperlink r:id="rIdL3">
+        <w:r>
+          <w:rPr>
+            <w:color w:val="229D96"/>
+            <w:u w:val="single"/>
+          </w:rPr>
+          <w:t xml:space="preserve">marketing@nbcevents.nl</w:t>
+        </w:r>
+      </w:hyperlink>
+      <w:r>
+        <w:t xml:space="preserve">. Voor Green Village kun je mailen naar </w:t>
+      </w:r>
+      <w:hyperlink r:id="rIdL4">
+        <w:r>
+          <w:rPr>
+            <w:color w:val="229D96"/>
+            <w:u w:val="single"/>
+          </w:rPr>
+          <w:t xml:space="preserve">marketing@green-village.nl</w:t>
+        </w:r>
+      </w:hyperlink>
+      <w:r>
+        <w:t xml:space="preserve">.</w:t>
+      </w:r>
+    </w:p>
+    <w:p>
+      <w:pPr>
+        <w:spacing w:before="120"/>
+      </w:pPr>
+      <w:r>
+        <w:t xml:space="preserve">Hieronder vind je de volledige handleiding met screenshots en uitleg per stap, van het indienen van een aanvraag tot het aanpassen van een bestaand design.</w:t>
+      </w:r>
+    </w:p>
+    <w:p>
+      <w:pPr>
+        <w:pStyle w:val="Kop2"/>
+        <w:pageBreakBefore/>
+      </w:pPr>
+      <w:r>
+        <w:t>In deze handleiding</w:t>
       </w:r>
     </w:p>
     <w:tbl>
@@ -525,7 +822,7 @@
         <w:spacing w:before="200"/>
       </w:pPr>
       <w:r>
-        <w:t xml:space="preserve">De screenshots in deze handleiding komen uit het formulier en tonen een fictief event. Een oranje kader met een nummer laat zien waar je moet klikken. Hetzelfde nummer vind je terug in de bijbehorende uitleg.</w:t>
+        <w:t xml:space="preserve">De screenshots in deze handleiding komen uit het formulier en tonen een fictief event. Een oranje kader laat zien waar je moet klikken.</w:t>
       </w:r>
     </w:p>
     <w:p>
@@ -760,11 +1057,9 @@
             </w:pPr>
             <w:r>
               <w:rPr>
-                <w:rFonts w:ascii="Area Normal Extrabold" w:hAnsi="Area Normal Extrabold"/>
                 <w:color w:val="E8590C"/>
-                <w:sz w:val="22"/>
-              </w:rPr>
-              <w:t>1</w:t>
+              </w:rPr>
+              <w:t>•</w:t>
             </w:r>
             <w:r>
               <w:tab/>
@@ -854,7 +1149,7 @@
                     <a:graphicData uri="http://schemas.openxmlformats.org/drawingml/2006/picture">
                       <pic:pic xmlns:pic="http://schemas.openxmlformats.org/drawingml/2006/picture">
                         <pic:nvPicPr>
-                          <pic:cNvPr id="0" name="g06-bestanden.jpg"/>
+                          <pic:cNvPr id="0" name="g08-modus.jpg"/>
                           <pic:cNvPicPr/>
                         </pic:nvPicPr>
                         <pic:blipFill>
@@ -901,17 +1196,15 @@
             </w:pPr>
             <w:r>
               <w:rPr>
-                <w:rFonts w:ascii="Area Normal Extrabold" w:hAnsi="Area Normal Extrabold"/>
                 <w:color w:val="E8590C"/>
-                <w:sz w:val="22"/>
-              </w:rPr>
-              <w:t>1</w:t>
+              </w:rPr>
+              <w:t>•</w:t>
             </w:r>
             <w:r>
               <w:tab/>
             </w:r>
             <w:r>
-              <w:t xml:space="preserve">Sleep een logo, voorbeelden of briefing naar het daarvoor bestemde vak, of klik erop om bestanden te kiezen.</w:t>
+              <w:t xml:space="preserve">Standaarddesigns zijn vaste templates die worden ingevuld met de gegevens van het event. Kies deze optie in de meeste gevallen.</w:t>
             </w:r>
           </w:p>
           <w:p>
@@ -924,38 +1217,15 @@
             </w:pPr>
             <w:r>
               <w:rPr>
-                <w:rFonts w:ascii="Area Normal Extrabold" w:hAnsi="Area Normal Extrabold"/>
                 <w:color w:val="E8590C"/>
-                <w:sz w:val="22"/>
-              </w:rPr>
-              <w:t>2</w:t>
+              </w:rPr>
+              <w:t>•</w:t>
             </w:r>
             <w:r>
               <w:tab/>
             </w:r>
             <w:r>
-              <w:t xml:space="preserve">Staat er een vinkje bij een bestand, dan wordt het meegestuurd.</w:t>
-            </w:r>
-          </w:p>
-          <w:p>
-            <w:pPr>
-              <w:tabs>
-                <w:tab w:val="left" w:pos="425"/>
-              </w:tabs>
-              <w:spacing w:after="120"/>
-              <w:ind w:left="425" w:hanging="425"/>
-            </w:pPr>
-            <w:r>
-              <w:rPr>
-                <w:color w:val="E8590C"/>
-              </w:rPr>
-              <w:t>•</w:t>
-            </w:r>
-            <w:r>
-              <w:tab/>
-            </w:r>
-            <w:r>
-              <w:t xml:space="preserve">Je kunt maximaal 5 bestanden van elk 25 MB toevoegen, zoals afbeeldingen, pdf-, Word- en PowerPoint-bestanden. Zijn de bestanden groter of gaat het om bronbestanden (AI, PSD of INDD)? Upload deze dan op de G-schijf en voeg de link naar de bestanden toe aan het formulier.</w:t>
+              <w:t xml:space="preserve">Kies alleen voor ‘Volledig custom’ als de opdrachtgever een eigen ontwerp wenst en hiervoor betaalt.</w:t>
             </w:r>
           </w:p>
         </w:tc>
@@ -965,49 +1235,6 @@
       <w:pPr>
         <w:spacing w:after="0" w:line="120" w:lineRule="exact"/>
       </w:pPr>
-    </w:p>
-    <w:p>
-      <w:pPr>
-        <w:keepNext/>
-        <w:tabs>
-          <w:tab w:val="left" w:pos="425"/>
-        </w:tabs>
-        <w:spacing w:after="120"/>
-        <w:ind w:left="425" w:hanging="425"/>
-      </w:pPr>
-      <w:r>
-        <w:rPr>
-          <w:color w:val="E8590C"/>
-        </w:rPr>
-        <w:t>•</w:t>
-      </w:r>
-      <w:r>
-        <w:tab/>
-      </w:r>
-      <w:r>
-        <w:t xml:space="preserve">Vul waar mogelijk de website van het bedrijf of event in. Zo kan Marketing de juiste branding, zoals logo’s, kleuren en lettertypen, achterhalen. Is er geen website beschikbaar? Dan kun je dit veld leeg laten.</w:t>
-      </w:r>
-    </w:p>
-    <w:p>
-      <w:pPr>
-        <w:tabs>
-          <w:tab w:val="left" w:pos="425"/>
-        </w:tabs>
-        <w:spacing w:after="120"/>
-        <w:ind w:left="425" w:hanging="425"/>
-      </w:pPr>
-      <w:r>
-        <w:rPr>
-          <w:color w:val="E8590C"/>
-        </w:rPr>
-        <w:t>•</w:t>
-      </w:r>
-      <w:r>
-        <w:tab/>
-      </w:r>
-      <w:r>
-        <w:t xml:space="preserve">Vink alles aan wat je voor het event nodig hebt. Staat jouw keuze er niet bij? Kies dan ‘Anders, namelijk…’ en beschrijf wat je nodig hebt.</w:t>
-      </w:r>
     </w:p>
     <w:tbl>
       <w:tblPr>
@@ -1061,7 +1288,7 @@
                     <a:graphicData uri="http://schemas.openxmlformats.org/drawingml/2006/picture">
                       <pic:pic xmlns:pic="http://schemas.openxmlformats.org/drawingml/2006/picture">
                         <pic:nvPicPr>
-                          <pic:cNvPr id="0" name="g08-modus.jpg"/>
+                          <pic:cNvPr id="0" name="g06-bestanden.jpg"/>
                           <pic:cNvPicPr/>
                         </pic:nvPicPr>
                         <pic:blipFill>
@@ -1108,17 +1335,15 @@
             </w:pPr>
             <w:r>
               <w:rPr>
-                <w:rFonts w:ascii="Area Normal Extrabold" w:hAnsi="Area Normal Extrabold"/>
                 <w:color w:val="E8590C"/>
-                <w:sz w:val="22"/>
-              </w:rPr>
-              <w:t>1</w:t>
+              </w:rPr>
+              <w:t>•</w:t>
             </w:r>
             <w:r>
               <w:tab/>
             </w:r>
             <w:r>
-              <w:t xml:space="preserve">Standaarddesigns zijn vaste templates die worden ingevuld met de gegevens van het event. Kies deze optie in de meeste gevallen.</w:t>
+              <w:t xml:space="preserve">Sleep een logo, voorbeelden of briefing naar het daarvoor bestemde vak, of klik erop om bestanden te kiezen.</w:t>
             </w:r>
           </w:p>
           <w:p>
@@ -1131,17 +1356,36 @@
             </w:pPr>
             <w:r>
               <w:rPr>
-                <w:rFonts w:ascii="Area Normal Extrabold" w:hAnsi="Area Normal Extrabold"/>
                 <w:color w:val="E8590C"/>
-                <w:sz w:val="22"/>
-              </w:rPr>
-              <w:t>2</w:t>
+              </w:rPr>
+              <w:t>•</w:t>
             </w:r>
             <w:r>
               <w:tab/>
             </w:r>
             <w:r>
-              <w:t xml:space="preserve">Kies alleen voor ‘Volledig custom’ als de opdrachtgever een eigen ontwerp wenst en hiervoor betaalt.</w:t>
+              <w:t xml:space="preserve">Staat er een vinkje bij een bestand, dan wordt het meegestuurd.</w:t>
+            </w:r>
+          </w:p>
+          <w:p>
+            <w:pPr>
+              <w:tabs>
+                <w:tab w:val="left" w:pos="425"/>
+              </w:tabs>
+              <w:spacing w:after="120"/>
+              <w:ind w:left="425" w:hanging="425"/>
+            </w:pPr>
+            <w:r>
+              <w:rPr>
+                <w:color w:val="E8590C"/>
+              </w:rPr>
+              <w:t>•</w:t>
+            </w:r>
+            <w:r>
+              <w:tab/>
+            </w:r>
+            <w:r>
+              <w:t xml:space="preserve">Je kunt maximaal 5 bestanden van elk 25 MB toevoegen, zoals afbeeldingen, pdf-, Word- en PowerPoint-bestanden. Zijn de bestanden groter of gaat het om bronbestanden (AI, PSD of INDD)? Upload deze dan op de G-schijf en voeg de link naar de bestanden toe aan het formulier.</w:t>
             </w:r>
           </w:p>
         </w:tc>
@@ -1151,6 +1395,49 @@
       <w:pPr>
         <w:spacing w:after="0" w:line="120" w:lineRule="exact"/>
       </w:pPr>
+    </w:p>
+    <w:p>
+      <w:pPr>
+        <w:keepNext/>
+        <w:tabs>
+          <w:tab w:val="left" w:pos="425"/>
+        </w:tabs>
+        <w:spacing w:after="120"/>
+        <w:ind w:left="425" w:hanging="425"/>
+      </w:pPr>
+      <w:r>
+        <w:rPr>
+          <w:color w:val="E8590C"/>
+        </w:rPr>
+        <w:t>•</w:t>
+      </w:r>
+      <w:r>
+        <w:tab/>
+      </w:r>
+      <w:r>
+        <w:t xml:space="preserve">Vul waar mogelijk de website van het bedrijf of event in. Zo kan Marketing de juiste branding, zoals logo’s, kleuren en lettertypen, achterhalen. Is er geen website beschikbaar? Dan kun je dit veld leeg laten.</w:t>
+      </w:r>
+    </w:p>
+    <w:p>
+      <w:pPr>
+        <w:tabs>
+          <w:tab w:val="left" w:pos="425"/>
+        </w:tabs>
+        <w:spacing w:after="120"/>
+        <w:ind w:left="425" w:hanging="425"/>
+      </w:pPr>
+      <w:r>
+        <w:rPr>
+          <w:color w:val="E8590C"/>
+        </w:rPr>
+        <w:t>•</w:t>
+      </w:r>
+      <w:r>
+        <w:tab/>
+      </w:r>
+      <w:r>
+        <w:t xml:space="preserve">Vink alles aan wat je voor het event nodig hebt. Staat jouw keuze er niet bij? Kies dan ‘Anders, namelijk…’ en beschrijf wat je nodig hebt.</w:t>
+      </w:r>
     </w:p>
     <w:tbl>
       <w:tblPr>
@@ -1251,11 +1538,9 @@
             </w:pPr>
             <w:r>
               <w:rPr>
-                <w:rFonts w:ascii="Area Normal Extrabold" w:hAnsi="Area Normal Extrabold"/>
                 <w:color w:val="E8590C"/>
-                <w:sz w:val="22"/>
-              </w:rPr>
-              <w:t>1</w:t>
+              </w:rPr>
+              <w:t>•</w:t>
             </w:r>
             <w:r>
               <w:tab/>
@@ -1274,11 +1559,9 @@
             </w:pPr>
             <w:r>
               <w:rPr>
-                <w:rFonts w:ascii="Area Normal Extrabold" w:hAnsi="Area Normal Extrabold"/>
                 <w:color w:val="E8590C"/>
-                <w:sz w:val="22"/>
-              </w:rPr>
-              <w:t>2</w:t>
+              </w:rPr>
+              <w:t>•</w:t>
             </w:r>
             <w:r>
               <w:tab/>
@@ -1415,11 +1698,9 @@
             </w:pPr>
             <w:r>
               <w:rPr>
-                <w:rFonts w:ascii="Area Normal Extrabold" w:hAnsi="Area Normal Extrabold"/>
                 <w:color w:val="E8590C"/>
-                <w:sz w:val="22"/>
-              </w:rPr>
-              <w:t>1</w:t>
+              </w:rPr>
+              <w:t>•</w:t>
             </w:r>
             <w:r>
               <w:tab/>
@@ -1438,11 +1719,9 @@
             </w:pPr>
             <w:r>
               <w:rPr>
-                <w:rFonts w:ascii="Area Normal Extrabold" w:hAnsi="Area Normal Extrabold"/>
                 <w:color w:val="E8590C"/>
-                <w:sz w:val="22"/>
-              </w:rPr>
-              <w:t>2</w:t>
+              </w:rPr>
+              <w:t>•</w:t>
             </w:r>
             <w:r>
               <w:tab/>
@@ -1558,11 +1837,9 @@
             </w:pPr>
             <w:r>
               <w:rPr>
-                <w:rFonts w:ascii="Area Normal Extrabold" w:hAnsi="Area Normal Extrabold"/>
                 <w:color w:val="E8590C"/>
-                <w:sz w:val="22"/>
-              </w:rPr>
-              <w:t>1</w:t>
+              </w:rPr>
+              <w:t>•</w:t>
             </w:r>
             <w:r>
               <w:tab/>
@@ -1581,11 +1858,9 @@
             </w:pPr>
             <w:r>
               <w:rPr>
-                <w:rFonts w:ascii="Area Normal Extrabold" w:hAnsi="Area Normal Extrabold"/>
                 <w:color w:val="E8590C"/>
-                <w:sz w:val="22"/>
-              </w:rPr>
-              <w:t>2</w:t>
+              </w:rPr>
+              <w:t>•</w:t>
             </w:r>
             <w:r>
               <w:tab/>
@@ -1847,11 +2122,9 @@
             </w:pPr>
             <w:r>
               <w:rPr>
-                <w:rFonts w:ascii="Area Normal Extrabold" w:hAnsi="Area Normal Extrabold"/>
                 <w:color w:val="E8590C"/>
-                <w:sz w:val="22"/>
-              </w:rPr>
-              <w:t>1</w:t>
+              </w:rPr>
+              <w:t>•</w:t>
             </w:r>
             <w:r>
               <w:tab/>
@@ -1870,11 +2143,9 @@
             </w:pPr>
             <w:r>
               <w:rPr>
-                <w:rFonts w:ascii="Area Normal Extrabold" w:hAnsi="Area Normal Extrabold"/>
                 <w:color w:val="E8590C"/>
-                <w:sz w:val="22"/>
-              </w:rPr>
-              <w:t>2</w:t>
+              </w:rPr>
+              <w:t>•</w:t>
             </w:r>
             <w:r>
               <w:tab/>
@@ -2058,11 +2329,9 @@
             </w:pPr>
             <w:r>
               <w:rPr>
-                <w:rFonts w:ascii="Area Normal Extrabold" w:hAnsi="Area Normal Extrabold"/>
                 <w:color w:val="E8590C"/>
-                <w:sz w:val="22"/>
-              </w:rPr>
-              <w:t>1</w:t>
+              </w:rPr>
+              <w:t>•</w:t>
             </w:r>
             <w:r>
               <w:tab/>
@@ -2081,11 +2350,9 @@
             </w:pPr>
             <w:r>
               <w:rPr>
-                <w:rFonts w:ascii="Area Normal Extrabold" w:hAnsi="Area Normal Extrabold"/>
                 <w:color w:val="E8590C"/>
-                <w:sz w:val="22"/>
-              </w:rPr>
-              <w:t>2</w:t>
+              </w:rPr>
+              <w:t>•</w:t>
             </w:r>
             <w:r>
               <w:tab/>
@@ -2104,11 +2371,9 @@
             </w:pPr>
             <w:r>
               <w:rPr>
-                <w:rFonts w:ascii="Area Normal Extrabold" w:hAnsi="Area Normal Extrabold"/>
                 <w:color w:val="E8590C"/>
-                <w:sz w:val="22"/>
-              </w:rPr>
-              <w:t>3</w:t>
+              </w:rPr>
+              <w:t>•</w:t>
             </w:r>
             <w:r>
               <w:tab/>
@@ -2127,11 +2392,9 @@
             </w:pPr>
             <w:r>
               <w:rPr>
-                <w:rFonts w:ascii="Area Normal Extrabold" w:hAnsi="Area Normal Extrabold"/>
                 <w:color w:val="E8590C"/>
-                <w:sz w:val="22"/>
-              </w:rPr>
-              <w:t>4</w:t>
+              </w:rPr>
+              <w:t>•</w:t>
             </w:r>
             <w:r>
               <w:tab/>
@@ -2307,11 +2570,9 @@
             </w:pPr>
             <w:r>
               <w:rPr>
-                <w:rFonts w:ascii="Area Normal Extrabold" w:hAnsi="Area Normal Extrabold"/>
                 <w:color w:val="E8590C"/>
-                <w:sz w:val="22"/>
-              </w:rPr>
-              <w:t>1</w:t>
+              </w:rPr>
+              <w:t>•</w:t>
             </w:r>
             <w:r>
               <w:tab/>
@@ -2330,11 +2591,9 @@
             </w:pPr>
             <w:r>
               <w:rPr>
-                <w:rFonts w:ascii="Area Normal Extrabold" w:hAnsi="Area Normal Extrabold"/>
                 <w:color w:val="E8590C"/>
-                <w:sz w:val="22"/>
-              </w:rPr>
-              <w:t>2</w:t>
+              </w:rPr>
+              <w:t>•</w:t>
             </w:r>
             <w:r>
               <w:tab/>
@@ -2353,11 +2612,9 @@
             </w:pPr>
             <w:r>
               <w:rPr>
-                <w:rFonts w:ascii="Area Normal Extrabold" w:hAnsi="Area Normal Extrabold"/>
                 <w:color w:val="E8590C"/>
-                <w:sz w:val="22"/>
-              </w:rPr>
-              <w:t>3</w:t>
+              </w:rPr>
+              <w:t>•</w:t>
             </w:r>
             <w:r>
               <w:tab/>
@@ -2473,11 +2730,9 @@
             </w:pPr>
             <w:r>
               <w:rPr>
-                <w:rFonts w:ascii="Area Normal Extrabold" w:hAnsi="Area Normal Extrabold"/>
                 <w:color w:val="E8590C"/>
-                <w:sz w:val="22"/>
-              </w:rPr>
-              <w:t>1</w:t>
+              </w:rPr>
+              <w:t>•</w:t>
             </w:r>
             <w:r>
               <w:tab/>
@@ -2496,11 +2751,9 @@
             </w:pPr>
             <w:r>
               <w:rPr>
-                <w:rFonts w:ascii="Area Normal Extrabold" w:hAnsi="Area Normal Extrabold"/>
                 <w:color w:val="E8590C"/>
-                <w:sz w:val="22"/>
-              </w:rPr>
-              <w:t>2</w:t>
+              </w:rPr>
+              <w:t>•</w:t>
             </w:r>
             <w:r>
               <w:tab/>
@@ -2676,11 +2929,9 @@
             </w:pPr>
             <w:r>
               <w:rPr>
-                <w:rFonts w:ascii="Area Normal Extrabold" w:hAnsi="Area Normal Extrabold"/>
                 <w:color w:val="E8590C"/>
-                <w:sz w:val="22"/>
-              </w:rPr>
-              <w:t>1</w:t>
+              </w:rPr>
+              <w:t>•</w:t>
             </w:r>
             <w:r>
               <w:tab/>
@@ -2838,11 +3089,9 @@
             </w:pPr>
             <w:r>
               <w:rPr>
-                <w:rFonts w:ascii="Area Normal Extrabold" w:hAnsi="Area Normal Extrabold"/>
                 <w:color w:val="E8590C"/>
-                <w:sz w:val="22"/>
-              </w:rPr>
-              <w:t>1</w:t>
+              </w:rPr>
+              <w:t>•</w:t>
             </w:r>
             <w:r>
               <w:tab/>
@@ -2861,11 +3110,9 @@
             </w:pPr>
             <w:r>
               <w:rPr>
-                <w:rFonts w:ascii="Area Normal Extrabold" w:hAnsi="Area Normal Extrabold"/>
                 <w:color w:val="E8590C"/>
-                <w:sz w:val="22"/>
-              </w:rPr>
-              <w:t>2</w:t>
+              </w:rPr>
+              <w:t>•</w:t>
             </w:r>
             <w:r>
               <w:tab/>
@@ -2884,11 +3131,9 @@
             </w:pPr>
             <w:r>
               <w:rPr>
-                <w:rFonts w:ascii="Area Normal Extrabold" w:hAnsi="Area Normal Extrabold"/>
                 <w:color w:val="E8590C"/>
-                <w:sz w:val="22"/>
-              </w:rPr>
-              <w:t>3</w:t>
+              </w:rPr>
+              <w:t>•</w:t>
             </w:r>
             <w:r>
               <w:tab/>
@@ -3025,11 +3270,9 @@
             </w:pPr>
             <w:r>
               <w:rPr>
-                <w:rFonts w:ascii="Area Normal Extrabold" w:hAnsi="Area Normal Extrabold"/>
                 <w:color w:val="E8590C"/>
-                <w:sz w:val="22"/>
-              </w:rPr>
-              <w:t>1</w:t>
+              </w:rPr>
+              <w:t>•</w:t>
             </w:r>
             <w:r>
               <w:tab/>
@@ -3048,11 +3291,9 @@
             </w:pPr>
             <w:r>
               <w:rPr>
-                <w:rFonts w:ascii="Area Normal Extrabold" w:hAnsi="Area Normal Extrabold"/>
                 <w:color w:val="E8590C"/>
-                <w:sz w:val="22"/>
-              </w:rPr>
-              <w:t>2</w:t>
+              </w:rPr>
+              <w:t>•</w:t>
             </w:r>
             <w:r>
               <w:tab/>

</xml_diff>

<commit_message>
Projectengids: hoofdstuk 1 eruit, 'Design aanvraag' als titel
De basis op pagina 1 vervangt 'Het formulier in het kort'. De andere
hoofdstukken zijn nu 1 tot en met 6, en de verwijzingen ernaar lopen mee.
'Design aanvraag' is de grote titel. Weer zeven pagina's.

Co-Authored-By: Claude Opus 5.5 <noreply@anthropic.com>
Claude-Session: https://claude.ai/code/session_01FF5qjJmcy9G5HYxEPWYe11
</commit_message>
<xml_diff>
--- a/docs/gids-projecten/Designs aanvragen - Handleiding voor projecten.docx
+++ b/docs/gids-projecten/Designs aanvragen - Handleiding voor projecten.docx
@@ -30,24 +30,7 @@
         <w:rPr>
           <w:sz w:val="54"/>
         </w:rPr>
-        <w:t>Designs aanvragen</w:t>
-      </w:r>
-      <w:r>
-        <w:rPr>
-          <w:sz w:val="54"/>
-        </w:rPr>
-        <w:br/>
-        <w:t>bij Marketing</w:t>
-      </w:r>
-    </w:p>
-    <w:p>
-      <w:pPr>
-        <w:pStyle w:val="Kop1"/>
-        <w:keepNext/>
-        <w:spacing w:before="120"/>
-      </w:pPr>
-      <w:r>
-        <w:t xml:space="preserve">Design aanvraag</w:t>
+        <w:t>Design aanvraag</w:t>
       </w:r>
     </w:p>
     <w:p>
@@ -411,7 +394,7 @@
               <w:rPr>
                 <w:rFonts w:ascii="Area Normal Extrabold" w:hAnsi="Area Normal Extrabold"/>
               </w:rPr>
-              <w:t xml:space="preserve">Het formulier in het kort</w:t>
+              <w:t xml:space="preserve">Een aanvraag voor een event</w:t>
             </w:r>
           </w:p>
         </w:tc>
@@ -475,7 +458,7 @@
               <w:rPr>
                 <w:rFonts w:ascii="Area Normal Extrabold" w:hAnsi="Area Normal Extrabold"/>
               </w:rPr>
-              <w:t xml:space="preserve">Een aanvraag voor een event</w:t>
+              <w:t xml:space="preserve">Een interne aanvraag voor NBC en Green Village</w:t>
             </w:r>
           </w:p>
         </w:tc>
@@ -539,7 +522,7 @@
               <w:rPr>
                 <w:rFonts w:ascii="Area Normal Extrabold" w:hAnsi="Area Normal Extrabold"/>
               </w:rPr>
-              <w:t xml:space="preserve">Een interne aanvraag voor NBC en Green Village</w:t>
+              <w:t xml:space="preserve">Een menukaart of menuscherm</w:t>
             </w:r>
           </w:p>
         </w:tc>
@@ -603,7 +586,7 @@
               <w:rPr>
                 <w:rFonts w:ascii="Area Normal Extrabold" w:hAnsi="Area Normal Extrabold"/>
               </w:rPr>
-              <w:t xml:space="preserve">Een menukaart of menuscherm</w:t>
+              <w:t xml:space="preserve">Je design is klaar</w:t>
             </w:r>
           </w:p>
         </w:tc>
@@ -667,7 +650,7 @@
               <w:rPr>
                 <w:rFonts w:ascii="Area Normal Extrabold" w:hAnsi="Area Normal Extrabold"/>
               </w:rPr>
-              <w:t xml:space="preserve">Je design is klaar</w:t>
+              <w:t xml:space="preserve">Aanvullen of wijzigen</w:t>
             </w:r>
           </w:p>
         </w:tc>
@@ -731,7 +714,7 @@
               <w:rPr>
                 <w:rFonts w:ascii="Area Normal Extrabold" w:hAnsi="Area Normal Extrabold"/>
               </w:rPr>
-              <w:t xml:space="preserve">Aanvullen of wijzigen</w:t>
+              <w:t xml:space="preserve">Spoed en vragen</w:t>
             </w:r>
           </w:p>
         </w:tc>
@@ -752,70 +735,6 @@
           </w:p>
         </w:tc>
       </w:tr>
-      <w:tr>
-        <w:tc>
-          <w:tcPr>
-            <w:tcW w:w="510" w:type="dxa"/>
-            <w:tcMar>
-              <w:top w:w="30" w:type="dxa"/>
-              <w:left w:w="0" w:type="dxa"/>
-              <w:bottom w:w="30" w:type="dxa"/>
-              <w:right w:w="80" w:type="dxa"/>
-            </w:tcMar>
-          </w:tcPr>
-          <w:p>
-            <w:pPr>
-              <w:spacing w:after="20"/>
-            </w:pPr>
-            <w:r>
-              <w:rPr>
-                <w:rFonts w:ascii="Pockota Med" w:hAnsi="Pockota Med"/>
-                <w:color w:val="229D96"/>
-                <w:sz w:val="20"/>
-              </w:rPr>
-              <w:t>7</w:t>
-            </w:r>
-          </w:p>
-        </w:tc>
-        <w:tc>
-          <w:tcPr>
-            <w:tcW w:w="3061" w:type="dxa"/>
-            <w:tcMar>
-              <w:top w:w="30" w:type="dxa"/>
-              <w:left w:w="0" w:type="dxa"/>
-              <w:bottom w:w="30" w:type="dxa"/>
-              <w:right w:w="80" w:type="dxa"/>
-            </w:tcMar>
-          </w:tcPr>
-          <w:p>
-            <w:pPr>
-              <w:spacing w:after="20"/>
-            </w:pPr>
-            <w:r>
-              <w:rPr>
-                <w:rFonts w:ascii="Area Normal Extrabold" w:hAnsi="Area Normal Extrabold"/>
-              </w:rPr>
-              <w:t xml:space="preserve">Spoed en vragen</w:t>
-            </w:r>
-          </w:p>
-        </w:tc>
-        <w:tc>
-          <w:tcPr>
-            <w:tcW w:w="5443" w:type="dxa"/>
-            <w:tcMar>
-              <w:top w:w="30" w:type="dxa"/>
-              <w:left w:w="0" w:type="dxa"/>
-              <w:bottom w:w="30" w:type="dxa"/>
-              <w:right w:w="80" w:type="dxa"/>
-            </w:tcMar>
-          </w:tcPr>
-          <w:p>
-            <w:pPr>
-              <w:spacing w:after="20"/>
-            </w:pPr>
-          </w:p>
-        </w:tc>
-      </w:tr>
     </w:tbl>
     <w:p>
       <w:pPr>
@@ -832,122 +751,7 @@
         <w:spacing w:before="280"/>
       </w:pPr>
       <w:r>
-        <w:t xml:space="preserve">1  Het formulier in het kort</w:t>
-      </w:r>
-    </w:p>
-    <w:p>
-      <w:pPr>
-        <w:keepNext/>
-      </w:pPr>
-      <w:r>
-        <w:t xml:space="preserve">Met het formulier dien je eenvoudig een designaanvraag in bij Marketing. Je vindt het formulier via marketing-nbc.github.io/designaanvraag. Voeg de link toe aan je favorieten, zodat je het formulier snel terugvindt.</w:t>
-      </w:r>
-    </w:p>
-    <w:p>
-      <w:pPr>
-        <w:keepNext/>
-        <w:keepLines/>
-      </w:pPr>
-      <w:r>
-        <w:rPr>
-          <w:rFonts w:ascii="Area Normal Extrabold" w:hAnsi="Area Normal Extrabold"/>
-        </w:rPr>
-        <w:t xml:space="preserve">Start:</w:t>
-      </w:r>
-      <w:r>
-        <w:t xml:space="preserve"> klik op deze optie om een nieuwe aanvraag in te dienen.</w:t>
-      </w:r>
-    </w:p>
-    <w:p>
-      <w:pPr>
-        <w:keepNext/>
-        <w:keepLines/>
-      </w:pPr>
-      <w:r>
-        <w:t xml:space="preserve">Het formulier toont één vraag per scherm, met een korte toelichting. Selecteer je antwoord en klik op </w:t>
-      </w:r>
-      <w:r>
-        <w:rPr>
-          <w:rFonts w:ascii="Area Normal Extrabold" w:hAnsi="Area Normal Extrabold"/>
-        </w:rPr>
-        <w:t xml:space="preserve">‘Volgende’</w:t>
-      </w:r>
-      <w:r>
-        <w:t xml:space="preserve"> of druk op Enter om verder te gaan. Je kunt altijd terug naar een vorige vraag. De voortgangsteller onderaan laat zien hoever je bent.</w:t>
-      </w:r>
-    </w:p>
-    <w:p>
-      <w:pPr>
-        <w:keepNext/>
-        <w:keepLines/>
-      </w:pPr>
-      <w:r>
-        <w:t xml:space="preserve">Je antwoorden worden automatisch bewaard. Sluit je het venster tussentijds, dan kun je later verdergaan waar je bent gebleven.</w:t>
-      </w:r>
-    </w:p>
-    <w:p>
-      <w:pPr>
-        <w:pStyle w:val="Lijstalinea"/>
-        <w:numPr>
-          <w:ilvl w:val="0"/>
-          <w:numId w:val="2"/>
-        </w:numPr>
-        <w:keepNext/>
-        <w:spacing w:after="60"/>
-      </w:pPr>
-      <w:r>
-        <w:t xml:space="preserve">Vraag je design minimaal 10 werkdagen vóór het event aan. Is de termijn korter, dan geldt het als spoed en wordt de aanvraag als spoed geregistreerd.</w:t>
-      </w:r>
-    </w:p>
-    <w:p>
-      <w:pPr>
-        <w:pStyle w:val="Lijstalinea"/>
-        <w:numPr>
-          <w:ilvl w:val="0"/>
-          <w:numId w:val="2"/>
-        </w:numPr>
-        <w:keepNext/>
-        <w:spacing w:after="60"/>
-      </w:pPr>
-      <w:r>
-        <w:t xml:space="preserve">Dien één aanvraag per event in. Vink alles aan wat je nodig hebt, zodat alles bij elkaar staat.</w:t>
-      </w:r>
-    </w:p>
-    <w:p>
-      <w:pPr>
-        <w:pStyle w:val="Lijstalinea"/>
-        <w:numPr>
-          <w:ilvl w:val="0"/>
-          <w:numId w:val="2"/>
-        </w:numPr>
-        <w:keepNext/>
-        <w:spacing w:after="60"/>
-      </w:pPr>
-      <w:r>
-        <w:t xml:space="preserve">Kies standaarddesigns, tenzij de opdrachtgever om een eigen ontwerp vraagt of daarvoor betaalt.</w:t>
-      </w:r>
-    </w:p>
-    <w:p>
-      <w:pPr>
-        <w:pStyle w:val="Lijstalinea"/>
-        <w:numPr>
-          <w:ilvl w:val="0"/>
-          <w:numId w:val="2"/>
-        </w:numPr>
-        <w:spacing w:after="60"/>
-      </w:pPr>
-      <w:r>
-        <w:t xml:space="preserve">Geef feedback en geef eventuele wijzigingen door via de knop ‘Feedback geven’ in de e-mail. We verwerken feedback uitsluitend via het formulier en niet via losse berichten per e-mail, Teams of WhatsApp.</w:t>
-      </w:r>
-    </w:p>
-    <w:p>
-      <w:pPr>
-        <w:pStyle w:val="Kop1"/>
-        <w:keepNext/>
-        <w:spacing w:before="280"/>
-      </w:pPr>
-      <w:r>
-        <w:t xml:space="preserve">2  Een aanvraag voor een event</w:t>
+        <w:t xml:space="preserve">1  Een aanvraag voor een event</w:t>
       </w:r>
     </w:p>
     <w:p>
@@ -1991,7 +1795,7 @@
         <w:spacing w:before="280"/>
       </w:pPr>
       <w:r>
-        <w:t xml:space="preserve">3  Een interne aanvraag</w:t>
+        <w:t xml:space="preserve">2  Een interne aanvraag</w:t>
       </w:r>
     </w:p>
     <w:p>
@@ -2190,7 +1994,7 @@
         <w:spacing w:before="280"/>
       </w:pPr>
       <w:r>
-        <w:t xml:space="preserve">4  Een menukaart of menuscherm</w:t>
+        <w:t xml:space="preserve">3  Een menukaart of menuscherm</w:t>
       </w:r>
     </w:p>
     <w:p>
@@ -2460,7 +2264,7 @@
         <w:spacing w:before="280"/>
       </w:pPr>
       <w:r>
-        <w:t xml:space="preserve">5  Je design is klaar</w:t>
+        <w:t xml:space="preserve">4  Je design is klaar</w:t>
       </w:r>
     </w:p>
     <w:p>
@@ -2819,7 +2623,7 @@
         <w:spacing w:before="280"/>
       </w:pPr>
       <w:r>
-        <w:t xml:space="preserve">6  Aanvullen of wijzigen</w:t>
+        <w:t xml:space="preserve">5  Aanvullen of wijzigen</w:t>
       </w:r>
     </w:p>
     <w:p>
@@ -3139,7 +2943,7 @@
               <w:tab/>
             </w:r>
             <w:r>
-              <w:t xml:space="preserve">Menu aanpassen is alleen beschikbaar bij aanvragen voor een menukaart of menuscherm. Je krijgt dan hetzelfde menuoverzicht als in hoofdstuk 4, met het huidige menu al ingevuld. Pas aan wat nodig is.</w:t>
+              <w:t xml:space="preserve">Menu aanpassen is alleen beschikbaar bij aanvragen voor een menukaart of menuscherm. Je krijgt dan hetzelfde menuoverzicht als in hoofdstuk 3, met het huidige menu al ingevuld. Pas aan wat nodig is.</w:t>
             </w:r>
           </w:p>
           <w:p>
@@ -3317,7 +3121,7 @@
         <w:spacing w:before="280"/>
       </w:pPr>
       <w:r>
-        <w:t xml:space="preserve">7  Spoed en vragen</w:t>
+        <w:t xml:space="preserve">6  Spoed en vragen</w:t>
       </w:r>
     </w:p>
     <w:p>
@@ -3325,7 +3129,7 @@
         <w:keepNext/>
       </w:pPr>
       <w:r>
-        <w:t xml:space="preserve">Je aanvraag komt bij Marketing binnen als taak. Marketing ontvangt een e-mail en ziet de aanvraag in de lijst. Vervolgens plant Marketing de aanvraag in. Is er iets onduidelijk, dan neemt Marketing contact met je op. Zodra het design klaar is, ontvang je een e-mail met de bestanden (zie hoofdstuk 5).</w:t>
+        <w:t xml:space="preserve">Je aanvraag komt bij Marketing binnen als taak. Marketing ontvangt een e-mail en ziet de aanvraag in de lijst. Vervolgens plant Marketing de aanvraag in. Is er iets onduidelijk, dan neemt Marketing contact met je op. Zodra het design klaar is, ontvang je een e-mail met de bestanden (zie hoofdstuk 4).</w:t>
       </w:r>
     </w:p>
     <w:p>

</xml_diff>

<commit_message>
Projectengids: aanpassingen van Anouk, en twee aanvullingen voor custom
Haar versie is de nieuwe basis: minder ruimte onder de titel, 'Een interne
aanvraag' in de inhoudsopgave, hoofdstuknummers met een punt, en
'marketing' met een kleine letter midden in een zin (nu ook op de plekken
die ze oversloeg).

Rechtgezet: knopnamen weer met hoofdletter zoals in de app ('Verstuur
aanvraag', 'Geen deadline', 'Feedback geven', 'Menu aanpassen', ...), en een
zin die met een kleine letter begon.

Toegevoegd, sinds #37: 'Menukaart print' en 'Anders, namelijk…' kunnen
alleen bij 'Volledig custom'.

Co-Authored-By: Claude Opus 5.5 <noreply@anthropic.com>
Claude-Session: https://claude.ai/code/session_01FF5qjJmcy9G5HYxEPWYe11
</commit_message>
<xml_diff>
--- a/docs/gids-projecten/Designs aanvragen - Handleiding voor projecten.docx
+++ b/docs/gids-projecten/Designs aanvragen - Handleiding voor projecten.docx
@@ -24,7 +24,7 @@
     <w:p>
       <w:pPr>
         <w:pStyle w:val="Kop1"/>
-        <w:spacing w:after="120" w:line="240" w:lineRule="auto"/>
+        <w:spacing w:line="240" w:lineRule="auto"/>
       </w:pPr>
       <w:r>
         <w:rPr>
@@ -458,7 +458,7 @@
               <w:rPr>
                 <w:rFonts w:ascii="Area Normal Extrabold" w:hAnsi="Area Normal Extrabold"/>
               </w:rPr>
-              <w:t xml:space="preserve">Een interne aanvraag voor NBC en Green Village</w:t>
+              <w:t xml:space="preserve">Een interne aanvraag</w:t>
             </w:r>
           </w:p>
         </w:tc>
@@ -751,7 +751,7 @@
         <w:spacing w:before="280"/>
       </w:pPr>
       <w:r>
-        <w:t xml:space="preserve">1  Een aanvraag voor een event</w:t>
+        <w:t xml:space="preserve">1.  Een aanvraag voor een event</w:t>
       </w:r>
     </w:p>
     <w:p>
@@ -1219,7 +1219,7 @@
         <w:tab/>
       </w:r>
       <w:r>
-        <w:t xml:space="preserve">Vul waar mogelijk de website van het bedrijf of event in. Zo kan Marketing de juiste branding, zoals logo’s, kleuren en lettertypen, achterhalen. Is er geen website beschikbaar? Dan kun je dit veld leeg laten.</w:t>
+        <w:t xml:space="preserve">Vul waar mogelijk de website van het bedrijf of event in. Zo kan marketing de juiste branding, zoals logo’s, kleuren en lettertypen, achterhalen. Is er geen website beschikbaar? Dan kun je dit veld leeg laten.</w:t>
       </w:r>
     </w:p>
     <w:p>
@@ -1240,7 +1240,7 @@
         <w:tab/>
       </w:r>
       <w:r>
-        <w:t xml:space="preserve">Vink alles aan wat je voor het event nodig hebt. Staat jouw keuze er niet bij? Kies dan ‘Anders, namelijk…’ en beschrijf wat je nodig hebt.</w:t>
+        <w:t xml:space="preserve">Vink alles aan wat je voor het event nodig hebt. Staat jouw keuze er niet bij? Kies dan ‘Anders, namelijk…’ en beschrijf wat je nodig hebt. Deze optie is er alleen bij ‘Volledig custom’.</w:t>
       </w:r>
     </w:p>
     <w:tbl>
@@ -1350,7 +1350,7 @@
               <w:tab/>
             </w:r>
             <w:r>
-              <w:t xml:space="preserve">Vermeld alle informatie die Marketing nodig heeft, zoals teksten, sfeer en gewenste formaten. Gebruik Enter om een nieuwe regel te beginnen.</w:t>
+              <w:t xml:space="preserve">Vermeld alle informatie die marketing nodig heeft, zoals teksten, sfeer en gewenste formaten. Gebruik Enter om een nieuwe regel te beginnen.</w:t>
             </w:r>
           </w:p>
           <w:p>
@@ -1649,7 +1649,7 @@
               <w:tab/>
             </w:r>
             <w:r>
-              <w:t xml:space="preserve">Je aanvraag is nu ingediend bij Marketing.</w:t>
+              <w:t xml:space="preserve">Je aanvraag is nu ingediend bij marketing.</w:t>
             </w:r>
           </w:p>
           <w:p>
@@ -1691,7 +1691,7 @@
               <w:tab/>
             </w:r>
             <w:r>
-              <w:t xml:space="preserve">Is het erg krap? Dan herinnert het formulier je eraan om contact op te nemen met Marketing.</w:t>
+              <w:t xml:space="preserve">Is het erg krap? Dan herinnert het formulier je eraan om contact op te nemen met marketing.</w:t>
             </w:r>
           </w:p>
           <w:p>
@@ -1785,7 +1785,7 @@
         <w:tab/>
       </w:r>
       <w:r>
-        <w:t xml:space="preserve">Valt de deadline binnen 5 werkdagen? Dan verschijnt er ook een melding. Je kunt de aanvraag verder invullen, maar stem de planning eerst even af met Marketing.</w:t>
+        <w:t xml:space="preserve">Valt de deadline binnen 5 werkdagen? Dan verschijnt er ook een melding. Je kunt de aanvraag verder invullen, maar stem de planning eerst even af met marketing.</w:t>
       </w:r>
     </w:p>
     <w:p>
@@ -1795,7 +1795,7 @@
         <w:spacing w:before="280"/>
       </w:pPr>
       <w:r>
-        <w:t xml:space="preserve">2  Een interne aanvraag</w:t>
+        <w:t xml:space="preserve">2.  Een interne aanvraag</w:t>
       </w:r>
     </w:p>
     <w:p>
@@ -1994,7 +1994,7 @@
         <w:spacing w:before="280"/>
       </w:pPr>
       <w:r>
-        <w:t xml:space="preserve">3  Een menukaart of menuscherm</w:t>
+        <w:t xml:space="preserve">3.  Een menukaart of menuscherm</w:t>
       </w:r>
     </w:p>
     <w:p>
@@ -2002,7 +2002,7 @@
         <w:keepNext/>
       </w:pPr>
       <w:r>
-        <w:t xml:space="preserve">Selecteer bij ‘Wat wil je aanvragen?’ de optie ‘Menukaart print’, ‘Menu scherm’ of beide. Er verschijnt vervolgens een extra vraag: om welk menu gaat het?</w:t>
+        <w:t xml:space="preserve">Selecteer bij ‘Wat wil je aanvragen?’ de optie ‘Menukaart print’, ‘Menu scherm’ of beide. ‘Menukaart print’ kun je alleen kiezen bij ‘Volledig custom’. Er verschijnt vervolgens een extra vraag: om welk menu gaat het?</w:t>
       </w:r>
     </w:p>
     <w:p>
@@ -2225,7 +2225,7 @@
               <w:tab/>
             </w:r>
             <w:r>
-              <w:t xml:space="preserve">Selecteer de gerechten uit de lijst. Voer je zelf een gerecht in? Dan verschijnt er een melding en beoordeelt Marketing de invoer.</w:t>
+              <w:t xml:space="preserve">Selecteer de gerechten uit de lijst. Voer je zelf een gerecht in? Dan verschijnt er een melding en beoordeelt marketing de invoer.</w:t>
             </w:r>
           </w:p>
           <w:p>
@@ -2264,7 +2264,7 @@
         <w:spacing w:before="280"/>
       </w:pPr>
       <w:r>
-        <w:t xml:space="preserve">4  Je design is klaar</w:t>
+        <w:t xml:space="preserve">4.  Je design is klaar</w:t>
       </w:r>
     </w:p>
     <w:p>
@@ -2272,7 +2272,7 @@
         <w:keepNext/>
       </w:pPr>
       <w:r>
-        <w:t xml:space="preserve">Zodra je design klaar is, ontvang je een e-mail van Designaanvraag (designaanvraag@nbcevents.nl).</w:t>
+        <w:t xml:space="preserve">Zodra je design klaar is, ontvang je een e-mail van designaanvraag (designaanvraag@nbcevents.nl).</w:t>
       </w:r>
     </w:p>
     <w:tbl>
@@ -2623,7 +2623,7 @@
         <w:spacing w:before="280"/>
       </w:pPr>
       <w:r>
-        <w:t xml:space="preserve">5  Aanvullen of wijzigen</w:t>
+        <w:t xml:space="preserve">5.  Aanvullen of wijzigen</w:t>
       </w:r>
     </w:p>
     <w:p>
@@ -2762,7 +2762,7 @@
               <w:tab/>
             </w:r>
             <w:r>
-              <w:t xml:space="preserve">Vul daarna je naam in, zodat Marketing weet wie de wijziging doorgeeft.</w:t>
+              <w:t xml:space="preserve">Vul daarna je naam in, zodat marketing weet wie de wijziging doorgeeft.</w:t>
             </w:r>
           </w:p>
           <w:p>
@@ -3121,7 +3121,7 @@
         <w:spacing w:before="280"/>
       </w:pPr>
       <w:r>
-        <w:t xml:space="preserve">6  Spoed en vragen</w:t>
+        <w:t xml:space="preserve">6.  Spoed en vragen</w:t>
       </w:r>
     </w:p>
     <w:p>
@@ -3129,7 +3129,7 @@
         <w:keepNext/>
       </w:pPr>
       <w:r>
-        <w:t xml:space="preserve">Je aanvraag komt bij Marketing binnen als taak. Marketing ontvangt een e-mail en ziet de aanvraag in de lijst. Vervolgens plant Marketing de aanvraag in. Is er iets onduidelijk, dan neemt Marketing contact met je op. Zodra het design klaar is, ontvang je een e-mail met de bestanden (zie hoofdstuk 4).</w:t>
+        <w:t xml:space="preserve">Je aanvraag komt bij marketing binnen als taak. Marketing ontvangt een e-mail en ziet de aanvraag in de lijst. Vervolgens plant marketing de aanvraag in. Is er iets onduidelijk, dan neemt marketing contact met je op. Zodra het design klaar is, ontvang je een e-mail met de bestanden (zie hoofdstuk 4).</w:t>
       </w:r>
     </w:p>
     <w:p>
@@ -3290,7 +3290,7 @@
               <w:spacing w:after="40"/>
             </w:pPr>
             <w:r>
-              <w:t xml:space="preserve">Dien je aanvraag in en mail daarna meteen Marketing om te bespreken wat nog mogelijk is.</w:t>
+              <w:t xml:space="preserve">Dien je aanvraag in en mail daarna meteen marketing om te bespreken wat nog mogelijk is.</w:t>
             </w:r>
           </w:p>
         </w:tc>
@@ -3704,7 +3704,7 @@
               <w:spacing w:after="40"/>
             </w:pPr>
             <w:r>
-              <w:t xml:space="preserve">Is de aanvraag ouder dan 4 maanden of is deze niet via het formulier ingediend? Mail dan Marketing.</w:t>
+              <w:t xml:space="preserve">Is de aanvraag ouder dan 4 maanden of is deze niet via het formulier ingediend? Mail dan marketing.</w:t>
             </w:r>
           </w:p>
         </w:tc>
@@ -3750,7 +3750,7 @@
               <w:spacing w:after="40"/>
             </w:pPr>
             <w:r>
-              <w:t xml:space="preserve">Mail Marketing, zodat de aanvraag kan worden verwijderd.</w:t>
+              <w:t xml:space="preserve">Mail marketing, zodat de aanvraag kan worden verwijderd.</w:t>
             </w:r>
           </w:p>
         </w:tc>
@@ -3823,8 +3823,8 @@
       </w:pPr>
     </w:p>
     <w:sectPr>
-      <w:headerReference w:type="default" r:id="rId21"/>
-      <w:footerReference w:type="default" r:id="rId22"/>
+      <w:headerReference w:type="default" r:id="rId25"/>
+      <w:footerReference w:type="default" r:id="rId26"/>
       <w:pgSz w:w="11906" w:h="16838" w:code="9"/>
       <w:pgMar w:top="1440" w:right="1440" w:bottom="1440" w:left="1440" w:header="850" w:footer="1701" w:gutter="0"/>
       <w:cols w:space="708"/>
@@ -3865,7 +3865,7 @@
         <w:noProof/>
       </w:rPr>
       <w:drawing>
-        <wp:anchor distT="0" distB="0" distL="114300" distR="114300" simplePos="0" relativeHeight="251660288" behindDoc="1" locked="0" layoutInCell="1" allowOverlap="1" wp14:anchorId="0D893E23" wp14:editId="5119F348">
+        <wp:anchor distT="0" distB="0" distL="114300" distR="114300" simplePos="0" relativeHeight="251660288" behindDoc="1" locked="0" layoutInCell="1" allowOverlap="1" wp14:anchorId="1D4ED143" wp14:editId="73BEB6E0">
           <wp:simplePos x="0" y="0"/>
           <wp:positionH relativeFrom="column">
             <wp:posOffset>-403225</wp:posOffset>
@@ -3963,7 +3963,7 @@
       <mc:AlternateContent>
         <mc:Choice Requires="wps">
           <w:drawing>
-            <wp:anchor distT="0" distB="0" distL="114300" distR="114300" simplePos="0" relativeHeight="251662336" behindDoc="0" locked="0" layoutInCell="1" allowOverlap="1" wp14:anchorId="6100FB58" wp14:editId="6A485CDE">
+            <wp:anchor distT="0" distB="0" distL="114300" distR="114300" simplePos="0" relativeHeight="251662336" behindDoc="0" locked="0" layoutInCell="1" allowOverlap="1" wp14:anchorId="3AAB4845" wp14:editId="58004473">
               <wp:simplePos x="0" y="0"/>
               <wp:positionH relativeFrom="column">
                 <wp:posOffset>-915670</wp:posOffset>
@@ -4035,7 +4035,7 @@
                               <w:noProof/>
                             </w:rPr>
                             <w:drawing>
-                              <wp:inline distT="0" distB="0" distL="0" distR="0" wp14:anchorId="77096505" wp14:editId="62978981">
+                              <wp:inline distT="0" distB="0" distL="0" distR="0" wp14:anchorId="49C8967F" wp14:editId="2F426286">
                                 <wp:extent cx="1986280" cy="39370"/>
                                 <wp:effectExtent l="0" t="0" r="0" b="0"/>
                                 <wp:docPr id="2071231899" name="Afbeelding 2"/>
@@ -4106,7 +4106,7 @@
         </mc:Choice>
         <mc:Fallback>
           <w:pict>
-            <v:rect w14:anchorId="6100FB58" id="Rechthoek 1" o:spid="_x0000_s1026" style="position:absolute;margin-left:-72.1pt;margin-top:-41.95pt;width:595.3pt;height:11.35pt;z-index:251662336;visibility:visible;mso-wrap-style:square;mso-width-percent:0;mso-height-percent:0;mso-wrap-distance-left:9pt;mso-wrap-distance-top:0;mso-wrap-distance-right:9pt;mso-wrap-distance-bottom:0;mso-position-horizontal:absolute;mso-position-horizontal-relative:text;mso-position-vertical:absolute;mso-position-vertical-relative:text;mso-width-percent:0;mso-height-percent:0;mso-width-relative:margin;mso-height-relative:margin;v-text-anchor:middle" o:gfxdata="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" fillcolor="#229d96" stroked="f" strokeweight="1pt">
+            <v:rect w14:anchorId="3AAB4845" id="Rechthoek 1" o:spid="_x0000_s1026" style="position:absolute;margin-left:-72.1pt;margin-top:-41.95pt;width:595.3pt;height:11.35pt;z-index:251662336;visibility:visible;mso-wrap-style:square;mso-width-percent:0;mso-height-percent:0;mso-wrap-distance-left:9pt;mso-wrap-distance-top:0;mso-wrap-distance-right:9pt;mso-wrap-distance-bottom:0;mso-position-horizontal:absolute;mso-position-horizontal-relative:text;mso-position-vertical:absolute;mso-position-vertical-relative:text;mso-width-percent:0;mso-height-percent:0;mso-width-relative:margin;mso-height-relative:margin;v-text-anchor:middle" o:gfxdata="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" fillcolor="#229d96" stroked="f" strokeweight="1pt">
               <v:fill color2="#f5a300" angle="30" colors="0 #229d96;19661f #229d96" focus="100%" type="gradient">
                 <o:fill v:ext="view" type="gradientUnscaled"/>
               </v:fill>
@@ -4126,7 +4126,7 @@
                         <w:noProof/>
                       </w:rPr>
                       <w:drawing>
-                        <wp:inline distT="0" distB="0" distL="0" distR="0" wp14:anchorId="77096505" wp14:editId="62978981">
+                        <wp:inline distT="0" distB="0" distL="0" distR="0" wp14:anchorId="49C8967F" wp14:editId="2F426286">
                           <wp:extent cx="1986280" cy="39370"/>
                           <wp:effectExtent l="0" t="0" r="0" b="0"/>
                           <wp:docPr id="2071231899" name="Afbeelding 2"/>

</xml_diff>

<commit_message>
Projectengids: nieuwe basis, bredere eerste kolom en zonder menukaart-zin
Het aangeleverde Word-bestand is de basis. Het enige verschil met de vorige
versie zat in de tabellen 'Krappe deadlines' en 'Wat doe je als…': een
bredere eerste kolom (3969 in plaats van 3200 twips). Dat doet het
bouwscript nu ook. De zin dat 'Menukaart print' alleen bij 'Volledig
custom' kan, is eruit.

Co-Authored-By: Claude Opus 5.5 <noreply@anthropic.com>
Claude-Session: https://claude.ai/code/session_01FF5qjJmcy9G5HYxEPWYe11
</commit_message>
<xml_diff>
--- a/docs/gids-projecten/Designs aanvragen - Handleiding voor projecten.docx
+++ b/docs/gids-projecten/Designs aanvragen - Handleiding voor projecten.docx
@@ -2002,7 +2002,7 @@
         <w:keepNext/>
       </w:pPr>
       <w:r>
-        <w:t xml:space="preserve">Selecteer bij ‘Wat wil je aanvragen?’ de optie ‘Menukaart print’, ‘Menu scherm’ of beide. ‘Menukaart print’ kun je alleen kiezen bij ‘Volledig custom’. Er verschijnt vervolgens een extra vraag: om welk menu gaat het?</w:t>
+        <w:t xml:space="preserve">Selecteer bij ‘Wat wil je aanvragen?’ de optie ‘Menukaart print’, ‘Menu scherm’ of beide. Er verschijnt vervolgens een extra vraag: om welk menu gaat het?</w:t>
       </w:r>
     </w:p>
     <w:p>
@@ -3154,8 +3154,8 @@
         <w:tblLayout w:type="fixed"/>
       </w:tblPr>
       <w:tblGrid>
-        <w:gridCol w:w="3200"/>
-        <w:gridCol w:w="5815"/>
+        <w:gridCol w:w="3969"/>
+        <w:gridCol w:w="5046"/>
       </w:tblGrid>
       <w:tr>
         <w:trPr>
@@ -3163,7 +3163,7 @@
         </w:trPr>
         <w:tc>
           <w:tcPr>
-            <w:tcW w:w="3200" w:type="dxa"/>
+            <w:tcW w:w="3969" w:type="dxa"/>
             <w:tcMar>
               <w:top w:w="90" w:type="dxa"/>
               <w:left w:w="140" w:type="dxa"/>
@@ -3185,7 +3185,7 @@
         </w:tc>
         <w:tc>
           <w:tcPr>
-            <w:tcW w:w="5815" w:type="dxa"/>
+            <w:tcW w:w="5046" w:type="dxa"/>
             <w:tcMar>
               <w:top w:w="90" w:type="dxa"/>
               <w:left w:w="140" w:type="dxa"/>
@@ -3209,7 +3209,7 @@
         </w:trPr>
         <w:tc>
           <w:tcPr>
-            <w:tcW w:w="3200" w:type="dxa"/>
+            <w:tcW w:w="3969" w:type="dxa"/>
             <w:tcMar>
               <w:top w:w="90" w:type="dxa"/>
               <w:left w:w="140" w:type="dxa"/>
@@ -3231,7 +3231,7 @@
         </w:tc>
         <w:tc>
           <w:tcPr>
-            <w:tcW w:w="5815" w:type="dxa"/>
+            <w:tcW w:w="5046" w:type="dxa"/>
             <w:tcMar>
               <w:top w:w="90" w:type="dxa"/>
               <w:left w:w="140" w:type="dxa"/>
@@ -3255,7 +3255,7 @@
         </w:trPr>
         <w:tc>
           <w:tcPr>
-            <w:tcW w:w="3200" w:type="dxa"/>
+            <w:tcW w:w="3969" w:type="dxa"/>
             <w:tcMar>
               <w:top w:w="90" w:type="dxa"/>
               <w:left w:w="140" w:type="dxa"/>
@@ -3277,7 +3277,7 @@
         </w:tc>
         <w:tc>
           <w:tcPr>
-            <w:tcW w:w="5815" w:type="dxa"/>
+            <w:tcW w:w="5046" w:type="dxa"/>
             <w:tcMar>
               <w:top w:w="90" w:type="dxa"/>
               <w:left w:w="140" w:type="dxa"/>
@@ -3384,8 +3384,8 @@
         <w:tblLayout w:type="fixed"/>
       </w:tblPr>
       <w:tblGrid>
-        <w:gridCol w:w="3200"/>
-        <w:gridCol w:w="5815"/>
+        <w:gridCol w:w="3969"/>
+        <w:gridCol w:w="5046"/>
       </w:tblGrid>
       <w:tr>
         <w:trPr>
@@ -3393,7 +3393,7 @@
         </w:trPr>
         <w:tc>
           <w:tcPr>
-            <w:tcW w:w="3200" w:type="dxa"/>
+            <w:tcW w:w="3969" w:type="dxa"/>
             <w:tcMar>
               <w:top w:w="90" w:type="dxa"/>
               <w:left w:w="140" w:type="dxa"/>
@@ -3415,7 +3415,7 @@
         </w:tc>
         <w:tc>
           <w:tcPr>
-            <w:tcW w:w="5815" w:type="dxa"/>
+            <w:tcW w:w="5046" w:type="dxa"/>
             <w:tcMar>
               <w:top w:w="90" w:type="dxa"/>
               <w:left w:w="140" w:type="dxa"/>
@@ -3439,7 +3439,7 @@
         </w:trPr>
         <w:tc>
           <w:tcPr>
-            <w:tcW w:w="3200" w:type="dxa"/>
+            <w:tcW w:w="3969" w:type="dxa"/>
             <w:tcMar>
               <w:top w:w="90" w:type="dxa"/>
               <w:left w:w="140" w:type="dxa"/>
@@ -3461,7 +3461,7 @@
         </w:tc>
         <w:tc>
           <w:tcPr>
-            <w:tcW w:w="5815" w:type="dxa"/>
+            <w:tcW w:w="5046" w:type="dxa"/>
             <w:tcMar>
               <w:top w:w="90" w:type="dxa"/>
               <w:left w:w="140" w:type="dxa"/>
@@ -3485,7 +3485,7 @@
         </w:trPr>
         <w:tc>
           <w:tcPr>
-            <w:tcW w:w="3200" w:type="dxa"/>
+            <w:tcW w:w="3969" w:type="dxa"/>
             <w:tcMar>
               <w:top w:w="90" w:type="dxa"/>
               <w:left w:w="140" w:type="dxa"/>
@@ -3507,7 +3507,7 @@
         </w:tc>
         <w:tc>
           <w:tcPr>
-            <w:tcW w:w="5815" w:type="dxa"/>
+            <w:tcW w:w="5046" w:type="dxa"/>
             <w:tcMar>
               <w:top w:w="90" w:type="dxa"/>
               <w:left w:w="140" w:type="dxa"/>
@@ -3531,7 +3531,7 @@
         </w:trPr>
         <w:tc>
           <w:tcPr>
-            <w:tcW w:w="3200" w:type="dxa"/>
+            <w:tcW w:w="3969" w:type="dxa"/>
             <w:tcMar>
               <w:top w:w="90" w:type="dxa"/>
               <w:left w:w="140" w:type="dxa"/>
@@ -3553,7 +3553,7 @@
         </w:tc>
         <w:tc>
           <w:tcPr>
-            <w:tcW w:w="5815" w:type="dxa"/>
+            <w:tcW w:w="5046" w:type="dxa"/>
             <w:tcMar>
               <w:top w:w="90" w:type="dxa"/>
               <w:left w:w="140" w:type="dxa"/>
@@ -3577,7 +3577,7 @@
         </w:trPr>
         <w:tc>
           <w:tcPr>
-            <w:tcW w:w="3200" w:type="dxa"/>
+            <w:tcW w:w="3969" w:type="dxa"/>
             <w:tcMar>
               <w:top w:w="90" w:type="dxa"/>
               <w:left w:w="140" w:type="dxa"/>
@@ -3599,7 +3599,7 @@
         </w:tc>
         <w:tc>
           <w:tcPr>
-            <w:tcW w:w="5815" w:type="dxa"/>
+            <w:tcW w:w="5046" w:type="dxa"/>
             <w:tcMar>
               <w:top w:w="90" w:type="dxa"/>
               <w:left w:w="140" w:type="dxa"/>
@@ -3623,7 +3623,7 @@
         </w:trPr>
         <w:tc>
           <w:tcPr>
-            <w:tcW w:w="3200" w:type="dxa"/>
+            <w:tcW w:w="3969" w:type="dxa"/>
             <w:tcMar>
               <w:top w:w="90" w:type="dxa"/>
               <w:left w:w="140" w:type="dxa"/>
@@ -3645,7 +3645,7 @@
         </w:tc>
         <w:tc>
           <w:tcPr>
-            <w:tcW w:w="5815" w:type="dxa"/>
+            <w:tcW w:w="5046" w:type="dxa"/>
             <w:tcMar>
               <w:top w:w="90" w:type="dxa"/>
               <w:left w:w="140" w:type="dxa"/>
@@ -3669,7 +3669,7 @@
         </w:trPr>
         <w:tc>
           <w:tcPr>
-            <w:tcW w:w="3200" w:type="dxa"/>
+            <w:tcW w:w="3969" w:type="dxa"/>
             <w:tcMar>
               <w:top w:w="90" w:type="dxa"/>
               <w:left w:w="140" w:type="dxa"/>
@@ -3691,7 +3691,7 @@
         </w:tc>
         <w:tc>
           <w:tcPr>
-            <w:tcW w:w="5815" w:type="dxa"/>
+            <w:tcW w:w="5046" w:type="dxa"/>
             <w:tcMar>
               <w:top w:w="90" w:type="dxa"/>
               <w:left w:w="140" w:type="dxa"/>
@@ -3715,7 +3715,7 @@
         </w:trPr>
         <w:tc>
           <w:tcPr>
-            <w:tcW w:w="3200" w:type="dxa"/>
+            <w:tcW w:w="3969" w:type="dxa"/>
             <w:tcMar>
               <w:top w:w="90" w:type="dxa"/>
               <w:left w:w="140" w:type="dxa"/>
@@ -3737,7 +3737,7 @@
         </w:tc>
         <w:tc>
           <w:tcPr>
-            <w:tcW w:w="5815" w:type="dxa"/>
+            <w:tcW w:w="5046" w:type="dxa"/>
             <w:tcMar>
               <w:top w:w="90" w:type="dxa"/>
               <w:left w:w="140" w:type="dxa"/>

</xml_diff>

<commit_message>
Projectengids: bij spoed neemt marketing contact op
Twee zinnen zeiden nog dat de collega zelf moest afstemmen of mailen bij
een deadline binnen 5 werkdagen. Nu staat er, net als in de app, dat
marketing contact opneemt (basispagina) en dat het marketingteam beoordeelt
wat er nog mogelijk is (tabel 'Krappe deadlines').

Co-Authored-By: Claude Opus 5.5 <noreply@anthropic.com>
Claude-Session: https://claude.ai/code/session_01FF5qjJmcy9G5HYxEPWYe11
</commit_message>
<xml_diff>
--- a/docs/gids-projecten/Designs aanvragen - Handleiding voor projecten.docx
+++ b/docs/gids-projecten/Designs aanvragen - Handleiding voor projecten.docx
@@ -82,7 +82,7 @@
         <w:spacing w:after="60"/>
       </w:pPr>
       <w:r>
-        <w:t xml:space="preserve">Is de deadline korter? Dan geldt de aanvraag als spoed. Stem deadlines binnen 5 werkdagen altijd af met marketing.</w:t>
+        <w:t xml:space="preserve">Is de deadline korter? Dan geldt de aanvraag als spoed. Bij deadlines binnen 5 werkdagen neemt marketing contact met je op.</w:t>
       </w:r>
     </w:p>
     <w:p>
@@ -3247,7 +3247,7 @@
               <w:spacing w:after="40"/>
             </w:pPr>
             <w:r>
-              <w:t xml:space="preserve">Dien je aanvraag in en mail daarna meteen marketing om te bespreken wat nog mogelijk is.</w:t>
+              <w:t xml:space="preserve">Dien je aanvraag in. Het marketingteam beoordeelt wat er nog mogelijk is en neemt contact met je op.</w:t>
             </w:r>
           </w:p>
         </w:tc>

</xml_diff>

<commit_message>
Projectengids: hoofdstuk 5 en 6 beginnen op een nieuwe pagina
Het aangeleverde Word-bestand is de basis. Het voegde pagina-einden toe
voor 'Aanvullen of wijzigen' en 'Spoed en vragen'; het bouwscript doet dat
nu ook (nieuwe_pagina). Opnieuw gebouwd is hij gelijk aan de basis, op
zeven pagina's.

Co-Authored-By: Claude Opus 5.5 <noreply@anthropic.com>
Claude-Session: https://claude.ai/code/session_01FF5qjJmcy9G5HYxEPWYe11
</commit_message>
<xml_diff>
--- a/docs/gids-projecten/Designs aanvragen - Handleiding voor projecten.docx
+++ b/docs/gids-projecten/Designs aanvragen - Handleiding voor projecten.docx
@@ -2575,6 +2575,18 @@
     </w:p>
     <w:p>
       <w:pPr>
+        <w:spacing w:line="259" w:lineRule="auto"/>
+        <w:rPr>
+          <w:rFonts w:ascii="Pockota Med" w:hAnsi="Pockota Med"/>
+          <w:sz w:val="36"/>
+        </w:rPr>
+      </w:pPr>
+      <w:r>
+        <w:br w:type="page"/>
+      </w:r>
+    </w:p>
+    <w:p>
+      <w:pPr>
         <w:pStyle w:val="Kop1"/>
         <w:keepNext/>
         <w:spacing w:before="280"/>
@@ -3070,6 +3082,18 @@
       <w:pPr>
         <w:spacing w:after="0" w:line="120" w:lineRule="exact"/>
       </w:pPr>
+    </w:p>
+    <w:p>
+      <w:pPr>
+        <w:spacing w:line="259" w:lineRule="auto"/>
+        <w:rPr>
+          <w:rFonts w:ascii="Pockota Med" w:hAnsi="Pockota Med"/>
+          <w:sz w:val="36"/>
+        </w:rPr>
+      </w:pPr>
+      <w:r>
+        <w:br w:type="page"/>
+      </w:r>
     </w:p>
     <w:p>
       <w:pPr>

</xml_diff>